<commit_message>
Document selective force-native protocol in the collaborator report.
Adds Stage XV with glossary terms for A→C→B, selective b-step intervention,
force-native article, and packaging vs editable wrappers; includes Figure 8
from selective_bc_force_native summaries and rebuilds the DOCX (oMath +
embedded figures verified).

Co-authored-by: Cursor <cursoragent@cursor.com>
</commit_message>
<xml_diff>
--- a/docs/collaborator-report/collaborator-report-v3.docx
+++ b/docs/collaborator-report/collaborator-report-v3.docx
@@ -429,13 +429,13 @@
         <w:t xml:space="preserve"> </w:t>
       </w:r>
       <w:r>
-        <w:t xml:space="preserve">content-lock / dual intervention, a causal tetrad on twin families, and</w:t>
-      </w:r>
-      <w:r>
-        <w:t xml:space="preserve"> </w:t>
-      </w:r>
-      <w:r>
-        <w:t xml:space="preserve">slim domain transfer,</w:t>
+        <w:t xml:space="preserve">content-lock / dual intervention, a causal tetrad on twin families,</w:t>
+      </w:r>
+      <w:r>
+        <w:t xml:space="preserve"> </w:t>
+      </w:r>
+      <w:r>
+        <w:t xml:space="preserve">slim domain transfer, and a</w:t>
       </w:r>
       <w:r>
         <w:t xml:space="preserve"> </w:t>
@@ -445,7 +445,7 @@
           <w:b/>
           <w:bCs/>
         </w:rPr>
-        <w:t xml:space="preserve">no held-out condition produced reliable</w:t>
+        <w:t xml:space="preserve">selective article-step intervention with</w:t>
       </w:r>
       <w:r>
         <w:rPr>
@@ -459,16 +459,67 @@
           <w:b/>
           <w:bCs/>
         </w:rPr>
-        <w:t xml:space="preserve">wrapper-like repair</w:t>
-      </w:r>
-      <w:r>
-        <w:t xml:space="preserve">. Dual-effect gain-of-function remained</w:t>
-      </w:r>
-      <w:r>
-        <w:t xml:space="preserve"> </w:t>
-      </w:r>
-      <w:r>
-        <w:t xml:space="preserve">trajectory-like (chunking)—for example amplifying frozen features turned</w:t>
+        <w:t xml:space="preserve">forced native article</w:t>
+      </w:r>
+      <w:r>
+        <w:t xml:space="preserve"> </w:t>
+      </w:r>
+      <w:r>
+        <w:t xml:space="preserve">(the cleanest modular</w:t>
+      </w:r>
+      <w:r>
+        <w:t xml:space="preserve"> </w:t>
+      </w:r>
+      <m:oMath>
+        <m:r>
+          <m:t>C</m:t>
+        </m:r>
+        <m:r>
+          <m:rPr>
+            <m:sty m:val="p"/>
+          </m:rPr>
+          <m:t>→</m:t>
+        </m:r>
+        <m:r>
+          <m:t>B</m:t>
+        </m:r>
+      </m:oMath>
+      <w:r>
+        <w:t xml:space="preserve"> </w:t>
+      </w:r>
+      <w:r>
+        <w:t xml:space="preserve">test we</w:t>
+      </w:r>
+      <w:r>
+        <w:t xml:space="preserve"> </w:t>
+      </w:r>
+      <w:r>
+        <w:t xml:space="preserve">ran),</w:t>
+      </w:r>
+      <w:r>
+        <w:t xml:space="preserve"> </w:t>
+      </w:r>
+      <w:r>
+        <w:rPr>
+          <w:b/>
+          <w:bCs/>
+        </w:rPr>
+        <w:t xml:space="preserve">no held-out condition produced reliable wrapper-like repair</w:t>
+      </w:r>
+      <w:r>
+        <w:t xml:space="preserve">.</w:t>
+      </w:r>
+      <w:r>
+        <w:t xml:space="preserve"> </w:t>
+      </w:r>
+      <w:r>
+        <w:t xml:space="preserve">Dual-effect gain-of-function remained trajectory-like (chunking)—for</w:t>
+      </w:r>
+      <w:r>
+        <w:t xml:space="preserve"> </w:t>
+      </w:r>
+      <w:r>
+        <w:t xml:space="preserve">example amplifying frozen features turned</w:t>
       </w:r>
       <w:r>
         <w:t xml:space="preserve"> </w:t>
@@ -510,13 +561,16 @@
         <w:t xml:space="preserve">an aviator</w:t>
       </w:r>
       <w:r>
-        <w:t xml:space="preserve">, and</w:t>
-      </w:r>
-      <w:r>
-        <w:t xml:space="preserve"> </w:t>
-      </w:r>
-      <w:r>
-        <w:t xml:space="preserve">simultaneously amplifying “content-lock” features did not preserve</w:t>
+        <w:t xml:space="preserve"> </w:t>
+      </w:r>
+      <w:r>
+        <w:t xml:space="preserve">when generation was free, yet</w:t>
+      </w:r>
+      <w:r>
+        <w:t xml:space="preserve"> </w:t>
+      </w:r>
+      <w:r>
+        <w:t xml:space="preserve">forcing the native article</w:t>
       </w:r>
       <w:r>
         <w:t xml:space="preserve"> </w:t>
@@ -525,13 +579,31 @@
         <w:rPr>
           <w:rStyle w:val="VerbatimChar"/>
         </w:rPr>
+        <w:t xml:space="preserve">a</w:t>
+      </w:r>
+      <w:r>
+        <w:t xml:space="preserve"> </w:t>
+      </w:r>
+      <w:r>
+        <w:t xml:space="preserve">restored</w:t>
+      </w:r>
+      <w:r>
+        <w:t xml:space="preserve"> </w:t>
+      </w:r>
+      <w:r>
+        <w:rPr>
+          <w:rStyle w:val="VerbatimChar"/>
+        </w:rPr>
         <w:t xml:space="preserve">pilot</w:t>
       </w:r>
       <w:r>
-        <w:t xml:space="preserve"> </w:t>
-      </w:r>
-      <w:r>
-        <w:t xml:space="preserve">while flipping only the article. Illicit mismatches such as</w:t>
+        <w:t xml:space="preserve">. Content-only features</w:t>
+      </w:r>
+      <w:r>
+        <w:t xml:space="preserve"> </w:t>
+      </w:r>
+      <w:r>
+        <w:t xml:space="preserve">did not provide a selective licensing handle. Illicit mismatches such as</w:t>
       </w:r>
       <w:r>
         <w:t xml:space="preserve"> </w:t>
@@ -636,7 +708,85 @@
           <w:i/>
           <w:iCs/>
         </w:rPr>
-        <w:t xml:space="preserve">planning unless content identity is locked and reported.</w:t>
+        <w:t xml:space="preserve">planning unless content identity is locked and reported—and even under</w:t>
+      </w:r>
+      <w:r>
+        <w:rPr>
+          <w:i/>
+          <w:iCs/>
+        </w:rPr>
+        <w:t xml:space="preserve"> </w:t>
+      </w:r>
+      <w:r>
+        <w:rPr>
+          <w:i/>
+          <w:iCs/>
+        </w:rPr>
+        <w:t xml:space="preserve">a selective intervene-at-</w:t>
+      </w:r>
+      <m:oMath>
+        <m:r>
+          <m:t>b</m:t>
+        </m:r>
+      </m:oMath>
+      <w:r>
+        <w:rPr>
+          <w:i/>
+          <w:iCs/>
+        </w:rPr>
+        <w:t xml:space="preserve"> </w:t>
+      </w:r>
+      <w:r>
+        <w:rPr>
+          <w:i/>
+          <w:iCs/>
+        </w:rPr>
+        <w:t xml:space="preserve">/ force-native-</w:t>
+      </w:r>
+      <m:oMath>
+        <m:r>
+          <m:t>b</m:t>
+        </m:r>
+      </m:oMath>
+      <w:r>
+        <w:rPr>
+          <w:i/>
+          <w:iCs/>
+        </w:rPr>
+        <w:t xml:space="preserve"> </w:t>
+      </w:r>
+      <w:r>
+        <w:rPr>
+          <w:i/>
+          <w:iCs/>
+        </w:rPr>
+        <w:t xml:space="preserve">/ generate-</w:t>
+      </w:r>
+      <m:oMath>
+        <m:r>
+          <m:t>c</m:t>
+        </m:r>
+      </m:oMath>
+      <w:r>
+        <w:rPr>
+          <w:i/>
+          <w:iCs/>
+        </w:rPr>
+        <w:t xml:space="preserve">-off</w:t>
+      </w:r>
+      <w:r>
+        <w:rPr>
+          <w:i/>
+          <w:iCs/>
+        </w:rPr>
+        <w:t xml:space="preserve"> </w:t>
+      </w:r>
+      <w:r>
+        <w:rPr>
+          <w:i/>
+          <w:iCs/>
+        </w:rPr>
+        <w:t xml:space="preserve">protocol, we still see packaging rather than modular licensing.</w:t>
       </w:r>
     </w:p>
     <w:p>
@@ -1228,13 +1378,37 @@
           <w:b/>
           <w:bCs/>
         </w:rPr>
-        <w:t xml:space="preserve">Wrapper-like effect:</w:t>
-      </w:r>
-      <w:r>
-        <w:t xml:space="preserve"> </w:t>
-      </w:r>
-      <w:r>
-        <w:t xml:space="preserve">an intervention that changes the preparatory article while preserving the later content word (or its identity). This is what a content-preserving latent-planning repair would look like.</w:t>
+        <w:t xml:space="preserve">Wrapper-like effect / editable wrapper:</w:t>
+      </w:r>
+      <w:r>
+        <w:t xml:space="preserve"> </w:t>
+      </w:r>
+      <w:r>
+        <w:t xml:space="preserve">an intervention that</w:t>
+      </w:r>
+      <w:r>
+        <w:t xml:space="preserve"> </w:t>
+      </w:r>
+      <w:r>
+        <w:t xml:space="preserve">changes the preparatory article while preserving the later content</w:t>
+      </w:r>
+      <w:r>
+        <w:t xml:space="preserve"> </w:t>
+      </w:r>
+      <w:r>
+        <w:t xml:space="preserve">word (or its planned identity). This is what a content-preserving</w:t>
+      </w:r>
+      <w:r>
+        <w:t xml:space="preserve"> </w:t>
+      </w:r>
+      <w:r>
+        <w:t xml:space="preserve">latent-planning repair would look like—an editable “wrapper” around a</w:t>
+      </w:r>
+      <w:r>
+        <w:t xml:space="preserve"> </w:t>
+      </w:r>
+      <w:r>
+        <w:t xml:space="preserve">fixed latent noun.</w:t>
       </w:r>
     </w:p>
     <w:p>
@@ -1255,7 +1429,19 @@
         <w:t xml:space="preserve"> </w:t>
       </w:r>
       <w:r>
-        <w:t xml:space="preserve">an intervention that switches a coordinated multi-token package—typically article plus noun-initial sound class—together (for example</w:t>
+        <w:t xml:space="preserve">an</w:t>
+      </w:r>
+      <w:r>
+        <w:t xml:space="preserve"> </w:t>
+      </w:r>
+      <w:r>
+        <w:t xml:space="preserve">intervention that switches a coordinated multi-token package—typically</w:t>
+      </w:r>
+      <w:r>
+        <w:t xml:space="preserve"> </w:t>
+      </w:r>
+      <w:r>
+        <w:t xml:space="preserve">article plus noun-initial sound class—together (for example</w:t>
       </w:r>
       <w:r>
         <w:t xml:space="preserve"> </w:t>
@@ -1282,7 +1468,41 @@
         <w:t xml:space="preserve">an aviator</w:t>
       </w:r>
       <w:r>
-        <w:t xml:space="preserve">). In this report we use “compiled trajectory,” “response class,” and “chunk” as near-synonyms for that package structure.</w:t>
+        <w:t xml:space="preserve">). In this report we use “compiled trajectory,”</w:t>
+      </w:r>
+      <w:r>
+        <w:t xml:space="preserve"> </w:t>
+      </w:r>
+      <w:r>
+        <w:t xml:space="preserve">“response class,” “chunk,” and “package” as near-synonyms for that</w:t>
+      </w:r>
+      <w:r>
+        <w:t xml:space="preserve"> </w:t>
+      </w:r>
+      <w:r>
+        <w:t xml:space="preserve">structure. A</w:t>
+      </w:r>
+      <w:r>
+        <w:t xml:space="preserve"> </w:t>
+      </w:r>
+      <w:r>
+        <w:rPr>
+          <w:b/>
+          <w:bCs/>
+        </w:rPr>
+        <w:t xml:space="preserve">packager</w:t>
+      </w:r>
+      <w:r>
+        <w:t xml:space="preserve"> </w:t>
+      </w:r>
+      <w:r>
+        <w:t xml:space="preserve">mechanism is one that implements such fused</w:t>
+      </w:r>
+      <w:r>
+        <w:t xml:space="preserve"> </w:t>
+      </w:r>
+      <w:r>
+        <w:t xml:space="preserve">packages rather than separately editable preparation and content.</w:t>
       </w:r>
     </w:p>
     <w:p>
@@ -1297,13 +1517,253 @@
           <w:b/>
           <w:bCs/>
         </w:rPr>
-        <w:t xml:space="preserve">Gain-of-function (amplify):</w:t>
-      </w:r>
-      <w:r>
-        <w:t xml:space="preserve"> </w:t>
-      </w:r>
-      <w:r>
-        <w:t xml:space="preserve">raising a feature’s activation above its natural value on a prompt, used to test sufficiency.</w:t>
+        <w:t xml:space="preserve">Latent Planning causal graph</w:t>
+      </w:r>
+      <w:r>
+        <w:rPr>
+          <w:b/>
+          <w:bCs/>
+        </w:rPr>
+        <w:t xml:space="preserve"> </w:t>
+      </w:r>
+      <m:oMath>
+        <m:r>
+          <m:t>A</m:t>
+        </m:r>
+        <m:r>
+          <m:rPr>
+            <m:sty m:val="p"/>
+          </m:rPr>
+          <m:t>→</m:t>
+        </m:r>
+        <m:r>
+          <m:t>C</m:t>
+        </m:r>
+        <m:r>
+          <m:rPr>
+            <m:sty m:val="p"/>
+          </m:rPr>
+          <m:t>→</m:t>
+        </m:r>
+        <m:r>
+          <m:t>B</m:t>
+        </m:r>
+      </m:oMath>
+      <w:r>
+        <w:rPr>
+          <w:b/>
+          <w:bCs/>
+        </w:rPr>
+        <w:t xml:space="preserve">:</w:t>
+      </w:r>
+      <w:r>
+        <w:t xml:space="preserve"> </w:t>
+      </w:r>
+      <w:r>
+        <w:t xml:space="preserve">for a</w:t>
+      </w:r>
+      <w:r>
+        <w:t xml:space="preserve"> </w:t>
+      </w:r>
+      <w:r>
+        <w:t xml:space="preserve">token sequence</w:t>
+      </w:r>
+      <w:r>
+        <w:t xml:space="preserve"> </w:t>
+      </w:r>
+      <m:oMath>
+        <m:r>
+          <m:t>a</m:t>
+        </m:r>
+      </m:oMath>
+      <w:r>
+        <w:t xml:space="preserve"> </w:t>
+      </w:r>
+      <w:r>
+        <w:t xml:space="preserve">(prompt-final context),</w:t>
+      </w:r>
+      <w:r>
+        <w:t xml:space="preserve"> </w:t>
+      </w:r>
+      <m:oMath>
+        <m:r>
+          <m:t>b</m:t>
+        </m:r>
+      </m:oMath>
+      <w:r>
+        <w:t xml:space="preserve"> </w:t>
+      </w:r>
+      <w:r>
+        <w:t xml:space="preserve">(article),</w:t>
+      </w:r>
+      <w:r>
+        <w:t xml:space="preserve"> </w:t>
+      </w:r>
+      <m:oMath>
+        <m:r>
+          <m:t>c</m:t>
+        </m:r>
+      </m:oMath>
+      <w:r>
+        <w:t xml:space="preserve"> </w:t>
+      </w:r>
+      <w:r>
+        <w:t xml:space="preserve">(noun), the modular planning claim is that concept</w:t>
+      </w:r>
+      <w:r>
+        <w:t xml:space="preserve"> </w:t>
+      </w:r>
+      <m:oMath>
+        <m:r>
+          <m:t>A</m:t>
+        </m:r>
+      </m:oMath>
+      <w:r>
+        <w:t xml:space="preserve"> </w:t>
+      </w:r>
+      <w:r>
+        <w:t xml:space="preserve">causes future</w:t>
+      </w:r>
+      <w:r>
+        <w:t xml:space="preserve"> </w:t>
+      </w:r>
+      <w:r>
+        <w:t xml:space="preserve">content concept</w:t>
+      </w:r>
+      <w:r>
+        <w:t xml:space="preserve"> </w:t>
+      </w:r>
+      <m:oMath>
+        <m:r>
+          <m:t>C</m:t>
+        </m:r>
+      </m:oMath>
+      <w:r>
+        <w:t xml:space="preserve"> </w:t>
+      </w:r>
+      <w:r>
+        <w:t xml:space="preserve">(</w:t>
+      </w:r>
+      <w:r>
+        <w:rPr>
+          <w:b/>
+          <w:bCs/>
+        </w:rPr>
+        <w:t xml:space="preserve">forward planning</w:t>
+      </w:r>
+      <w:r>
+        <w:t xml:space="preserve">), and</w:t>
+      </w:r>
+      <w:r>
+        <w:t xml:space="preserve"> </w:t>
+      </w:r>
+      <m:oMath>
+        <m:r>
+          <m:t>C</m:t>
+        </m:r>
+      </m:oMath>
+      <w:r>
+        <w:t xml:space="preserve"> </w:t>
+      </w:r>
+      <w:r>
+        <w:t xml:space="preserve">causes</w:t>
+      </w:r>
+      <w:r>
+        <w:t xml:space="preserve"> </w:t>
+      </w:r>
+      <w:r>
+        <w:t xml:space="preserve">preparatory concept</w:t>
+      </w:r>
+      <w:r>
+        <w:t xml:space="preserve"> </w:t>
+      </w:r>
+      <m:oMath>
+        <m:r>
+          <m:t>B</m:t>
+        </m:r>
+      </m:oMath>
+      <w:r>
+        <w:t xml:space="preserve"> </w:t>
+      </w:r>
+      <w:r>
+        <w:t xml:space="preserve">(</w:t>
+      </w:r>
+      <w:r>
+        <w:rPr>
+          <w:b/>
+          <w:bCs/>
+        </w:rPr>
+        <w:t xml:space="preserve">backward planning</w:t>
+      </w:r>
+      <w:r>
+        <w:t xml:space="preserve"> </w:t>
+      </w:r>
+      <w:r>
+        <w:t xml:space="preserve">/ licensing). Token</w:t>
+      </w:r>
+      <w:r>
+        <w:t xml:space="preserve"> </w:t>
+      </w:r>
+      <w:r>
+        <w:t xml:space="preserve">order is</w:t>
+      </w:r>
+      <w:r>
+        <w:t xml:space="preserve"> </w:t>
+      </w:r>
+      <m:oMath>
+        <m:r>
+          <m:t>a</m:t>
+        </m:r>
+        <m:r>
+          <m:rPr>
+            <m:sty m:val="p"/>
+          </m:rPr>
+          <m:t>,</m:t>
+        </m:r>
+        <m:r>
+          <m:t>b</m:t>
+        </m:r>
+        <m:r>
+          <m:rPr>
+            <m:sty m:val="p"/>
+          </m:rPr>
+          <m:t>,</m:t>
+        </m:r>
+        <m:r>
+          <m:t>c</m:t>
+        </m:r>
+      </m:oMath>
+      <w:r>
+        <w:t xml:space="preserve">; causal order for planning is</w:t>
+      </w:r>
+      <w:r>
+        <w:t xml:space="preserve"> </w:t>
+      </w:r>
+      <m:oMath>
+        <m:r>
+          <m:t>A</m:t>
+        </m:r>
+        <m:r>
+          <m:rPr>
+            <m:sty m:val="p"/>
+          </m:rPr>
+          <m:t>→</m:t>
+        </m:r>
+        <m:r>
+          <m:t>C</m:t>
+        </m:r>
+        <m:r>
+          <m:rPr>
+            <m:sty m:val="p"/>
+          </m:rPr>
+          <m:t>→</m:t>
+        </m:r>
+        <m:r>
+          <m:t>B</m:t>
+        </m:r>
+      </m:oMath>
+      <w:r>
+        <w:t xml:space="preserve">.</w:t>
       </w:r>
     </w:p>
     <w:p>
@@ -1318,13 +1778,314 @@
           <w:b/>
           <w:bCs/>
         </w:rPr>
+        <w:t xml:space="preserve">Selective</w:t>
+      </w:r>
+      <w:r>
+        <w:rPr>
+          <w:b/>
+          <w:bCs/>
+        </w:rPr>
+        <w:t xml:space="preserve"> </w:t>
+      </w:r>
+      <m:oMath>
+        <m:r>
+          <m:t>b</m:t>
+        </m:r>
+      </m:oMath>
+      <w:r>
+        <w:rPr>
+          <w:b/>
+          <w:bCs/>
+        </w:rPr>
+        <w:t xml:space="preserve">-step intervention:</w:t>
+      </w:r>
+      <w:r>
+        <w:t xml:space="preserve"> </w:t>
+      </w:r>
+      <w:r>
+        <w:t xml:space="preserve">clamp selected features only on</w:t>
+      </w:r>
+      <w:r>
+        <w:t xml:space="preserve"> </w:t>
+      </w:r>
+      <w:r>
+        <w:t xml:space="preserve">the forward pass that predicts the article</w:t>
+      </w:r>
+      <w:r>
+        <w:t xml:space="preserve"> </w:t>
+      </w:r>
+      <m:oMath>
+        <m:r>
+          <m:t>b</m:t>
+        </m:r>
+      </m:oMath>
+      <w:r>
+        <w:t xml:space="preserve">, then turn the clamp</w:t>
+      </w:r>
+      <w:r>
+        <w:t xml:space="preserve"> </w:t>
+      </w:r>
+      <w:r>
+        <w:rPr>
+          <w:b/>
+          <w:bCs/>
+        </w:rPr>
+        <w:t xml:space="preserve">off</w:t>
+      </w:r>
+      <w:r>
+        <w:t xml:space="preserve"> </w:t>
+      </w:r>
+      <w:r>
+        <w:t xml:space="preserve">before predicting the noun</w:t>
+      </w:r>
+      <w:r>
+        <w:t xml:space="preserve"> </w:t>
+      </w:r>
+      <m:oMath>
+        <m:r>
+          <m:t>c</m:t>
+        </m:r>
+      </m:oMath>
+      <w:r>
+        <w:t xml:space="preserve">.</w:t>
+      </w:r>
+    </w:p>
+    <w:p>
+      <w:pPr>
+        <w:numPr>
+          <w:ilvl w:val="0"/>
+          <w:numId w:val="1001"/>
+        </w:numPr>
+      </w:pPr>
+      <w:r>
+        <w:rPr>
+          <w:b/>
+          <w:bCs/>
+        </w:rPr>
+        <w:t xml:space="preserve">Force-native article:</w:t>
+      </w:r>
+      <w:r>
+        <w:t xml:space="preserve"> </w:t>
+      </w:r>
+      <w:r>
+        <w:t xml:space="preserve">after the intervened</w:t>
+      </w:r>
+      <w:r>
+        <w:t xml:space="preserve"> </w:t>
+      </w:r>
+      <m:oMath>
+        <m:r>
+          <m:t>b</m:t>
+        </m:r>
+      </m:oMath>
+      <w:r>
+        <w:t xml:space="preserve">-step, insert the</w:t>
+      </w:r>
+      <w:r>
+        <w:t xml:space="preserve"> </w:t>
+      </w:r>
+      <w:r>
+        <w:t xml:space="preserve">article token the</w:t>
+      </w:r>
+      <w:r>
+        <w:t xml:space="preserve"> </w:t>
+      </w:r>
+      <w:r>
+        <w:rPr>
+          <w:i/>
+          <w:iCs/>
+        </w:rPr>
+        <w:t xml:space="preserve">unintervened</w:t>
+      </w:r>
+      <w:r>
+        <w:t xml:space="preserve"> </w:t>
+      </w:r>
+      <w:r>
+        <w:t xml:space="preserve">model would have produced, then</w:t>
+      </w:r>
+      <w:r>
+        <w:t xml:space="preserve"> </w:t>
+      </w:r>
+      <w:r>
+        <w:t xml:space="preserve">continue. This prevents a non-native article from rewriting</w:t>
+      </w:r>
+      <w:r>
+        <w:t xml:space="preserve"> </w:t>
+      </w:r>
+      <m:oMath>
+        <m:r>
+          <m:t>c</m:t>
+        </m:r>
+      </m:oMath>
+      <w:r>
+        <w:t xml:space="preserve"> </w:t>
+      </w:r>
+      <w:r>
+        <w:t xml:space="preserve">merely by sitting in the autoregressive context—so any change in</w:t>
+      </w:r>
+      <w:r>
+        <w:t xml:space="preserve"> </w:t>
+      </w:r>
+      <m:oMath>
+        <m:r>
+          <m:t>c</m:t>
+        </m:r>
+      </m:oMath>
+      <w:r>
+        <w:t xml:space="preserve"> </w:t>
+      </w:r>
+      <w:r>
+        <w:t xml:space="preserve">cannot be blamed on having emitted</w:t>
+      </w:r>
+      <w:r>
+        <w:t xml:space="preserve"> </w:t>
+      </w:r>
+      <w:r>
+        <w:rPr>
+          <w:rStyle w:val="VerbatimChar"/>
+        </w:rPr>
+        <w:t xml:space="preserve">an</w:t>
+      </w:r>
+      <w:r>
+        <w:t xml:space="preserve"> </w:t>
+      </w:r>
+      <w:r>
+        <w:t xml:space="preserve">instead of</w:t>
+      </w:r>
+      <w:r>
+        <w:t xml:space="preserve"> </w:t>
+      </w:r>
+      <w:r>
+        <w:rPr>
+          <w:rStyle w:val="VerbatimChar"/>
+        </w:rPr>
+        <w:t xml:space="preserve">a</w:t>
+      </w:r>
+      <w:r>
+        <w:t xml:space="preserve"> </w:t>
+      </w:r>
+      <w:r>
+        <w:t xml:space="preserve">(or vice</w:t>
+      </w:r>
+      <w:r>
+        <w:t xml:space="preserve"> </w:t>
+      </w:r>
+      <w:r>
+        <w:t xml:space="preserve">versa).</w:t>
+      </w:r>
+    </w:p>
+    <w:p>
+      <w:pPr>
+        <w:numPr>
+          <w:ilvl w:val="0"/>
+          <w:numId w:val="1001"/>
+        </w:numPr>
+      </w:pPr>
+      <w:r>
+        <w:rPr>
+          <w:b/>
+          <w:bCs/>
+        </w:rPr>
+        <w:t xml:space="preserve">Gain-of-function (amplify):</w:t>
+      </w:r>
+      <w:r>
+        <w:t xml:space="preserve"> </w:t>
+      </w:r>
+      <w:r>
+        <w:t xml:space="preserve">raising a feature’s activation above</w:t>
+      </w:r>
+      <w:r>
+        <w:t xml:space="preserve"> </w:t>
+      </w:r>
+      <w:r>
+        <w:t xml:space="preserve">its natural value on a prompt, used to test sufficiency.</w:t>
+      </w:r>
+    </w:p>
+    <w:p>
+      <w:pPr>
+        <w:numPr>
+          <w:ilvl w:val="0"/>
+          <w:numId w:val="1001"/>
+        </w:numPr>
+      </w:pPr>
+      <w:r>
+        <w:rPr>
+          <w:b/>
+          <w:bCs/>
+        </w:rPr>
         <w:t xml:space="preserve">Loss-of-function (zero / suppress):</w:t>
       </w:r>
       <w:r>
         <w:t xml:space="preserve"> </w:t>
       </w:r>
       <w:r>
-        <w:t xml:space="preserve">setting a feature’s activation to zero, used to test necessity.</w:t>
+        <w:t xml:space="preserve">setting a feature’s activation</w:t>
+      </w:r>
+      <w:r>
+        <w:t xml:space="preserve"> </w:t>
+      </w:r>
+      <w:r>
+        <w:t xml:space="preserve">to zero, used to test necessity.</w:t>
+      </w:r>
+    </w:p>
+    <w:p>
+      <w:pPr>
+        <w:numPr>
+          <w:ilvl w:val="0"/>
+          <w:numId w:val="1001"/>
+        </w:numPr>
+      </w:pPr>
+      <w:r>
+        <w:rPr>
+          <w:b/>
+          <w:bCs/>
+        </w:rPr>
+        <w:t xml:space="preserve">Illicit mismatch:</w:t>
+      </w:r>
+      <w:r>
+        <w:t xml:space="preserve"> </w:t>
+      </w:r>
+      <w:r>
+        <w:t xml:space="preserve">a generated article–noun pair that violates</w:t>
+      </w:r>
+      <w:r>
+        <w:t xml:space="preserve"> </w:t>
+      </w:r>
+      <w:r>
+        <w:t xml:space="preserve">English indefinite-article phonology (for example</w:t>
+      </w:r>
+      <w:r>
+        <w:t xml:space="preserve"> </w:t>
+      </w:r>
+      <w:r>
+        <w:rPr>
+          <w:rStyle w:val="VerbatimChar"/>
+        </w:rPr>
+        <w:t xml:space="preserve">an pilot</w:t>
+      </w:r>
+      <w:r>
+        <w:t xml:space="preserve"> </w:t>
+      </w:r>
+      <w:r>
+        <w:t xml:space="preserve">or</w:t>
+      </w:r>
+      <w:r>
+        <w:t xml:space="preserve"> </w:t>
+      </w:r>
+      <w:r>
+        <w:rPr>
+          <w:rStyle w:val="VerbatimChar"/>
+        </w:rPr>
+        <w:t xml:space="preserve">a aviator</w:t>
+      </w:r>
+      <w:r>
+        <w:t xml:space="preserve">). Near-zero illicit rates under strong article interventions</w:t>
+      </w:r>
+      <w:r>
+        <w:t xml:space="preserve"> </w:t>
+      </w:r>
+      <w:r>
+        <w:t xml:space="preserve">suggest the model prefers legal packages over grammar-only edits.</w:t>
       </w:r>
     </w:p>
     <w:p>
@@ -1380,7 +2141,7 @@
         <w:t xml:space="preserve"> </w:t>
       </w:r>
       <w:r>
-        <w:t xml:space="preserve">activations suppressed.</w:t>
+        <w:t xml:space="preserve">activations suppressed (or amplified).</w:t>
       </w:r>
     </w:p>
     <w:bookmarkEnd w:id="30"/>
@@ -5475,7 +6236,7 @@
     </w:p>
     <w:bookmarkEnd w:id="68"/>
     <w:bookmarkEnd w:id="69"/>
-    <w:bookmarkStart w:id="93" w:name="Xb22d1a1387c762e8d872cf2f151ca041df80e4c"/>
+    <w:bookmarkStart w:id="102" w:name="Xb22d1a1387c762e8d872cf2f151ca041df80e4c"/>
     <w:p>
       <w:pPr>
         <w:pStyle w:val="Heading1"/>
@@ -6083,7 +6844,80 @@
         <w:t xml:space="preserve"> </w:t>
       </w:r>
       <w:r>
-        <w:t xml:space="preserve">content on every trial.</w:t>
+        <w:t xml:space="preserve">content on every trial. Collaborator</w:t>
+      </w:r>
+      <w:r>
+        <w:t xml:space="preserve"> </w:t>
+      </w:r>
+      <w:r>
+        <w:t xml:space="preserve">discussion further required a</w:t>
+      </w:r>
+      <w:r>
+        <w:t xml:space="preserve"> </w:t>
+      </w:r>
+      <w:r>
+        <w:rPr>
+          <w:b/>
+          <w:bCs/>
+        </w:rPr>
+        <w:t xml:space="preserve">selective</w:t>
+      </w:r>
+      <w:r>
+        <w:t xml:space="preserve"> </w:t>
+      </w:r>
+      <w:r>
+        <w:t xml:space="preserve">modular test: intervene only</w:t>
+      </w:r>
+      <w:r>
+        <w:t xml:space="preserve"> </w:t>
+      </w:r>
+      <w:r>
+        <w:t xml:space="preserve">while predicting the article, force the native article back into the</w:t>
+      </w:r>
+      <w:r>
+        <w:t xml:space="preserve"> </w:t>
+      </w:r>
+      <w:r>
+        <w:t xml:space="preserve">string, then generate the noun with the clamp off—so a changed noun</w:t>
+      </w:r>
+      <w:r>
+        <w:t xml:space="preserve"> </w:t>
+      </w:r>
+      <w:r>
+        <w:t xml:space="preserve">cannot be blamed merely on autoregressive conditioning on</w:t>
+      </w:r>
+      <w:r>
+        <w:t xml:space="preserve"> </w:t>
+      </w:r>
+      <w:r>
+        <w:rPr>
+          <w:rStyle w:val="VerbatimChar"/>
+        </w:rPr>
+        <w:t xml:space="preserve">an</w:t>
+      </w:r>
+      <w:r>
+        <w:t xml:space="preserve"> </w:t>
+      </w:r>
+      <w:r>
+        <w:t xml:space="preserve">instead</w:t>
+      </w:r>
+      <w:r>
+        <w:t xml:space="preserve"> </w:t>
+      </w:r>
+      <w:r>
+        <w:t xml:space="preserve">of</w:t>
+      </w:r>
+      <w:r>
+        <w:t xml:space="preserve"> </w:t>
+      </w:r>
+      <w:r>
+        <w:rPr>
+          <w:rStyle w:val="VerbatimChar"/>
+        </w:rPr>
+        <w:t xml:space="preserve">a</w:t>
+      </w:r>
+      <w:r>
+        <w:t xml:space="preserve">. That protocol is Stage XV below.</w:t>
       </w:r>
     </w:p>
     <w:bookmarkEnd w:id="71"/>
@@ -9340,13 +10174,24 @@
       </w:r>
     </w:p>
     <w:bookmarkEnd w:id="91"/>
-    <w:bookmarkStart w:id="92" w:name="current-hypothesis-after-stages-viiixiv"/>
+    <w:bookmarkStart w:id="100" w:name="X43d3693a2bd50f1acb2a4ccafa60c2f25f630b7"/>
     <w:p>
       <w:pPr>
         <w:pStyle w:val="Heading2"/>
       </w:pPr>
       <w:r>
-        <w:t xml:space="preserve">10.11 Current hypothesis (after Stages VIII–XIV)</w:t>
+        <w:t xml:space="preserve">10.11 Stage XV: Selective</w:t>
+      </w:r>
+      <w:r>
+        <w:t xml:space="preserve"> </w:t>
+      </w:r>
+      <m:oMath>
+        <m:r>
+          <m:t>b</m:t>
+        </m:r>
+      </m:oMath>
+      <w:r>
+        <w:t xml:space="preserve">-step intervention with force-native article</w:t>
       </w:r>
     </w:p>
     <w:p>
@@ -9354,7 +10199,523 @@
         <w:pStyle w:val="FirstParagraph"/>
       </w:pPr>
       <w:r>
-        <w:t xml:space="preserve">Relating old and new terms:</w:t>
+        <w:t xml:space="preserve">E3 kept the feature clamp on for the whole continuation. That design can</w:t>
+      </w:r>
+      <w:r>
+        <w:t xml:space="preserve"> </w:t>
+      </w:r>
+      <w:r>
+        <w:t xml:space="preserve">show packaging, but it leaves open a modular objection: perhaps the noun</w:t>
+      </w:r>
+      <w:r>
+        <w:t xml:space="preserve"> </w:t>
+      </w:r>
+      <w:r>
+        <w:t xml:space="preserve">changed only because the intervened article remained in context. The</w:t>
+      </w:r>
+      <w:r>
+        <w:t xml:space="preserve"> </w:t>
+      </w:r>
+      <w:r>
+        <w:t xml:space="preserve">selective protocol answers that objection directly.</w:t>
+      </w:r>
+    </w:p>
+    <w:bookmarkStart w:id="92" w:name="why-this-test"/>
+    <w:p>
+      <w:pPr>
+        <w:pStyle w:val="Heading3"/>
+      </w:pPr>
+      <w:r>
+        <w:t xml:space="preserve">Why this test?</w:t>
+      </w:r>
+    </w:p>
+    <w:p>
+      <w:pPr>
+        <w:pStyle w:val="FirstParagraph"/>
+      </w:pPr>
+      <w:r>
+        <w:t xml:space="preserve">Under modular Latent Planning (</w:t>
+      </w:r>
+      <m:oMath>
+        <m:r>
+          <m:t>A</m:t>
+        </m:r>
+        <m:r>
+          <m:rPr>
+            <m:sty m:val="p"/>
+          </m:rPr>
+          <m:t>→</m:t>
+        </m:r>
+        <m:r>
+          <m:t>C</m:t>
+        </m:r>
+        <m:r>
+          <m:rPr>
+            <m:sty m:val="p"/>
+          </m:rPr>
+          <m:t>→</m:t>
+        </m:r>
+        <m:r>
+          <m:t>B</m:t>
+        </m:r>
+      </m:oMath>
+      <w:r>
+        <w:t xml:space="preserve">):</w:t>
+      </w:r>
+    </w:p>
+    <w:p>
+      <w:pPr>
+        <w:pStyle w:val="Compact"/>
+        <w:numPr>
+          <w:ilvl w:val="0"/>
+          <w:numId w:val="1011"/>
+        </w:numPr>
+      </w:pPr>
+      <w:r>
+        <w:t xml:space="preserve">Selectively turning</w:t>
+      </w:r>
+      <w:r>
+        <w:t xml:space="preserve"> </w:t>
+      </w:r>
+      <w:r>
+        <w:rPr>
+          <w:b/>
+          <w:bCs/>
+        </w:rPr>
+        <w:t xml:space="preserve">content</w:t>
+      </w:r>
+      <w:r>
+        <w:t xml:space="preserve"> </w:t>
+      </w:r>
+      <w:r>
+        <w:t xml:space="preserve">concept</w:t>
+      </w:r>
+      <w:r>
+        <w:t xml:space="preserve"> </w:t>
+      </w:r>
+      <m:oMath>
+        <m:r>
+          <m:t>C</m:t>
+        </m:r>
+      </m:oMath>
+      <w:r>
+        <w:t xml:space="preserve"> </w:t>
+      </w:r>
+      <w:r>
+        <w:t xml:space="preserve">up or down should move</w:t>
+      </w:r>
+      <w:r>
+        <w:t xml:space="preserve"> </w:t>
+      </w:r>
+      <w:r>
+        <w:t xml:space="preserve">licensing</w:t>
+      </w:r>
+      <w:r>
+        <w:t xml:space="preserve"> </w:t>
+      </w:r>
+      <m:oMath>
+        <m:r>
+          <m:t>B</m:t>
+        </m:r>
+      </m:oMath>
+      <w:r>
+        <w:t xml:space="preserve"> </w:t>
+      </w:r>
+      <w:r>
+        <w:t xml:space="preserve">(the article preference), while—after restoring the</w:t>
+      </w:r>
+      <w:r>
+        <w:t xml:space="preserve"> </w:t>
+      </w:r>
+      <w:r>
+        <w:t xml:space="preserve">native article—content token</w:t>
+      </w:r>
+      <w:r>
+        <w:t xml:space="preserve"> </w:t>
+      </w:r>
+      <m:oMath>
+        <m:r>
+          <m:t>c</m:t>
+        </m:r>
+      </m:oMath>
+      <w:r>
+        <w:t xml:space="preserve"> </w:t>
+      </w:r>
+      <w:r>
+        <w:t xml:space="preserve">should still follow from</w:t>
+      </w:r>
+      <w:r>
+        <w:t xml:space="preserve"> </w:t>
+      </w:r>
+      <m:oMath>
+        <m:r>
+          <m:t>A</m:t>
+        </m:r>
+      </m:oMath>
+      <w:r>
+        <w:t xml:space="preserve">.</w:t>
+      </w:r>
+    </w:p>
+    <w:p>
+      <w:pPr>
+        <w:pStyle w:val="Compact"/>
+        <w:numPr>
+          <w:ilvl w:val="0"/>
+          <w:numId w:val="1011"/>
+        </w:numPr>
+      </w:pPr>
+      <w:r>
+        <w:t xml:space="preserve">Selectively turning</w:t>
+      </w:r>
+      <w:r>
+        <w:t xml:space="preserve"> </w:t>
+      </w:r>
+      <w:r>
+        <w:rPr>
+          <w:b/>
+          <w:bCs/>
+        </w:rPr>
+        <w:t xml:space="preserve">article/licensing</w:t>
+      </w:r>
+      <w:r>
+        <w:t xml:space="preserve"> </w:t>
+      </w:r>
+      <w:r>
+        <w:t xml:space="preserve">concept</w:t>
+      </w:r>
+      <w:r>
+        <w:t xml:space="preserve"> </w:t>
+      </w:r>
+      <m:oMath>
+        <m:r>
+          <m:t>B</m:t>
+        </m:r>
+      </m:oMath>
+      <w:r>
+        <w:t xml:space="preserve"> </w:t>
+      </w:r>
+      <w:r>
+        <w:t xml:space="preserve">should move</w:t>
+      </w:r>
+      <w:r>
+        <w:t xml:space="preserve"> </w:t>
+      </w:r>
+      <w:r>
+        <w:t xml:space="preserve">article logits without rewriting</w:t>
+      </w:r>
+      <w:r>
+        <w:t xml:space="preserve"> </w:t>
+      </w:r>
+      <m:oMath>
+        <m:r>
+          <m:t>C</m:t>
+        </m:r>
+      </m:oMath>
+      <w:r>
+        <w:t xml:space="preserve">.</w:t>
+      </w:r>
+    </w:p>
+    <w:p>
+      <w:pPr>
+        <w:pStyle w:val="Compact"/>
+        <w:numPr>
+          <w:ilvl w:val="0"/>
+          <w:numId w:val="1011"/>
+        </w:numPr>
+      </w:pPr>
+      <w:r>
+        <w:t xml:space="preserve">A fused</w:t>
+      </w:r>
+      <w:r>
+        <w:t xml:space="preserve"> </w:t>
+      </w:r>
+      <w:r>
+        <w:rPr>
+          <w:b/>
+          <w:bCs/>
+        </w:rPr>
+        <w:t xml:space="preserve">packager</w:t>
+      </w:r>
+      <w:r>
+        <w:t xml:space="preserve"> </w:t>
+      </w:r>
+      <w:r>
+        <w:t xml:space="preserve">instead predicts: free generation under</w:t>
+      </w:r>
+      <w:r>
+        <w:t xml:space="preserve"> </w:t>
+      </w:r>
+      <w:r>
+        <w:t xml:space="preserve">“planning” features yields twin packages (</w:t>
+      </w:r>
+      <w:r>
+        <w:rPr>
+          <w:rStyle w:val="VerbatimChar"/>
+        </w:rPr>
+        <w:t xml:space="preserve">a pilot</w:t>
+      </w:r>
+      <w:r>
+        <w:t xml:space="preserve">→</w:t>
+      </w:r>
+      <w:r>
+        <w:rPr>
+          <w:rStyle w:val="VerbatimChar"/>
+        </w:rPr>
+        <w:t xml:space="preserve">an aviator</w:t>
+      </w:r>
+      <w:r>
+        <w:t xml:space="preserve">);</w:t>
+      </w:r>
+      <w:r>
+        <w:t xml:space="preserve"> </w:t>
+      </w:r>
+      <w:r>
+        <w:t xml:space="preserve">forcing the native article restores the baseline noun; there is no</w:t>
+      </w:r>
+      <w:r>
+        <w:t xml:space="preserve"> </w:t>
+      </w:r>
+      <w:r>
+        <w:t xml:space="preserve">selective</w:t>
+      </w:r>
+      <w:r>
+        <w:t xml:space="preserve"> </w:t>
+      </w:r>
+      <m:oMath>
+        <m:r>
+          <m:t>C</m:t>
+        </m:r>
+      </m:oMath>
+      <w:r>
+        <w:t xml:space="preserve">-only handle that edits only</w:t>
+      </w:r>
+      <w:r>
+        <w:t xml:space="preserve"> </w:t>
+      </w:r>
+      <m:oMath>
+        <m:r>
+          <m:t>B</m:t>
+        </m:r>
+      </m:oMath>
+      <w:r>
+        <w:t xml:space="preserve">.</w:t>
+      </w:r>
+    </w:p>
+    <w:bookmarkEnd w:id="92"/>
+    <w:bookmarkStart w:id="93" w:name="protocol-operational-definitions"/>
+    <w:p>
+      <w:pPr>
+        <w:pStyle w:val="Heading3"/>
+      </w:pPr>
+      <w:r>
+        <w:t xml:space="preserve">Protocol (operational definitions)</w:t>
+      </w:r>
+    </w:p>
+    <w:p>
+      <w:pPr>
+        <w:pStyle w:val="FirstParagraph"/>
+      </w:pPr>
+      <w:r>
+        <w:t xml:space="preserve">For each held-out prompt and each frozen feature set from E1:</w:t>
+      </w:r>
+    </w:p>
+    <w:p>
+      <w:pPr>
+        <w:pStyle w:val="Compact"/>
+        <w:numPr>
+          <w:ilvl w:val="0"/>
+          <w:numId w:val="1012"/>
+        </w:numPr>
+      </w:pPr>
+      <m:oMath>
+        <m:r>
+          <m:t>b</m:t>
+        </m:r>
+      </m:oMath>
+      <w:r>
+        <w:rPr>
+          <w:b/>
+          <w:bCs/>
+        </w:rPr>
+        <w:t xml:space="preserve">-step ON:</w:t>
+      </w:r>
+      <w:r>
+        <w:t xml:space="preserve"> </w:t>
+      </w:r>
+      <w:r>
+        <w:t xml:space="preserve">apply amplify (</w:t>
+      </w:r>
+      <m:oMath>
+        <m:r>
+          <m:t>5</m:t>
+        </m:r>
+        <m:r>
+          <m:rPr>
+            <m:sty m:val="p"/>
+          </m:rPr>
+          <m:t>×</m:t>
+        </m:r>
+      </m:oMath>
+      <w:r>
+        <w:t xml:space="preserve">) or zero only on the</w:t>
+      </w:r>
+      <w:r>
+        <w:t xml:space="preserve"> </w:t>
+      </w:r>
+      <w:r>
+        <w:t xml:space="preserve">forward pass that scores</w:t>
+      </w:r>
+      <w:r>
+        <w:t xml:space="preserve"> </w:t>
+      </w:r>
+      <w:r>
+        <w:rPr>
+          <w:rStyle w:val="VerbatimChar"/>
+        </w:rPr>
+        <w:t xml:space="preserve">a</w:t>
+      </w:r>
+      <w:r>
+        <w:t xml:space="preserve"> </w:t>
+      </w:r>
+      <w:r>
+        <w:t xml:space="preserve">versus</w:t>
+      </w:r>
+      <w:r>
+        <w:t xml:space="preserve"> </w:t>
+      </w:r>
+      <w:r>
+        <w:rPr>
+          <w:rStyle w:val="VerbatimChar"/>
+        </w:rPr>
+        <w:t xml:space="preserve">an</w:t>
+      </w:r>
+      <w:r>
+        <w:t xml:space="preserve">.</w:t>
+      </w:r>
+    </w:p>
+    <w:p>
+      <w:pPr>
+        <w:pStyle w:val="Compact"/>
+        <w:numPr>
+          <w:ilvl w:val="0"/>
+          <w:numId w:val="1012"/>
+        </w:numPr>
+      </w:pPr>
+      <w:r>
+        <w:rPr>
+          <w:b/>
+          <w:bCs/>
+        </w:rPr>
+        <w:t xml:space="preserve">Force-native</w:t>
+      </w:r>
+      <w:r>
+        <w:rPr>
+          <w:b/>
+          <w:bCs/>
+        </w:rPr>
+        <w:t xml:space="preserve"> </w:t>
+      </w:r>
+      <m:oMath>
+        <m:r>
+          <m:t>b</m:t>
+        </m:r>
+      </m:oMath>
+      <w:r>
+        <w:rPr>
+          <w:b/>
+          <w:bCs/>
+        </w:rPr>
+        <w:t xml:space="preserve">:</w:t>
+      </w:r>
+      <w:r>
+        <w:t xml:space="preserve"> </w:t>
+      </w:r>
+      <w:r>
+        <w:t xml:space="preserve">append the baseline article token (almost</w:t>
+      </w:r>
+      <w:r>
+        <w:t xml:space="preserve"> </w:t>
+      </w:r>
+      <w:r>
+        <w:t xml:space="preserve">always</w:t>
+      </w:r>
+      <w:r>
+        <w:t xml:space="preserve"> </w:t>
+      </w:r>
+      <w:r>
+        <w:rPr>
+          <w:rStyle w:val="VerbatimChar"/>
+        </w:rPr>
+        <w:t xml:space="preserve">a</w:t>
+      </w:r>
+      <w:r>
+        <w:t xml:space="preserve"> </w:t>
+      </w:r>
+      <w:r>
+        <w:t xml:space="preserve">on these stems).</w:t>
+      </w:r>
+    </w:p>
+    <w:p>
+      <w:pPr>
+        <w:pStyle w:val="Compact"/>
+        <w:numPr>
+          <w:ilvl w:val="0"/>
+          <w:numId w:val="1012"/>
+        </w:numPr>
+      </w:pPr>
+      <m:oMath>
+        <m:r>
+          <m:t>c</m:t>
+        </m:r>
+      </m:oMath>
+      <w:r>
+        <w:rPr>
+          <w:b/>
+          <w:bCs/>
+        </w:rPr>
+        <w:t xml:space="preserve">-step OFF:</w:t>
+      </w:r>
+      <w:r>
+        <w:t xml:space="preserve"> </w:t>
+      </w:r>
+      <w:r>
+        <w:t xml:space="preserve">generate the noun with interventions disabled.</w:t>
+      </w:r>
+    </w:p>
+    <w:p>
+      <w:pPr>
+        <w:pStyle w:val="Compact"/>
+        <w:numPr>
+          <w:ilvl w:val="0"/>
+          <w:numId w:val="1012"/>
+        </w:numPr>
+      </w:pPr>
+      <w:r>
+        <w:rPr>
+          <w:b/>
+          <w:bCs/>
+        </w:rPr>
+        <w:t xml:space="preserve">Free companion:</w:t>
+      </w:r>
+      <w:r>
+        <w:t xml:space="preserve"> </w:t>
+      </w:r>
+      <w:r>
+        <w:t xml:space="preserve">generate the full continuation with the same</w:t>
+      </w:r>
+      <w:r>
+        <w:t xml:space="preserve"> </w:t>
+      </w:r>
+      <w:r>
+        <w:t xml:space="preserve">intervention left on (packager check).</w:t>
+      </w:r>
+    </w:p>
+    <w:p>
+      <w:pPr>
+        <w:pStyle w:val="FirstParagraph"/>
+      </w:pPr>
+      <w:r>
+        <w:t xml:space="preserve">Feature mapping used here:</w:t>
       </w:r>
     </w:p>
     <w:tbl>
@@ -9379,18 +10740,18 @@
               <w:pStyle w:val="Compact"/>
             </w:pPr>
             <w:r>
-              <w:t xml:space="preserve">Earlier Stage VII language</w:t>
-            </w:r>
-          </w:p>
-        </w:tc>
-        <w:tc>
-          <w:tcPr/>
-          <w:p>
-            <w:pPr>
-              <w:pStyle w:val="Compact"/>
-            </w:pPr>
-            <w:r>
-              <w:t xml:space="preserve">Current causal language</w:t>
+              <w:t xml:space="preserve">Set</w:t>
+            </w:r>
+          </w:p>
+        </w:tc>
+        <w:tc>
+          <w:tcPr/>
+          <w:p>
+            <w:pPr>
+              <w:pStyle w:val="Compact"/>
+            </w:pPr>
+            <w:r>
+              <w:t xml:space="preserve">Intended role</w:t>
             </w:r>
           </w:p>
         </w:tc>
@@ -9403,19 +10764,27 @@
               <w:pStyle w:val="Compact"/>
             </w:pPr>
             <w:r>
-              <w:t xml:space="preserve">Coordinated preparation–content classes</w:t>
-            </w:r>
-          </w:p>
-        </w:tc>
-        <w:tc>
-          <w:tcPr/>
-          <w:p>
-            <w:pPr>
-              <w:pStyle w:val="Compact"/>
-            </w:pPr>
-            <w:r>
-              <w:t xml:space="preserve">Compiled trajectories (chunks)</w:t>
-            </w:r>
+              <w:t xml:space="preserve">S3 content-only</w:t>
+            </w:r>
+          </w:p>
+        </w:tc>
+        <w:tc>
+          <w:tcPr/>
+          <w:p>
+            <w:pPr>
+              <w:pStyle w:val="Compact"/>
+            </w:pPr>
+            <w:r>
+              <w:t xml:space="preserve">Approximate content concept</w:t>
+            </w:r>
+            <w:r>
+              <w:t xml:space="preserve"> </w:t>
+            </w:r>
+            <m:oMath>
+              <m:r>
+                <m:t>C</m:t>
+              </m:r>
+            </m:oMath>
           </w:p>
         </w:tc>
       </w:tr>
@@ -9427,19 +10796,27 @@
               <w:pStyle w:val="Compact"/>
             </w:pPr>
             <w:r>
-              <w:t xml:space="preserve">Content-preserving grammar repair</w:t>
-            </w:r>
-          </w:p>
-        </w:tc>
-        <w:tc>
-          <w:tcPr/>
-          <w:p>
-            <w:pPr>
-              <w:pStyle w:val="Compact"/>
-            </w:pPr>
-            <w:r>
-              <w:t xml:space="preserve">Wrapper-like / modular planning success</w:t>
-            </w:r>
+              <w:t xml:space="preserve">S2 article-only</w:t>
+            </w:r>
+          </w:p>
+        </w:tc>
+        <w:tc>
+          <w:tcPr/>
+          <w:p>
+            <w:pPr>
+              <w:pStyle w:val="Compact"/>
+            </w:pPr>
+            <w:r>
+              <w:t xml:space="preserve">Approximate licensing concept</w:t>
+            </w:r>
+            <w:r>
+              <w:t xml:space="preserve"> </w:t>
+            </w:r>
+            <m:oMath>
+              <m:r>
+                <m:t>B</m:t>
+              </m:r>
+            </m:oMath>
           </w:p>
         </w:tc>
       </w:tr>
@@ -9451,36 +10828,179 @@
               <w:pStyle w:val="Compact"/>
             </w:pPr>
             <w:r>
-              <w:t xml:space="preserve">Fixed-pair suppression switches</w:t>
+              <w:t xml:space="preserve">S1 dual-effect</w:t>
+            </w:r>
+          </w:p>
+        </w:tc>
+        <w:tc>
+          <w:tcPr/>
+          <w:p>
+            <w:pPr>
+              <w:pStyle w:val="Compact"/>
+            </w:pPr>
+            <w:r>
+              <w:t xml:space="preserve">Joint Latent-Planning-style set (not a pure context</w:t>
             </w:r>
             <w:r>
               <w:t xml:space="preserve"> </w:t>
             </w:r>
-            <w:r>
-              <w:rPr>
-                <w:rStyle w:val="VerbatimChar"/>
-              </w:rPr>
-              <w:t xml:space="preserve">a pilot</w:t>
-            </w:r>
-            <w:r>
-              <w:t xml:space="preserve">→</w:t>
-            </w:r>
-            <w:r>
-              <w:rPr>
-                <w:rStyle w:val="VerbatimChar"/>
-              </w:rPr>
-              <w:t xml:space="preserve">an aviator</w:t>
-            </w:r>
-          </w:p>
-        </w:tc>
-        <w:tc>
-          <w:tcPr/>
-          <w:p>
-            <w:pPr>
-              <w:pStyle w:val="Compact"/>
-            </w:pPr>
-            <w:r>
-              <w:t xml:space="preserve">Loss- or gain-of-function selects packages</w:t>
+            <m:oMath>
+              <m:r>
+                <m:t>A</m:t>
+              </m:r>
+            </m:oMath>
+            <w:r>
+              <w:t xml:space="preserve"> </w:t>
+            </w:r>
+            <w:r>
+              <w:t xml:space="preserve">set)</w:t>
+            </w:r>
+          </w:p>
+        </w:tc>
+      </w:tr>
+    </w:tbl>
+    <w:bookmarkEnd w:id="93"/>
+    <w:bookmarkStart w:id="97" w:name="results"/>
+    <w:p>
+      <w:pPr>
+        <w:pStyle w:val="Heading3"/>
+      </w:pPr>
+      <w:r>
+        <w:t xml:space="preserve">Results</w:t>
+      </w:r>
+    </w:p>
+    <w:tbl>
+      <w:tblPr>
+        <w:tblStyle w:val="Table"/>
+        <w:tblW w:type="pct" w:w="5000"/>
+        <w:tblLayout w:type="fixed"/>
+        <w:tblLook w:firstRow="1" w:lastRow="0" w:firstColumn="0" w:lastColumn="0" w:noHBand="0" w:noVBand="0" w:val="0020"/>
+      </w:tblPr>
+      <w:tblGrid>
+        <w:gridCol w:w="1033"/>
+        <w:gridCol w:w="1377"/>
+        <w:gridCol w:w="1377"/>
+        <w:gridCol w:w="1377"/>
+        <w:gridCol w:w="1377"/>
+        <w:gridCol w:w="1377"/>
+      </w:tblGrid>
+      <w:tr>
+        <w:trPr>
+          <w:tblHeader w:val="on"/>
+        </w:trPr>
+        <w:tc>
+          <w:tcPr/>
+          <w:p>
+            <w:pPr>
+              <w:pStyle w:val="Compact"/>
+            </w:pPr>
+            <w:r>
+              <w:t xml:space="preserve">Condition</w:t>
+            </w:r>
+          </w:p>
+        </w:tc>
+        <w:tc>
+          <w:tcPr/>
+          <w:p>
+            <w:pPr>
+              <w:pStyle w:val="Compact"/>
+              <w:jc w:val="right"/>
+            </w:pPr>
+            <w:r>
+              <w:t xml:space="preserve">Mean</w:t>
+            </w:r>
+            <w:r>
+              <w:t xml:space="preserve"> </w:t>
+            </w:r>
+            <m:oMath>
+              <m:r>
+                <m:rPr>
+                  <m:sty m:val="p"/>
+                </m:rPr>
+                <m:t>Δ</m:t>
+              </m:r>
+              <m:r>
+                <m:rPr>
+                  <m:sty m:val="p"/>
+                </m:rPr>
+                <m:t>(</m:t>
+              </m:r>
+              <m:r>
+                <m:rPr>
+                  <m:nor/>
+                  <m:scr m:val="monospace"/>
+                  <m:sty m:val="p"/>
+                </m:rPr>
+                <m:t>an</m:t>
+              </m:r>
+              <m:r>
+                <m:rPr>
+                  <m:sty m:val="p"/>
+                </m:rPr>
+                <m:t>−</m:t>
+              </m:r>
+              <m:r>
+                <m:rPr>
+                  <m:nor/>
+                  <m:scr m:val="monospace"/>
+                  <m:sty m:val="p"/>
+                </m:rPr>
+                <m:t>a</m:t>
+              </m:r>
+              <m:r>
+                <m:rPr>
+                  <m:sty m:val="p"/>
+                </m:rPr>
+                <m:t>)</m:t>
+              </m:r>
+            </m:oMath>
+          </w:p>
+        </w:tc>
+        <w:tc>
+          <w:tcPr/>
+          <w:p>
+            <w:pPr>
+              <w:pStyle w:val="Compact"/>
+              <w:jc w:val="right"/>
+            </w:pPr>
+            <w:r>
+              <w:t xml:space="preserve">Content preserved (force-native)</w:t>
+            </w:r>
+          </w:p>
+        </w:tc>
+        <w:tc>
+          <w:tcPr/>
+          <w:p>
+            <w:pPr>
+              <w:pStyle w:val="Compact"/>
+              <w:jc w:val="right"/>
+            </w:pPr>
+            <w:r>
+              <w:t xml:space="preserve">Content preserved (free)</w:t>
+            </w:r>
+          </w:p>
+        </w:tc>
+        <w:tc>
+          <w:tcPr/>
+          <w:p>
+            <w:pPr>
+              <w:pStyle w:val="Compact"/>
+              <w:jc w:val="right"/>
+            </w:pPr>
+            <w:r>
+              <w:t xml:space="preserve">Trajectory-like (free)</w:t>
+            </w:r>
+          </w:p>
+        </w:tc>
+        <w:tc>
+          <w:tcPr/>
+          <w:p>
+            <w:pPr>
+              <w:pStyle w:val="Compact"/>
+              <w:jc w:val="right"/>
+            </w:pPr>
+            <w:r>
+              <w:t xml:space="preserve">Illicit (free)</w:t>
             </w:r>
           </w:p>
         </w:tc>
@@ -9493,18 +11013,525 @@
               <w:pStyle w:val="Compact"/>
             </w:pPr>
             <w:r>
-              <w:t xml:space="preserve">“Not yet publishable; need twin study”</w:t>
-            </w:r>
-          </w:p>
-        </w:tc>
-        <w:tc>
-          <w:tcPr/>
-          <w:p>
-            <w:pPr>
-              <w:pStyle w:val="Compact"/>
-            </w:pPr>
-            <w:r>
-              <w:t xml:space="preserve">Twin + dual-lock + dose suite now completed</w:t>
+              <w:t xml:space="preserve">Baseline</w:t>
+            </w:r>
+          </w:p>
+        </w:tc>
+        <w:tc>
+          <w:tcPr/>
+          <w:p>
+            <w:pPr>
+              <w:pStyle w:val="Compact"/>
+              <w:jc w:val="right"/>
+            </w:pPr>
+            <w:r>
+              <w:t xml:space="preserve">0.00</w:t>
+            </w:r>
+          </w:p>
+        </w:tc>
+        <w:tc>
+          <w:tcPr/>
+          <w:p>
+            <w:pPr>
+              <w:pStyle w:val="Compact"/>
+              <w:jc w:val="right"/>
+            </w:pPr>
+            <w:r>
+              <w:t xml:space="preserve">1.00</w:t>
+            </w:r>
+          </w:p>
+        </w:tc>
+        <w:tc>
+          <w:tcPr/>
+          <w:p>
+            <w:pPr>
+              <w:pStyle w:val="Compact"/>
+              <w:jc w:val="right"/>
+            </w:pPr>
+            <w:r>
+              <w:t xml:space="preserve">1.00</w:t>
+            </w:r>
+          </w:p>
+        </w:tc>
+        <w:tc>
+          <w:tcPr/>
+          <w:p>
+            <w:pPr>
+              <w:pStyle w:val="Compact"/>
+              <w:jc w:val="right"/>
+            </w:pPr>
+            <w:r>
+              <w:t xml:space="preserve">0.00</w:t>
+            </w:r>
+          </w:p>
+        </w:tc>
+        <w:tc>
+          <w:tcPr/>
+          <w:p>
+            <w:pPr>
+              <w:pStyle w:val="Compact"/>
+              <w:jc w:val="right"/>
+            </w:pPr>
+            <w:r>
+              <w:t xml:space="preserve">0.00</w:t>
+            </w:r>
+          </w:p>
+        </w:tc>
+      </w:tr>
+      <w:tr>
+        <w:tc>
+          <w:tcPr/>
+          <w:p>
+            <w:pPr>
+              <w:pStyle w:val="Compact"/>
+            </w:pPr>
+            <w:r>
+              <w:t xml:space="preserve">S1 amplify</w:t>
+            </w:r>
+          </w:p>
+        </w:tc>
+        <w:tc>
+          <w:tcPr/>
+          <w:p>
+            <w:pPr>
+              <w:pStyle w:val="Compact"/>
+              <w:jc w:val="right"/>
+            </w:pPr>
+            <w:r>
+              <w:rPr>
+                <w:b/>
+                <w:bCs/>
+              </w:rPr>
+              <w:t xml:space="preserve">+3.31</w:t>
+            </w:r>
+          </w:p>
+        </w:tc>
+        <w:tc>
+          <w:tcPr/>
+          <w:p>
+            <w:pPr>
+              <w:pStyle w:val="Compact"/>
+              <w:jc w:val="right"/>
+            </w:pPr>
+            <w:r>
+              <w:rPr>
+                <w:b/>
+                <w:bCs/>
+              </w:rPr>
+              <w:t xml:space="preserve">1.00</w:t>
+            </w:r>
+          </w:p>
+        </w:tc>
+        <w:tc>
+          <w:tcPr/>
+          <w:p>
+            <w:pPr>
+              <w:pStyle w:val="Compact"/>
+              <w:jc w:val="right"/>
+            </w:pPr>
+            <w:r>
+              <w:rPr>
+                <w:b/>
+                <w:bCs/>
+              </w:rPr>
+              <w:t xml:space="preserve">0.05</w:t>
+            </w:r>
+          </w:p>
+        </w:tc>
+        <w:tc>
+          <w:tcPr/>
+          <w:p>
+            <w:pPr>
+              <w:pStyle w:val="Compact"/>
+              <w:jc w:val="right"/>
+            </w:pPr>
+            <w:r>
+              <w:rPr>
+                <w:b/>
+                <w:bCs/>
+              </w:rPr>
+              <w:t xml:space="preserve">0.95</w:t>
+            </w:r>
+          </w:p>
+        </w:tc>
+        <w:tc>
+          <w:tcPr/>
+          <w:p>
+            <w:pPr>
+              <w:pStyle w:val="Compact"/>
+              <w:jc w:val="right"/>
+            </w:pPr>
+            <w:r>
+              <w:rPr>
+                <w:b/>
+                <w:bCs/>
+              </w:rPr>
+              <w:t xml:space="preserve">0.00</w:t>
+            </w:r>
+          </w:p>
+        </w:tc>
+      </w:tr>
+      <w:tr>
+        <w:tc>
+          <w:tcPr/>
+          <w:p>
+            <w:pPr>
+              <w:pStyle w:val="Compact"/>
+            </w:pPr>
+            <w:r>
+              <w:t xml:space="preserve">S1 zero</w:t>
+            </w:r>
+          </w:p>
+        </w:tc>
+        <w:tc>
+          <w:tcPr/>
+          <w:p>
+            <w:pPr>
+              <w:pStyle w:val="Compact"/>
+              <w:jc w:val="right"/>
+            </w:pPr>
+            <w:r>
+              <w:t xml:space="preserve">−1.03</w:t>
+            </w:r>
+          </w:p>
+        </w:tc>
+        <w:tc>
+          <w:tcPr/>
+          <w:p>
+            <w:pPr>
+              <w:pStyle w:val="Compact"/>
+              <w:jc w:val="right"/>
+            </w:pPr>
+            <w:r>
+              <w:t xml:space="preserve">1.00</w:t>
+            </w:r>
+          </w:p>
+        </w:tc>
+        <w:tc>
+          <w:tcPr/>
+          <w:p>
+            <w:pPr>
+              <w:pStyle w:val="Compact"/>
+              <w:jc w:val="right"/>
+            </w:pPr>
+            <w:r>
+              <w:t xml:space="preserve">0.95</w:t>
+            </w:r>
+          </w:p>
+        </w:tc>
+        <w:tc>
+          <w:tcPr/>
+          <w:p>
+            <w:pPr>
+              <w:pStyle w:val="Compact"/>
+              <w:jc w:val="right"/>
+            </w:pPr>
+            <w:r>
+              <w:t xml:space="preserve">0.00</w:t>
+            </w:r>
+          </w:p>
+        </w:tc>
+        <w:tc>
+          <w:tcPr/>
+          <w:p>
+            <w:pPr>
+              <w:pStyle w:val="Compact"/>
+              <w:jc w:val="right"/>
+            </w:pPr>
+            <w:r>
+              <w:t xml:space="preserve">0.00</w:t>
+            </w:r>
+          </w:p>
+        </w:tc>
+      </w:tr>
+      <w:tr>
+        <w:tc>
+          <w:tcPr/>
+          <w:p>
+            <w:pPr>
+              <w:pStyle w:val="Compact"/>
+            </w:pPr>
+            <w:r>
+              <w:t xml:space="preserve">S2 amplify</w:t>
+            </w:r>
+          </w:p>
+        </w:tc>
+        <w:tc>
+          <w:tcPr/>
+          <w:p>
+            <w:pPr>
+              <w:pStyle w:val="Compact"/>
+              <w:jc w:val="right"/>
+            </w:pPr>
+            <w:r>
+              <w:t xml:space="preserve">+1.03</w:t>
+            </w:r>
+          </w:p>
+        </w:tc>
+        <w:tc>
+          <w:tcPr/>
+          <w:p>
+            <w:pPr>
+              <w:pStyle w:val="Compact"/>
+              <w:jc w:val="right"/>
+            </w:pPr>
+            <w:r>
+              <w:t xml:space="preserve">1.00</w:t>
+            </w:r>
+          </w:p>
+        </w:tc>
+        <w:tc>
+          <w:tcPr/>
+          <w:p>
+            <w:pPr>
+              <w:pStyle w:val="Compact"/>
+              <w:jc w:val="right"/>
+            </w:pPr>
+            <w:r>
+              <w:t xml:space="preserve">0.35</w:t>
+            </w:r>
+          </w:p>
+        </w:tc>
+        <w:tc>
+          <w:tcPr/>
+          <w:p>
+            <w:pPr>
+              <w:pStyle w:val="Compact"/>
+              <w:jc w:val="right"/>
+            </w:pPr>
+            <w:r>
+              <w:t xml:space="preserve">0.05</w:t>
+            </w:r>
+          </w:p>
+        </w:tc>
+        <w:tc>
+          <w:tcPr/>
+          <w:p>
+            <w:pPr>
+              <w:pStyle w:val="Compact"/>
+              <w:jc w:val="right"/>
+            </w:pPr>
+            <w:r>
+              <w:t xml:space="preserve">0.00</w:t>
+            </w:r>
+          </w:p>
+        </w:tc>
+      </w:tr>
+      <w:tr>
+        <w:tc>
+          <w:tcPr/>
+          <w:p>
+            <w:pPr>
+              <w:pStyle w:val="Compact"/>
+            </w:pPr>
+            <w:r>
+              <w:t xml:space="preserve">S3 amplify</w:t>
+            </w:r>
+          </w:p>
+        </w:tc>
+        <w:tc>
+          <w:tcPr/>
+          <w:p>
+            <w:pPr>
+              <w:pStyle w:val="Compact"/>
+              <w:jc w:val="right"/>
+            </w:pPr>
+            <w:r>
+              <w:t xml:space="preserve">+0.11</w:t>
+            </w:r>
+          </w:p>
+        </w:tc>
+        <w:tc>
+          <w:tcPr/>
+          <w:p>
+            <w:pPr>
+              <w:pStyle w:val="Compact"/>
+              <w:jc w:val="right"/>
+            </w:pPr>
+            <w:r>
+              <w:t xml:space="preserve">1.00</w:t>
+            </w:r>
+          </w:p>
+        </w:tc>
+        <w:tc>
+          <w:tcPr/>
+          <w:p>
+            <w:pPr>
+              <w:pStyle w:val="Compact"/>
+              <w:jc w:val="right"/>
+            </w:pPr>
+            <w:r>
+              <w:t xml:space="preserve">0.95</w:t>
+            </w:r>
+          </w:p>
+        </w:tc>
+        <w:tc>
+          <w:tcPr/>
+          <w:p>
+            <w:pPr>
+              <w:pStyle w:val="Compact"/>
+              <w:jc w:val="right"/>
+            </w:pPr>
+            <w:r>
+              <w:t xml:space="preserve">0.05</w:t>
+            </w:r>
+          </w:p>
+        </w:tc>
+        <w:tc>
+          <w:tcPr/>
+          <w:p>
+            <w:pPr>
+              <w:pStyle w:val="Compact"/>
+              <w:jc w:val="right"/>
+            </w:pPr>
+            <w:r>
+              <w:t xml:space="preserve">0.00</w:t>
+            </w:r>
+          </w:p>
+        </w:tc>
+      </w:tr>
+      <w:tr>
+        <w:tc>
+          <w:tcPr/>
+          <w:p>
+            <w:pPr>
+              <w:pStyle w:val="Compact"/>
+            </w:pPr>
+            <w:r>
+              <w:t xml:space="preserve">S3 zero</w:t>
+            </w:r>
+          </w:p>
+        </w:tc>
+        <w:tc>
+          <w:tcPr/>
+          <w:p>
+            <w:pPr>
+              <w:pStyle w:val="Compact"/>
+              <w:jc w:val="right"/>
+            </w:pPr>
+            <w:r>
+              <w:t xml:space="preserve">−0.08</w:t>
+            </w:r>
+          </w:p>
+        </w:tc>
+        <w:tc>
+          <w:tcPr/>
+          <w:p>
+            <w:pPr>
+              <w:pStyle w:val="Compact"/>
+              <w:jc w:val="right"/>
+            </w:pPr>
+            <w:r>
+              <w:t xml:space="preserve">1.00</w:t>
+            </w:r>
+          </w:p>
+        </w:tc>
+        <w:tc>
+          <w:tcPr/>
+          <w:p>
+            <w:pPr>
+              <w:pStyle w:val="Compact"/>
+              <w:jc w:val="right"/>
+            </w:pPr>
+            <w:r>
+              <w:t xml:space="preserve">1.00</w:t>
+            </w:r>
+          </w:p>
+        </w:tc>
+        <w:tc>
+          <w:tcPr/>
+          <w:p>
+            <w:pPr>
+              <w:pStyle w:val="Compact"/>
+              <w:jc w:val="right"/>
+            </w:pPr>
+            <w:r>
+              <w:t xml:space="preserve">0.00</w:t>
+            </w:r>
+          </w:p>
+        </w:tc>
+        <w:tc>
+          <w:tcPr/>
+          <w:p>
+            <w:pPr>
+              <w:pStyle w:val="Compact"/>
+              <w:jc w:val="right"/>
+            </w:pPr>
+            <w:r>
+              <w:t xml:space="preserve">0.00</w:t>
+            </w:r>
+          </w:p>
+        </w:tc>
+      </w:tr>
+      <w:tr>
+        <w:tc>
+          <w:tcPr/>
+          <w:p>
+            <w:pPr>
+              <w:pStyle w:val="Compact"/>
+            </w:pPr>
+            <w:r>
+              <w:t xml:space="preserve">Control amplify</w:t>
+            </w:r>
+          </w:p>
+        </w:tc>
+        <w:tc>
+          <w:tcPr/>
+          <w:p>
+            <w:pPr>
+              <w:pStyle w:val="Compact"/>
+              <w:jc w:val="right"/>
+            </w:pPr>
+            <w:r>
+              <w:t xml:space="preserve">+0.14</w:t>
+            </w:r>
+          </w:p>
+        </w:tc>
+        <w:tc>
+          <w:tcPr/>
+          <w:p>
+            <w:pPr>
+              <w:pStyle w:val="Compact"/>
+              <w:jc w:val="right"/>
+            </w:pPr>
+            <w:r>
+              <w:t xml:space="preserve">1.00</w:t>
+            </w:r>
+          </w:p>
+        </w:tc>
+        <w:tc>
+          <w:tcPr/>
+          <w:p>
+            <w:pPr>
+              <w:pStyle w:val="Compact"/>
+              <w:jc w:val="right"/>
+            </w:pPr>
+            <w:r>
+              <w:t xml:space="preserve">1.00</w:t>
+            </w:r>
+          </w:p>
+        </w:tc>
+        <w:tc>
+          <w:tcPr/>
+          <w:p>
+            <w:pPr>
+              <w:pStyle w:val="Compact"/>
+              <w:jc w:val="right"/>
+            </w:pPr>
+            <w:r>
+              <w:t xml:space="preserve">0.00</w:t>
+            </w:r>
+          </w:p>
+        </w:tc>
+        <w:tc>
+          <w:tcPr/>
+          <w:p>
+            <w:pPr>
+              <w:pStyle w:val="Compact"/>
+              <w:jc w:val="right"/>
+            </w:pPr>
+            <w:r>
+              <w:t xml:space="preserve">0.00</w:t>
             </w:r>
           </w:p>
         </w:tc>
@@ -9512,72 +11539,384 @@
     </w:tbl>
     <w:p>
       <w:pPr>
+        <w:pStyle w:val="CaptionedFigure"/>
+      </w:pPr>
+      <w:r>
+        <w:drawing>
+          <wp:inline>
+            <wp:extent cx="5943600" cy="3263152"/>
+            <wp:effectExtent b="0" l="0" r="0" t="0"/>
+            <wp:docPr descr="Figure 8. Selective protocol: S1 amplify class-switches under free generation but restores baseline nouns when the native article is forced; S3 does not move article preference enough to act as a modular C \rightarrow B handle." title="" id="95" name="Picture"/>
+            <a:graphic>
+              <a:graphicData uri="http://schemas.openxmlformats.org/drawingml/2006/picture">
+                <pic:pic>
+                  <pic:nvPicPr>
+                    <pic:cNvPr descr="figures/figure8_selective_force_native.png" id="96" name="Picture"/>
+                    <pic:cNvPicPr>
+                      <a:picLocks noChangeArrowheads="1" noChangeAspect="1"/>
+                    </pic:cNvPicPr>
+                  </pic:nvPicPr>
+                  <pic:blipFill>
+                    <a:blip r:embed="rId94"/>
+                    <a:stretch>
+                      <a:fillRect/>
+                    </a:stretch>
+                  </pic:blipFill>
+                  <pic:spPr bwMode="auto">
+                    <a:xfrm>
+                      <a:off x="0" y="0"/>
+                      <a:ext cx="5943600" cy="3263152"/>
+                    </a:xfrm>
+                    <a:prstGeom prst="rect">
+                      <a:avLst/>
+                    </a:prstGeom>
+                    <a:noFill/>
+                    <a:ln w="9525">
+                      <a:noFill/>
+                      <a:headEnd/>
+                      <a:tailEnd/>
+                    </a:ln>
+                  </pic:spPr>
+                </pic:pic>
+              </a:graphicData>
+            </a:graphic>
+          </wp:inline>
+        </w:drawing>
+      </w:r>
+    </w:p>
+    <w:p>
+      <w:pPr>
+        <w:pStyle w:val="ImageCaption"/>
+      </w:pPr>
+      <w:r>
+        <w:t xml:space="preserve">Figure 8. Selective protocol: S1 amplify class-switches under free generation but restores baseline nouns when the native article is forced; S3 does not move article preference enough to act as a modular</w:t>
+      </w:r>
+      <w:r>
+        <w:t xml:space="preserve"> </w:t>
+      </w:r>
+      <m:oMath>
+        <m:r>
+          <m:t>C</m:t>
+        </m:r>
+        <m:r>
+          <m:rPr>
+            <m:sty m:val="p"/>
+          </m:rPr>
+          <m:t>→</m:t>
+        </m:r>
+        <m:r>
+          <m:t>B</m:t>
+        </m:r>
+      </m:oMath>
+      <w:r>
+        <w:t xml:space="preserve"> </w:t>
+      </w:r>
+      <w:r>
+        <w:t xml:space="preserve">handle.</w:t>
+      </w:r>
+    </w:p>
+    <w:p>
+      <w:pPr>
         <w:pStyle w:val="BodyText"/>
       </w:pPr>
+      <w:r>
+        <w:t xml:space="preserve">Concrete S1-amplify examples:</w:t>
+      </w:r>
+    </w:p>
+    <w:tbl>
+      <w:tblPr>
+        <w:tblStyle w:val="Table"/>
+        <w:tblW w:type="pct" w:w="5000"/>
+        <w:tblLayout w:type="fixed"/>
+        <w:tblLook w:firstRow="1" w:lastRow="0" w:firstColumn="0" w:lastColumn="0" w:noHBand="0" w:noVBand="0" w:val="0020"/>
+      </w:tblPr>
+      <w:tblGrid>
+        <w:gridCol w:w="2640"/>
+        <w:gridCol w:w="2640"/>
+        <w:gridCol w:w="2640"/>
+      </w:tblGrid>
+      <w:tr>
+        <w:trPr>
+          <w:tblHeader w:val="on"/>
+        </w:trPr>
+        <w:tc>
+          <w:tcPr/>
+          <w:p>
+            <w:pPr>
+              <w:pStyle w:val="Compact"/>
+            </w:pPr>
+            <w:r>
+              <w:t xml:space="preserve">Prompt</w:t>
+            </w:r>
+          </w:p>
+        </w:tc>
+        <w:tc>
+          <w:tcPr/>
+          <w:p>
+            <w:pPr>
+              <w:pStyle w:val="Compact"/>
+            </w:pPr>
+            <w:r>
+              <w:t xml:space="preserve">Force-native continuation</w:t>
+            </w:r>
+          </w:p>
+        </w:tc>
+        <w:tc>
+          <w:tcPr/>
+          <w:p>
+            <w:pPr>
+              <w:pStyle w:val="Compact"/>
+            </w:pPr>
+            <w:r>
+              <w:t xml:space="preserve">Free continuation</w:t>
+            </w:r>
+          </w:p>
+        </w:tc>
+      </w:tr>
+      <w:tr>
+        <w:tc>
+          <w:tcPr/>
+          <w:p>
+            <w:pPr>
+              <w:pStyle w:val="Compact"/>
+            </w:pPr>
+            <w:r>
+              <w:t xml:space="preserve">Someone who flies airplanes is</w:t>
+            </w:r>
+          </w:p>
+        </w:tc>
+        <w:tc>
+          <w:tcPr/>
+          <w:p>
+            <w:pPr>
+              <w:pStyle w:val="Compact"/>
+            </w:pPr>
+            <w:r>
+              <w:t xml:space="preserve">a pilot</w:t>
+            </w:r>
+          </w:p>
+        </w:tc>
+        <w:tc>
+          <w:tcPr/>
+          <w:p>
+            <w:pPr>
+              <w:pStyle w:val="Compact"/>
+            </w:pPr>
+            <w:r>
+              <w:t xml:space="preserve">an aviator</w:t>
+            </w:r>
+          </w:p>
+        </w:tc>
+      </w:tr>
+      <w:tr>
+        <w:tc>
+          <w:tcPr/>
+          <w:p>
+            <w:pPr>
+              <w:pStyle w:val="Compact"/>
+            </w:pPr>
+            <w:r>
+              <w:t xml:space="preserve">Someone who represents clients in legal matters is</w:t>
+            </w:r>
+          </w:p>
+        </w:tc>
+        <w:tc>
+          <w:tcPr/>
+          <w:p>
+            <w:pPr>
+              <w:pStyle w:val="Compact"/>
+            </w:pPr>
+            <w:r>
+              <w:t xml:space="preserve">a lawyer</w:t>
+            </w:r>
+          </w:p>
+        </w:tc>
+        <w:tc>
+          <w:tcPr/>
+          <w:p>
+            <w:pPr>
+              <w:pStyle w:val="Compact"/>
+            </w:pPr>
+            <w:r>
+              <w:t xml:space="preserve">an attorney</w:t>
+            </w:r>
+          </w:p>
+        </w:tc>
+      </w:tr>
+      <w:tr>
+        <w:tc>
+          <w:tcPr/>
+          <w:p>
+            <w:pPr>
+              <w:pStyle w:val="Compact"/>
+            </w:pPr>
+            <w:r>
+              <w:t xml:space="preserve">Someone who studies matter and energy is</w:t>
+            </w:r>
+          </w:p>
+        </w:tc>
+        <w:tc>
+          <w:tcPr/>
+          <w:p>
+            <w:pPr>
+              <w:pStyle w:val="Compact"/>
+            </w:pPr>
+            <w:r>
+              <w:t xml:space="preserve">a physicist</w:t>
+            </w:r>
+          </w:p>
+        </w:tc>
+        <w:tc>
+          <w:tcPr/>
+          <w:p>
+            <w:pPr>
+              <w:pStyle w:val="Compact"/>
+            </w:pPr>
+            <w:r>
+              <w:t xml:space="preserve">an astronomer</w:t>
+            </w:r>
+          </w:p>
+        </w:tc>
+      </w:tr>
+    </w:tbl>
+    <w:bookmarkEnd w:id="97"/>
+    <w:bookmarkStart w:id="98" w:name="Xc651160569f8f268570a2c825be983fe07aef73"/>
+    <w:p>
+      <w:pPr>
+        <w:pStyle w:val="Heading3"/>
+      </w:pPr>
+      <w:r>
+        <w:t xml:space="preserve">How to read the pattern (avoiding a false “wrapper” reading)</w:t>
+      </w:r>
+    </w:p>
+    <w:p>
+      <w:pPr>
+        <w:pStyle w:val="FirstParagraph"/>
+      </w:pPr>
+      <w:r>
+        <w:t xml:space="preserve">S1 amplify raises article logits toward</w:t>
+      </w:r>
+      <w:r>
+        <w:t xml:space="preserve"> </w:t>
+      </w:r>
+      <w:r>
+        <w:rPr>
+          <w:rStyle w:val="VerbatimChar"/>
+        </w:rPr>
+        <w:t xml:space="preserve">an</w:t>
+      </w:r>
+      <w:r>
+        <w:t xml:space="preserve"> </w:t>
+      </w:r>
+      <w:r>
+        <w:rPr>
+          <w:i/>
+          <w:iCs/>
+        </w:rPr>
+        <w:t xml:space="preserve">and</w:t>
+      </w:r>
+      <w:r>
+        <w:t xml:space="preserve"> </w:t>
+      </w:r>
+      <w:r>
+        <w:t xml:space="preserve">yields force-native</w:t>
+      </w:r>
+      <w:r>
+        <w:t xml:space="preserve"> </w:t>
+      </w:r>
+      <w:r>
+        <w:t xml:space="preserve">content preservation near 1.0. That combination is</w:t>
+      </w:r>
+      <w:r>
+        <w:t xml:space="preserve"> </w:t>
+      </w:r>
       <w:r>
         <w:rPr>
           <w:b/>
           <w:bCs/>
         </w:rPr>
-        <w:t xml:space="preserve">Current hypothesis.</w:t>
-      </w:r>
-    </w:p>
-    <w:p>
-      <w:pPr>
-        <w:pStyle w:val="BlockText"/>
-      </w:pPr>
-      <w:r>
-        <w:t xml:space="preserve">In pretrained Gemma 3 270M with Gemma Scope 2 affine features, sparse</w:t>
-      </w:r>
-      <w:r>
-        <w:t xml:space="preserve"> </w:t>
-      </w:r>
-      <w:r>
-        <w:t xml:space="preserve">features that jointly affect article logits and future-content</w:t>
-      </w:r>
-      <w:r>
-        <w:t xml:space="preserve"> </w:t>
-      </w:r>
-      <w:r>
-        <w:t xml:space="preserve">attributions causally implement compiled trajectories (chunking): they</w:t>
-      </w:r>
-      <w:r>
-        <w:t xml:space="preserve"> </w:t>
-      </w:r>
-      <w:r>
-        <w:t xml:space="preserve">select coherent article–noun packages. They do not behave as wrappers</w:t>
-      </w:r>
-      <w:r>
-        <w:t xml:space="preserve"> </w:t>
-      </w:r>
-      <w:r>
-        <w:t xml:space="preserve">that edit preparation around a locked latent noun under held-out</w:t>
-      </w:r>
-      <w:r>
-        <w:t xml:space="preserve"> </w:t>
-      </w:r>
-      <w:r>
-        <w:t xml:space="preserve">gain-of-function, dose sweeps, or dual content-lock tests.</w:t>
-      </w:r>
-    </w:p>
-    <w:p>
-      <w:pPr>
-        <w:pStyle w:val="FirstParagraph"/>
-      </w:pPr>
+        <w:t xml:space="preserve">not</w:t>
+      </w:r>
+      <w:r>
+        <w:t xml:space="preserve"> </w:t>
+      </w:r>
+      <w:r>
+        <w:t xml:space="preserve">editable-wrapper</w:t>
+      </w:r>
+      <w:r>
+        <w:t xml:space="preserve"> </w:t>
+      </w:r>
+      <w:r>
+        <w:t xml:space="preserve">success. It is what packaging predicts: when you refuse to emit the</w:t>
+      </w:r>
+      <w:r>
+        <w:t xml:space="preserve"> </w:t>
+      </w:r>
+      <w:r>
+        <w:t xml:space="preserve">intervened article and put baseline</w:t>
+      </w:r>
+      <w:r>
+        <w:t xml:space="preserve"> </w:t>
+      </w:r>
+      <w:r>
+        <w:rPr>
+          <w:rStyle w:val="VerbatimChar"/>
+        </w:rPr>
+        <w:t xml:space="preserve">a</w:t>
+      </w:r>
+      <w:r>
+        <w:t xml:space="preserve"> </w:t>
+      </w:r>
+      <w:r>
+        <w:t xml:space="preserve">back in the string, the</w:t>
+      </w:r>
+      <w:r>
+        <w:t xml:space="preserve"> </w:t>
+      </w:r>
+      <m:oMath>
+        <m:r>
+          <m:t>a</m:t>
+        </m:r>
+      </m:oMath>
+      <w:r>
+        <w:t xml:space="preserve">+consonant package returns. True wrapper evidence on these stems</w:t>
+      </w:r>
+      <w:r>
+        <w:t xml:space="preserve"> </w:t>
+      </w:r>
+      <w:r>
+        <w:t xml:space="preserve">would require free</w:t>
+      </w:r>
+      <w:r>
+        <w:t xml:space="preserve"> </w:t>
+      </w:r>
+      <w:r>
+        <w:rPr>
+          <w:rStyle w:val="VerbatimChar"/>
+        </w:rPr>
+        <w:t xml:space="preserve">an</w:t>
+      </w:r>
+      <w:r>
+        <w:t xml:space="preserve"> </w:t>
+      </w:r>
+      <w:r>
+        <w:t xml:space="preserve">with the</w:t>
+      </w:r>
+      <w:r>
+        <w:t xml:space="preserve"> </w:t>
+      </w:r>
       <w:r>
         <w:rPr>
           <w:b/>
           <w:bCs/>
         </w:rPr>
-        <w:t xml:space="preserve">Rejected alternative (for this model/task).</w:t>
-      </w:r>
-    </w:p>
-    <w:p>
-      <w:pPr>
-        <w:pStyle w:val="BlockText"/>
-      </w:pPr>
-      <w:r>
-        <w:t xml:space="preserve">Dual-effect “planning” features can be used to flip</w:t>
+        <w:t xml:space="preserve">same</w:t>
+      </w:r>
+      <w:r>
+        <w:t xml:space="preserve"> </w:t>
+      </w:r>
+      <w:r>
+        <w:t xml:space="preserve">noun (often an illicit</w:t>
       </w:r>
       <w:r>
         <w:t xml:space="preserve"> </w:t>
@@ -9586,36 +11925,58 @@
         <w:rPr>
           <w:rStyle w:val="VerbatimChar"/>
         </w:rPr>
-        <w:t xml:space="preserve">a</w:t>
-      </w:r>
-      <w:r>
-        <w:t xml:space="preserve">/</w:t>
-      </w:r>
-      <w:r>
-        <w:rPr>
-          <w:rStyle w:val="VerbatimChar"/>
-        </w:rPr>
-        <w:t xml:space="preserve">an</w:t>
-      </w:r>
-      <w:r>
-        <w:t xml:space="preserve"> </w:t>
-      </w:r>
-      <w:r>
-        <w:t xml:space="preserve">while</w:t>
-      </w:r>
-      <w:r>
-        <w:t xml:space="preserve"> </w:t>
-      </w:r>
-      <w:r>
-        <w:t xml:space="preserve">preserving content identity above controls.</w:t>
-      </w:r>
-    </w:p>
-    <w:p>
-      <w:pPr>
-        <w:pStyle w:val="FirstParagraph"/>
-      </w:pPr>
-      <w:r>
-        <w:t xml:space="preserve">Article</w:t>
+        <w:t xml:space="preserve">an pilot</w:t>
+      </w:r>
+      <w:r>
+        <w:t xml:space="preserve">), or a selective</w:t>
+      </w:r>
+      <w:r>
+        <w:t xml:space="preserve"> </w:t>
+      </w:r>
+      <m:oMath>
+        <m:sSub>
+          <m:e>
+            <m:r>
+              <m:t>F</m:t>
+            </m:r>
+          </m:e>
+          <m:sub>
+            <m:r>
+              <m:t>C</m:t>
+            </m:r>
+          </m:sub>
+        </m:sSub>
+      </m:oMath>
+      <w:r>
+        <w:t xml:space="preserve"> </w:t>
+      </w:r>
+      <w:r>
+        <w:t xml:space="preserve">(S3) that moves only licensing while</w:t>
+      </w:r>
+      <w:r>
+        <w:t xml:space="preserve"> </w:t>
+      </w:r>
+      <w:r>
+        <w:t xml:space="preserve">content stays fixed. We observed</w:t>
+      </w:r>
+      <w:r>
+        <w:t xml:space="preserve"> </w:t>
+      </w:r>
+      <w:r>
+        <w:rPr>
+          <w:b/>
+          <w:bCs/>
+        </w:rPr>
+        <w:t xml:space="preserve">neither</w:t>
+      </w:r>
+      <w:r>
+        <w:t xml:space="preserve">: illicit free rate stayed</w:t>
+      </w:r>
+      <w:r>
+        <w:t xml:space="preserve"> </w:t>
+      </w:r>
+      <w:r>
+        <w:t xml:space="preserve">0.00, and S3 barely moved</w:t>
       </w:r>
       <w:r>
         <w:t xml:space="preserve"> </w:t>
@@ -9627,29 +11988,109 @@
           </m:rPr>
           <m:t>Δ</m:t>
         </m:r>
+        <m:r>
+          <m:rPr>
+            <m:sty m:val="p"/>
+          </m:rPr>
+          <m:t>(</m:t>
+        </m:r>
+        <m:r>
+          <m:rPr>
+            <m:nor/>
+            <m:scr m:val="monospace"/>
+            <m:sty m:val="p"/>
+          </m:rPr>
+          <m:t>an</m:t>
+        </m:r>
+        <m:r>
+          <m:rPr>
+            <m:sty m:val="p"/>
+          </m:rPr>
+          <m:t>−</m:t>
+        </m:r>
+        <m:r>
+          <m:rPr>
+            <m:nor/>
+            <m:scr m:val="monospace"/>
+            <m:sty m:val="p"/>
+          </m:rPr>
+          <m:t>a</m:t>
+        </m:r>
+        <m:r>
+          <m:rPr>
+            <m:sty m:val="p"/>
+          </m:rPr>
+          <m:t>)</m:t>
+        </m:r>
       </m:oMath>
       <w:r>
-        <w:t xml:space="preserve"> </w:t>
-      </w:r>
-      <w:r>
-        <w:t xml:space="preserve">without content locking remains an insufficient</w:t>
-      </w:r>
-      <w:r>
-        <w:t xml:space="preserve"> </w:t>
-      </w:r>
-      <w:r>
-        <w:t xml:space="preserve">metric for claiming content-preserving latent planning.</w:t>
-      </w:r>
-    </w:p>
-    <w:bookmarkEnd w:id="92"/>
-    <w:bookmarkEnd w:id="93"/>
-    <w:bookmarkStart w:id="94" w:name="what-has-and-has-not-been-achieved"/>
-    <w:p>
-      <w:pPr>
-        <w:pStyle w:val="Heading1"/>
-      </w:pPr>
-      <w:r>
-        <w:t xml:space="preserve">11. What has and has not been achieved</w:t>
+        <w:t xml:space="preserve">.</w:t>
+      </w:r>
+    </w:p>
+    <w:p>
+      <w:pPr>
+        <w:pStyle w:val="BodyText"/>
+      </w:pPr>
+      <w:r>
+        <w:t xml:space="preserve">S2 amplify moved article logits moderately but produced messy free</w:t>
+      </w:r>
+      <w:r>
+        <w:t xml:space="preserve"> </w:t>
+      </w:r>
+      <w:r>
+        <w:t xml:space="preserve">continuations (</w:t>
+      </w:r>
+      <w:r>
+        <w:rPr>
+          <w:rStyle w:val="VerbatimChar"/>
+        </w:rPr>
+        <w:t xml:space="preserve">called a …</w:t>
+      </w:r>
+      <w:r>
+        <w:t xml:space="preserve">,</w:t>
+      </w:r>
+      <w:r>
+        <w:t xml:space="preserve"> </w:t>
+      </w:r>
+      <w:r>
+        <w:rPr>
+          <w:rStyle w:val="VerbatimChar"/>
+        </w:rPr>
+        <w:t xml:space="preserve">also a biologist</w:t>
+      </w:r>
+      <w:r>
+        <w:t xml:space="preserve">), not clean</w:t>
+      </w:r>
+      <w:r>
+        <w:t xml:space="preserve"> </w:t>
+      </w:r>
+      <w:r>
+        <w:t xml:space="preserve">content-preserving</w:t>
+      </w:r>
+      <w:r>
+        <w:t xml:space="preserve"> </w:t>
+      </w:r>
+      <w:r>
+        <w:rPr>
+          <w:rStyle w:val="VerbatimChar"/>
+        </w:rPr>
+        <w:t xml:space="preserve">an</w:t>
+      </w:r>
+      <w:r>
+        <w:t xml:space="preserve"> </w:t>
+      </w:r>
+      <w:r>
+        <w:t xml:space="preserve">repairs. Controls remained near baseline.</w:t>
+      </w:r>
+    </w:p>
+    <w:bookmarkEnd w:id="98"/>
+    <w:bookmarkStart w:id="99" w:name="conclusion-of-stage-xv"/>
+    <w:p>
+      <w:pPr>
+        <w:pStyle w:val="Heading3"/>
+      </w:pPr>
+      <w:r>
+        <w:t xml:space="preserve">Conclusion of Stage XV</w:t>
       </w:r>
     </w:p>
     <w:p>
@@ -9657,299 +12098,79 @@
         <w:pStyle w:val="FirstParagraph"/>
       </w:pPr>
       <w:r>
-        <w:t xml:space="preserve">We have achieved:</w:t>
-      </w:r>
-    </w:p>
-    <w:p>
-      <w:pPr>
-        <w:pStyle w:val="Compact"/>
-        <w:numPr>
-          <w:ilvl w:val="0"/>
-          <w:numId w:val="1011"/>
-        </w:numPr>
-      </w:pPr>
-      <w:r>
-        <w:t xml:space="preserve">a reproducible, memory-safe Circuit Tracer workflow for Gemma 3 270M</w:t>
-      </w:r>
-      <w:r>
-        <w:t xml:space="preserve"> </w:t>
-      </w:r>
-      <w:r>
-        <w:t xml:space="preserve">on constrained hardware;</w:t>
-      </w:r>
-    </w:p>
-    <w:p>
-      <w:pPr>
-        <w:pStyle w:val="Compact"/>
-        <w:numPr>
-          <w:ilvl w:val="0"/>
-          <w:numId w:val="1011"/>
-        </w:numPr>
-      </w:pPr>
-      <w:r>
-        <w:t xml:space="preserve">behavioral replication of a strong minority-class</w:t>
-      </w:r>
-      <w:r>
-        <w:t xml:space="preserve"> </w:t>
-      </w:r>
-      <w:r>
-        <w:rPr>
-          <w:rStyle w:val="VerbatimChar"/>
-        </w:rPr>
-        <w:t xml:space="preserve">an</w:t>
-      </w:r>
-      <w:r>
-        <w:t xml:space="preserve"> </w:t>
-      </w:r>
-      <w:r>
-        <w:t xml:space="preserve">disadvantage as</w:t>
-      </w:r>
-      <w:r>
-        <w:t xml:space="preserve"> </w:t>
-      </w:r>
-      <w:r>
-        <w:t xml:space="preserve">found in</w:t>
-      </w:r>
-      <w:r>
-        <w:t xml:space="preserve"> </w:t>
-      </w:r>
-      <w:r>
-        <w:rPr>
-          <w:i/>
-          <w:iCs/>
-        </w:rPr>
-        <w:t xml:space="preserve">Latent Planning Emerges with Scale</w:t>
-      </w:r>
-      <w:r>
-        <w:t xml:space="preserve">;</w:t>
-      </w:r>
-    </w:p>
-    <w:p>
-      <w:pPr>
-        <w:pStyle w:val="Compact"/>
-        <w:numPr>
-          <w:ilvl w:val="0"/>
-          <w:numId w:val="1011"/>
-        </w:numPr>
-      </w:pPr>
-      <w:r>
-        <w:t xml:space="preserve">direct evidence that future-answer information is active before an</w:t>
-      </w:r>
-      <w:r>
-        <w:t xml:space="preserve"> </w:t>
-      </w:r>
-      <w:r>
-        <w:t xml:space="preserve">incorrect article in the ophthalmologist discovery case;</w:t>
-      </w:r>
-    </w:p>
-    <w:p>
-      <w:pPr>
-        <w:pStyle w:val="Compact"/>
-        <w:numPr>
-          <w:ilvl w:val="0"/>
-          <w:numId w:val="1011"/>
-        </w:numPr>
-      </w:pPr>
-      <w:r>
-        <w:t xml:space="preserve">a suppression-only intervention that corrected that source continuation</w:t>
-      </w:r>
-      <w:r>
-        <w:t xml:space="preserve"> </w:t>
-      </w:r>
-      <w:r>
-        <w:t xml:space="preserve">without directly ablating the future noun token in the original</w:t>
-      </w:r>
-      <w:r>
-        <w:t xml:space="preserve"> </w:t>
-      </w:r>
-      <w:r>
-        <w:t xml:space="preserve">mismatch setting;</w:t>
-      </w:r>
-    </w:p>
-    <w:p>
-      <w:pPr>
-        <w:pStyle w:val="Compact"/>
-        <w:numPr>
-          <w:ilvl w:val="0"/>
-          <w:numId w:val="1011"/>
-        </w:numPr>
-      </w:pPr>
-      <w:r>
-        <w:t xml:space="preserve">a held-out fixed-pair test showing coordinated article and lexical</w:t>
-      </w:r>
-      <w:r>
-        <w:t xml:space="preserve"> </w:t>
-      </w:r>
-      <w:r>
-        <w:t xml:space="preserve">choice—compiled trajectories (chunking), not grammar-only repair;</w:t>
-      </w:r>
-    </w:p>
-    <w:p>
-      <w:pPr>
-        <w:pStyle w:val="Compact"/>
-        <w:numPr>
-          <w:ilvl w:val="0"/>
-          <w:numId w:val="1011"/>
-        </w:numPr>
-      </w:pPr>
-      <w:r>
-        <w:t xml:space="preserve">a Latent-Planning-style gain-of-function clincher that class-switches</w:t>
-      </w:r>
-      <w:r>
-        <w:t xml:space="preserve"> </w:t>
-      </w:r>
-      <w:r>
-        <w:t xml:space="preserve">on held-out occupations (</w:t>
-      </w:r>
-      <w:r>
-        <w:rPr>
-          <w:rStyle w:val="VerbatimChar"/>
-        </w:rPr>
-        <w:t xml:space="preserve">a pilot</w:t>
-      </w:r>
-      <w:r>
-        <w:t xml:space="preserve">→</w:t>
-      </w:r>
-      <w:r>
-        <w:rPr>
-          <w:rStyle w:val="VerbatimChar"/>
-        </w:rPr>
-        <w:t xml:space="preserve">an aviator</w:t>
-      </w:r>
-      <w:r>
-        <w:t xml:space="preserve">, and analogues);</w:t>
-      </w:r>
-    </w:p>
-    <w:p>
-      <w:pPr>
-        <w:pStyle w:val="Compact"/>
-        <w:numPr>
-          <w:ilvl w:val="0"/>
-          <w:numId w:val="1011"/>
-        </w:numPr>
-      </w:pPr>
-      <w:r>
-        <w:t xml:space="preserve">a selection-criterion ablation showing that dual-effect, article-only,</w:t>
-      </w:r>
-      <w:r>
-        <w:t xml:space="preserve"> </w:t>
-      </w:r>
-      <w:r>
-        <w:t xml:space="preserve">content-only, and competing-</w:t>
-      </w:r>
-      <w:r>
-        <w:rPr>
-          <w:rStyle w:val="VerbatimChar"/>
-        </w:rPr>
-        <w:t xml:space="preserve">a</w:t>
-      </w:r>
-      <w:r>
-        <w:t xml:space="preserve"> </w:t>
-      </w:r>
-      <w:r>
-        <w:t xml:space="preserve">rules do not yield wrapper-like</w:t>
-      </w:r>
-      <w:r>
-        <w:t xml:space="preserve"> </w:t>
-      </w:r>
-      <w:r>
-        <w:t xml:space="preserve">held-out success;</w:t>
-      </w:r>
-    </w:p>
-    <w:p>
-      <w:pPr>
-        <w:pStyle w:val="Compact"/>
-        <w:numPr>
-          <w:ilvl w:val="0"/>
-          <w:numId w:val="1011"/>
-        </w:numPr>
-      </w:pPr>
-      <w:r>
-        <w:t xml:space="preserve">a dose–response with no content-preserving wrapper window;</w:t>
-      </w:r>
-    </w:p>
-    <w:p>
-      <w:pPr>
-        <w:pStyle w:val="Compact"/>
-        <w:numPr>
-          <w:ilvl w:val="0"/>
-          <w:numId w:val="1011"/>
-        </w:numPr>
-      </w:pPr>
-      <w:r>
-        <w:t xml:space="preserve">a dual content-lock test in which article-push and dual conditions</w:t>
-      </w:r>
-      <w:r>
-        <w:t xml:space="preserve"> </w:t>
-      </w:r>
-      <w:r>
-        <w:t xml:space="preserve">remain trajectory-like (chunking) while illicit mismatches stay near</w:t>
-      </w:r>
-      <w:r>
-        <w:t xml:space="preserve"> </w:t>
-      </w:r>
-      <w:r>
-        <w:t xml:space="preserve">zero;</w:t>
-      </w:r>
-    </w:p>
-    <w:p>
-      <w:pPr>
-        <w:pStyle w:val="Compact"/>
-        <w:numPr>
-          <w:ilvl w:val="0"/>
-          <w:numId w:val="1011"/>
-        </w:numPr>
-      </w:pPr>
-      <w:r>
-        <w:t xml:space="preserve">a twin-family causal tetrad in which gain-of-function selects</w:t>
-      </w:r>
-      <w:r>
-        <w:t xml:space="preserve"> </w:t>
-      </w:r>
-      <w:r>
-        <w:rPr>
-          <w:rStyle w:val="VerbatimChar"/>
-        </w:rPr>
-        <w:t xml:space="preserve">an aviator</w:t>
-      </w:r>
-      <w:r>
-        <w:t xml:space="preserve"> </w:t>
-      </w:r>
-      <w:r>
-        <w:t xml:space="preserve">/</w:t>
-      </w:r>
-      <w:r>
-        <w:t xml:space="preserve"> </w:t>
-      </w:r>
-      <w:r>
-        <w:rPr>
-          <w:rStyle w:val="VerbatimChar"/>
-        </w:rPr>
-        <w:t xml:space="preserve">an attorney</w:t>
-      </w:r>
-      <w:r>
-        <w:t xml:space="preserve"> </w:t>
-      </w:r>
-      <w:r>
-        <w:t xml:space="preserve">above matched controls;</w:t>
-      </w:r>
-    </w:p>
-    <w:p>
-      <w:pPr>
-        <w:pStyle w:val="Compact"/>
-        <w:numPr>
-          <w:ilvl w:val="0"/>
-          <w:numId w:val="1011"/>
-        </w:numPr>
-      </w:pPr>
-      <w:r>
-        <w:t xml:space="preserve">an explicit stack decision for pretrained + affine over IT + non-affine</w:t>
-      </w:r>
-      <w:r>
-        <w:t xml:space="preserve"> </w:t>
-      </w:r>
-      <w:r>
-        <w:t xml:space="preserve">for this hypothesis test.</w:t>
+        <w:t xml:space="preserve">The editable-wrapper / modular</w:t>
+      </w:r>
+      <w:r>
+        <w:t xml:space="preserve"> </w:t>
+      </w:r>
+      <m:oMath>
+        <m:r>
+          <m:t>C</m:t>
+        </m:r>
+        <m:r>
+          <m:rPr>
+            <m:sty m:val="p"/>
+          </m:rPr>
+          <m:t>→</m:t>
+        </m:r>
+        <m:r>
+          <m:t>B</m:t>
+        </m:r>
+      </m:oMath>
+      <w:r>
+        <w:t xml:space="preserve"> </w:t>
+      </w:r>
+      <w:r>
+        <w:t xml:space="preserve">hypothesis remains</w:t>
+      </w:r>
+      <w:r>
+        <w:t xml:space="preserve"> </w:t>
+      </w:r>
+      <w:r>
+        <w:rPr>
+          <w:b/>
+          <w:bCs/>
+        </w:rPr>
+        <w:t xml:space="preserve">testable in principle</w:t>
+      </w:r>
+      <w:r>
+        <w:t xml:space="preserve">, but on these frozen feature sets and prompts</w:t>
+      </w:r>
+      <w:r>
+        <w:t xml:space="preserve"> </w:t>
+      </w:r>
+      <w:r>
+        <w:t xml:space="preserve">it is</w:t>
+      </w:r>
+      <w:r>
+        <w:t xml:space="preserve"> </w:t>
+      </w:r>
+      <w:r>
+        <w:rPr>
+          <w:b/>
+          <w:bCs/>
+        </w:rPr>
+        <w:t xml:space="preserve">not supported</w:t>
+      </w:r>
+      <w:r>
+        <w:t xml:space="preserve">. The selective force-native protocol strengthens</w:t>
+      </w:r>
+      <w:r>
+        <w:t xml:space="preserve"> </w:t>
+      </w:r>
+      <w:r>
+        <w:t xml:space="preserve">the compiled-trajectory (chunking) reading already favored by E1–E4.</w:t>
+      </w:r>
+    </w:p>
+    <w:bookmarkEnd w:id="99"/>
+    <w:bookmarkEnd w:id="100"/>
+    <w:bookmarkStart w:id="101" w:name="current-hypothesis-after-stages-viiixv"/>
+    <w:p>
+      <w:pPr>
+        <w:pStyle w:val="Heading2"/>
+      </w:pPr>
+      <w:r>
+        <w:t xml:space="preserve">10.12 Current hypothesis (after Stages VIII–XV)</w:t>
       </w:r>
     </w:p>
     <w:p>
@@ -9957,174 +12178,7 @@
         <w:pStyle w:val="FirstParagraph"/>
       </w:pPr>
       <w:r>
-        <w:t xml:space="preserve">We have not achieved:</w:t>
-      </w:r>
-    </w:p>
-    <w:p>
-      <w:pPr>
-        <w:pStyle w:val="Compact"/>
-        <w:numPr>
-          <w:ilvl w:val="0"/>
-          <w:numId w:val="1012"/>
-        </w:numPr>
-      </w:pPr>
-      <w:r>
-        <w:t xml:space="preserve">a general tool for reducing stalling behavior on country–city prompts;</w:t>
-      </w:r>
-    </w:p>
-    <w:p>
-      <w:pPr>
-        <w:pStyle w:val="Compact"/>
-        <w:numPr>
-          <w:ilvl w:val="0"/>
-          <w:numId w:val="1012"/>
-        </w:numPr>
-      </w:pPr>
-      <w:r>
-        <w:t xml:space="preserve">a content-preserving grammar correction that transfers across prompts;</w:t>
-      </w:r>
-    </w:p>
-    <w:p>
-      <w:pPr>
-        <w:pStyle w:val="Compact"/>
-        <w:numPr>
-          <w:ilvl w:val="0"/>
-          <w:numId w:val="1012"/>
-        </w:numPr>
-      </w:pPr>
-      <w:r>
-        <w:t xml:space="preserve">evidence that the country–city</w:t>
-      </w:r>
-      <w:r>
-        <w:t xml:space="preserve"> </w:t>
-      </w:r>
-      <w:r>
-        <w:rPr>
-          <w:rStyle w:val="VerbatimChar"/>
-        </w:rPr>
-        <w:t xml:space="preserve">the</w:t>
-      </w:r>
-      <w:r>
-        <w:t xml:space="preserve"> </w:t>
-      </w:r>
-      <w:r>
-        <w:t xml:space="preserve">token reflects one reusable</w:t>
-      </w:r>
-      <w:r>
-        <w:t xml:space="preserve"> </w:t>
-      </w:r>
-      <w:r>
-        <w:t xml:space="preserve">stalling circuit;</w:t>
-      </w:r>
-    </w:p>
-    <w:p>
-      <w:pPr>
-        <w:pStyle w:val="Compact"/>
-        <w:numPr>
-          <w:ilvl w:val="0"/>
-          <w:numId w:val="1012"/>
-        </w:numPr>
-      </w:pPr>
-      <w:r>
-        <w:t xml:space="preserve">proof that compiled trajectories (chunking) are the story at larger</w:t>
-      </w:r>
-      <w:r>
-        <w:t xml:space="preserve"> </w:t>
-      </w:r>
-      <w:r>
-        <w:t xml:space="preserve">scales or in other model families—the Latent Planning scale axis is</w:t>
-      </w:r>
-      <w:r>
-        <w:t xml:space="preserve"> </w:t>
-      </w:r>
-      <w:r>
-        <w:t xml:space="preserve">outside our hardware envelope;</w:t>
-      </w:r>
-    </w:p>
-    <w:p>
-      <w:pPr>
-        <w:pStyle w:val="Compact"/>
-        <w:numPr>
-          <w:ilvl w:val="0"/>
-          <w:numId w:val="1012"/>
-        </w:numPr>
-      </w:pPr>
-      <w:r>
-        <w:t xml:space="preserve">a complete necessity story from zero-ablation alone on twin baselines</w:t>
-      </w:r>
-      <w:r>
-        <w:t xml:space="preserve"> </w:t>
-      </w:r>
-      <w:r>
-        <w:t xml:space="preserve">(GoF/specificity carry more of the causal weight here).</w:t>
-      </w:r>
-    </w:p>
-    <w:p>
-      <w:pPr>
-        <w:pStyle w:val="FirstParagraph"/>
-      </w:pPr>
-      <w:r>
-        <w:t xml:space="preserve">The main scientific progress is therefore twofold. First, increasingly</w:t>
-      </w:r>
-      <w:r>
-        <w:t xml:space="preserve"> </w:t>
-      </w:r>
-      <w:r>
-        <w:t xml:space="preserve">stringent transfer and specificity tests rejected the simplest stalling</w:t>
-      </w:r>
-      <w:r>
-        <w:t xml:space="preserve"> </w:t>
-      </w:r>
-      <w:r>
-        <w:t xml:space="preserve">and wrapper readings. Second, the same tests—extended with Latent</w:t>
-      </w:r>
-      <w:r>
-        <w:t xml:space="preserve"> </w:t>
-      </w:r>
-      <w:r>
-        <w:t xml:space="preserve">Planning-style gain-of-function, dose, dual lock, and twin</w:t>
-      </w:r>
-      <w:r>
-        <w:t xml:space="preserve"> </w:t>
-      </w:r>
-      <w:r>
-        <w:t xml:space="preserve">controls—support a precise positive claim: in this small model, sparse</w:t>
-      </w:r>
-      <w:r>
-        <w:t xml:space="preserve"> </w:t>
-      </w:r>
-      <w:r>
-        <w:t xml:space="preserve">“planning-looking” features causally select preparation–content packages</w:t>
-      </w:r>
-      <w:r>
-        <w:t xml:space="preserve"> </w:t>
-      </w:r>
-      <w:r>
-        <w:t xml:space="preserve">(chunks), so article interventions must not be scored as</w:t>
-      </w:r>
-      <w:r>
-        <w:t xml:space="preserve"> </w:t>
-      </w:r>
-      <w:r>
-        <w:t xml:space="preserve">content-preserving latent planning unless content identity is locked.</w:t>
-      </w:r>
-    </w:p>
-    <w:bookmarkEnd w:id="94"/>
-    <w:bookmarkStart w:id="95" w:name="reproducibility-map"/>
-    <w:p>
-      <w:pPr>
-        <w:pStyle w:val="Heading1"/>
-      </w:pPr>
-      <w:r>
-        <w:t xml:space="preserve">Reproducibility map</w:t>
-      </w:r>
-    </w:p>
-    <w:p>
-      <w:pPr>
-        <w:pStyle w:val="FirstParagraph"/>
-      </w:pPr>
-      <w:r>
-        <w:t xml:space="preserve">The reports and machine-readable outputs are organized by experiment:</w:t>
+        <w:t xml:space="preserve">Relating old and new terms:</w:t>
       </w:r>
     </w:p>
     <w:tbl>
@@ -10149,6 +12203,1036 @@
               <w:pStyle w:val="Compact"/>
             </w:pPr>
             <w:r>
+              <w:t xml:space="preserve">Earlier Stage VII language</w:t>
+            </w:r>
+          </w:p>
+        </w:tc>
+        <w:tc>
+          <w:tcPr/>
+          <w:p>
+            <w:pPr>
+              <w:pStyle w:val="Compact"/>
+            </w:pPr>
+            <w:r>
+              <w:t xml:space="preserve">Current causal language</w:t>
+            </w:r>
+          </w:p>
+        </w:tc>
+      </w:tr>
+      <w:tr>
+        <w:tc>
+          <w:tcPr/>
+          <w:p>
+            <w:pPr>
+              <w:pStyle w:val="Compact"/>
+            </w:pPr>
+            <w:r>
+              <w:t xml:space="preserve">Coordinated preparation–content classes</w:t>
+            </w:r>
+          </w:p>
+        </w:tc>
+        <w:tc>
+          <w:tcPr/>
+          <w:p>
+            <w:pPr>
+              <w:pStyle w:val="Compact"/>
+            </w:pPr>
+            <w:r>
+              <w:t xml:space="preserve">Compiled trajectories (chunks) / packages</w:t>
+            </w:r>
+          </w:p>
+        </w:tc>
+      </w:tr>
+      <w:tr>
+        <w:tc>
+          <w:tcPr/>
+          <w:p>
+            <w:pPr>
+              <w:pStyle w:val="Compact"/>
+            </w:pPr>
+            <w:r>
+              <w:t xml:space="preserve">Content-preserving grammar repair</w:t>
+            </w:r>
+          </w:p>
+        </w:tc>
+        <w:tc>
+          <w:tcPr/>
+          <w:p>
+            <w:pPr>
+              <w:pStyle w:val="Compact"/>
+            </w:pPr>
+            <w:r>
+              <w:t xml:space="preserve">Wrapper-like / modular</w:t>
+            </w:r>
+            <w:r>
+              <w:t xml:space="preserve"> </w:t>
+            </w:r>
+            <m:oMath>
+              <m:r>
+                <m:t>C</m:t>
+              </m:r>
+              <m:r>
+                <m:rPr>
+                  <m:sty m:val="p"/>
+                </m:rPr>
+                <m:t>→</m:t>
+              </m:r>
+              <m:r>
+                <m:t>B</m:t>
+              </m:r>
+            </m:oMath>
+            <w:r>
+              <w:t xml:space="preserve"> </w:t>
+            </w:r>
+            <w:r>
+              <w:t xml:space="preserve">success</w:t>
+            </w:r>
+          </w:p>
+        </w:tc>
+      </w:tr>
+      <w:tr>
+        <w:tc>
+          <w:tcPr/>
+          <w:p>
+            <w:pPr>
+              <w:pStyle w:val="Compact"/>
+            </w:pPr>
+            <w:r>
+              <w:t xml:space="preserve">Fixed-pair suppression switches</w:t>
+            </w:r>
+            <w:r>
+              <w:t xml:space="preserve"> </w:t>
+            </w:r>
+            <w:r>
+              <w:rPr>
+                <w:rStyle w:val="VerbatimChar"/>
+              </w:rPr>
+              <w:t xml:space="preserve">a pilot</w:t>
+            </w:r>
+            <w:r>
+              <w:t xml:space="preserve">→</w:t>
+            </w:r>
+            <w:r>
+              <w:rPr>
+                <w:rStyle w:val="VerbatimChar"/>
+              </w:rPr>
+              <w:t xml:space="preserve">an aviator</w:t>
+            </w:r>
+          </w:p>
+        </w:tc>
+        <w:tc>
+          <w:tcPr/>
+          <w:p>
+            <w:pPr>
+              <w:pStyle w:val="Compact"/>
+            </w:pPr>
+            <w:r>
+              <w:t xml:space="preserve">Loss- or gain-of-function selects packages</w:t>
+            </w:r>
+          </w:p>
+        </w:tc>
+      </w:tr>
+      <w:tr>
+        <w:tc>
+          <w:tcPr/>
+          <w:p>
+            <w:pPr>
+              <w:pStyle w:val="Compact"/>
+            </w:pPr>
+            <w:r>
+              <w:t xml:space="preserve">“Need a cleaner modular test”</w:t>
+            </w:r>
+          </w:p>
+        </w:tc>
+        <w:tc>
+          <w:tcPr/>
+          <w:p>
+            <w:pPr>
+              <w:pStyle w:val="Compact"/>
+            </w:pPr>
+            <w:r>
+              <w:t xml:space="preserve">Selective</w:t>
+            </w:r>
+            <w:r>
+              <w:t xml:space="preserve"> </w:t>
+            </w:r>
+            <m:oMath>
+              <m:r>
+                <m:t>b</m:t>
+              </m:r>
+            </m:oMath>
+            <w:r>
+              <w:t xml:space="preserve">-step + force-native article (Stage XV)</w:t>
+            </w:r>
+          </w:p>
+        </w:tc>
+      </w:tr>
+    </w:tbl>
+    <w:p>
+      <w:pPr>
+        <w:pStyle w:val="BodyText"/>
+      </w:pPr>
+      <w:r>
+        <w:rPr>
+          <w:b/>
+          <w:bCs/>
+        </w:rPr>
+        <w:t xml:space="preserve">Current hypothesis.</w:t>
+      </w:r>
+    </w:p>
+    <w:p>
+      <w:pPr>
+        <w:pStyle w:val="BlockText"/>
+      </w:pPr>
+      <w:r>
+        <w:t xml:space="preserve">In pretrained Gemma 3 270M with Gemma Scope 2 affine features, sparse</w:t>
+      </w:r>
+      <w:r>
+        <w:t xml:space="preserve"> </w:t>
+      </w:r>
+      <w:r>
+        <w:t xml:space="preserve">features that jointly affect article logits and future-content</w:t>
+      </w:r>
+      <w:r>
+        <w:t xml:space="preserve"> </w:t>
+      </w:r>
+      <w:r>
+        <w:t xml:space="preserve">attributions causally implement compiled trajectories (chunking): they</w:t>
+      </w:r>
+      <w:r>
+        <w:t xml:space="preserve"> </w:t>
+      </w:r>
+      <w:r>
+        <w:t xml:space="preserve">select coherent article–noun packages. They do not behave as wrappers</w:t>
+      </w:r>
+      <w:r>
+        <w:t xml:space="preserve"> </w:t>
+      </w:r>
+      <w:r>
+        <w:t xml:space="preserve">that edit preparation around a locked latent noun under held-out</w:t>
+      </w:r>
+      <w:r>
+        <w:t xml:space="preserve"> </w:t>
+      </w:r>
+      <w:r>
+        <w:t xml:space="preserve">gain-of-function, dose sweeps, dual content-lock tests, or selective</w:t>
+      </w:r>
+      <w:r>
+        <w:t xml:space="preserve"> </w:t>
+      </w:r>
+      <w:r>
+        <w:t xml:space="preserve">intervene-at-</w:t>
+      </w:r>
+      <m:oMath>
+        <m:r>
+          <m:t>b</m:t>
+        </m:r>
+      </m:oMath>
+      <w:r>
+        <w:t xml:space="preserve"> </w:t>
+      </w:r>
+      <w:r>
+        <w:t xml:space="preserve">/ force-native-</w:t>
+      </w:r>
+      <m:oMath>
+        <m:r>
+          <m:t>b</m:t>
+        </m:r>
+      </m:oMath>
+      <w:r>
+        <w:t xml:space="preserve"> </w:t>
+      </w:r>
+      <w:r>
+        <w:t xml:space="preserve">/ generate-</w:t>
+      </w:r>
+      <m:oMath>
+        <m:r>
+          <m:t>c</m:t>
+        </m:r>
+      </m:oMath>
+      <w:r>
+        <w:t xml:space="preserve">-off tests.</w:t>
+      </w:r>
+    </w:p>
+    <w:p>
+      <w:pPr>
+        <w:pStyle w:val="FirstParagraph"/>
+      </w:pPr>
+      <w:r>
+        <w:rPr>
+          <w:b/>
+          <w:bCs/>
+        </w:rPr>
+        <w:t xml:space="preserve">Rejected alternative (for this model/task).</w:t>
+      </w:r>
+    </w:p>
+    <w:p>
+      <w:pPr>
+        <w:pStyle w:val="BlockText"/>
+      </w:pPr>
+      <w:r>
+        <w:t xml:space="preserve">Dual-effect “planning” features can be used to flip</w:t>
+      </w:r>
+      <w:r>
+        <w:t xml:space="preserve"> </w:t>
+      </w:r>
+      <w:r>
+        <w:rPr>
+          <w:rStyle w:val="VerbatimChar"/>
+        </w:rPr>
+        <w:t xml:space="preserve">a</w:t>
+      </w:r>
+      <w:r>
+        <w:t xml:space="preserve">/</w:t>
+      </w:r>
+      <w:r>
+        <w:rPr>
+          <w:rStyle w:val="VerbatimChar"/>
+        </w:rPr>
+        <w:t xml:space="preserve">an</w:t>
+      </w:r>
+      <w:r>
+        <w:t xml:space="preserve"> </w:t>
+      </w:r>
+      <w:r>
+        <w:t xml:space="preserve">while</w:t>
+      </w:r>
+      <w:r>
+        <w:t xml:space="preserve"> </w:t>
+      </w:r>
+      <w:r>
+        <w:t xml:space="preserve">preserving content identity above controls—or, more strongly, content</w:t>
+      </w:r>
+      <w:r>
+        <w:t xml:space="preserve"> </w:t>
+      </w:r>
+      <w:r>
+        <w:t xml:space="preserve">features alone can selectively retune licensing</w:t>
+      </w:r>
+      <w:r>
+        <w:t xml:space="preserve"> </w:t>
+      </w:r>
+      <m:oMath>
+        <m:r>
+          <m:t>B</m:t>
+        </m:r>
+      </m:oMath>
+      <w:r>
+        <w:t xml:space="preserve"> </w:t>
+      </w:r>
+      <w:r>
+        <w:t xml:space="preserve">while leaving</w:t>
+      </w:r>
+      <w:r>
+        <w:t xml:space="preserve"> </w:t>
+      </w:r>
+      <w:r>
+        <w:t xml:space="preserve">content</w:t>
+      </w:r>
+      <w:r>
+        <w:t xml:space="preserve"> </w:t>
+      </w:r>
+      <m:oMath>
+        <m:r>
+          <m:t>C</m:t>
+        </m:r>
+      </m:oMath>
+      <w:r>
+        <w:t xml:space="preserve"> </w:t>
+      </w:r>
+      <w:r>
+        <w:t xml:space="preserve">intact under force-native article continuation.</w:t>
+      </w:r>
+    </w:p>
+    <w:p>
+      <w:pPr>
+        <w:pStyle w:val="FirstParagraph"/>
+      </w:pPr>
+      <w:r>
+        <w:t xml:space="preserve">Article</w:t>
+      </w:r>
+      <w:r>
+        <w:t xml:space="preserve"> </w:t>
+      </w:r>
+      <m:oMath>
+        <m:r>
+          <m:rPr>
+            <m:sty m:val="p"/>
+          </m:rPr>
+          <m:t>Δ</m:t>
+        </m:r>
+      </m:oMath>
+      <w:r>
+        <w:t xml:space="preserve"> </w:t>
+      </w:r>
+      <w:r>
+        <w:t xml:space="preserve">without content locking—and without the selective</w:t>
+      </w:r>
+      <w:r>
+        <w:t xml:space="preserve"> </w:t>
+      </w:r>
+      <w:r>
+        <w:t xml:space="preserve">force-native control—remains an insufficient metric for claiming</w:t>
+      </w:r>
+      <w:r>
+        <w:t xml:space="preserve"> </w:t>
+      </w:r>
+      <w:r>
+        <w:t xml:space="preserve">content-preserving latent planning.</w:t>
+      </w:r>
+    </w:p>
+    <w:bookmarkEnd w:id="101"/>
+    <w:bookmarkEnd w:id="102"/>
+    <w:bookmarkStart w:id="103" w:name="what-has-and-has-not-been-achieved"/>
+    <w:p>
+      <w:pPr>
+        <w:pStyle w:val="Heading1"/>
+      </w:pPr>
+      <w:r>
+        <w:t xml:space="preserve">11. What has and has not been achieved</w:t>
+      </w:r>
+    </w:p>
+    <w:p>
+      <w:pPr>
+        <w:pStyle w:val="FirstParagraph"/>
+      </w:pPr>
+      <w:r>
+        <w:t xml:space="preserve">We have achieved:</w:t>
+      </w:r>
+    </w:p>
+    <w:p>
+      <w:pPr>
+        <w:pStyle w:val="Compact"/>
+        <w:numPr>
+          <w:ilvl w:val="0"/>
+          <w:numId w:val="1013"/>
+        </w:numPr>
+      </w:pPr>
+      <w:r>
+        <w:t xml:space="preserve">a reproducible, memory-safe Circuit Tracer workflow for Gemma 3 270M</w:t>
+      </w:r>
+      <w:r>
+        <w:t xml:space="preserve"> </w:t>
+      </w:r>
+      <w:r>
+        <w:t xml:space="preserve">on constrained hardware;</w:t>
+      </w:r>
+    </w:p>
+    <w:p>
+      <w:pPr>
+        <w:pStyle w:val="Compact"/>
+        <w:numPr>
+          <w:ilvl w:val="0"/>
+          <w:numId w:val="1013"/>
+        </w:numPr>
+      </w:pPr>
+      <w:r>
+        <w:t xml:space="preserve">behavioral replication of a strong minority-class</w:t>
+      </w:r>
+      <w:r>
+        <w:t xml:space="preserve"> </w:t>
+      </w:r>
+      <w:r>
+        <w:rPr>
+          <w:rStyle w:val="VerbatimChar"/>
+        </w:rPr>
+        <w:t xml:space="preserve">an</w:t>
+      </w:r>
+      <w:r>
+        <w:t xml:space="preserve"> </w:t>
+      </w:r>
+      <w:r>
+        <w:t xml:space="preserve">disadvantage as</w:t>
+      </w:r>
+      <w:r>
+        <w:t xml:space="preserve"> </w:t>
+      </w:r>
+      <w:r>
+        <w:t xml:space="preserve">found in</w:t>
+      </w:r>
+      <w:r>
+        <w:t xml:space="preserve"> </w:t>
+      </w:r>
+      <w:r>
+        <w:rPr>
+          <w:i/>
+          <w:iCs/>
+        </w:rPr>
+        <w:t xml:space="preserve">Latent Planning Emerges with Scale</w:t>
+      </w:r>
+      <w:r>
+        <w:t xml:space="preserve">;</w:t>
+      </w:r>
+    </w:p>
+    <w:p>
+      <w:pPr>
+        <w:pStyle w:val="Compact"/>
+        <w:numPr>
+          <w:ilvl w:val="0"/>
+          <w:numId w:val="1013"/>
+        </w:numPr>
+      </w:pPr>
+      <w:r>
+        <w:t xml:space="preserve">direct evidence that future-answer information is active before an</w:t>
+      </w:r>
+      <w:r>
+        <w:t xml:space="preserve"> </w:t>
+      </w:r>
+      <w:r>
+        <w:t xml:space="preserve">incorrect article in the ophthalmologist discovery case;</w:t>
+      </w:r>
+    </w:p>
+    <w:p>
+      <w:pPr>
+        <w:pStyle w:val="Compact"/>
+        <w:numPr>
+          <w:ilvl w:val="0"/>
+          <w:numId w:val="1013"/>
+        </w:numPr>
+      </w:pPr>
+      <w:r>
+        <w:t xml:space="preserve">a suppression-only intervention that corrected that source continuation</w:t>
+      </w:r>
+      <w:r>
+        <w:t xml:space="preserve"> </w:t>
+      </w:r>
+      <w:r>
+        <w:t xml:space="preserve">without directly ablating the future noun token in the original</w:t>
+      </w:r>
+      <w:r>
+        <w:t xml:space="preserve"> </w:t>
+      </w:r>
+      <w:r>
+        <w:t xml:space="preserve">mismatch setting;</w:t>
+      </w:r>
+    </w:p>
+    <w:p>
+      <w:pPr>
+        <w:pStyle w:val="Compact"/>
+        <w:numPr>
+          <w:ilvl w:val="0"/>
+          <w:numId w:val="1013"/>
+        </w:numPr>
+      </w:pPr>
+      <w:r>
+        <w:t xml:space="preserve">a held-out fixed-pair test showing coordinated article and lexical</w:t>
+      </w:r>
+      <w:r>
+        <w:t xml:space="preserve"> </w:t>
+      </w:r>
+      <w:r>
+        <w:t xml:space="preserve">choice—compiled trajectories (chunking), not grammar-only repair;</w:t>
+      </w:r>
+    </w:p>
+    <w:p>
+      <w:pPr>
+        <w:pStyle w:val="Compact"/>
+        <w:numPr>
+          <w:ilvl w:val="0"/>
+          <w:numId w:val="1013"/>
+        </w:numPr>
+      </w:pPr>
+      <w:r>
+        <w:t xml:space="preserve">a Latent-Planning-style gain-of-function clincher that class-switches</w:t>
+      </w:r>
+      <w:r>
+        <w:t xml:space="preserve"> </w:t>
+      </w:r>
+      <w:r>
+        <w:t xml:space="preserve">on held-out occupations (</w:t>
+      </w:r>
+      <w:r>
+        <w:rPr>
+          <w:rStyle w:val="VerbatimChar"/>
+        </w:rPr>
+        <w:t xml:space="preserve">a pilot</w:t>
+      </w:r>
+      <w:r>
+        <w:t xml:space="preserve">→</w:t>
+      </w:r>
+      <w:r>
+        <w:rPr>
+          <w:rStyle w:val="VerbatimChar"/>
+        </w:rPr>
+        <w:t xml:space="preserve">an aviator</w:t>
+      </w:r>
+      <w:r>
+        <w:t xml:space="preserve">, and analogues);</w:t>
+      </w:r>
+    </w:p>
+    <w:p>
+      <w:pPr>
+        <w:pStyle w:val="Compact"/>
+        <w:numPr>
+          <w:ilvl w:val="0"/>
+          <w:numId w:val="1013"/>
+        </w:numPr>
+      </w:pPr>
+      <w:r>
+        <w:t xml:space="preserve">a selection-criterion ablation showing that dual-effect, article-only,</w:t>
+      </w:r>
+      <w:r>
+        <w:t xml:space="preserve"> </w:t>
+      </w:r>
+      <w:r>
+        <w:t xml:space="preserve">content-only, and competing-</w:t>
+      </w:r>
+      <w:r>
+        <w:rPr>
+          <w:rStyle w:val="VerbatimChar"/>
+        </w:rPr>
+        <w:t xml:space="preserve">a</w:t>
+      </w:r>
+      <w:r>
+        <w:t xml:space="preserve"> </w:t>
+      </w:r>
+      <w:r>
+        <w:t xml:space="preserve">rules do not yield wrapper-like</w:t>
+      </w:r>
+      <w:r>
+        <w:t xml:space="preserve"> </w:t>
+      </w:r>
+      <w:r>
+        <w:t xml:space="preserve">held-out success;</w:t>
+      </w:r>
+    </w:p>
+    <w:p>
+      <w:pPr>
+        <w:pStyle w:val="Compact"/>
+        <w:numPr>
+          <w:ilvl w:val="0"/>
+          <w:numId w:val="1013"/>
+        </w:numPr>
+      </w:pPr>
+      <w:r>
+        <w:t xml:space="preserve">a dose–response with no content-preserving wrapper window;</w:t>
+      </w:r>
+    </w:p>
+    <w:p>
+      <w:pPr>
+        <w:pStyle w:val="Compact"/>
+        <w:numPr>
+          <w:ilvl w:val="0"/>
+          <w:numId w:val="1013"/>
+        </w:numPr>
+      </w:pPr>
+      <w:r>
+        <w:t xml:space="preserve">a dual content-lock test in which article-push and dual conditions</w:t>
+      </w:r>
+      <w:r>
+        <w:t xml:space="preserve"> </w:t>
+      </w:r>
+      <w:r>
+        <w:t xml:space="preserve">remain trajectory-like (chunking) while illicit mismatches stay near</w:t>
+      </w:r>
+      <w:r>
+        <w:t xml:space="preserve"> </w:t>
+      </w:r>
+      <w:r>
+        <w:t xml:space="preserve">zero;</w:t>
+      </w:r>
+    </w:p>
+    <w:p>
+      <w:pPr>
+        <w:pStyle w:val="Compact"/>
+        <w:numPr>
+          <w:ilvl w:val="0"/>
+          <w:numId w:val="1013"/>
+        </w:numPr>
+      </w:pPr>
+      <w:r>
+        <w:t xml:space="preserve">a twin-family causal tetrad in which gain-of-function selects</w:t>
+      </w:r>
+      <w:r>
+        <w:t xml:space="preserve"> </w:t>
+      </w:r>
+      <w:r>
+        <w:rPr>
+          <w:rStyle w:val="VerbatimChar"/>
+        </w:rPr>
+        <w:t xml:space="preserve">an aviator</w:t>
+      </w:r>
+      <w:r>
+        <w:t xml:space="preserve"> </w:t>
+      </w:r>
+      <w:r>
+        <w:t xml:space="preserve">/</w:t>
+      </w:r>
+      <w:r>
+        <w:t xml:space="preserve"> </w:t>
+      </w:r>
+      <w:r>
+        <w:rPr>
+          <w:rStyle w:val="VerbatimChar"/>
+        </w:rPr>
+        <w:t xml:space="preserve">an attorney</w:t>
+      </w:r>
+      <w:r>
+        <w:t xml:space="preserve"> </w:t>
+      </w:r>
+      <w:r>
+        <w:t xml:space="preserve">above matched controls;</w:t>
+      </w:r>
+    </w:p>
+    <w:p>
+      <w:pPr>
+        <w:pStyle w:val="Compact"/>
+        <w:numPr>
+          <w:ilvl w:val="0"/>
+          <w:numId w:val="1013"/>
+        </w:numPr>
+      </w:pPr>
+      <w:r>
+        <w:t xml:space="preserve">a selective</w:t>
+      </w:r>
+      <w:r>
+        <w:t xml:space="preserve"> </w:t>
+      </w:r>
+      <m:oMath>
+        <m:r>
+          <m:t>b</m:t>
+        </m:r>
+      </m:oMath>
+      <w:r>
+        <w:t xml:space="preserve">-step / force-native-article test showing that free</w:t>
+      </w:r>
+      <w:r>
+        <w:t xml:space="preserve"> </w:t>
+      </w:r>
+      <w:r>
+        <w:t xml:space="preserve">dual-effect amplification still class-switches while forcing the native</w:t>
+      </w:r>
+      <w:r>
+        <w:t xml:space="preserve"> </w:t>
+      </w:r>
+      <w:r>
+        <w:t xml:space="preserve">article restores baseline nouns, and that content-only features do not</w:t>
+      </w:r>
+      <w:r>
+        <w:t xml:space="preserve"> </w:t>
+      </w:r>
+      <w:r>
+        <w:t xml:space="preserve">supply a modular</w:t>
+      </w:r>
+      <w:r>
+        <w:t xml:space="preserve"> </w:t>
+      </w:r>
+      <m:oMath>
+        <m:r>
+          <m:t>C</m:t>
+        </m:r>
+        <m:r>
+          <m:rPr>
+            <m:sty m:val="p"/>
+          </m:rPr>
+          <m:t>→</m:t>
+        </m:r>
+        <m:r>
+          <m:t>B</m:t>
+        </m:r>
+      </m:oMath>
+      <w:r>
+        <w:t xml:space="preserve"> </w:t>
+      </w:r>
+      <w:r>
+        <w:t xml:space="preserve">licensing handle;</w:t>
+      </w:r>
+    </w:p>
+    <w:p>
+      <w:pPr>
+        <w:pStyle w:val="Compact"/>
+        <w:numPr>
+          <w:ilvl w:val="0"/>
+          <w:numId w:val="1013"/>
+        </w:numPr>
+      </w:pPr>
+      <w:r>
+        <w:t xml:space="preserve">an explicit stack decision for pretrained + affine over IT + non-affine</w:t>
+      </w:r>
+      <w:r>
+        <w:t xml:space="preserve"> </w:t>
+      </w:r>
+      <w:r>
+        <w:t xml:space="preserve">for this hypothesis test.</w:t>
+      </w:r>
+    </w:p>
+    <w:p>
+      <w:pPr>
+        <w:pStyle w:val="FirstParagraph"/>
+      </w:pPr>
+      <w:r>
+        <w:t xml:space="preserve">We have not achieved:</w:t>
+      </w:r>
+    </w:p>
+    <w:p>
+      <w:pPr>
+        <w:pStyle w:val="Compact"/>
+        <w:numPr>
+          <w:ilvl w:val="0"/>
+          <w:numId w:val="1014"/>
+        </w:numPr>
+      </w:pPr>
+      <w:r>
+        <w:t xml:space="preserve">a general tool for reducing stalling behavior on country–city prompts;</w:t>
+      </w:r>
+    </w:p>
+    <w:p>
+      <w:pPr>
+        <w:pStyle w:val="Compact"/>
+        <w:numPr>
+          <w:ilvl w:val="0"/>
+          <w:numId w:val="1014"/>
+        </w:numPr>
+      </w:pPr>
+      <w:r>
+        <w:t xml:space="preserve">a content-preserving grammar correction that transfers across prompts;</w:t>
+      </w:r>
+    </w:p>
+    <w:p>
+      <w:pPr>
+        <w:pStyle w:val="Compact"/>
+        <w:numPr>
+          <w:ilvl w:val="0"/>
+          <w:numId w:val="1014"/>
+        </w:numPr>
+      </w:pPr>
+      <w:r>
+        <w:t xml:space="preserve">evidence that the country–city</w:t>
+      </w:r>
+      <w:r>
+        <w:t xml:space="preserve"> </w:t>
+      </w:r>
+      <w:r>
+        <w:rPr>
+          <w:rStyle w:val="VerbatimChar"/>
+        </w:rPr>
+        <w:t xml:space="preserve">the</w:t>
+      </w:r>
+      <w:r>
+        <w:t xml:space="preserve"> </w:t>
+      </w:r>
+      <w:r>
+        <w:t xml:space="preserve">token reflects one reusable</w:t>
+      </w:r>
+      <w:r>
+        <w:t xml:space="preserve"> </w:t>
+      </w:r>
+      <w:r>
+        <w:t xml:space="preserve">stalling circuit;</w:t>
+      </w:r>
+    </w:p>
+    <w:p>
+      <w:pPr>
+        <w:pStyle w:val="Compact"/>
+        <w:numPr>
+          <w:ilvl w:val="0"/>
+          <w:numId w:val="1014"/>
+        </w:numPr>
+      </w:pPr>
+      <w:r>
+        <w:t xml:space="preserve">proof that compiled trajectories (chunking) are the story at larger</w:t>
+      </w:r>
+      <w:r>
+        <w:t xml:space="preserve"> </w:t>
+      </w:r>
+      <w:r>
+        <w:t xml:space="preserve">scales or in other model families—the Latent Planning scale axis is</w:t>
+      </w:r>
+      <w:r>
+        <w:t xml:space="preserve"> </w:t>
+      </w:r>
+      <w:r>
+        <w:t xml:space="preserve">outside our hardware envelope;</w:t>
+      </w:r>
+    </w:p>
+    <w:p>
+      <w:pPr>
+        <w:pStyle w:val="Compact"/>
+        <w:numPr>
+          <w:ilvl w:val="0"/>
+          <w:numId w:val="1014"/>
+        </w:numPr>
+      </w:pPr>
+      <w:r>
+        <w:t xml:space="preserve">a complete necessity story from zero-ablation alone on twin baselines</w:t>
+      </w:r>
+      <w:r>
+        <w:t xml:space="preserve"> </w:t>
+      </w:r>
+      <w:r>
+        <w:t xml:space="preserve">(GoF/specificity carry more of the causal weight here);</w:t>
+      </w:r>
+    </w:p>
+    <w:p>
+      <w:pPr>
+        <w:pStyle w:val="Compact"/>
+        <w:numPr>
+          <w:ilvl w:val="0"/>
+          <w:numId w:val="1014"/>
+        </w:numPr>
+      </w:pPr>
+      <w:r>
+        <w:t xml:space="preserve">a pure context-concept (</w:t>
+      </w:r>
+      <m:oMath>
+        <m:r>
+          <m:t>A</m:t>
+        </m:r>
+      </m:oMath>
+      <w:r>
+        <w:t xml:space="preserve">) feature set for the full</w:t>
+      </w:r>
+      <w:r>
+        <w:t xml:space="preserve"> </w:t>
+      </w:r>
+      <m:oMath>
+        <m:r>
+          <m:t>A</m:t>
+        </m:r>
+        <m:r>
+          <m:rPr>
+            <m:sty m:val="p"/>
+          </m:rPr>
+          <m:t>→</m:t>
+        </m:r>
+        <m:r>
+          <m:t>C</m:t>
+        </m:r>
+        <m:r>
+          <m:rPr>
+            <m:sty m:val="p"/>
+          </m:rPr>
+          <m:t>→</m:t>
+        </m:r>
+        <m:r>
+          <m:t>B</m:t>
+        </m:r>
+      </m:oMath>
+      <w:r>
+        <w:t xml:space="preserve"> </w:t>
+      </w:r>
+      <w:r>
+        <w:t xml:space="preserve">latent triad (Stage XV tested</w:t>
+      </w:r>
+      <w:r>
+        <w:t xml:space="preserve"> </w:t>
+      </w:r>
+      <m:oMath>
+        <m:r>
+          <m:t>B</m:t>
+        </m:r>
+      </m:oMath>
+      <w:r>
+        <w:t xml:space="preserve">/</w:t>
+      </w:r>
+      <w:r>
+        <w:t xml:space="preserve"> </w:t>
+      </w:r>
+      <m:oMath>
+        <m:r>
+          <m:t>C</m:t>
+        </m:r>
+      </m:oMath>
+      <w:r>
+        <w:t xml:space="preserve">/joint sets).</w:t>
+      </w:r>
+    </w:p>
+    <w:p>
+      <w:pPr>
+        <w:pStyle w:val="FirstParagraph"/>
+      </w:pPr>
+      <w:r>
+        <w:t xml:space="preserve">The main scientific progress is therefore twofold. First, increasingly</w:t>
+      </w:r>
+      <w:r>
+        <w:t xml:space="preserve"> </w:t>
+      </w:r>
+      <w:r>
+        <w:t xml:space="preserve">stringent transfer and specificity tests rejected the simplest stalling</w:t>
+      </w:r>
+      <w:r>
+        <w:t xml:space="preserve"> </w:t>
+      </w:r>
+      <w:r>
+        <w:t xml:space="preserve">and wrapper readings. Second, the same tests—extended with Latent</w:t>
+      </w:r>
+      <w:r>
+        <w:t xml:space="preserve"> </w:t>
+      </w:r>
+      <w:r>
+        <w:t xml:space="preserve">Planning-style gain-of-function, dose, dual lock, twin controls, and</w:t>
+      </w:r>
+      <w:r>
+        <w:t xml:space="preserve"> </w:t>
+      </w:r>
+      <w:r>
+        <w:t xml:space="preserve">selective force-native article continuation—support a precise positive</w:t>
+      </w:r>
+      <w:r>
+        <w:t xml:space="preserve"> </w:t>
+      </w:r>
+      <w:r>
+        <w:t xml:space="preserve">claim: in this small model, sparse “planning-looking” features causally</w:t>
+      </w:r>
+      <w:r>
+        <w:t xml:space="preserve"> </w:t>
+      </w:r>
+      <w:r>
+        <w:t xml:space="preserve">select preparation–content packages (chunks), so article interventions</w:t>
+      </w:r>
+      <w:r>
+        <w:t xml:space="preserve"> </w:t>
+      </w:r>
+      <w:r>
+        <w:t xml:space="preserve">must not be scored as content-preserving latent planning unless content</w:t>
+      </w:r>
+      <w:r>
+        <w:t xml:space="preserve"> </w:t>
+      </w:r>
+      <w:r>
+        <w:t xml:space="preserve">identity is locked.</w:t>
+      </w:r>
+    </w:p>
+    <w:bookmarkEnd w:id="103"/>
+    <w:bookmarkStart w:id="104" w:name="reproducibility-map"/>
+    <w:p>
+      <w:pPr>
+        <w:pStyle w:val="Heading1"/>
+      </w:pPr>
+      <w:r>
+        <w:t xml:space="preserve">Reproducibility map</w:t>
+      </w:r>
+    </w:p>
+    <w:p>
+      <w:pPr>
+        <w:pStyle w:val="FirstParagraph"/>
+      </w:pPr>
+      <w:r>
+        <w:t xml:space="preserve">The reports and machine-readable outputs are organized by experiment:</w:t>
+      </w:r>
+    </w:p>
+    <w:tbl>
+      <w:tblPr>
+        <w:tblStyle w:val="Table"/>
+        <w:tblW w:type="pct" w:w="5000"/>
+        <w:tblLayout w:type="fixed"/>
+        <w:tblLook w:firstRow="1" w:lastRow="0" w:firstColumn="0" w:lastColumn="0" w:noHBand="0" w:noVBand="0" w:val="0020"/>
+      </w:tblPr>
+      <w:tblGrid>
+        <w:gridCol w:w="3960"/>
+        <w:gridCol w:w="3960"/>
+      </w:tblGrid>
+      <w:tr>
+        <w:trPr>
+          <w:tblHeader w:val="on"/>
+        </w:trPr>
+        <w:tc>
+          <w:tcPr/>
+          <w:p>
+            <w:pPr>
+              <w:pStyle w:val="Compact"/>
+            </w:pPr>
+            <w:r>
               <w:t xml:space="preserve">Stage</w:t>
             </w:r>
           </w:p>
@@ -10647,6 +13731,44 @@
               <w:pStyle w:val="Compact"/>
             </w:pPr>
             <w:r>
+              <w:t xml:space="preserve">Selective</w:t>
+            </w:r>
+            <w:r>
+              <w:t xml:space="preserve"> </w:t>
+            </w:r>
+            <m:oMath>
+              <m:r>
+                <m:t>b</m:t>
+              </m:r>
+            </m:oMath>
+            <w:r>
+              <w:t xml:space="preserve">-step + force-native article</w:t>
+            </w:r>
+          </w:p>
+        </w:tc>
+        <w:tc>
+          <w:tcPr/>
+          <w:p>
+            <w:pPr>
+              <w:pStyle w:val="Compact"/>
+            </w:pPr>
+            <w:r>
+              <w:rPr>
+                <w:rStyle w:val="VerbatimChar"/>
+              </w:rPr>
+              <w:t xml:space="preserve">experiments/selective_bc_force_native/</w:t>
+            </w:r>
+          </w:p>
+        </w:tc>
+      </w:tr>
+      <w:tr>
+        <w:tc>
+          <w:tcPr/>
+          <w:p>
+            <w:pPr>
+              <w:pStyle w:val="Compact"/>
+            </w:pPr>
+            <w:r>
               <w:t xml:space="preserve">Paper execution contract</w:t>
             </w:r>
           </w:p>
@@ -10762,7 +13884,7 @@
         <w:t xml:space="preserve">(Pandoc path).</w:t>
       </w:r>
     </w:p>
-    <w:bookmarkEnd w:id="95"/>
+    <w:bookmarkEnd w:id="104"/>
     <w:sectPr>
       <w:pgSz w:h="15840" w:orient="portrait" w:w="12240"/>
       <w:pgMar w:bottom="1440" w:footer="720" w:header="720" w:left="1440" w:right="1440" w:top="1440"/>
@@ -11178,6 +14300,91 @@
       <w:rPr>
         <w:rFonts w:ascii="Wingdings" w:hAnsi="Wingdings" w:cs="Wingdings" w:hint="default"/>
       </w:rPr>
+    </w:lvl>
+  </w:abstractNum>
+  <w:abstractNum w:abstractNumId="99411">
+    <w:nsid w:val="00A99411"/>
+    <w:multiLevelType w:val="multilevel"/>
+    <w:lvl w:ilvl="0">
+      <w:start w:val="1"/>
+      <w:numFmt w:val="decimal"/>
+      <w:lvlText w:val="%1."/>
+      <w:lvlJc w:val="left"/>
+      <w:pPr>
+        <w:ind w:left="720" w:hanging="360"/>
+      </w:pPr>
+    </w:lvl>
+    <w:lvl w:ilvl="1">
+      <w:start w:val="1"/>
+      <w:numFmt w:val="decimal"/>
+      <w:lvlText w:val="%2."/>
+      <w:lvlJc w:val="left"/>
+      <w:pPr>
+        <w:ind w:left="1440" w:hanging="360"/>
+      </w:pPr>
+    </w:lvl>
+    <w:lvl w:ilvl="2">
+      <w:start w:val="1"/>
+      <w:numFmt w:val="decimal"/>
+      <w:lvlText w:val="%3."/>
+      <w:lvlJc w:val="left"/>
+      <w:pPr>
+        <w:ind w:left="2160" w:hanging="360"/>
+      </w:pPr>
+    </w:lvl>
+    <w:lvl w:ilvl="3">
+      <w:start w:val="1"/>
+      <w:numFmt w:val="decimal"/>
+      <w:lvlText w:val="%4."/>
+      <w:lvlJc w:val="left"/>
+      <w:pPr>
+        <w:ind w:left="2880" w:hanging="360"/>
+      </w:pPr>
+    </w:lvl>
+    <w:lvl w:ilvl="4">
+      <w:start w:val="1"/>
+      <w:numFmt w:val="decimal"/>
+      <w:lvlText w:val="%5."/>
+      <w:lvlJc w:val="left"/>
+      <w:pPr>
+        <w:ind w:left="3600" w:hanging="360"/>
+      </w:pPr>
+    </w:lvl>
+    <w:lvl w:ilvl="5">
+      <w:start w:val="1"/>
+      <w:numFmt w:val="decimal"/>
+      <w:lvlText w:val="%6."/>
+      <w:lvlJc w:val="left"/>
+      <w:pPr>
+        <w:ind w:left="4320" w:hanging="360"/>
+      </w:pPr>
+    </w:lvl>
+    <w:lvl w:ilvl="6">
+      <w:start w:val="1"/>
+      <w:numFmt w:val="decimal"/>
+      <w:lvlText w:val="%7."/>
+      <w:lvlJc w:val="left"/>
+      <w:pPr>
+        <w:ind w:left="5040" w:hanging="360"/>
+      </w:pPr>
+    </w:lvl>
+    <w:lvl w:ilvl="7">
+      <w:start w:val="1"/>
+      <w:numFmt w:val="decimal"/>
+      <w:lvlText w:val="%8."/>
+      <w:lvlJc w:val="left"/>
+      <w:pPr>
+        <w:ind w:left="5760" w:hanging="360"/>
+      </w:pPr>
+    </w:lvl>
+    <w:lvl w:ilvl="8">
+      <w:start w:val="1"/>
+      <w:numFmt w:val="decimal"/>
+      <w:lvlText w:val="%9."/>
+      <w:lvlJc w:val="left"/>
+      <w:pPr>
+        <w:ind w:left="6480" w:hanging="360"/>
+      </w:pPr>
     </w:lvl>
   </w:abstractNum>
   <w:num w:numId="1">
@@ -11220,9 +14427,69 @@
     <w:abstractNumId w:val="991"/>
   </w:num>
   <w:num w:numId="1011">
+    <w:abstractNumId w:val="99411"/>
+    <w:lvlOverride w:ilvl="0">
+      <w:startOverride w:val="1"/>
+    </w:lvlOverride>
+    <w:lvlOverride w:ilvl="1">
+      <w:startOverride w:val="1"/>
+    </w:lvlOverride>
+    <w:lvlOverride w:ilvl="2">
+      <w:startOverride w:val="1"/>
+    </w:lvlOverride>
+    <w:lvlOverride w:ilvl="3">
+      <w:startOverride w:val="1"/>
+    </w:lvlOverride>
+    <w:lvlOverride w:ilvl="4">
+      <w:startOverride w:val="1"/>
+    </w:lvlOverride>
+    <w:lvlOverride w:ilvl="5">
+      <w:startOverride w:val="1"/>
+    </w:lvlOverride>
+    <w:lvlOverride w:ilvl="6">
+      <w:startOverride w:val="1"/>
+    </w:lvlOverride>
+    <w:lvlOverride w:ilvl="7">
+      <w:startOverride w:val="1"/>
+    </w:lvlOverride>
+    <w:lvlOverride w:ilvl="8">
+      <w:startOverride w:val="1"/>
+    </w:lvlOverride>
+  </w:num>
+  <w:num w:numId="1012">
+    <w:abstractNumId w:val="99411"/>
+    <w:lvlOverride w:ilvl="0">
+      <w:startOverride w:val="1"/>
+    </w:lvlOverride>
+    <w:lvlOverride w:ilvl="1">
+      <w:startOverride w:val="1"/>
+    </w:lvlOverride>
+    <w:lvlOverride w:ilvl="2">
+      <w:startOverride w:val="1"/>
+    </w:lvlOverride>
+    <w:lvlOverride w:ilvl="3">
+      <w:startOverride w:val="1"/>
+    </w:lvlOverride>
+    <w:lvlOverride w:ilvl="4">
+      <w:startOverride w:val="1"/>
+    </w:lvlOverride>
+    <w:lvlOverride w:ilvl="5">
+      <w:startOverride w:val="1"/>
+    </w:lvlOverride>
+    <w:lvlOverride w:ilvl="6">
+      <w:startOverride w:val="1"/>
+    </w:lvlOverride>
+    <w:lvlOverride w:ilvl="7">
+      <w:startOverride w:val="1"/>
+    </w:lvlOverride>
+    <w:lvlOverride w:ilvl="8">
+      <w:startOverride w:val="1"/>
+    </w:lvlOverride>
+  </w:num>
+  <w:num w:numId="1013">
     <w:abstractNumId w:val="991"/>
   </w:num>
-  <w:num w:numId="1012">
+  <w:num w:numId="1014">
     <w:abstractNumId w:val="991"/>
   </w:num>
 </w:numbering>

</xml_diff>

<commit_message>
State the paper-strong anti-H1 claim and remaining experimental holes.
Make the scoped interim conclusion match our reasoning: these sparse
features do not demonstrate independent C→c with b fixed, so free noun
change tracks b→c and should not be read as modular planning—without
claiming a network-wide refutation. Document the missing within-class
fixed-b and latent-probe experiments needed to push harder.

Co-authored-by: Cursor <cursoragent@cursor.com>
</commit_message>
<xml_diff>
--- a/docs/collaborator-report/collaborator-report-v3.docx
+++ b/docs/collaborator-report/collaborator-report-v3.docx
@@ -823,7 +823,7 @@
           <w:i/>
           <w:iCs/>
         </w:rPr>
-        <w:t xml:space="preserve">(Hypothesis H1). Holding the article fixed abolishes noun change under</w:t>
+        <w:t xml:space="preserve">(Hypothesis H1). With these intervenable features we cannot demonstrate</w:t>
       </w:r>
       <w:r>
         <w:rPr>
@@ -837,7 +837,7 @@
           <w:i/>
           <w:iCs/>
         </w:rPr>
-        <w:t xml:space="preserve">these interventions; free noun change tracks</w:t>
+        <w:t xml:space="preserve">independent</w:t>
       </w:r>
       <w:r>
         <w:rPr>
@@ -848,7 +848,7 @@
       </w:r>
       <m:oMath>
         <m:r>
-          <m:t>b</m:t>
+          <m:t>C</m:t>
         </m:r>
         <m:r>
           <m:rPr>
@@ -865,22 +865,27 @@
           <w:i/>
           <w:iCs/>
         </w:rPr>
-        <w:t xml:space="preserve">.</w:t>
+        <w:t xml:space="preserve"> </w:t>
       </w:r>
       <w:r>
         <w:rPr>
           <w:i/>
           <w:iCs/>
         </w:rPr>
-        <w:t xml:space="preserve"> </w:t>
+        <w:t xml:space="preserve">once</w:t>
       </w:r>
       <w:r>
         <w:rPr>
           <w:i/>
           <w:iCs/>
         </w:rPr>
-        <w:t xml:space="preserve">Article movement alone is not evidence of content-preserving latent</w:t>
-      </w:r>
+        <w:t xml:space="preserve"> </w:t>
+      </w:r>
+      <m:oMath>
+        <m:r>
+          <m:t>b</m:t>
+        </m:r>
+      </m:oMath>
       <w:r>
         <w:rPr>
           <w:i/>
@@ -893,7 +898,7 @@
           <w:i/>
           <w:iCs/>
         </w:rPr>
-        <w:t xml:space="preserve">planning unless the H1 edges—especially independent</w:t>
+        <w:t xml:space="preserve">is held fixed; free noun</w:t>
       </w:r>
       <w:r>
         <w:rPr>
@@ -902,9 +907,23 @@
         </w:rPr>
         <w:t xml:space="preserve"> </w:t>
       </w:r>
+      <w:r>
+        <w:rPr>
+          <w:i/>
+          <w:iCs/>
+        </w:rPr>
+        <w:t xml:space="preserve">change tracks</w:t>
+      </w:r>
+      <w:r>
+        <w:rPr>
+          <w:i/>
+          <w:iCs/>
+        </w:rPr>
+        <w:t xml:space="preserve"> </w:t>
+      </w:r>
       <m:oMath>
         <m:r>
-          <m:t>C</m:t>
+          <m:t>b</m:t>
         </m:r>
         <m:r>
           <m:rPr>
@@ -921,27 +940,22 @@
           <w:i/>
           <w:iCs/>
         </w:rPr>
-        <w:t xml:space="preserve"> </w:t>
+        <w:t xml:space="preserve">. That is strong evidence these</w:t>
       </w:r>
       <w:r>
         <w:rPr>
           <w:i/>
           <w:iCs/>
         </w:rPr>
-        <w:t xml:space="preserve">with</w:t>
+        <w:t xml:space="preserve"> </w:t>
       </w:r>
       <w:r>
         <w:rPr>
           <w:i/>
           <w:iCs/>
         </w:rPr>
-        <w:t xml:space="preserve"> </w:t>
-      </w:r>
-      <m:oMath>
-        <m:r>
-          <m:t>b</m:t>
-        </m:r>
-      </m:oMath>
+        <w:t xml:space="preserve">mechanisms are not modular latent planning and that</w:t>
+      </w:r>
       <w:r>
         <w:rPr>
           <w:i/>
@@ -954,7 +968,84 @@
           <w:i/>
           <w:iCs/>
         </w:rPr>
-        <w:t xml:space="preserve">fixed—are demonstrated.</w:t>
+        <w:t xml:space="preserve">article-conditioned packaging (or strong</w:t>
+      </w:r>
+      <w:r>
+        <w:rPr>
+          <w:i/>
+          <w:iCs/>
+        </w:rPr>
+        <w:t xml:space="preserve"> </w:t>
+      </w:r>
+      <m:oMath>
+        <m:r>
+          <m:t>b</m:t>
+        </m:r>
+        <m:r>
+          <m:rPr>
+            <m:sty m:val="p"/>
+          </m:rPr>
+          <m:t>→</m:t>
+        </m:r>
+        <m:r>
+          <m:t>c</m:t>
+        </m:r>
+      </m:oMath>
+      <w:r>
+        <w:rPr>
+          <w:i/>
+          <w:iCs/>
+        </w:rPr>
+        <w:t xml:space="preserve">) dominates</w:t>
+      </w:r>
+      <w:r>
+        <w:rPr>
+          <w:i/>
+          <w:iCs/>
+        </w:rPr>
+        <w:t xml:space="preserve"> </w:t>
+      </w:r>
+      <w:r>
+        <w:rPr>
+          <w:i/>
+          <w:iCs/>
+        </w:rPr>
+        <w:t xml:space="preserve">execution—without yet being a refutation of every</w:t>
+      </w:r>
+      <w:r>
+        <w:rPr>
+          <w:i/>
+          <w:iCs/>
+        </w:rPr>
+        <w:t xml:space="preserve"> </w:t>
+      </w:r>
+      <m:oMath>
+        <m:r>
+          <m:t>C</m:t>
+        </m:r>
+        <m:r>
+          <m:rPr>
+            <m:sty m:val="p"/>
+          </m:rPr>
+          <m:t>→</m:t>
+        </m:r>
+        <m:r>
+          <m:t>c</m:t>
+        </m:r>
+      </m:oMath>
+      <w:r>
+        <w:rPr>
+          <w:i/>
+          <w:iCs/>
+        </w:rPr>
+        <w:t xml:space="preserve"> </w:t>
+      </w:r>
+      <w:r>
+        <w:rPr>
+          <w:i/>
+          <w:iCs/>
+        </w:rPr>
+        <w:t xml:space="preserve">somewhere in the network (Section 11).</w:t>
       </w:r>
     </w:p>
     <w:p>
@@ -8342,6 +8433,53 @@
       <w:r>
         <w:t xml:space="preserve">those features—and thus against reading them as modular H1 planning.</w:t>
       </w:r>
+      <w:r>
+        <w:t xml:space="preserve"> </w:t>
+      </w:r>
+      <w:r>
+        <w:t xml:space="preserve">(Caveat and next experiment: within-class noun tests under fixed</w:t>
+      </w:r>
+      <w:r>
+        <w:t xml:space="preserve"> </w:t>
+      </w:r>
+      <m:oMath>
+        <m:r>
+          <m:t>b</m:t>
+        </m:r>
+      </m:oMath>
+      <w:r>
+        <w:t xml:space="preserve">,</w:t>
+      </w:r>
+      <w:r>
+        <w:t xml:space="preserve"> </w:t>
+      </w:r>
+      <w:r>
+        <w:t xml:space="preserve">Section 11—so failure is not dismissed as “</w:t>
+      </w:r>
+      <w:r>
+        <w:rPr>
+          <w:rStyle w:val="VerbatimChar"/>
+        </w:rPr>
+        <w:t xml:space="preserve">a</w:t>
+      </w:r>
+      <w:r>
+        <w:t xml:space="preserve"> </w:t>
+      </w:r>
+      <w:r>
+        <w:t xml:space="preserve">merely blocks</w:t>
+      </w:r>
+      <w:r>
+        <w:t xml:space="preserve"> </w:t>
+      </w:r>
+      <w:r>
+        <w:rPr>
+          <w:rStyle w:val="VerbatimChar"/>
+        </w:rPr>
+        <w:t xml:space="preserve">aviator</w:t>
+      </w:r>
+      <w:r>
+        <w:t xml:space="preserve">.”)</w:t>
+      </w:r>
     </w:p>
     <w:p>
       <w:pPr>
@@ -15158,76 +15296,23 @@
         <w:pStyle w:val="FirstParagraph"/>
       </w:pPr>
       <w:r>
-        <w:t xml:space="preserve">H1 remains</w:t>
-      </w:r>
-      <w:r>
-        <w:t xml:space="preserve"> </w:t>
-      </w:r>
-      <w:r>
         <w:rPr>
           <w:b/>
           <w:bCs/>
         </w:rPr>
-        <w:t xml:space="preserve">testable in principle</w:t>
-      </w:r>
-      <w:r>
-        <w:t xml:space="preserve">, but on these frozen feature sets and</w:t>
-      </w:r>
-      <w:r>
-        <w:t xml:space="preserve"> </w:t>
-      </w:r>
-      <w:r>
-        <w:t xml:space="preserve">prompts it is</w:t>
-      </w:r>
-      <w:r>
-        <w:t xml:space="preserve"> </w:t>
-      </w:r>
-      <w:r>
-        <w:rPr>
-          <w:b/>
-          <w:bCs/>
-        </w:rPr>
-        <w:t xml:space="preserve">not supported</w:t>
-      </w:r>
-      <w:r>
-        <w:t xml:space="preserve">. The selective paste-native-</w:t>
-      </w:r>
-      <m:oMath>
-        <m:r>
-          <m:t>b</m:t>
-        </m:r>
-      </m:oMath>
-      <w:r>
-        <w:t xml:space="preserve"> </w:t>
-      </w:r>
-      <w:r>
-        <w:t xml:space="preserve">protocol</w:t>
-      </w:r>
-      <w:r>
-        <w:t xml:space="preserve"> </w:t>
-      </w:r>
-      <w:r>
-        <w:t xml:space="preserve">strengthens H2 for these interventions: free S1 generation class-switches;</w:t>
-      </w:r>
-      <w:r>
-        <w:t xml:space="preserve"> </w:t>
-      </w:r>
-      <w:r>
-        <w:t xml:space="preserve">holding</w:t>
-      </w:r>
-      <w:r>
-        <w:t xml:space="preserve"> </w:t>
-      </w:r>
-      <m:oMath>
-        <m:r>
-          <m:t>b</m:t>
-        </m:r>
-      </m:oMath>
-      <w:r>
-        <w:t xml:space="preserve"> </w:t>
-      </w:r>
-      <w:r>
-        <w:t xml:space="preserve">fixed abolishes noun change; S3 does not supply modular</w:t>
+        <w:t xml:space="preserve">Emphatic result.</w:t>
+      </w:r>
+      <w:r>
+        <w:t xml:space="preserve"> </w:t>
+      </w:r>
+      <w:r>
+        <w:t xml:space="preserve">With these intervenable sparse features, we cannot</w:t>
+      </w:r>
+      <w:r>
+        <w:t xml:space="preserve"> </w:t>
+      </w:r>
+      <w:r>
+        <w:t xml:space="preserve">demonstrate independent</w:t>
       </w:r>
       <w:r>
         <w:t xml:space="preserve"> </w:t>
@@ -15243,11 +15328,258 @@
           <m:t>→</m:t>
         </m:r>
         <m:r>
+          <m:t>c</m:t>
+        </m:r>
+      </m:oMath>
+      <w:r>
+        <w:t xml:space="preserve"> </w:t>
+      </w:r>
+      <w:r>
+        <w:t xml:space="preserve">once</w:t>
+      </w:r>
+      <w:r>
+        <w:t xml:space="preserve"> </w:t>
+      </w:r>
+      <m:oMath>
+        <m:r>
+          <m:t>b</m:t>
+        </m:r>
+      </m:oMath>
+      <w:r>
+        <w:t xml:space="preserve"> </w:t>
+      </w:r>
+      <w:r>
+        <w:t xml:space="preserve">is held fixed.</w:t>
+      </w:r>
+      <w:r>
+        <w:t xml:space="preserve"> </w:t>
+      </w:r>
+      <w:r>
+        <w:t xml:space="preserve">Free S1 generation class-switches (</w:t>
+      </w:r>
+      <w:r>
+        <w:rPr>
+          <w:rStyle w:val="VerbatimChar"/>
+        </w:rPr>
+        <w:t xml:space="preserve">a pilot</w:t>
+      </w:r>
+      <w:r>
+        <w:t xml:space="preserve"> </w:t>
+      </w:r>
+      <w:r>
+        <w:t xml:space="preserve">→</w:t>
+      </w:r>
+      <w:r>
+        <w:t xml:space="preserve"> </w:t>
+      </w:r>
+      <w:r>
+        <w:rPr>
+          <w:rStyle w:val="VerbatimChar"/>
+        </w:rPr>
+        <w:t xml:space="preserve">an aviator</w:t>
+      </w:r>
+      <w:r>
+        <w:t xml:space="preserve">); pasting</w:t>
+      </w:r>
+      <w:r>
+        <w:t xml:space="preserve"> </w:t>
+      </w:r>
+      <w:r>
+        <w:t xml:space="preserve">native</w:t>
+      </w:r>
+      <w:r>
+        <w:t xml:space="preserve"> </w:t>
+      </w:r>
+      <m:oMath>
+        <m:r>
+          <m:t>b</m:t>
+        </m:r>
+      </m:oMath>
+      <w:r>
+        <w:t xml:space="preserve"> </w:t>
+      </w:r>
+      <w:r>
+        <w:t xml:space="preserve">restores native</w:t>
+      </w:r>
+      <w:r>
+        <w:t xml:space="preserve"> </w:t>
+      </w:r>
+      <m:oMath>
+        <m:r>
+          <m:t>c</m:t>
+        </m:r>
+      </m:oMath>
+      <w:r>
+        <w:t xml:space="preserve">; S3 does not supply modular</w:t>
+      </w:r>
+      <w:r>
+        <w:t xml:space="preserve"> </w:t>
+      </w:r>
+      <m:oMath>
+        <m:r>
+          <m:t>C</m:t>
+        </m:r>
+        <m:r>
+          <m:rPr>
+            <m:sty m:val="p"/>
+          </m:rPr>
+          <m:t>→</m:t>
+        </m:r>
+        <m:r>
           <m:t>B</m:t>
         </m:r>
       </m:oMath>
       <w:r>
+        <w:t xml:space="preserve">. Noun changes under free intervention track</w:t>
+      </w:r>
+      <w:r>
+        <w:t xml:space="preserve"> </w:t>
+      </w:r>
+      <m:oMath>
+        <m:r>
+          <m:t>b</m:t>
+        </m:r>
+        <m:r>
+          <m:rPr>
+            <m:sty m:val="p"/>
+          </m:rPr>
+          <m:t>→</m:t>
+        </m:r>
+        <m:r>
+          <m:t>c</m:t>
+        </m:r>
+      </m:oMath>
+      <w:r>
+        <w:t xml:space="preserve">. That is strong evidence these mechanisms are</w:t>
+      </w:r>
+      <w:r>
+        <w:t xml:space="preserve"> </w:t>
+      </w:r>
+      <w:r>
+        <w:rPr>
+          <w:b/>
+          <w:bCs/>
+        </w:rPr>
+        <w:t xml:space="preserve">not</w:t>
+      </w:r>
+      <w:r>
+        <w:t xml:space="preserve"> </w:t>
+      </w:r>
+      <w:r>
+        <w:t xml:space="preserve">H1 modular latent planning, and that article-conditioned packaging and/or</w:t>
+      </w:r>
+      <w:r>
+        <w:t xml:space="preserve"> </w:t>
+      </w:r>
+      <w:r>
+        <w:t xml:space="preserve">strong</w:t>
+      </w:r>
+      <w:r>
+        <w:t xml:space="preserve"> </w:t>
+      </w:r>
+      <m:oMath>
+        <m:r>
+          <m:t>b</m:t>
+        </m:r>
+        <m:r>
+          <m:rPr>
+            <m:sty m:val="p"/>
+          </m:rPr>
+          <m:t>→</m:t>
+        </m:r>
+        <m:r>
+          <m:t>c</m:t>
+        </m:r>
+      </m:oMath>
+      <w:r>
+        <w:t xml:space="preserve"> </w:t>
+      </w:r>
+      <w:r>
+        <w:t xml:space="preserve">dominates</w:t>
+      </w:r>
+      <w:r>
+        <w:t xml:space="preserve"> </w:t>
+      </w:r>
+      <w:r>
+        <w:rPr>
+          <w:b/>
+          <w:bCs/>
+        </w:rPr>
+        <w:t xml:space="preserve">execution</w:t>
+      </w:r>
+      <w:r>
+        <w:t xml:space="preserve"> </w:t>
+      </w:r>
+      <w:r>
+        <w:t xml:space="preserve">for the handles we</w:t>
+      </w:r>
+      <w:r>
+        <w:t xml:space="preserve"> </w:t>
+      </w:r>
+      <w:r>
+        <w:t xml:space="preserve">tested.</w:t>
+      </w:r>
+    </w:p>
+    <w:p>
+      <w:pPr>
+        <w:pStyle w:val="BodyText"/>
+      </w:pPr>
+      <w:r>
+        <w:t xml:space="preserve">This challenges the modular graph</w:t>
+      </w:r>
+      <w:r>
+        <w:t xml:space="preserve"> </w:t>
+      </w:r>
+      <w:r>
+        <w:rPr>
+          <w:b/>
+          <w:bCs/>
+        </w:rPr>
+        <w:t xml:space="preserve">as an account of our interventions</w:t>
+      </w:r>
+      <w:r>
         <w:t xml:space="preserve">.</w:t>
+      </w:r>
+      <w:r>
+        <w:t xml:space="preserve"> </w:t>
+      </w:r>
+      <w:r>
+        <w:t xml:space="preserve">It does not yet refute every possible</w:t>
+      </w:r>
+      <w:r>
+        <w:t xml:space="preserve"> </w:t>
+      </w:r>
+      <m:oMath>
+        <m:r>
+          <m:t>C</m:t>
+        </m:r>
+        <m:r>
+          <m:rPr>
+            <m:sty m:val="p"/>
+          </m:rPr>
+          <m:t>→</m:t>
+        </m:r>
+        <m:r>
+          <m:t>c</m:t>
+        </m:r>
+      </m:oMath>
+      <w:r>
+        <w:t xml:space="preserve"> </w:t>
+      </w:r>
+      <w:r>
+        <w:t xml:space="preserve">in the full</w:t>
+      </w:r>
+      <w:r>
+        <w:t xml:space="preserve"> </w:t>
+      </w:r>
+      <w:r>
+        <w:t xml:space="preserve">network (see Section 11 for the remaining within-class and latent-probe</w:t>
+      </w:r>
+      <w:r>
+        <w:t xml:space="preserve"> </w:t>
+      </w:r>
+      <w:r>
+        <w:t xml:space="preserve">holes).</w:t>
       </w:r>
     </w:p>
     <w:bookmarkEnd w:id="103"/>
@@ -15723,7 +16055,7 @@
     </w:p>
     <w:bookmarkEnd w:id="105"/>
     <w:bookmarkEnd w:id="106"/>
-    <w:bookmarkStart w:id="110" w:name="what-has-and-has-not-been-achieved"/>
+    <w:bookmarkStart w:id="112" w:name="what-has-and-has-not-been-achieved"/>
     <w:p>
       <w:pPr>
         <w:pStyle w:val="Heading1"/>
@@ -16721,15 +17053,17 @@
         </w:numPr>
       </w:pPr>
       <w:r>
-        <w:t xml:space="preserve">noun-identity latent probes that could still detect an “abandoned”</w:t>
-      </w:r>
-      <w:r>
-        <w:t xml:space="preserve"> </w:t>
-      </w:r>
-      <w:r>
-        <w:t xml:space="preserve">content plan after pasting native</w:t>
-      </w:r>
-      <w:r>
+        <w:rPr>
+          <w:b/>
+          <w:bCs/>
+        </w:rPr>
+        <w:t xml:space="preserve">within-class noun moves under fixed</w:t>
+      </w:r>
+      <w:r>
+        <w:rPr>
+          <w:b/>
+          <w:bCs/>
+        </w:rPr>
         <w:t xml:space="preserve"> </w:t>
       </w:r>
       <m:oMath>
@@ -16741,7 +17075,13 @@
         <w:t xml:space="preserve"> </w:t>
       </w:r>
       <w:r>
-        <w:t xml:space="preserve">(tokens only show execution);</w:t>
+        <w:t xml:space="preserve">(the main hole before a</w:t>
+      </w:r>
+      <w:r>
+        <w:t xml:space="preserve"> </w:t>
+      </w:r>
+      <w:r>
+        <w:t xml:space="preserve">harder anti-H1 claim; see above);</w:t>
       </w:r>
     </w:p>
     <w:p>
@@ -16753,19 +17093,7 @@
         </w:numPr>
       </w:pPr>
       <w:r>
-        <w:t xml:space="preserve">proof that H2 is the story at larger scales or in other model</w:t>
-      </w:r>
-      <w:r>
-        <w:t xml:space="preserve"> </w:t>
-      </w:r>
-      <w:r>
-        <w:t xml:space="preserve">families—the Latent Planning scale axis is outside our hardware</w:t>
-      </w:r>
-      <w:r>
-        <w:t xml:space="preserve"> </w:t>
-      </w:r>
-      <w:r>
-        <w:t xml:space="preserve">envelope;</w:t>
+        <w:t xml:space="preserve">noun-identity latent probes for plan-then-abandon vs package-reset;</w:t>
       </w:r>
     </w:p>
     <w:p>
@@ -16777,41 +17105,65 @@
         </w:numPr>
       </w:pPr>
       <w:r>
+        <w:t xml:space="preserve">proof that H2 is the story at larger scales or in other model</w:t>
+      </w:r>
+      <w:r>
+        <w:t xml:space="preserve"> </w:t>
+      </w:r>
+      <w:r>
+        <w:t xml:space="preserve">families—the Latent Planning scale axis is outside our hardware</w:t>
+      </w:r>
+      <w:r>
+        <w:t xml:space="preserve"> </w:t>
+      </w:r>
+      <w:r>
+        <w:t xml:space="preserve">envelope;</w:t>
+      </w:r>
+    </w:p>
+    <w:p>
+      <w:pPr>
+        <w:pStyle w:val="Compact"/>
+        <w:numPr>
+          <w:ilvl w:val="0"/>
+          <w:numId w:val="1017"/>
+        </w:numPr>
+      </w:pPr>
+      <w:r>
         <w:t xml:space="preserve">a complete necessity story from zero-ablation alone on twin baselines.</w:t>
       </w:r>
     </w:p>
     <w:bookmarkEnd w:id="108"/>
-    <w:bookmarkStart w:id="109" w:name="interim-paper-strong-conclusion"/>
+    <w:bookmarkStart w:id="109" w:name="X46d31a06604842fe089d9adc9cbb8d804c11a4b"/>
     <w:p>
       <w:pPr>
         <w:pStyle w:val="Heading2"/>
       </w:pPr>
       <w:r>
-        <w:t xml:space="preserve">Interim paper-strong conclusion</w:t>
+        <w:t xml:space="preserve">Interim paper-strong claim (stated as in our internal reasoning)</w:t>
       </w:r>
     </w:p>
     <w:p>
       <w:pPr>
         <w:pStyle w:val="FirstParagraph"/>
       </w:pPr>
-      <w:r>
-        <w:t xml:space="preserve">For Latent-Planning-style and content-oriented sparse interventions on</w:t>
-      </w:r>
-      <w:r>
-        <w:t xml:space="preserve"> </w:t>
-      </w:r>
       <w:r>
         <w:rPr>
           <w:b/>
           <w:bCs/>
         </w:rPr>
-        <w:t xml:space="preserve">this</w:t>
-      </w:r>
-      <w:r>
-        <w:t xml:space="preserve"> </w:t>
-      </w:r>
-      <w:r>
-        <w:t xml:space="preserve">model,</w:t>
+        <w:t xml:space="preserve">Claim (scoped).</w:t>
+      </w:r>
+      <w:r>
+        <w:t xml:space="preserve"> </w:t>
+      </w:r>
+      <w:r>
+        <w:t xml:space="preserve">On this small model, with these intervenable sparse</w:t>
+      </w:r>
+      <w:r>
+        <w:t xml:space="preserve"> </w:t>
+      </w:r>
+      <w:r>
+        <w:t xml:space="preserve">features, we</w:t>
       </w:r>
       <w:r>
         <w:t xml:space="preserve"> </w:t>
@@ -16821,40 +17173,13 @@
           <w:b/>
           <w:bCs/>
         </w:rPr>
-        <w:t xml:space="preserve">holding the article fixed abolishes noun change</w:t>
-      </w:r>
-      <w:r>
-        <w:t xml:space="preserve">; free</w:t>
-      </w:r>
-      <w:r>
-        <w:t xml:space="preserve"> </w:t>
-      </w:r>
-      <w:r>
-        <w:t xml:space="preserve">noun change tracks article change. That is strong evidence these</w:t>
-      </w:r>
-      <w:r>
-        <w:t xml:space="preserve"> </w:t>
-      </w:r>
-      <w:r>
-        <w:t xml:space="preserve">interventions do</w:t>
-      </w:r>
-      <w:r>
-        <w:t xml:space="preserve"> </w:t>
+        <w:t xml:space="preserve">cannot demonstrate independent</w:t>
       </w:r>
       <w:r>
         <w:rPr>
           <w:b/>
           <w:bCs/>
         </w:rPr>
-        <w:t xml:space="preserve">not</w:t>
-      </w:r>
-      <w:r>
-        <w:t xml:space="preserve"> </w:t>
-      </w:r>
-      <w:r>
-        <w:t xml:space="preserve">implement modular</w:t>
-      </w:r>
-      <w:r>
         <w:t xml:space="preserve"> </w:t>
       </w:r>
       <m:oMath>
@@ -16872,16 +17197,47 @@
         </m:r>
       </m:oMath>
       <w:r>
-        <w:t xml:space="preserve"> </w:t>
-      </w:r>
-      <w:r>
-        <w:t xml:space="preserve">independent</w:t>
-      </w:r>
-      <w:r>
-        <w:t xml:space="preserve"> </w:t>
-      </w:r>
-      <w:r>
-        <w:t xml:space="preserve">of</w:t>
+        <w:rPr>
+          <w:b/>
+          <w:bCs/>
+        </w:rPr>
+        <w:t xml:space="preserve"> </w:t>
+      </w:r>
+      <w:r>
+        <w:rPr>
+          <w:b/>
+          <w:bCs/>
+        </w:rPr>
+        <w:t xml:space="preserve">once</w:t>
+      </w:r>
+      <w:r>
+        <w:rPr>
+          <w:b/>
+          <w:bCs/>
+        </w:rPr>
+        <w:t xml:space="preserve"> </w:t>
+      </w:r>
+      <m:oMath>
+        <m:r>
+          <m:t>b</m:t>
+        </m:r>
+      </m:oMath>
+      <w:r>
+        <w:rPr>
+          <w:b/>
+          <w:bCs/>
+        </w:rPr>
+        <w:t xml:space="preserve"> </w:t>
+      </w:r>
+      <w:r>
+        <w:rPr>
+          <w:b/>
+          <w:bCs/>
+        </w:rPr>
+        <w:t xml:space="preserve">is held fixed</w:t>
+      </w:r>
+      <w:r>
+        <w:t xml:space="preserve">. Noun changes under free intervention track</w:t>
       </w:r>
       <w:r>
         <w:t xml:space="preserve"> </w:t>
@@ -16901,7 +17257,7 @@
         </m:r>
       </m:oMath>
       <w:r>
-        <w:t xml:space="preserve">, and therefore should</w:t>
+        <w:t xml:space="preserve">. That is</w:t>
       </w:r>
       <w:r>
         <w:t xml:space="preserve"> </w:t>
@@ -16911,57 +17267,54 @@
           <w:b/>
           <w:bCs/>
         </w:rPr>
-        <w:t xml:space="preserve">not</w:t>
-      </w:r>
-      <w:r>
-        <w:t xml:space="preserve"> </w:t>
-      </w:r>
-      <w:r>
-        <w:t xml:space="preserve">be read as confirming</w:t>
-      </w:r>
-      <w:r>
-        <w:t xml:space="preserve"> </w:t>
-      </w:r>
-      <w:r>
-        <w:t xml:space="preserve">the separable planning graph (H1) for these features.</w:t>
-      </w:r>
-    </w:p>
-    <w:p>
-      <w:pPr>
-        <w:pStyle w:val="BodyText"/>
-      </w:pPr>
-      <w:r>
-        <w:t xml:space="preserve">Equivalently: among the handles we can turn up and down, we have not</w:t>
-      </w:r>
-      <w:r>
-        <w:t xml:space="preserve"> </w:t>
-      </w:r>
-      <w:r>
-        <w:t xml:space="preserve">demonstrated independence of the H1 edges that would make “planning</w:t>
-      </w:r>
-      <w:r>
-        <w:t xml:space="preserve"> </w:t>
-      </w:r>
-      <w:r>
-        <w:t xml:space="preserve">features” mean an editable wrapper around a fixed content plan. What we</w:t>
-      </w:r>
-      <w:r>
-        <w:t xml:space="preserve"> </w:t>
-      </w:r>
-      <w:r>
-        <w:rPr>
-          <w:i/>
-          <w:iCs/>
-        </w:rPr>
-        <w:t xml:space="preserve">have</w:t>
-      </w:r>
-      <w:r>
-        <w:t xml:space="preserve"> </w:t>
-      </w:r>
-      <w:r>
-        <w:t xml:space="preserve">demonstrated is package-like control plus a real</w:t>
-      </w:r>
-      <w:r>
+        <w:t xml:space="preserve">strong evidence these mechanisms are not</w:t>
+      </w:r>
+      <w:r>
+        <w:rPr>
+          <w:b/>
+          <w:bCs/>
+        </w:rPr>
+        <w:t xml:space="preserve"> </w:t>
+      </w:r>
+      <w:r>
+        <w:rPr>
+          <w:b/>
+          <w:bCs/>
+        </w:rPr>
+        <w:t xml:space="preserve">modular latent planning (H1)</w:t>
+      </w:r>
+      <w:r>
+        <w:t xml:space="preserve">, and that</w:t>
+      </w:r>
+      <w:r>
+        <w:t xml:space="preserve"> </w:t>
+      </w:r>
+      <w:r>
+        <w:rPr>
+          <w:b/>
+          <w:bCs/>
+        </w:rPr>
+        <w:t xml:space="preserve">article-conditioned packaging</w:t>
+      </w:r>
+      <w:r>
+        <w:rPr>
+          <w:b/>
+          <w:bCs/>
+        </w:rPr>
+        <w:t xml:space="preserve"> </w:t>
+      </w:r>
+      <w:r>
+        <w:rPr>
+          <w:b/>
+          <w:bCs/>
+        </w:rPr>
+        <w:t xml:space="preserve">and/or strong</w:t>
+      </w:r>
+      <w:r>
+        <w:rPr>
+          <w:b/>
+          <w:bCs/>
+        </w:rPr>
         <w:t xml:space="preserve"> </w:t>
       </w:r>
       <m:oMath>
@@ -16979,33 +17332,10 @@
         </m:r>
       </m:oMath>
       <w:r>
-        <w:t xml:space="preserve"> </w:t>
-      </w:r>
-      <w:r>
-        <w:t xml:space="preserve">confounder—i.e., support for H2 as an account of</w:t>
-      </w:r>
-      <w:r>
-        <w:t xml:space="preserve"> </w:t>
-      </w:r>
-      <w:r>
         <w:rPr>
           <w:b/>
           <w:bCs/>
         </w:rPr>
-        <w:t xml:space="preserve">these interventions</w:t>
-      </w:r>
-      <w:r>
-        <w:t xml:space="preserve">.</w:t>
-      </w:r>
-    </w:p>
-    <w:p>
-      <w:pPr>
-        <w:pStyle w:val="BodyText"/>
-      </w:pPr>
-      <w:r>
-        <w:t xml:space="preserve">This is a</w:t>
-      </w:r>
-      <w:r>
         <w:t xml:space="preserve"> </w:t>
       </w:r>
       <w:r>
@@ -17013,25 +17343,19 @@
           <w:b/>
           <w:bCs/>
         </w:rPr>
-        <w:t xml:space="preserve">mechanistic / methodological</w:t>
-      </w:r>
-      <w:r>
-        <w:t xml:space="preserve"> </w:t>
-      </w:r>
-      <w:r>
-        <w:t xml:space="preserve">conclusion, not a claim that</w:t>
-      </w:r>
-      <w:r>
-        <w:t xml:space="preserve"> </w:t>
-      </w:r>
-      <w:r>
-        <w:t xml:space="preserve">Gemma 3 270M has no causal structure anywhere, nor that latent planning</w:t>
-      </w:r>
-      <w:r>
-        <w:t xml:space="preserve"> </w:t>
-      </w:r>
-      <w:r>
-        <w:t xml:space="preserve">is impossible at larger scales.</w:t>
+        <w:t xml:space="preserve">dominates execution</w:t>
+      </w:r>
+      <w:r>
+        <w:t xml:space="preserve"> </w:t>
+      </w:r>
+      <w:r>
+        <w:t xml:space="preserve">for the handles we</w:t>
+      </w:r>
+      <w:r>
+        <w:t xml:space="preserve"> </w:t>
+      </w:r>
+      <w:r>
+        <w:t xml:space="preserve">tested (H2 as an account of</w:t>
       </w:r>
       <w:r>
         <w:t xml:space="preserve"> </w:t>
@@ -17041,48 +17365,87 @@
           <w:i/>
           <w:iCs/>
         </w:rPr>
-        <w:t xml:space="preserve">Latent Planning Emerges with Scale</w:t>
-      </w:r>
-      <w:r>
-        <w:t xml:space="preserve"> </w:t>
-      </w:r>
-      <w:r>
-        <w:t xml:space="preserve">already places reliable a/an success at much larger models; our</w:t>
-      </w:r>
-      <w:r>
-        <w:t xml:space="preserve"> </w:t>
-      </w:r>
-      <w:r>
-        <w:t xml:space="preserve">contribution is to show why article-moving sparse interventions on a</w:t>
-      </w:r>
-      <w:r>
-        <w:t xml:space="preserve"> </w:t>
-      </w:r>
-      <w:r>
-        <w:t xml:space="preserve">small model are easy to</w:t>
-      </w:r>
-      <w:r>
-        <w:t xml:space="preserve"> </w:t>
-      </w:r>
+        <w:t xml:space="preserve">these interventions</w:t>
+      </w:r>
+      <w:r>
+        <w:t xml:space="preserve">).</w:t>
+      </w:r>
+    </w:p>
+    <w:p>
+      <w:pPr>
+        <w:pStyle w:val="BodyText"/>
+      </w:pPr>
       <w:r>
         <w:rPr>
           <w:b/>
           <w:bCs/>
         </w:rPr>
-        <w:t xml:space="preserve">misread</w:t>
-      </w:r>
-      <w:r>
-        <w:t xml:space="preserve"> </w:t>
-      </w:r>
-      <w:r>
-        <w:t xml:space="preserve">as modular planning if</w:t>
+        <w:t xml:space="preserve">What this is.</w:t>
+      </w:r>
+      <w:r>
+        <w:t xml:space="preserve"> </w:t>
+      </w:r>
+      <w:r>
+        <w:t xml:space="preserve">A paper-grade challenge to reading Latent-Planning-style</w:t>
+      </w:r>
+      <w:r>
+        <w:t xml:space="preserve"> </w:t>
+      </w:r>
+      <w:r>
+        <w:t xml:space="preserve">dual-effect (and related) sparse interventions on Gemma 3 270M as the</w:t>
+      </w:r>
+      <w:r>
+        <w:t xml:space="preserve"> </w:t>
+      </w:r>
+      <w:r>
+        <w:t xml:space="preserve">separable modular graph. It is the right emphasis for collaborators and</w:t>
+      </w:r>
+      <w:r>
+        <w:t xml:space="preserve"> </w:t>
+      </w:r>
+      <w:r>
+        <w:t xml:space="preserve">for a methods/results paper on misreading article flips.</w:t>
+      </w:r>
+    </w:p>
+    <w:p>
+      <w:pPr>
+        <w:pStyle w:val="BodyText"/>
+      </w:pPr>
+      <w:r>
+        <w:rPr>
+          <w:b/>
+          <w:bCs/>
+        </w:rPr>
+        <w:t xml:space="preserve">What this is not.</w:t>
+      </w:r>
+      <w:r>
+        <w:t xml:space="preserve"> </w:t>
+      </w:r>
+      <w:r>
+        <w:t xml:space="preserve">It is</w:t>
+      </w:r>
+      <w:r>
+        <w:t xml:space="preserve"> </w:t>
+      </w:r>
+      <w:r>
+        <w:rPr>
+          <w:b/>
+          <w:bCs/>
+        </w:rPr>
+        <w:t xml:space="preserve">not</w:t>
+      </w:r>
+      <w:r>
+        <w:t xml:space="preserve"> </w:t>
+      </w:r>
+      <w:r>
+        <w:t xml:space="preserve">a metaphysical refutation of any</w:t>
       </w:r>
       <w:r>
         <w:t xml:space="preserve"> </w:t>
       </w:r>
       <m:oMath>
         <m:r>
-          <m:t>b</m:t>
+          <m:t>C</m:t>
         </m:r>
         <m:r>
           <m:rPr>
@@ -17098,12 +17461,706 @@
         <w:t xml:space="preserve"> </w:t>
       </w:r>
       <w:r>
-        <w:t xml:space="preserve">and content identity are not tested as separate edges.</w:t>
+        <w:t xml:space="preserve">anywhere in the network, nor a claim that the model</w:t>
+      </w:r>
+      <w:r>
+        <w:t xml:space="preserve"> </w:t>
+      </w:r>
+      <w:r>
+        <w:t xml:space="preserve">has no causal structure, nor that latent planning is impossible at larger</w:t>
+      </w:r>
+      <w:r>
+        <w:t xml:space="preserve"> </w:t>
+      </w:r>
+      <w:r>
+        <w:t xml:space="preserve">scales. We tested specific frozen feature sets (S1/S2/S3/controls), not</w:t>
+      </w:r>
+      <w:r>
+        <w:t xml:space="preserve"> </w:t>
+      </w:r>
+      <w:r>
+        <w:t xml:space="preserve">all of activation space.</w:t>
+      </w:r>
+      <w:r>
+        <w:t xml:space="preserve"> </w:t>
+      </w:r>
+      <w:r>
+        <w:rPr>
+          <w:i/>
+          <w:iCs/>
+        </w:rPr>
+        <w:t xml:space="preserve">Latent Planning Emerges with Scale</w:t>
+      </w:r>
+      <w:r>
+        <w:t xml:space="preserve"> </w:t>
+      </w:r>
+      <w:r>
+        <w:t xml:space="preserve">already</w:t>
+      </w:r>
+      <w:r>
+        <w:t xml:space="preserve"> </w:t>
+      </w:r>
+      <w:r>
+        <w:t xml:space="preserve">places reliable a/an success at much larger models; our contribution is</w:t>
+      </w:r>
+      <w:r>
+        <w:t xml:space="preserve"> </w:t>
+      </w:r>
+      <w:r>
+        <w:t xml:space="preserve">to show why article-moving sparse interventions here are easy to</w:t>
+      </w:r>
+      <w:r>
+        <w:t xml:space="preserve"> </w:t>
+      </w:r>
+      <w:r>
+        <w:rPr>
+          <w:b/>
+          <w:bCs/>
+        </w:rPr>
+        <w:t xml:space="preserve">misread</w:t>
+      </w:r>
+      <w:r>
+        <w:t xml:space="preserve"> </w:t>
+      </w:r>
+      <w:r>
+        <w:t xml:space="preserve">as modular planning if</w:t>
+      </w:r>
+      <w:r>
+        <w:t xml:space="preserve"> </w:t>
+      </w:r>
+      <m:oMath>
+        <m:r>
+          <m:t>b</m:t>
+        </m:r>
+        <m:r>
+          <m:rPr>
+            <m:sty m:val="p"/>
+          </m:rPr>
+          <m:t>→</m:t>
+        </m:r>
+        <m:r>
+          <m:t>c</m:t>
+        </m:r>
+      </m:oMath>
+      <w:r>
+        <w:t xml:space="preserve"> </w:t>
+      </w:r>
+      <w:r>
+        <w:t xml:space="preserve">and content identity</w:t>
+      </w:r>
+      <w:r>
+        <w:t xml:space="preserve"> </w:t>
+      </w:r>
+      <w:r>
+        <w:t xml:space="preserve">are not tested as separate edges.</w:t>
+      </w:r>
+    </w:p>
+    <w:p>
+      <w:pPr>
+        <w:pStyle w:val="BodyText"/>
+      </w:pPr>
+      <w:r>
+        <w:rPr>
+          <w:b/>
+          <w:bCs/>
+        </w:rPr>
+        <w:t xml:space="preserve">One-sentence bottom line for readers:</w:t>
+      </w:r>
+      <w:r>
+        <w:t xml:space="preserve"> </w:t>
+      </w:r>
+      <w:r>
+        <w:t xml:space="preserve">holding the article fixed</w:t>
+      </w:r>
+      <w:r>
+        <w:t xml:space="preserve"> </w:t>
+      </w:r>
+      <w:r>
+        <w:t xml:space="preserve">abolishes noun change under these interventions; therefore free noun</w:t>
+      </w:r>
+      <w:r>
+        <w:t xml:space="preserve"> </w:t>
+      </w:r>
+      <w:r>
+        <w:t xml:space="preserve">change is not evidence of independent content causation for these</w:t>
+      </w:r>
+      <w:r>
+        <w:t xml:space="preserve"> </w:t>
+      </w:r>
+      <w:r>
+        <w:t xml:space="preserve">features.</w:t>
       </w:r>
     </w:p>
     <w:bookmarkEnd w:id="109"/>
+    <w:bookmarkStart w:id="110" w:name="X69f35625b0afe180d6b9eb586d8718d584be9ab"/>
+    <w:p>
+      <w:pPr>
+        <w:pStyle w:val="Heading2"/>
+      </w:pPr>
+      <w:r>
+        <w:t xml:space="preserve">What is still missing (before we can state the claim more forcefully)</w:t>
+      </w:r>
+    </w:p>
+    <w:p>
+      <w:pPr>
+        <w:pStyle w:val="FirstParagraph"/>
+      </w:pPr>
+      <w:r>
+        <w:t xml:space="preserve">The scoped claim above is already supported by Stage XV + E1–E3. Two</w:t>
+      </w:r>
+      <w:r>
+        <w:t xml:space="preserve"> </w:t>
+      </w:r>
+      <w:r>
+        <w:t xml:space="preserve">gaps still limit how hard we can push it:</w:t>
+      </w:r>
+    </w:p>
+    <w:p>
+      <w:pPr>
+        <w:pStyle w:val="Compact"/>
+        <w:numPr>
+          <w:ilvl w:val="0"/>
+          <w:numId w:val="1018"/>
+        </w:numPr>
+      </w:pPr>
+      <w:r>
+        <w:rPr>
+          <w:b/>
+          <w:bCs/>
+        </w:rPr>
+        <w:t xml:space="preserve">Within-class noun tests under fixed</w:t>
+      </w:r>
+      <w:r>
+        <w:rPr>
+          <w:b/>
+          <w:bCs/>
+        </w:rPr>
+        <w:t xml:space="preserve"> </w:t>
+      </w:r>
+      <m:oMath>
+        <m:r>
+          <m:t>b</m:t>
+        </m:r>
+      </m:oMath>
+      <w:r>
+        <w:t xml:space="preserve"> </w:t>
+      </w:r>
+      <w:r>
+        <w:rPr>
+          <w:i/>
+          <w:iCs/>
+        </w:rPr>
+        <w:t xml:space="preserve">(highest priority).</w:t>
+      </w:r>
+      <w:r>
+        <w:t xml:space="preserve"> </w:t>
+      </w:r>
+      <w:r>
+        <w:t xml:space="preserve">Pasting native</w:t>
+      </w:r>
+      <w:r>
+        <w:t xml:space="preserve"> </w:t>
+      </w:r>
+      <w:r>
+        <w:rPr>
+          <w:rStyle w:val="VerbatimChar"/>
+        </w:rPr>
+        <w:t xml:space="preserve">a</w:t>
+      </w:r>
+      <w:r>
+        <w:t xml:space="preserve"> </w:t>
+      </w:r>
+      <w:r>
+        <w:t xml:space="preserve">and failing to get</w:t>
+      </w:r>
+      <w:r>
+        <w:t xml:space="preserve"> </w:t>
+      </w:r>
+      <w:r>
+        <w:rPr>
+          <w:rStyle w:val="VerbatimChar"/>
+        </w:rPr>
+        <w:t xml:space="preserve">aviator</w:t>
+      </w:r>
+      <w:r>
+        <w:t xml:space="preserve"> </w:t>
+      </w:r>
+      <w:r>
+        <w:t xml:space="preserve">may partly reflect</w:t>
+      </w:r>
+      <w:r>
+        <w:t xml:space="preserve"> </w:t>
+      </w:r>
+      <w:r>
+        <w:t xml:space="preserve">English phonology (</w:t>
+      </w:r>
+      <m:oMath>
+        <m:r>
+          <m:t>b</m:t>
+        </m:r>
+        <m:r>
+          <m:rPr>
+            <m:sty m:val="p"/>
+          </m:rPr>
+          <m:t>→</m:t>
+        </m:r>
+        <m:r>
+          <m:t>c</m:t>
+        </m:r>
+      </m:oMath>
+      <w:r>
+        <w:t xml:space="preserve"> </w:t>
+      </w:r>
+      <w:r>
+        <w:t xml:space="preserve">blocking vowel-initial nouns),</w:t>
+      </w:r>
+      <w:r>
+        <w:t xml:space="preserve"> </w:t>
+      </w:r>
+      <w:r>
+        <w:t xml:space="preserve">not absence of</w:t>
+      </w:r>
+      <w:r>
+        <w:t xml:space="preserve"> </w:t>
+      </w:r>
+      <m:oMath>
+        <m:r>
+          <m:t>C</m:t>
+        </m:r>
+        <m:r>
+          <m:rPr>
+            <m:sty m:val="p"/>
+          </m:rPr>
+          <m:t>→</m:t>
+        </m:r>
+        <m:r>
+          <m:t>c</m:t>
+        </m:r>
+      </m:oMath>
+      <w:r>
+        <w:t xml:space="preserve">. To close that hole we need</w:t>
+      </w:r>
+      <w:r>
+        <w:t xml:space="preserve"> </w:t>
+      </w:r>
+      <w:r>
+        <w:t xml:space="preserve">interventions that try to change the noun</w:t>
+      </w:r>
+      <w:r>
+        <w:t xml:space="preserve"> </w:t>
+      </w:r>
+      <w:r>
+        <w:rPr>
+          <w:b/>
+          <w:bCs/>
+        </w:rPr>
+        <w:t xml:space="preserve">while staying inside the</w:t>
+      </w:r>
+      <w:r>
+        <w:rPr>
+          <w:b/>
+          <w:bCs/>
+        </w:rPr>
+        <w:t xml:space="preserve"> </w:t>
+      </w:r>
+      <w:r>
+        <w:rPr>
+          <w:b/>
+          <w:bCs/>
+        </w:rPr>
+        <w:t xml:space="preserve">article’s legal class</w:t>
+      </w:r>
+      <w:r>
+        <w:t xml:space="preserve">, for example:</w:t>
+      </w:r>
+    </w:p>
+    <w:p>
+      <w:pPr>
+        <w:pStyle w:val="Compact"/>
+        <w:numPr>
+          <w:ilvl w:val="1"/>
+          <w:numId w:val="1019"/>
+        </w:numPr>
+      </w:pPr>
+      <w:r>
+        <w:t xml:space="preserve">paste native</w:t>
+      </w:r>
+      <w:r>
+        <w:t xml:space="preserve"> </w:t>
+      </w:r>
+      <w:r>
+        <w:rPr>
+          <w:rStyle w:val="VerbatimChar"/>
+        </w:rPr>
+        <w:t xml:space="preserve">a</w:t>
+      </w:r>
+      <w:r>
+        <w:t xml:space="preserve">, then turn content-related features up/down and ask</w:t>
+      </w:r>
+      <w:r>
+        <w:t xml:space="preserve"> </w:t>
+      </w:r>
+      <w:r>
+        <w:t xml:space="preserve">whether</w:t>
+      </w:r>
+      <w:r>
+        <w:t xml:space="preserve"> </w:t>
+      </w:r>
+      <m:oMath>
+        <m:r>
+          <m:t>c</m:t>
+        </m:r>
+      </m:oMath>
+      <w:r>
+        <w:t xml:space="preserve"> </w:t>
+      </w:r>
+      <w:r>
+        <w:t xml:space="preserve">moves among consonant-initial occupations</w:t>
+      </w:r>
+      <w:r>
+        <w:t xml:space="preserve"> </w:t>
+      </w:r>
+      <w:r>
+        <w:t xml:space="preserve">(</w:t>
+      </w:r>
+      <w:r>
+        <w:rPr>
+          <w:rStyle w:val="VerbatimChar"/>
+        </w:rPr>
+        <w:t xml:space="preserve">pilot</w:t>
+      </w:r>
+      <w:r>
+        <w:t xml:space="preserve"> </w:t>
+      </w:r>
+      <w:r>
+        <w:t xml:space="preserve">↔</w:t>
+      </w:r>
+      <w:r>
+        <w:t xml:space="preserve"> </w:t>
+      </w:r>
+      <w:r>
+        <w:rPr>
+          <w:rStyle w:val="VerbatimChar"/>
+        </w:rPr>
+        <w:t xml:space="preserve">farmer</w:t>
+      </w:r>
+      <w:r>
+        <w:t xml:space="preserve">,</w:t>
+      </w:r>
+      <w:r>
+        <w:t xml:space="preserve"> </w:t>
+      </w:r>
+      <w:r>
+        <w:rPr>
+          <w:rStyle w:val="VerbatimChar"/>
+        </w:rPr>
+        <w:t xml:space="preserve">lawyer</w:t>
+      </w:r>
+      <w:r>
+        <w:t xml:space="preserve"> </w:t>
+      </w:r>
+      <w:r>
+        <w:t xml:space="preserve">↔</w:t>
+      </w:r>
+      <w:r>
+        <w:t xml:space="preserve"> </w:t>
+      </w:r>
+      <w:r>
+        <w:rPr>
+          <w:rStyle w:val="VerbatimChar"/>
+        </w:rPr>
+        <w:t xml:space="preserve">teacher</w:t>
+      </w:r>
+      <w:r>
+        <w:t xml:space="preserve">, …);</w:t>
+      </w:r>
+    </w:p>
+    <w:p>
+      <w:pPr>
+        <w:pStyle w:val="Compact"/>
+        <w:numPr>
+          <w:ilvl w:val="1"/>
+          <w:numId w:val="1019"/>
+        </w:numPr>
+      </w:pPr>
+      <w:r>
+        <w:t xml:space="preserve">paste</w:t>
+      </w:r>
+      <w:r>
+        <w:t xml:space="preserve"> </w:t>
+      </w:r>
+      <w:r>
+        <w:rPr>
+          <w:rStyle w:val="VerbatimChar"/>
+        </w:rPr>
+        <w:t xml:space="preserve">an</w:t>
+      </w:r>
+      <w:r>
+        <w:t xml:space="preserve"> </w:t>
+      </w:r>
+      <w:r>
+        <w:t xml:space="preserve">(or a vowel-licensing article), then ask whether</w:t>
+      </w:r>
+      <w:r>
+        <w:t xml:space="preserve"> </w:t>
+      </w:r>
+      <m:oMath>
+        <m:r>
+          <m:t>c</m:t>
+        </m:r>
+      </m:oMath>
+      <w:r>
+        <w:t xml:space="preserve"> </w:t>
+      </w:r>
+      <w:r>
+        <w:t xml:space="preserve">moves among vowel-initial occupations.</w:t>
+      </w:r>
+      <w:r>
+        <w:t xml:space="preserve"> </w:t>
+      </w:r>
+      <w:r>
+        <w:t xml:space="preserve">If those also fail across content-targeted handles, the</w:t>
+      </w:r>
+      <w:r>
+        <w:t xml:space="preserve"> </w:t>
+      </w:r>
+      <w:r>
+        <w:t xml:space="preserve">“no independent</w:t>
+      </w:r>
+      <w:r>
+        <w:t xml:space="preserve"> </w:t>
+      </w:r>
+      <m:oMath>
+        <m:r>
+          <m:t>C</m:t>
+        </m:r>
+        <m:r>
+          <m:rPr>
+            <m:sty m:val="p"/>
+          </m:rPr>
+          <m:t>→</m:t>
+        </m:r>
+        <m:r>
+          <m:t>c</m:t>
+        </m:r>
+      </m:oMath>
+      <w:r>
+        <w:t xml:space="preserve"> </w:t>
+      </w:r>
+      <w:r>
+        <w:t xml:space="preserve">for these features” claim becomes</w:t>
+      </w:r>
+      <w:r>
+        <w:t xml:space="preserve"> </w:t>
+      </w:r>
+      <w:r>
+        <w:t xml:space="preserve">much harder to dismiss as a grammar artifact.</w:t>
+      </w:r>
+    </w:p>
+    <w:p>
+      <w:pPr>
+        <w:pStyle w:val="Compact"/>
+        <w:numPr>
+          <w:ilvl w:val="0"/>
+          <w:numId w:val="1018"/>
+        </w:numPr>
+      </w:pPr>
+      <w:r>
+        <w:rPr>
+          <w:b/>
+          <w:bCs/>
+        </w:rPr>
+        <w:t xml:space="preserve">Latent content identity at article time and after paste-native</w:t>
+      </w:r>
+      <w:r>
+        <w:rPr>
+          <w:b/>
+          <w:bCs/>
+        </w:rPr>
+        <w:t xml:space="preserve"> </w:t>
+      </w:r>
+      <m:oMath>
+        <m:r>
+          <m:t>b</m:t>
+        </m:r>
+      </m:oMath>
+      <w:r>
+        <w:rPr>
+          <w:b/>
+          <w:bCs/>
+        </w:rPr>
+        <w:t xml:space="preserve">.</w:t>
+      </w:r>
+      <w:r>
+        <w:t xml:space="preserve"> </w:t>
+      </w:r>
+      <w:r>
+        <w:t xml:space="preserve">Written tokens only show execution. A content plan could rise under</w:t>
+      </w:r>
+      <w:r>
+        <w:t xml:space="preserve"> </w:t>
+      </w:r>
+      <w:r>
+        <w:t xml:space="preserve">S1 and then be abandoned when</w:t>
+      </w:r>
+      <w:r>
+        <w:t xml:space="preserve"> </w:t>
+      </w:r>
+      <w:r>
+        <w:rPr>
+          <w:rStyle w:val="VerbatimChar"/>
+        </w:rPr>
+        <w:t xml:space="preserve">a</w:t>
+      </w:r>
+      <w:r>
+        <w:t xml:space="preserve"> </w:t>
+      </w:r>
+      <w:r>
+        <w:t xml:space="preserve">is pasted. Noun-identity or</w:t>
+      </w:r>
+      <w:r>
+        <w:t xml:space="preserve"> </w:t>
+      </w:r>
+      <w:r>
+        <w:t xml:space="preserve">class probes (pilot vs aviator features) at (i) the article step under</w:t>
+      </w:r>
+      <w:r>
+        <w:t xml:space="preserve"> </w:t>
+      </w:r>
+      <w:r>
+        <w:t xml:space="preserve">intervention and (ii) the noun step after paste-native</w:t>
+      </w:r>
+      <w:r>
+        <w:t xml:space="preserve"> </w:t>
+      </w:r>
+      <m:oMath>
+        <m:r>
+          <m:t>b</m:t>
+        </m:r>
+      </m:oMath>
+      <w:r>
+        <w:t xml:space="preserve"> </w:t>
+      </w:r>
+      <w:r>
+        <w:t xml:space="preserve">would</w:t>
+      </w:r>
+      <w:r>
+        <w:t xml:space="preserve"> </w:t>
+      </w:r>
+      <w:r>
+        <w:t xml:space="preserve">distinguish packaging-with-reset from plan-then-abandon. That does not</w:t>
+      </w:r>
+      <w:r>
+        <w:t xml:space="preserve"> </w:t>
+      </w:r>
+      <w:r>
+        <w:t xml:space="preserve">weaken the scoped claim about</w:t>
+      </w:r>
+      <w:r>
+        <w:t xml:space="preserve"> </w:t>
+      </w:r>
+      <w:r>
+        <w:rPr>
+          <w:i/>
+          <w:iCs/>
+        </w:rPr>
+        <w:t xml:space="preserve">execution</w:t>
+      </w:r>
+      <w:r>
+        <w:t xml:space="preserve">, but it is required before</w:t>
+      </w:r>
+      <w:r>
+        <w:t xml:space="preserve"> </w:t>
+      </w:r>
+      <w:r>
+        <w:t xml:space="preserve">claiming there was never a latent content code.</w:t>
+      </w:r>
+    </w:p>
+    <w:p>
+      <w:pPr>
+        <w:pStyle w:val="FirstParagraph"/>
+      </w:pPr>
+      <w:r>
+        <w:t xml:space="preserve">Until (1) is run, collaborators should read our interim claim as:</w:t>
+      </w:r>
+      <w:r>
+        <w:t xml:space="preserve"> </w:t>
+      </w:r>
+      <w:r>
+        <w:rPr>
+          <w:b/>
+          <w:bCs/>
+        </w:rPr>
+        <w:t xml:space="preserve">strong against modular H1 for these interventions’ free-generation</w:t>
+      </w:r>
+      <w:r>
+        <w:rPr>
+          <w:b/>
+          <w:bCs/>
+        </w:rPr>
+        <w:t xml:space="preserve"> </w:t>
+      </w:r>
+      <w:r>
+        <w:rPr>
+          <w:b/>
+          <w:bCs/>
+        </w:rPr>
+        <w:t xml:space="preserve">behavior; not yet maximally strong against every phonological caveat.</w:t>
+      </w:r>
+      <w:r>
+        <w:t xml:space="preserve"> </w:t>
+      </w:r>
+      <w:r>
+        <w:t xml:space="preserve">Until (2) is run, we should not claim latent absence of content plans—only</w:t>
+      </w:r>
+      <w:r>
+        <w:t xml:space="preserve"> </w:t>
+      </w:r>
+      <w:r>
+        <w:t xml:space="preserve">absence of demonstrated independent causal control of executed</w:t>
+      </w:r>
+      <w:r>
+        <w:t xml:space="preserve"> </w:t>
+      </w:r>
+      <m:oMath>
+        <m:r>
+          <m:t>c</m:t>
+        </m:r>
+      </m:oMath>
+      <w:r>
+        <w:t xml:space="preserve"> </w:t>
+      </w:r>
+      <w:r>
+        <w:t xml:space="preserve">with</w:t>
+      </w:r>
+      <w:r>
+        <w:t xml:space="preserve"> </w:t>
+      </w:r>
+      <m:oMath>
+        <m:r>
+          <m:t>b</m:t>
+        </m:r>
+      </m:oMath>
+      <w:r>
+        <w:t xml:space="preserve"> </w:t>
+      </w:r>
+      <w:r>
+        <w:t xml:space="preserve">fixed.</w:t>
+      </w:r>
+    </w:p>
     <w:bookmarkEnd w:id="110"/>
-    <w:bookmarkStart w:id="111" w:name="reproducibility-map"/>
+    <w:bookmarkStart w:id="111" w:name="X3e6291f3838892d9a2bc8873c2d70d62ae3b7fb"/>
+    <w:p>
+      <w:pPr>
+        <w:pStyle w:val="Heading2"/>
+      </w:pPr>
+      <w:r>
+        <w:t xml:space="preserve">Other achievements and open engineering gaps</w:t>
+      </w:r>
+    </w:p>
+    <w:bookmarkEnd w:id="111"/>
+    <w:bookmarkEnd w:id="112"/>
+    <w:bookmarkStart w:id="113" w:name="reproducibility-map"/>
     <w:p>
       <w:pPr>
         <w:pStyle w:val="Heading1"/>
@@ -17793,7 +18850,7 @@
         <w:t xml:space="preserve">(Pandoc path).</w:t>
       </w:r>
     </w:p>
-    <w:bookmarkEnd w:id="111"/>
+    <w:bookmarkEnd w:id="113"/>
     <w:sectPr>
       <w:pgSz w:h="15840" w:orient="portrait" w:w="12240"/>
       <w:pgMar w:bottom="1440" w:footer="720" w:header="720" w:left="1440" w:right="1440" w:top="1440"/>
@@ -18408,6 +19465,39 @@
     <w:abstractNumId w:val="991"/>
   </w:num>
   <w:num w:numId="1017">
+    <w:abstractNumId w:val="991"/>
+  </w:num>
+  <w:num w:numId="1018">
+    <w:abstractNumId w:val="99411"/>
+    <w:lvlOverride w:ilvl="0">
+      <w:startOverride w:val="1"/>
+    </w:lvlOverride>
+    <w:lvlOverride w:ilvl="1">
+      <w:startOverride w:val="1"/>
+    </w:lvlOverride>
+    <w:lvlOverride w:ilvl="2">
+      <w:startOverride w:val="1"/>
+    </w:lvlOverride>
+    <w:lvlOverride w:ilvl="3">
+      <w:startOverride w:val="1"/>
+    </w:lvlOverride>
+    <w:lvlOverride w:ilvl="4">
+      <w:startOverride w:val="1"/>
+    </w:lvlOverride>
+    <w:lvlOverride w:ilvl="5">
+      <w:startOverride w:val="1"/>
+    </w:lvlOverride>
+    <w:lvlOverride w:ilvl="6">
+      <w:startOverride w:val="1"/>
+    </w:lvlOverride>
+    <w:lvlOverride w:ilvl="7">
+      <w:startOverride w:val="1"/>
+    </w:lvlOverride>
+    <w:lvlOverride w:ilvl="8">
+      <w:startOverride w:val="1"/>
+    </w:lvlOverride>
+  </w:num>
+  <w:num w:numId="1019">
     <w:abstractNumId w:val="991"/>
   </w:num>
 </w:numbering>

</xml_diff>

<commit_message>
Align remaining collaborator-report sections with Stage XVI.
After the Stage XVI writeup pass, several earlier subsections still
reflected the pre-correction protocol: Section 10 said VIII–XV only, the
methods glossary defined only c-step-off force-native, H2 success criteria
and E3 still pointed only at Stage XV, and Stage XV’s “how to read”
implied within-class content-on-c had already been tested there. Clarify
those spots, update the Figure 9 caption for the two-panel null figure,
drop an empty leftover heading, and rebuild the DOCX.

Co-authored-by: Cursor <cursoragent@cursor.com>
</commit_message>
<xml_diff>
--- a/docs/collaborator-report/collaborator-report-v3.docx
+++ b/docs/collaborator-report/collaborator-report-v3.docx
@@ -2539,19 +2539,19 @@
           <w:b/>
           <w:bCs/>
         </w:rPr>
-        <w:t xml:space="preserve">-step intervention:</w:t>
-      </w:r>
-      <w:r>
-        <w:t xml:space="preserve"> </w:t>
-      </w:r>
-      <w:r>
-        <w:t xml:space="preserve">clamp selected features only on</w:t>
-      </w:r>
-      <w:r>
-        <w:t xml:space="preserve"> </w:t>
-      </w:r>
-      <w:r>
-        <w:t xml:space="preserve">the forward pass that predicts the article</w:t>
+        <w:t xml:space="preserve">-step intervention (Stage XV schedule):</w:t>
+      </w:r>
+      <w:r>
+        <w:t xml:space="preserve"> </w:t>
+      </w:r>
+      <w:r>
+        <w:t xml:space="preserve">clamp</w:t>
+      </w:r>
+      <w:r>
+        <w:t xml:space="preserve"> </w:t>
+      </w:r>
+      <w:r>
+        <w:t xml:space="preserve">selected features on the forward pass that predicts the article</w:t>
       </w:r>
       <w:r>
         <w:t xml:space="preserve"> </w:t>
@@ -2590,6 +2590,86 @@
       </m:oMath>
       <w:r>
         <w:t xml:space="preserve">.</w:t>
+      </w:r>
+      <w:r>
+        <w:t xml:space="preserve"> </w:t>
+      </w:r>
+      <w:r>
+        <w:t xml:space="preserve">Good for demonstrating</w:t>
+      </w:r>
+      <w:r>
+        <w:t xml:space="preserve"> </w:t>
+      </w:r>
+      <m:oMath>
+        <m:r>
+          <m:t>b</m:t>
+        </m:r>
+        <m:r>
+          <m:rPr>
+            <m:sty m:val="p"/>
+          </m:rPr>
+          <m:t>→</m:t>
+        </m:r>
+        <m:r>
+          <m:t>c</m:t>
+        </m:r>
+      </m:oMath>
+      <w:r>
+        <w:t xml:space="preserve"> </w:t>
+      </w:r>
+      <w:r>
+        <w:t xml:space="preserve">under free vs force-native</w:t>
+      </w:r>
+      <w:r>
+        <w:t xml:space="preserve"> </w:t>
+      </w:r>
+      <w:r>
+        <w:t xml:space="preserve">generation;</w:t>
+      </w:r>
+      <w:r>
+        <w:t xml:space="preserve"> </w:t>
+      </w:r>
+      <w:r>
+        <w:rPr>
+          <w:b/>
+          <w:bCs/>
+        </w:rPr>
+        <w:t xml:space="preserve">not</w:t>
+      </w:r>
+      <w:r>
+        <w:t xml:space="preserve"> </w:t>
+      </w:r>
+      <w:r>
+        <w:t xml:space="preserve">a fair negative test of</w:t>
+      </w:r>
+      <w:r>
+        <w:t xml:space="preserve"> </w:t>
+      </w:r>
+      <m:oMath>
+        <m:r>
+          <m:t>C</m:t>
+        </m:r>
+        <m:r>
+          <m:rPr>
+            <m:sty m:val="p"/>
+          </m:rPr>
+          <m:t>→</m:t>
+        </m:r>
+        <m:r>
+          <m:t>c</m:t>
+        </m:r>
+      </m:oMath>
+      <w:r>
+        <w:t xml:space="preserve"> </w:t>
+      </w:r>
+      <w:r>
+        <w:t xml:space="preserve">by</w:t>
+      </w:r>
+      <w:r>
+        <w:t xml:space="preserve"> </w:t>
+      </w:r>
+      <w:r>
+        <w:t xml:space="preserve">itself, because content clamps are absent at the noun step.</w:t>
       </w:r>
     </w:p>
     <w:p>
@@ -2728,6 +2808,193 @@
       </w:r>
       <w:r>
         <w:t xml:space="preserve">(or vice versa).</w:t>
+      </w:r>
+    </w:p>
+    <w:p>
+      <w:pPr>
+        <w:numPr>
+          <w:ilvl w:val="0"/>
+          <w:numId w:val="1003"/>
+        </w:numPr>
+      </w:pPr>
+      <w:r>
+        <w:rPr>
+          <w:b/>
+          <w:bCs/>
+        </w:rPr>
+        <w:t xml:space="preserve">Fixed</w:t>
+      </w:r>
+      <w:r>
+        <w:rPr>
+          <w:b/>
+          <w:bCs/>
+        </w:rPr>
+        <w:t xml:space="preserve"> </w:t>
+      </w:r>
+      <m:oMath>
+        <m:r>
+          <m:t>b</m:t>
+        </m:r>
+      </m:oMath>
+      <w:r>
+        <w:rPr>
+          <w:b/>
+          <w:bCs/>
+        </w:rPr>
+        <w:t xml:space="preserve">, content-on-at-</w:t>
+      </w:r>
+      <m:oMath>
+        <m:r>
+          <m:t>c</m:t>
+        </m:r>
+      </m:oMath>
+      <w:r>
+        <w:rPr>
+          <w:b/>
+          <w:bCs/>
+        </w:rPr>
+        <w:t xml:space="preserve"> </w:t>
+      </w:r>
+      <w:r>
+        <w:rPr>
+          <w:b/>
+          <w:bCs/>
+        </w:rPr>
+        <w:t xml:space="preserve">(Stage XVI schedule):</w:t>
+      </w:r>
+      <w:r>
+        <w:t xml:space="preserve"> </w:t>
+      </w:r>
+      <w:r>
+        <w:t xml:space="preserve">paste native</w:t>
+      </w:r>
+      <w:r>
+        <w:t xml:space="preserve"> </w:t>
+      </w:r>
+      <m:oMath>
+        <m:r>
+          <m:t>b</m:t>
+        </m:r>
+      </m:oMath>
+      <w:r>
+        <w:t xml:space="preserve">, but keep content-feature clamps</w:t>
+      </w:r>
+      <w:r>
+        <w:t xml:space="preserve"> </w:t>
+      </w:r>
+      <w:r>
+        <w:rPr>
+          <w:b/>
+          <w:bCs/>
+        </w:rPr>
+        <w:t xml:space="preserve">active</w:t>
+      </w:r>
+      <w:r>
+        <w:t xml:space="preserve"> </w:t>
+      </w:r>
+      <w:r>
+        <w:t xml:space="preserve">at the original</w:t>
+      </w:r>
+      <w:r>
+        <w:t xml:space="preserve"> </w:t>
+      </w:r>
+      <w:r>
+        <w:t xml:space="preserve">pre-article planning position while predicting</w:t>
+      </w:r>
+      <w:r>
+        <w:t xml:space="preserve"> </w:t>
+      </w:r>
+      <m:oMath>
+        <m:r>
+          <m:t>c</m:t>
+        </m:r>
+      </m:oMath>
+      <w:r>
+        <w:t xml:space="preserve"> </w:t>
+      </w:r>
+      <w:r>
+        <w:t xml:space="preserve">(full-sequence</w:t>
+      </w:r>
+      <w:r>
+        <w:t xml:space="preserve"> </w:t>
+      </w:r>
+      <w:r>
+        <w:t xml:space="preserve">recompute). The fair assay for independent</w:t>
+      </w:r>
+      <w:r>
+        <w:t xml:space="preserve"> </w:t>
+      </w:r>
+      <m:oMath>
+        <m:r>
+          <m:t>C</m:t>
+        </m:r>
+        <m:r>
+          <m:rPr>
+            <m:sty m:val="p"/>
+          </m:rPr>
+          <m:t>→</m:t>
+        </m:r>
+        <m:r>
+          <m:t>c</m:t>
+        </m:r>
+      </m:oMath>
+      <w:r>
+        <w:t xml:space="preserve">,</w:t>
+      </w:r>
+      <w:r>
+        <w:t xml:space="preserve"> </w:t>
+      </w:r>
+      <w:r>
+        <w:t xml:space="preserve">especially with</w:t>
+      </w:r>
+      <w:r>
+        <w:t xml:space="preserve"> </w:t>
+      </w:r>
+      <w:r>
+        <w:rPr>
+          <w:b/>
+          <w:bCs/>
+        </w:rPr>
+        <w:t xml:space="preserve">within-class</w:t>
+      </w:r>
+      <w:r>
+        <w:t xml:space="preserve"> </w:t>
+      </w:r>
+      <w:r>
+        <w:t xml:space="preserve">noun targets (e.g. </w:t>
+      </w:r>
+      <w:r>
+        <w:rPr>
+          <w:rStyle w:val="VerbatimChar"/>
+        </w:rPr>
+        <w:t xml:space="preserve">pilot</w:t>
+      </w:r>
+      <w:r>
+        <w:t xml:space="preserve">↔</w:t>
+      </w:r>
+      <w:r>
+        <w:rPr>
+          <w:rStyle w:val="VerbatimChar"/>
+        </w:rPr>
+        <w:t xml:space="preserve">captain</w:t>
+      </w:r>
+      <w:r>
+        <w:t xml:space="preserve"> </w:t>
+      </w:r>
+      <w:r>
+        <w:t xml:space="preserve">under fixed</w:t>
+      </w:r>
+      <w:r>
+        <w:t xml:space="preserve"> </w:t>
+      </w:r>
+      <w:r>
+        <w:rPr>
+          <w:rStyle w:val="VerbatimChar"/>
+        </w:rPr>
+        <w:t xml:space="preserve">a</w:t>
+      </w:r>
+      <w:r>
+        <w:t xml:space="preserve">).</w:t>
       </w:r>
     </w:p>
     <w:p>
@@ -7151,7 +7418,7 @@
         <w:t xml:space="preserve"> </w:t>
       </w:r>
       <w:r>
-        <w:t xml:space="preserve">VIII–XV).</w:t>
+        <w:t xml:space="preserve">VIII–XVI).</w:t>
       </w:r>
     </w:p>
     <w:bookmarkStart w:id="70" w:name="what-we-planned-after-stage-vii"/>
@@ -8252,13 +8519,13 @@
         </m:r>
       </m:oMath>
       <w:r>
-        <w:t xml:space="preserve">; no handle</w:t>
-      </w:r>
-      <w:r>
-        <w:t xml:space="preserve"> </w:t>
-      </w:r>
-      <w:r>
-        <w:t xml:space="preserve">moves</w:t>
+        <w:t xml:space="preserve">; and—under the</w:t>
+      </w:r>
+      <w:r>
+        <w:t xml:space="preserve"> </w:t>
+      </w:r>
+      <w:r>
+        <w:t xml:space="preserve">corrected Stage XVI schedule—no content handle moves</w:t>
       </w:r>
       <w:r>
         <w:t xml:space="preserve"> </w:t>
@@ -8286,13 +8553,33 @@
         <w:t xml:space="preserve"> </w:t>
       </w:r>
       <w:r>
-        <w:t xml:space="preserve">held fixed, and no handle moves only</w:t>
+        <w:t xml:space="preserve">held fixed, including among within-class synonyms. (A selective</w:t>
+      </w:r>
+      <w:r>
+        <w:t xml:space="preserve"> </w:t>
+      </w:r>
+      <w:r>
+        <w:t xml:space="preserve">licensing handle that moves article logits without rewriting executed</w:t>
       </w:r>
       <w:r>
         <w:t xml:space="preserve"> </w:t>
       </w:r>
       <m:oMath>
         <m:r>
+          <m:t>c</m:t>
+        </m:r>
+      </m:oMath>
+      <w:r>
+        <w:t xml:space="preserve"> </w:t>
+      </w:r>
+      <w:r>
+        <w:t xml:space="preserve">under fixed</w:t>
+      </w:r>
+      <w:r>
+        <w:t xml:space="preserve"> </w:t>
+      </w:r>
+      <m:oMath>
+        <m:r>
           <m:t>b</m:t>
         </m:r>
       </m:oMath>
@@ -8300,13 +8587,7 @@
         <w:t xml:space="preserve"> </w:t>
       </w:r>
       <w:r>
-        <w:t xml:space="preserve">while</w:t>
-      </w:r>
-      <w:r>
-        <w:t xml:space="preserve"> </w:t>
-      </w:r>
-      <w:r>
-        <w:t xml:space="preserve">leaving content identity fixed.</w:t>
+        <w:t xml:space="preserve">is compatible with H2 and does not revive H1.)</w:t>
       </w:r>
     </w:p>
     <w:bookmarkEnd w:id="72"/>
@@ -11683,7 +11964,7 @@
         <w:t xml:space="preserve"> </w:t>
       </w:r>
       <w:r>
-        <w:t xml:space="preserve">remains a confounder until Stage XV).</w:t>
+        <w:t xml:space="preserve">remains a confounder until Stages XV–XVI).</w:t>
       </w:r>
     </w:p>
     <w:p>
@@ -11728,7 +12009,7 @@
           <w:b/>
           <w:bCs/>
         </w:rPr>
-        <w:t xml:space="preserve">protocol.</w:t>
+        <w:t xml:space="preserve">protocols.</w:t>
       </w:r>
       <w:r>
         <w:t xml:space="preserve"> </w:t>
@@ -15393,13 +15674,19 @@
         <w:t xml:space="preserve"> </w:t>
       </w:r>
       <w:r>
-        <w:t xml:space="preserve">pasted native,</w:t>
-      </w:r>
-      <w:r>
-        <w:t xml:space="preserve"> </w:t>
-      </w:r>
-      <w:r>
-        <w:t xml:space="preserve">a content intervention that still changes</w:t>
+        <w:t xml:space="preserve">pasted native</w:t>
+      </w:r>
+      <w:r>
+        <w:t xml:space="preserve"> </w:t>
+      </w:r>
+      <w:r>
+        <w:t xml:space="preserve">and content clamps still active, a content intervention that still</w:t>
+      </w:r>
+      <w:r>
+        <w:t xml:space="preserve"> </w:t>
+      </w:r>
+      <w:r>
+        <w:t xml:space="preserve">changes</w:t>
       </w:r>
       <w:r>
         <w:t xml:space="preserve"> </w:t>
@@ -15413,35 +15700,19 @@
         <w:t xml:space="preserve"> </w:t>
       </w:r>
       <w:r>
-        <w:t xml:space="preserve">within the allowed article</w:t>
-      </w:r>
-      <w:r>
-        <w:t xml:space="preserve"> </w:t>
-      </w:r>
-      <w:r>
-        <w:t xml:space="preserve">class. We observed</w:t>
-      </w:r>
-      <w:r>
-        <w:t xml:space="preserve"> </w:t>
-      </w:r>
-      <w:r>
-        <w:rPr>
-          <w:b/>
-          <w:bCs/>
-        </w:rPr>
-        <w:t xml:space="preserve">none</w:t>
-      </w:r>
-      <w:r>
-        <w:t xml:space="preserve"> </w:t>
-      </w:r>
-      <w:r>
-        <w:t xml:space="preserve">of these: illicit free rate stayed 0.00, and</w:t>
-      </w:r>
-      <w:r>
-        <w:t xml:space="preserve"> </w:t>
-      </w:r>
-      <w:r>
-        <w:t xml:space="preserve">S3 barely moved</w:t>
+        <w:t xml:space="preserve">within the allowed article class. In Stage XV itself we</w:t>
+      </w:r>
+      <w:r>
+        <w:t xml:space="preserve"> </w:t>
+      </w:r>
+      <w:r>
+        <w:t xml:space="preserve">observed the first two failures: illicit free rate stayed 0.00, and S3</w:t>
+      </w:r>
+      <w:r>
+        <w:t xml:space="preserve"> </w:t>
+      </w:r>
+      <w:r>
+        <w:t xml:space="preserve">barely moved</w:t>
       </w:r>
       <w:r>
         <w:t xml:space="preserve"> </w:t>
@@ -15489,7 +15760,50 @@
         </m:r>
       </m:oMath>
       <w:r>
-        <w:t xml:space="preserve">.</w:t>
+        <w:t xml:space="preserve">. The third</w:t>
+      </w:r>
+      <w:r>
+        <w:t xml:space="preserve"> </w:t>
+      </w:r>
+      <w:r>
+        <w:t xml:space="preserve">(within-class</w:t>
+      </w:r>
+      <w:r>
+        <w:t xml:space="preserve"> </w:t>
+      </w:r>
+      <m:oMath>
+        <m:r>
+          <m:t>C</m:t>
+        </m:r>
+        <m:r>
+          <m:rPr>
+            <m:sty m:val="p"/>
+          </m:rPr>
+          <m:t>→</m:t>
+        </m:r>
+        <m:r>
+          <m:t>c</m:t>
+        </m:r>
+      </m:oMath>
+      <w:r>
+        <w:t xml:space="preserve"> </w:t>
+      </w:r>
+      <w:r>
+        <w:t xml:space="preserve">under content-on-at-</w:t>
+      </w:r>
+      <m:oMath>
+        <m:r>
+          <m:t>c</m:t>
+        </m:r>
+      </m:oMath>
+      <w:r>
+        <w:t xml:space="preserve">) is Stage</w:t>
+      </w:r>
+      <w:r>
+        <w:t xml:space="preserve"> </w:t>
+      </w:r>
+      <w:r>
+        <w:t xml:space="preserve">XVI’s test, not Stage XV’s—see below.</w:t>
       </w:r>
     </w:p>
     <w:p>
@@ -17456,7 +17770,7 @@
           <wp:inline>
             <wp:extent cx="5943600" cy="2661986"/>
             <wp:effectExtent b="0" l="0" r="0" t="0"/>
-            <wp:docPr descr="Figure 9. Corrected fixed-b assay: no condition produces within-class C \rightarrow c under content clamps kept on at the noun step." title="" id="108" name="Picture"/>
+            <wp:docPr descr="Figure 9. Corrected fixed-b assay: binary within-class outcomes are all exactly zero; same-class nouns stay ~5 logits below source under content clamps kept on at the noun step." title="" id="108" name="Picture"/>
             <a:graphic>
               <a:graphicData uri="http://schemas.openxmlformats.org/drawingml/2006/picture">
                 <pic:pic>
@@ -17510,30 +17824,7 @@
         <w:t xml:space="preserve"> </w:t>
       </w:r>
       <w:r>
-        <w:t xml:space="preserve">assay: no condition produces within-class</w:t>
-      </w:r>
-      <w:r>
-        <w:t xml:space="preserve"> </w:t>
-      </w:r>
-      <m:oMath>
-        <m:r>
-          <m:t>C</m:t>
-        </m:r>
-        <m:r>
-          <m:rPr>
-            <m:sty m:val="p"/>
-          </m:rPr>
-          <m:t>→</m:t>
-        </m:r>
-        <m:r>
-          <m:t>c</m:t>
-        </m:r>
-      </m:oMath>
-      <w:r>
-        <w:t xml:space="preserve"> </w:t>
-      </w:r>
-      <w:r>
-        <w:t xml:space="preserve">under content clamps kept on at the noun step.</w:t>
+        <w:t xml:space="preserve">assay: binary within-class outcomes are all exactly zero; same-class nouns stay ~5 logits below source under content clamps kept on at the noun step.</w:t>
       </w:r>
     </w:p>
     <w:p>
@@ -18677,7 +18968,7 @@
     </w:p>
     <w:bookmarkEnd w:id="113"/>
     <w:bookmarkEnd w:id="114"/>
-    <w:bookmarkStart w:id="120" w:name="what-has-and-has-not-been-achieved"/>
+    <w:bookmarkStart w:id="119" w:name="what-has-and-has-not-been-achieved"/>
     <w:p>
       <w:pPr>
         <w:pStyle w:val="Heading1"/>
@@ -20760,25 +21051,25 @@
         <w:t xml:space="preserve">behavior</w:t>
       </w:r>
       <w:r>
-        <w:t xml:space="preserve">, including the phonological caveat for within-class targets.</w:t>
-      </w:r>
-      <w:r>
-        <w:t xml:space="preserve"> </w:t>
-      </w:r>
-      <w:r>
-        <w:t xml:space="preserve">Until finer latent probes and broader handles are run, we should not</w:t>
-      </w:r>
-      <w:r>
-        <w:t xml:space="preserve"> </w:t>
-      </w:r>
-      <w:r>
-        <w:t xml:space="preserve">claim latent absence of all content plans—only absence of demonstrated</w:t>
-      </w:r>
-      <w:r>
-        <w:t xml:space="preserve"> </w:t>
-      </w:r>
-      <w:r>
-        <w:t xml:space="preserve">independent causal control of executed</w:t>
+        <w:t xml:space="preserve">, with the phonological within-class caveat now closed for</w:t>
+      </w:r>
+      <w:r>
+        <w:t xml:space="preserve"> </w:t>
+      </w:r>
+      <w:r>
+        <w:t xml:space="preserve">these sparse handles. Until finer latent probes and broader handles are</w:t>
+      </w:r>
+      <w:r>
+        <w:t xml:space="preserve"> </w:t>
+      </w:r>
+      <w:r>
+        <w:t xml:space="preserve">run, we should not claim latent absence of all content plans—only</w:t>
+      </w:r>
+      <w:r>
+        <w:t xml:space="preserve"> </w:t>
+      </w:r>
+      <w:r>
+        <w:t xml:space="preserve">absence of demonstrated independent causal control of executed</w:t>
       </w:r>
       <w:r>
         <w:t xml:space="preserve"> </w:t>
@@ -20806,28 +21097,12 @@
         <w:t xml:space="preserve"> </w:t>
       </w:r>
       <w:r>
-        <w:t xml:space="preserve">fixed for the</w:t>
-      </w:r>
-      <w:r>
-        <w:t xml:space="preserve"> </w:t>
-      </w:r>
-      <w:r>
-        <w:t xml:space="preserve">handles we tested.</w:t>
+        <w:t xml:space="preserve">fixed for the handles we tested.</w:t>
       </w:r>
     </w:p>
     <w:bookmarkEnd w:id="118"/>
-    <w:bookmarkStart w:id="119" w:name="X3e6291f3838892d9a2bc8873c2d70d62ae3b7fb"/>
-    <w:p>
-      <w:pPr>
-        <w:pStyle w:val="Heading2"/>
-      </w:pPr>
-      <w:r>
-        <w:t xml:space="preserve">Other achievements and open engineering gaps</w:t>
-      </w:r>
-    </w:p>
     <w:bookmarkEnd w:id="119"/>
-    <w:bookmarkEnd w:id="120"/>
-    <w:bookmarkStart w:id="121" w:name="reproducibility-map"/>
+    <w:bookmarkStart w:id="120" w:name="reproducibility-map"/>
     <w:p>
       <w:pPr>
         <w:pStyle w:val="Heading1"/>
@@ -21566,7 +21841,7 @@
         <w:t xml:space="preserve">(Pandoc path).</w:t>
       </w:r>
     </w:p>
-    <w:bookmarkEnd w:id="121"/>
+    <w:bookmarkEnd w:id="120"/>
     <w:sectPr>
       <w:pgSz w:h="15840" w:orient="portrait" w:w="12240"/>
       <w:pgMar w:bottom="1440" w:footer="720" w:header="720" w:left="1440" w:right="1440" w:top="1440"/>

</xml_diff>

<commit_message>
Document Stage XVII per-noun fixed-b null in the collaborator report.
Integrates Experiment 2: Latent-Planning-style per-noun / contrast
features still yield zero within-class C→c under the Stage XVI schedule.
Adds §10.13, renumbers the current hypothesis to §10.14, updates the
edge table / claim / remaining-holes list (closes the wrong-sparse-grain
escape hatch; residual patching remains open), and adds Figure 10 plus
rebuild wiring for collaborator-report-v3.docx.

Co-authored-by: Cursor <cursoragent@cursor.com>
</commit_message>
<xml_diff>
--- a/docs/collaborator-report/collaborator-report-v3.docx
+++ b/docs/collaborator-report/collaborator-report-v3.docx
@@ -1047,7 +1047,21 @@
           <w:i/>
           <w:iCs/>
         </w:rPr>
-        <w:t xml:space="preserve">protocol; free noun change tracks</w:t>
+        <w:t xml:space="preserve">protocol, and including Latent-Planning-style per-noun feature</w:t>
+      </w:r>
+      <w:r>
+        <w:rPr>
+          <w:i/>
+          <w:iCs/>
+        </w:rPr>
+        <w:t xml:space="preserve"> </w:t>
+      </w:r>
+      <w:r>
+        <w:rPr>
+          <w:i/>
+          <w:iCs/>
+        </w:rPr>
+        <w:t xml:space="preserve">selection (Stage XVII); free noun change tracks</w:t>
       </w:r>
       <w:r>
         <w:rPr>
@@ -1075,7 +1089,7 @@
           <w:i/>
           <w:iCs/>
         </w:rPr>
-        <w:t xml:space="preserve">. That is strong</w:t>
+        <w:t xml:space="preserve">.</w:t>
       </w:r>
       <w:r>
         <w:rPr>
@@ -1089,7 +1103,7 @@
           <w:i/>
           <w:iCs/>
         </w:rPr>
-        <w:t xml:space="preserve">evidence these mechanisms are not modular latent planning and that</w:t>
+        <w:t xml:space="preserve">That is strong evidence these mechanisms are not modular latent</w:t>
       </w:r>
       <w:r>
         <w:rPr>
@@ -1103,7 +1117,7 @@
           <w:i/>
           <w:iCs/>
         </w:rPr>
-        <w:t xml:space="preserve">article-conditioned packaging (or strong</w:t>
+        <w:t xml:space="preserve">planning and that article-conditioned packaging (or strong</w:t>
       </w:r>
       <w:r>
         <w:rPr>
@@ -1131,7 +1145,7 @@
           <w:i/>
           <w:iCs/>
         </w:rPr>
-        <w:t xml:space="preserve">) dominates</w:t>
+        <w:t xml:space="preserve">) dominates execution—without yet being a refutation</w:t>
       </w:r>
       <w:r>
         <w:rPr>
@@ -1145,7 +1159,7 @@
           <w:i/>
           <w:iCs/>
         </w:rPr>
-        <w:t xml:space="preserve">execution—without yet being a refutation of every</w:t>
+        <w:t xml:space="preserve">of every</w:t>
       </w:r>
       <w:r>
         <w:rPr>
@@ -7362,7 +7376,7 @@
     </w:p>
     <w:bookmarkEnd w:id="68"/>
     <w:bookmarkEnd w:id="69"/>
-    <w:bookmarkStart w:id="114" w:name="Xb22d1a1387c762e8d872cf2f151ca041df80e4c"/>
+    <w:bookmarkStart w:id="121" w:name="Xb22d1a1387c762e8d872cf2f151ca041df80e4c"/>
     <w:p>
       <w:pPr>
         <w:pStyle w:val="Heading1"/>
@@ -7418,7 +7432,7 @@
         <w:t xml:space="preserve"> </w:t>
       </w:r>
       <w:r>
-        <w:t xml:space="preserve">VIII–XVI).</w:t>
+        <w:t xml:space="preserve">VIII–XVII).</w:t>
       </w:r>
     </w:p>
     <w:bookmarkStart w:id="70" w:name="what-we-planned-after-stage-vii"/>
@@ -8553,7 +8567,13 @@
         <w:t xml:space="preserve"> </w:t>
       </w:r>
       <w:r>
-        <w:t xml:space="preserve">held fixed, including among within-class synonyms. (A selective</w:t>
+        <w:t xml:space="preserve">held fixed, including among within-class synonyms and including</w:t>
+      </w:r>
+      <w:r>
+        <w:t xml:space="preserve"> </w:t>
+      </w:r>
+      <w:r>
+        <w:t xml:space="preserve">per-noun Latent-Planning-style features (Stage XVII). (A selective</w:t>
       </w:r>
       <w:r>
         <w:t xml:space="preserve"> </w:t>
@@ -8930,7 +8950,13 @@
         </m:r>
       </m:oMath>
       <w:r>
-        <w:t xml:space="preserve">”).</w:t>
+        <w:t xml:space="preserve">”). Stage XVII closes the “wrong sparse grain” caveat by</w:t>
+      </w:r>
+      <w:r>
+        <w:t xml:space="preserve"> </w:t>
+      </w:r>
+      <w:r>
+        <w:t xml:space="preserve">repeating that schedule with per-noun LP-style target features.</w:t>
       </w:r>
     </w:p>
     <w:p>
@@ -9545,6 +9571,84 @@
             </m:oMath>
             <w:r>
               <w:t xml:space="preserve">; latent S2/S3 readouts</w:t>
+            </w:r>
+          </w:p>
+        </w:tc>
+      </w:tr>
+      <w:tr>
+        <w:tc>
+          <w:tcPr/>
+          <w:p>
+            <w:pPr>
+              <w:pStyle w:val="Compact"/>
+            </w:pPr>
+            <w:r>
+              <w:t xml:space="preserve">XVII per-noun LP-style</w:t>
+            </w:r>
+            <w:r>
+              <w:t xml:space="preserve"> </w:t>
+            </w:r>
+            <m:oMath>
+              <m:sSub>
+                <m:e>
+                  <m:r>
+                    <m:t>C</m:t>
+                  </m:r>
+                </m:e>
+                <m:sub>
+                  <m:r>
+                    <m:t>t</m:t>
+                  </m:r>
+                </m:sub>
+              </m:sSub>
+            </m:oMath>
+            <w:r>
+              <w:t xml:space="preserve"> </w:t>
+            </w:r>
+            <w:r>
+              <w:t xml:space="preserve">under fixed</w:t>
+            </w:r>
+            <w:r>
+              <w:t xml:space="preserve"> </w:t>
+            </w:r>
+            <m:oMath>
+              <m:r>
+                <m:t>b</m:t>
+              </m:r>
+            </m:oMath>
+          </w:p>
+        </w:tc>
+        <w:tc>
+          <w:tcPr/>
+          <w:p>
+            <w:pPr>
+              <w:pStyle w:val="Compact"/>
+            </w:pPr>
+            <w:r>
+              <w:t xml:space="preserve">Same fair</w:t>
+            </w:r>
+            <w:r>
+              <w:t xml:space="preserve"> </w:t>
+            </w:r>
+            <m:oMath>
+              <m:r>
+                <m:t>C</m:t>
+              </m:r>
+              <m:r>
+                <m:rPr>
+                  <m:sty m:val="p"/>
+                </m:rPr>
+                <m:t>→</m:t>
+              </m:r>
+              <m:r>
+                <m:t>c</m:t>
+              </m:r>
+            </m:oMath>
+            <w:r>
+              <w:t xml:space="preserve"> </w:t>
+            </w:r>
+            <w:r>
+              <w:t xml:space="preserve">assay with per-example target-noun / contrast features (wrong-grain escape hatch)</w:t>
             </w:r>
           </w:p>
         </w:tc>
@@ -18379,56 +18483,1741 @@
         <w:pStyle w:val="BodyText"/>
       </w:pPr>
       <w:r>
-        <w:t xml:space="preserve">Remaining limits (Section 11): no pure</w:t>
-      </w:r>
-      <w:r>
-        <w:t xml:space="preserve"> </w:t>
-      </w:r>
-      <m:oMath>
-        <m:r>
-          <m:t>A</m:t>
-        </m:r>
-      </m:oMath>
-      <w:r>
-        <w:t xml:space="preserve"> </w:t>
-      </w:r>
-      <w:r>
-        <w:t xml:space="preserve">set; no residual/full</w:t>
-      </w:r>
-      <w:r>
-        <w:t xml:space="preserve"> </w:t>
-      </w:r>
-      <w:r>
-        <w:t xml:space="preserve">activation-direction patch beyond sparse CLT features and a lightweight</w:t>
-      </w:r>
-      <w:r>
-        <w:t xml:space="preserve"> </w:t>
-      </w:r>
-      <w:r>
-        <w:t xml:space="preserve">hint-contrast selector; latent noun-identity probes are only coarse</w:t>
-      </w:r>
-      <w:r>
-        <w:t xml:space="preserve"> </w:t>
-      </w:r>
-      <w:r>
-        <w:t xml:space="preserve">(S2/S3 means + noun logits), not dedicated pilot-vs-captain feature</w:t>
-      </w:r>
-      <w:r>
-        <w:t xml:space="preserve"> </w:t>
-      </w:r>
-      <w:r>
-        <w:t xml:space="preserve">probes; scale generalization remains open.</w:t>
+        <w:t xml:space="preserve">Remaining limits after Stage XVI alone (Section 11): Stage XVI still used</w:t>
+      </w:r>
+      <w:r>
+        <w:t xml:space="preserve"> </w:t>
+      </w:r>
+      <w:r>
+        <w:t xml:space="preserve">recurring E1 S3 / a graph-free hint-contrast selector rather than</w:t>
+      </w:r>
+      <w:r>
+        <w:t xml:space="preserve"> </w:t>
+      </w:r>
+      <w:r>
+        <w:t xml:space="preserve">Latent-Planning-style per-noun attribution features; residual/full</w:t>
+      </w:r>
+      <w:r>
+        <w:t xml:space="preserve"> </w:t>
+      </w:r>
+      <w:r>
+        <w:t xml:space="preserve">activation-direction patching was untested; latent noun-identity probes</w:t>
+      </w:r>
+      <w:r>
+        <w:t xml:space="preserve"> </w:t>
+      </w:r>
+      <w:r>
+        <w:t xml:space="preserve">were only coarse; scale generalization remains open. Stage XVII closes</w:t>
+      </w:r>
+      <w:r>
+        <w:t xml:space="preserve"> </w:t>
+      </w:r>
+      <w:r>
+        <w:t xml:space="preserve">the per-noun grain hole.</w:t>
       </w:r>
     </w:p>
     <w:bookmarkEnd w:id="111"/>
     <w:bookmarkEnd w:id="112"/>
-    <w:bookmarkStart w:id="113" w:name="current-hypothesis-after-stages-viiixvi"/>
+    <w:bookmarkStart w:id="119" w:name="X72b35bcc7dd7116e7b43c89511d65626b54a329"/>
     <w:p>
       <w:pPr>
         <w:pStyle w:val="Heading2"/>
       </w:pPr>
       <w:r>
-        <w:t xml:space="preserve">10.13 Current hypothesis (after Stages VIII–XVI)</w:t>
+        <w:t xml:space="preserve">10.13 Stage XVII (Experiment 2): Per-noun LP-style features under fixed</w:t>
+      </w:r>
+      <w:r>
+        <w:t xml:space="preserve"> </w:t>
+      </w:r>
+      <m:oMath>
+        <m:r>
+          <m:t>b</m:t>
+        </m:r>
+      </m:oMath>
+    </w:p>
+    <w:p>
+      <w:pPr>
+        <w:pStyle w:val="FirstParagraph"/>
+      </w:pPr>
+      <w:r>
+        <w:rPr>
+          <w:b/>
+          <w:bCs/>
+        </w:rPr>
+        <w:t xml:space="preserve">Escape hatch under test:</w:t>
+      </w:r>
+      <w:r>
+        <w:t xml:space="preserve"> </w:t>
+      </w:r>
+      <w:r>
+        <w:t xml:space="preserve">after Stage XVI, a modular defender could</w:t>
+      </w:r>
+      <w:r>
+        <w:t xml:space="preserve"> </w:t>
+      </w:r>
+      <w:r>
+        <w:t xml:space="preserve">still say that E1 S3 and the graph-free contrast selector were the</w:t>
+      </w:r>
+      <w:r>
+        <w:t xml:space="preserve"> </w:t>
+      </w:r>
+      <w:r>
+        <w:rPr>
+          <w:i/>
+          <w:iCs/>
+        </w:rPr>
+        <w:t xml:space="preserve">wrong sparse objects</w:t>
+      </w:r>
+      <w:r>
+        <w:t xml:space="preserve">—that Latent Planning’s per-example content</w:t>
+      </w:r>
+      <w:r>
+        <w:t xml:space="preserve"> </w:t>
+      </w:r>
+      <w:r>
+        <w:t xml:space="preserve">features</w:t>
+      </w:r>
+      <w:r>
+        <w:t xml:space="preserve"> </w:t>
+      </w:r>
+      <m:oMath>
+        <m:sSub>
+          <m:e>
+            <m:r>
+              <m:t>C</m:t>
+            </m:r>
+          </m:e>
+          <m:sub>
+            <m:r>
+              <m:t>t</m:t>
+            </m:r>
+          </m:sub>
+        </m:sSub>
+      </m:oMath>
+      <w:r>
+        <w:t xml:space="preserve"> </w:t>
+      </w:r>
+      <w:r>
+        <w:t xml:space="preserve">(positive attribution to a target noun, low article</w:t>
+      </w:r>
+      <w:r>
+        <w:t xml:space="preserve"> </w:t>
+      </w:r>
+      <w:r>
+        <w:t xml:space="preserve">attribution) would provide the missing independent</w:t>
+      </w:r>
+      <w:r>
+        <w:t xml:space="preserve"> </w:t>
+      </w:r>
+      <m:oMath>
+        <m:r>
+          <m:t>C</m:t>
+        </m:r>
+        <m:r>
+          <m:rPr>
+            <m:sty m:val="p"/>
+          </m:rPr>
+          <m:t>→</m:t>
+        </m:r>
+        <m:r>
+          <m:t>c</m:t>
+        </m:r>
+      </m:oMath>
+      <w:r>
+        <w:t xml:space="preserve"> </w:t>
+      </w:r>
+      <w:r>
+        <w:t xml:space="preserve">dial.</w:t>
+      </w:r>
+    </w:p>
+    <w:bookmarkStart w:id="113" w:name="protocol-1"/>
+    <w:p>
+      <w:pPr>
+        <w:pStyle w:val="Heading3"/>
+      </w:pPr>
+      <w:r>
+        <w:t xml:space="preserve">Protocol</w:t>
+      </w:r>
+    </w:p>
+    <w:p>
+      <w:pPr>
+        <w:pStyle w:val="FirstParagraph"/>
+      </w:pPr>
+      <w:r>
+        <w:t xml:space="preserve">For three native-</w:t>
+      </w:r>
+      <w:r>
+        <w:rPr>
+          <w:rStyle w:val="VerbatimChar"/>
+        </w:rPr>
+        <w:t xml:space="preserve">a</w:t>
+      </w:r>
+      <w:r>
+        <w:t xml:space="preserve"> </w:t>
+      </w:r>
+      <w:r>
+        <w:t xml:space="preserve">twin families (aircraft pilot/captain; legal</w:t>
+      </w:r>
+      <w:r>
+        <w:t xml:space="preserve"> </w:t>
+      </w:r>
+      <w:r>
+        <w:t xml:space="preserve">lawyer/barrister; psychology psychologist/therapist):</w:t>
+      </w:r>
+    </w:p>
+    <w:p>
+      <w:pPr>
+        <w:pStyle w:val="Compact"/>
+        <w:numPr>
+          <w:ilvl w:val="0"/>
+          <w:numId w:val="1018"/>
+        </w:numPr>
+      </w:pPr>
+      <w:r>
+        <w:t xml:space="preserve">Attribute</w:t>
+      </w:r>
+      <w:r>
+        <w:t xml:space="preserve"> </w:t>
+      </w:r>
+      <w:r>
+        <w:rPr>
+          <w:rStyle w:val="VerbatimChar"/>
+        </w:rPr>
+        <w:t xml:space="preserve">a</w:t>
+      </w:r>
+      <w:r>
+        <w:t xml:space="preserve">/</w:t>
+      </w:r>
+      <w:r>
+        <w:rPr>
+          <w:rStyle w:val="VerbatimChar"/>
+        </w:rPr>
+        <w:t xml:space="preserve">an</w:t>
+      </w:r>
+      <w:r>
+        <w:t xml:space="preserve"> </w:t>
+      </w:r>
+      <w:r>
+        <w:t xml:space="preserve">on the pre-article prompt.</w:t>
+      </w:r>
+    </w:p>
+    <w:p>
+      <w:pPr>
+        <w:pStyle w:val="Compact"/>
+        <w:numPr>
+          <w:ilvl w:val="0"/>
+          <w:numId w:val="1018"/>
+        </w:numPr>
+      </w:pPr>
+      <w:r>
+        <w:t xml:space="preserve">Attribute source and same-class noun tokens on</w:t>
+      </w:r>
+      <w:r>
+        <w:t xml:space="preserve"> </w:t>
+      </w:r>
+      <w:r>
+        <w:rPr>
+          <w:rStyle w:val="VerbatimChar"/>
+        </w:rPr>
+        <w:t xml:space="preserve">prompt + native article</w:t>
+      </w:r>
+      <w:r>
+        <w:t xml:space="preserve">.</w:t>
+      </w:r>
+    </w:p>
+    <w:p>
+      <w:pPr>
+        <w:pStyle w:val="Compact"/>
+        <w:numPr>
+          <w:ilvl w:val="0"/>
+          <w:numId w:val="1018"/>
+        </w:numPr>
+      </w:pPr>
+      <w:r>
+        <w:t xml:space="preserve">At planning position</w:t>
+      </w:r>
+      <w:r>
+        <w:t xml:space="preserve"> </w:t>
+      </w:r>
+      <m:oMath>
+        <m:r>
+          <m:t>P</m:t>
+        </m:r>
+      </m:oMath>
+      <w:r>
+        <w:t xml:space="preserve">, select top-4 features under each rule</w:t>
+      </w:r>
+      <w:r>
+        <w:t xml:space="preserve"> </w:t>
+      </w:r>
+      <w:r>
+        <w:t xml:space="preserve">(article</w:t>
+      </w:r>
+      <w:r>
+        <w:t xml:space="preserve"> </w:t>
+      </w:r>
+      <m:oMath>
+        <m:r>
+          <m:rPr>
+            <m:sty m:val="p"/>
+          </m:rPr>
+          <m:t>|</m:t>
+        </m:r>
+        <m:r>
+          <m:rPr>
+            <m:sty m:val="p"/>
+          </m:rPr>
+          <m:t>D</m:t>
+        </m:r>
+        <m:r>
+          <m:rPr>
+            <m:sty m:val="p"/>
+          </m:rPr>
+          <m:t>E</m:t>
+        </m:r>
+        <m:r>
+          <m:rPr>
+            <m:sty m:val="p"/>
+          </m:rPr>
+          <m:t>|</m:t>
+        </m:r>
+        <m:r>
+          <m:rPr>
+            <m:sty m:val="p"/>
+          </m:rPr>
+          <m:t>≤</m:t>
+        </m:r>
+        <m:r>
+          <m:t>0.05</m:t>
+        </m:r>
+      </m:oMath>
+      <w:r>
+        <w:t xml:space="preserve">):</w:t>
+      </w:r>
+    </w:p>
+    <w:p>
+      <w:pPr>
+        <w:pStyle w:val="Compact"/>
+        <w:numPr>
+          <w:ilvl w:val="1"/>
+          <w:numId w:val="1019"/>
+        </w:numPr>
+      </w:pPr>
+      <w:r>
+        <w:rPr>
+          <w:b/>
+          <w:bCs/>
+        </w:rPr>
+        <w:t xml:space="preserve">lp_target:</w:t>
+      </w:r>
+      <w:r>
+        <w:t xml:space="preserve"> </w:t>
+      </w:r>
+      <m:oMath>
+        <m:r>
+          <m:rPr>
+            <m:sty m:val="p"/>
+          </m:rPr>
+          <m:t>+</m:t>
+        </m:r>
+        <m:r>
+          <m:rPr>
+            <m:sty m:val="p"/>
+          </m:rPr>
+          <m:t>a</m:t>
+        </m:r>
+        <m:r>
+          <m:rPr>
+            <m:sty m:val="p"/>
+          </m:rPr>
+          <m:t>t</m:t>
+        </m:r>
+        <m:r>
+          <m:rPr>
+            <m:sty m:val="p"/>
+          </m:rPr>
+          <m:t>t</m:t>
+        </m:r>
+        <m:r>
+          <m:rPr>
+            <m:sty m:val="p"/>
+          </m:rPr>
+          <m:t>r</m:t>
+        </m:r>
+        <m:r>
+          <m:rPr>
+            <m:sty m:val="p"/>
+          </m:rPr>
+          <m:t>(</m:t>
+        </m:r>
+        <m:r>
+          <m:rPr>
+            <m:nor/>
+            <m:sty m:val="p"/>
+          </m:rPr>
+          <m:t>same-class target</m:t>
+        </m:r>
+        <m:r>
+          <m:rPr>
+            <m:sty m:val="p"/>
+          </m:rPr>
+          <m:t>)</m:t>
+        </m:r>
+      </m:oMath>
+    </w:p>
+    <w:p>
+      <w:pPr>
+        <w:pStyle w:val="Compact"/>
+        <w:numPr>
+          <w:ilvl w:val="1"/>
+          <w:numId w:val="1019"/>
+        </w:numPr>
+      </w:pPr>
+      <w:r>
+        <w:rPr>
+          <w:b/>
+          <w:bCs/>
+        </w:rPr>
+        <w:t xml:space="preserve">contrast:</w:t>
+      </w:r>
+      <w:r>
+        <w:t xml:space="preserve"> </w:t>
+      </w:r>
+      <w:r>
+        <w:t xml:space="preserve">maximize</w:t>
+      </w:r>
+      <w:r>
+        <w:t xml:space="preserve"> </w:t>
+      </w:r>
+      <m:oMath>
+        <m:r>
+          <m:rPr>
+            <m:sty m:val="p"/>
+          </m:rPr>
+          <m:t>a</m:t>
+        </m:r>
+        <m:r>
+          <m:rPr>
+            <m:sty m:val="p"/>
+          </m:rPr>
+          <m:t>t</m:t>
+        </m:r>
+        <m:r>
+          <m:rPr>
+            <m:sty m:val="p"/>
+          </m:rPr>
+          <m:t>t</m:t>
+        </m:r>
+        <m:r>
+          <m:rPr>
+            <m:sty m:val="p"/>
+          </m:rPr>
+          <m:t>r</m:t>
+        </m:r>
+        <m:r>
+          <m:rPr>
+            <m:sty m:val="p"/>
+          </m:rPr>
+          <m:t>(</m:t>
+        </m:r>
+        <m:r>
+          <m:rPr>
+            <m:nor/>
+            <m:sty m:val="p"/>
+          </m:rPr>
+          <m:t>target</m:t>
+        </m:r>
+        <m:r>
+          <m:rPr>
+            <m:sty m:val="p"/>
+          </m:rPr>
+          <m:t>)</m:t>
+        </m:r>
+        <m:r>
+          <m:rPr>
+            <m:sty m:val="p"/>
+          </m:rPr>
+          <m:t>−</m:t>
+        </m:r>
+        <m:r>
+          <m:rPr>
+            <m:sty m:val="p"/>
+          </m:rPr>
+          <m:t>a</m:t>
+        </m:r>
+        <m:r>
+          <m:rPr>
+            <m:sty m:val="p"/>
+          </m:rPr>
+          <m:t>t</m:t>
+        </m:r>
+        <m:r>
+          <m:rPr>
+            <m:sty m:val="p"/>
+          </m:rPr>
+          <m:t>t</m:t>
+        </m:r>
+        <m:r>
+          <m:rPr>
+            <m:sty m:val="p"/>
+          </m:rPr>
+          <m:t>r</m:t>
+        </m:r>
+        <m:r>
+          <m:rPr>
+            <m:sty m:val="p"/>
+          </m:rPr>
+          <m:t>(</m:t>
+        </m:r>
+        <m:r>
+          <m:rPr>
+            <m:nor/>
+            <m:sty m:val="p"/>
+          </m:rPr>
+          <m:t>source</m:t>
+        </m:r>
+        <m:r>
+          <m:rPr>
+            <m:sty m:val="p"/>
+          </m:rPr>
+          <m:t>)</m:t>
+        </m:r>
+      </m:oMath>
+    </w:p>
+    <w:p>
+      <w:pPr>
+        <w:pStyle w:val="Compact"/>
+        <w:numPr>
+          <w:ilvl w:val="0"/>
+          <w:numId w:val="1018"/>
+        </w:numPr>
+      </w:pPr>
+      <w:r>
+        <w:t xml:space="preserve">Evaluate amplify</w:t>
+      </w:r>
+      <w:r>
+        <w:t xml:space="preserve"> </w:t>
+      </w:r>
+      <m:oMath>
+        <m:r>
+          <m:rPr>
+            <m:sty m:val="p"/>
+          </m:rPr>
+          <m:t>×</m:t>
+        </m:r>
+        <m:r>
+          <m:t>5</m:t>
+        </m:r>
+      </m:oMath>
+      <w:r>
+        <w:t xml:space="preserve">/</w:t>
+      </w:r>
+      <m:oMath>
+        <m:r>
+          <m:rPr>
+            <m:sty m:val="p"/>
+          </m:rPr>
+          <m:t>×</m:t>
+        </m:r>
+        <m:r>
+          <m:t>8</m:t>
+        </m:r>
+      </m:oMath>
+      <w:r>
+        <w:t xml:space="preserve">, zero, and activation-matched</w:t>
+      </w:r>
+      <w:r>
+        <w:t xml:space="preserve"> </w:t>
+      </w:r>
+      <w:r>
+        <w:t xml:space="preserve">controls under the</w:t>
+      </w:r>
+      <w:r>
+        <w:t xml:space="preserve"> </w:t>
+      </w:r>
+      <w:r>
+        <w:rPr>
+          <w:b/>
+          <w:bCs/>
+        </w:rPr>
+        <w:t xml:space="preserve">Stage XVI schedule</w:t>
+      </w:r>
+      <w:r>
+        <w:t xml:space="preserve"> </w:t>
+      </w:r>
+      <w:r>
+        <w:t xml:space="preserve">(paste native</w:t>
+      </w:r>
+      <w:r>
+        <w:t xml:space="preserve"> </w:t>
+      </w:r>
+      <m:oMath>
+        <m:r>
+          <m:t>b</m:t>
+        </m:r>
+      </m:oMath>
+      <w:r>
+        <w:t xml:space="preserve">; content</w:t>
+      </w:r>
+      <w:r>
+        <w:t xml:space="preserve"> </w:t>
+      </w:r>
+      <w:r>
+        <w:t xml:space="preserve">clamps</w:t>
+      </w:r>
+      <w:r>
+        <w:t xml:space="preserve"> </w:t>
+      </w:r>
+      <w:r>
+        <w:rPr>
+          <w:b/>
+          <w:bCs/>
+        </w:rPr>
+        <w:t xml:space="preserve">on</w:t>
+      </w:r>
+      <w:r>
+        <w:t xml:space="preserve"> </w:t>
+      </w:r>
+      <w:r>
+        <w:t xml:space="preserve">at</w:t>
+      </w:r>
+      <w:r>
+        <w:t xml:space="preserve"> </w:t>
+      </w:r>
+      <m:oMath>
+        <m:r>
+          <m:t>P</m:t>
+        </m:r>
+      </m:oMath>
+      <w:r>
+        <w:t xml:space="preserve"> </w:t>
+      </w:r>
+      <w:r>
+        <w:t xml:space="preserve">during noun prediction).</w:t>
+      </w:r>
+    </w:p>
+    <w:p>
+      <w:pPr>
+        <w:pStyle w:val="FirstParagraph"/>
+      </w:pPr>
+      <w:r>
+        <w:t xml:space="preserve">Primary success (upset): within-class noun change under fixed</w:t>
+      </w:r>
+      <w:r>
+        <w:t xml:space="preserve"> </w:t>
+      </w:r>
+      <m:oMath>
+        <m:r>
+          <m:t>b</m:t>
+        </m:r>
+      </m:oMath>
+      <w:r>
+        <w:t xml:space="preserve"> </w:t>
+      </w:r>
+      <w:r>
+        <w:t xml:space="preserve">at</w:t>
+      </w:r>
+      <w:r>
+        <w:t xml:space="preserve"> </w:t>
+      </w:r>
+      <w:r>
+        <w:t xml:space="preserve">rates above baseline/controls, or a clear same−source logit takeover.</w:t>
+      </w:r>
+    </w:p>
+    <w:bookmarkEnd w:id="113"/>
+    <w:bookmarkStart w:id="117" w:name="results-2"/>
+    <w:p>
+      <w:pPr>
+        <w:pStyle w:val="Heading3"/>
+      </w:pPr>
+      <w:r>
+        <w:t xml:space="preserve">Results</w:t>
+      </w:r>
+    </w:p>
+    <w:tbl>
+      <w:tblPr>
+        <w:tblStyle w:val="Table"/>
+        <w:tblW w:type="pct" w:w="5000"/>
+        <w:tblLayout w:type="fixed"/>
+        <w:tblLook w:firstRow="1" w:lastRow="0" w:firstColumn="0" w:lastColumn="0" w:noHBand="0" w:noVBand="0" w:val="0020"/>
+      </w:tblPr>
+      <w:tblGrid>
+        <w:gridCol w:w="1033"/>
+        <w:gridCol w:w="1377"/>
+        <w:gridCol w:w="1377"/>
+        <w:gridCol w:w="1377"/>
+        <w:gridCol w:w="1377"/>
+        <w:gridCol w:w="1377"/>
+      </w:tblGrid>
+      <w:tr>
+        <w:trPr>
+          <w:tblHeader w:val="on"/>
+        </w:trPr>
+        <w:tc>
+          <w:tcPr/>
+          <w:p>
+            <w:pPr>
+              <w:pStyle w:val="Compact"/>
+            </w:pPr>
+            <w:r>
+              <w:t xml:space="preserve">Condition (3 families)</w:t>
+            </w:r>
+          </w:p>
+        </w:tc>
+        <w:tc>
+          <w:tcPr/>
+          <w:p>
+            <w:pPr>
+              <w:pStyle w:val="Compact"/>
+              <w:jc w:val="right"/>
+            </w:pPr>
+            <m:oMath>
+              <m:r>
+                <m:t>c</m:t>
+              </m:r>
+              <m:r>
+                <m:rPr>
+                  <m:sty m:val="p"/>
+                </m:rPr>
+                <m:t>→</m:t>
+              </m:r>
+              <m:r>
+                <m:t>c</m:t>
+              </m:r>
+            </m:oMath>
+            <w:r>
+              <w:t xml:space="preserve"> </w:t>
+            </w:r>
+            <w:r>
+              <w:t xml:space="preserve">signal</w:t>
+            </w:r>
+          </w:p>
+        </w:tc>
+        <w:tc>
+          <w:tcPr/>
+          <w:p>
+            <w:pPr>
+              <w:pStyle w:val="Compact"/>
+              <w:jc w:val="right"/>
+            </w:pPr>
+            <w:r>
+              <w:t xml:space="preserve">Content changed</w:t>
+            </w:r>
+          </w:p>
+        </w:tc>
+        <w:tc>
+          <w:tcPr/>
+          <w:p>
+            <w:pPr>
+              <w:pStyle w:val="Compact"/>
+              <w:jc w:val="right"/>
+            </w:pPr>
+            <w:r>
+              <w:t xml:space="preserve">Matched same-class</w:t>
+            </w:r>
+          </w:p>
+        </w:tc>
+        <w:tc>
+          <w:tcPr/>
+          <w:p>
+            <w:pPr>
+              <w:pStyle w:val="Compact"/>
+              <w:jc w:val="right"/>
+            </w:pPr>
+            <w:r>
+              <w:t xml:space="preserve">Mean</w:t>
+            </w:r>
+            <w:r>
+              <w:t xml:space="preserve"> </w:t>
+            </w:r>
+            <m:oMath>
+              <m:r>
+                <m:rPr>
+                  <m:sty m:val="p"/>
+                </m:rPr>
+                <m:t>Δ</m:t>
+              </m:r>
+            </m:oMath>
+            <w:r>
+              <w:t xml:space="preserve">(same−source)</w:t>
+            </w:r>
+          </w:p>
+        </w:tc>
+        <w:tc>
+          <w:tcPr/>
+          <w:p>
+            <w:pPr>
+              <w:pStyle w:val="Compact"/>
+              <w:jc w:val="right"/>
+            </w:pPr>
+            <w:r>
+              <w:t xml:space="preserve">Mean</w:t>
+            </w:r>
+            <w:r>
+              <w:t xml:space="preserve"> </w:t>
+            </w:r>
+            <m:oMath>
+              <m:r>
+                <m:rPr>
+                  <m:sty m:val="p"/>
+                </m:rPr>
+                <m:t>Δ</m:t>
+              </m:r>
+              <m:r>
+                <m:rPr>
+                  <m:sty m:val="p"/>
+                </m:rPr>
+                <m:t>Δ</m:t>
+              </m:r>
+            </m:oMath>
+            <w:r>
+              <w:t xml:space="preserve">(same−source) vs off</w:t>
+            </w:r>
+          </w:p>
+        </w:tc>
+      </w:tr>
+      <w:tr>
+        <w:tc>
+          <w:tcPr/>
+          <w:p>
+            <w:pPr>
+              <w:pStyle w:val="Compact"/>
+            </w:pPr>
+            <w:r>
+              <w:t xml:space="preserve">Baseline</w:t>
+            </w:r>
+          </w:p>
+        </w:tc>
+        <w:tc>
+          <w:tcPr/>
+          <w:p>
+            <w:pPr>
+              <w:pStyle w:val="Compact"/>
+              <w:jc w:val="right"/>
+            </w:pPr>
+            <w:r>
+              <w:t xml:space="preserve">0.00</w:t>
+            </w:r>
+          </w:p>
+        </w:tc>
+        <w:tc>
+          <w:tcPr/>
+          <w:p>
+            <w:pPr>
+              <w:pStyle w:val="Compact"/>
+              <w:jc w:val="right"/>
+            </w:pPr>
+            <w:r>
+              <w:t xml:space="preserve">0.00</w:t>
+            </w:r>
+          </w:p>
+        </w:tc>
+        <w:tc>
+          <w:tcPr/>
+          <w:p>
+            <w:pPr>
+              <w:pStyle w:val="Compact"/>
+              <w:jc w:val="right"/>
+            </w:pPr>
+            <w:r>
+              <w:t xml:space="preserve">0.00</w:t>
+            </w:r>
+          </w:p>
+        </w:tc>
+        <w:tc>
+          <w:tcPr/>
+          <w:p>
+            <w:pPr>
+              <w:pStyle w:val="Compact"/>
+              <w:jc w:val="right"/>
+            </w:pPr>
+            <w:r>
+              <w:t xml:space="preserve">−5.54</w:t>
+            </w:r>
+          </w:p>
+        </w:tc>
+        <w:tc>
+          <w:tcPr/>
+          <w:p>
+            <w:pPr>
+              <w:pStyle w:val="Compact"/>
+              <w:jc w:val="right"/>
+            </w:pPr>
+            <w:r>
+              <w:t xml:space="preserve">0.00</w:t>
+            </w:r>
+          </w:p>
+        </w:tc>
+      </w:tr>
+      <w:tr>
+        <w:tc>
+          <w:tcPr/>
+          <w:p>
+            <w:pPr>
+              <w:pStyle w:val="Compact"/>
+            </w:pPr>
+            <w:r>
+              <w:t xml:space="preserve">lp_target amplify</w:t>
+            </w:r>
+            <w:r>
+              <w:t xml:space="preserve"> </w:t>
+            </w:r>
+            <m:oMath>
+              <m:r>
+                <m:rPr>
+                  <m:sty m:val="p"/>
+                </m:rPr>
+                <m:t>×</m:t>
+              </m:r>
+              <m:r>
+                <m:t>5</m:t>
+              </m:r>
+            </m:oMath>
+          </w:p>
+        </w:tc>
+        <w:tc>
+          <w:tcPr/>
+          <w:p>
+            <w:pPr>
+              <w:pStyle w:val="Compact"/>
+              <w:jc w:val="right"/>
+            </w:pPr>
+            <w:r>
+              <w:t xml:space="preserve">0.00</w:t>
+            </w:r>
+          </w:p>
+        </w:tc>
+        <w:tc>
+          <w:tcPr/>
+          <w:p>
+            <w:pPr>
+              <w:pStyle w:val="Compact"/>
+              <w:jc w:val="right"/>
+            </w:pPr>
+            <w:r>
+              <w:t xml:space="preserve">0.00</w:t>
+            </w:r>
+          </w:p>
+        </w:tc>
+        <w:tc>
+          <w:tcPr/>
+          <w:p>
+            <w:pPr>
+              <w:pStyle w:val="Compact"/>
+              <w:jc w:val="right"/>
+            </w:pPr>
+            <w:r>
+              <w:t xml:space="preserve">0.00</w:t>
+            </w:r>
+          </w:p>
+        </w:tc>
+        <w:tc>
+          <w:tcPr/>
+          <w:p>
+            <w:pPr>
+              <w:pStyle w:val="Compact"/>
+              <w:jc w:val="right"/>
+            </w:pPr>
+            <w:r>
+              <w:t xml:space="preserve">−5.48</w:t>
+            </w:r>
+          </w:p>
+        </w:tc>
+        <w:tc>
+          <w:tcPr/>
+          <w:p>
+            <w:pPr>
+              <w:pStyle w:val="Compact"/>
+              <w:jc w:val="right"/>
+            </w:pPr>
+            <w:r>
+              <w:t xml:space="preserve">+0.06</w:t>
+            </w:r>
+          </w:p>
+        </w:tc>
+      </w:tr>
+      <w:tr>
+        <w:tc>
+          <w:tcPr/>
+          <w:p>
+            <w:pPr>
+              <w:pStyle w:val="Compact"/>
+            </w:pPr>
+            <w:r>
+              <w:t xml:space="preserve">lp_target amplify</w:t>
+            </w:r>
+            <w:r>
+              <w:t xml:space="preserve"> </w:t>
+            </w:r>
+            <m:oMath>
+              <m:r>
+                <m:rPr>
+                  <m:sty m:val="p"/>
+                </m:rPr>
+                <m:t>×</m:t>
+              </m:r>
+              <m:r>
+                <m:t>8</m:t>
+              </m:r>
+            </m:oMath>
+          </w:p>
+        </w:tc>
+        <w:tc>
+          <w:tcPr/>
+          <w:p>
+            <w:pPr>
+              <w:pStyle w:val="Compact"/>
+              <w:jc w:val="right"/>
+            </w:pPr>
+            <w:r>
+              <w:t xml:space="preserve">0.00</w:t>
+            </w:r>
+          </w:p>
+        </w:tc>
+        <w:tc>
+          <w:tcPr/>
+          <w:p>
+            <w:pPr>
+              <w:pStyle w:val="Compact"/>
+              <w:jc w:val="right"/>
+            </w:pPr>
+            <w:r>
+              <w:t xml:space="preserve">0.00</w:t>
+            </w:r>
+          </w:p>
+        </w:tc>
+        <w:tc>
+          <w:tcPr/>
+          <w:p>
+            <w:pPr>
+              <w:pStyle w:val="Compact"/>
+              <w:jc w:val="right"/>
+            </w:pPr>
+            <w:r>
+              <w:t xml:space="preserve">0.00</w:t>
+            </w:r>
+          </w:p>
+        </w:tc>
+        <w:tc>
+          <w:tcPr/>
+          <w:p>
+            <w:pPr>
+              <w:pStyle w:val="Compact"/>
+              <w:jc w:val="right"/>
+            </w:pPr>
+            <w:r>
+              <w:t xml:space="preserve">−5.58</w:t>
+            </w:r>
+          </w:p>
+        </w:tc>
+        <w:tc>
+          <w:tcPr/>
+          <w:p>
+            <w:pPr>
+              <w:pStyle w:val="Compact"/>
+              <w:jc w:val="right"/>
+            </w:pPr>
+            <w:r>
+              <w:t xml:space="preserve">−0.04</w:t>
+            </w:r>
+          </w:p>
+        </w:tc>
+      </w:tr>
+      <w:tr>
+        <w:tc>
+          <w:tcPr/>
+          <w:p>
+            <w:pPr>
+              <w:pStyle w:val="Compact"/>
+            </w:pPr>
+            <w:r>
+              <w:t xml:space="preserve">lp_target zero</w:t>
+            </w:r>
+          </w:p>
+        </w:tc>
+        <w:tc>
+          <w:tcPr/>
+          <w:p>
+            <w:pPr>
+              <w:pStyle w:val="Compact"/>
+              <w:jc w:val="right"/>
+            </w:pPr>
+            <w:r>
+              <w:t xml:space="preserve">0.00</w:t>
+            </w:r>
+          </w:p>
+        </w:tc>
+        <w:tc>
+          <w:tcPr/>
+          <w:p>
+            <w:pPr>
+              <w:pStyle w:val="Compact"/>
+              <w:jc w:val="right"/>
+            </w:pPr>
+            <w:r>
+              <w:t xml:space="preserve">0.00</w:t>
+            </w:r>
+          </w:p>
+        </w:tc>
+        <w:tc>
+          <w:tcPr/>
+          <w:p>
+            <w:pPr>
+              <w:pStyle w:val="Compact"/>
+              <w:jc w:val="right"/>
+            </w:pPr>
+            <w:r>
+              <w:t xml:space="preserve">0.00</w:t>
+            </w:r>
+          </w:p>
+        </w:tc>
+        <w:tc>
+          <w:tcPr/>
+          <w:p>
+            <w:pPr>
+              <w:pStyle w:val="Compact"/>
+              <w:jc w:val="right"/>
+            </w:pPr>
+            <w:r>
+              <w:t xml:space="preserve">−5.50</w:t>
+            </w:r>
+          </w:p>
+        </w:tc>
+        <w:tc>
+          <w:tcPr/>
+          <w:p>
+            <w:pPr>
+              <w:pStyle w:val="Compact"/>
+              <w:jc w:val="right"/>
+            </w:pPr>
+            <w:r>
+              <w:t xml:space="preserve">+0.04</w:t>
+            </w:r>
+          </w:p>
+        </w:tc>
+      </w:tr>
+      <w:tr>
+        <w:tc>
+          <w:tcPr/>
+          <w:p>
+            <w:pPr>
+              <w:pStyle w:val="Compact"/>
+            </w:pPr>
+            <w:r>
+              <w:t xml:space="preserve">contrast amplify</w:t>
+            </w:r>
+            <w:r>
+              <w:t xml:space="preserve"> </w:t>
+            </w:r>
+            <m:oMath>
+              <m:r>
+                <m:rPr>
+                  <m:sty m:val="p"/>
+                </m:rPr>
+                <m:t>×</m:t>
+              </m:r>
+              <m:r>
+                <m:t>5</m:t>
+              </m:r>
+            </m:oMath>
+          </w:p>
+        </w:tc>
+        <w:tc>
+          <w:tcPr/>
+          <w:p>
+            <w:pPr>
+              <w:pStyle w:val="Compact"/>
+              <w:jc w:val="right"/>
+            </w:pPr>
+            <w:r>
+              <w:t xml:space="preserve">0.00</w:t>
+            </w:r>
+          </w:p>
+        </w:tc>
+        <w:tc>
+          <w:tcPr/>
+          <w:p>
+            <w:pPr>
+              <w:pStyle w:val="Compact"/>
+              <w:jc w:val="right"/>
+            </w:pPr>
+            <w:r>
+              <w:t xml:space="preserve">0.00</w:t>
+            </w:r>
+          </w:p>
+        </w:tc>
+        <w:tc>
+          <w:tcPr/>
+          <w:p>
+            <w:pPr>
+              <w:pStyle w:val="Compact"/>
+              <w:jc w:val="right"/>
+            </w:pPr>
+            <w:r>
+              <w:t xml:space="preserve">0.00</w:t>
+            </w:r>
+          </w:p>
+        </w:tc>
+        <w:tc>
+          <w:tcPr/>
+          <w:p>
+            <w:pPr>
+              <w:pStyle w:val="Compact"/>
+              <w:jc w:val="right"/>
+            </w:pPr>
+            <w:r>
+              <w:t xml:space="preserve">−5.29</w:t>
+            </w:r>
+          </w:p>
+        </w:tc>
+        <w:tc>
+          <w:tcPr/>
+          <w:p>
+            <w:pPr>
+              <w:pStyle w:val="Compact"/>
+              <w:jc w:val="right"/>
+            </w:pPr>
+            <w:r>
+              <w:t xml:space="preserve">+0.25</w:t>
+            </w:r>
+          </w:p>
+        </w:tc>
+      </w:tr>
+      <w:tr>
+        <w:tc>
+          <w:tcPr/>
+          <w:p>
+            <w:pPr>
+              <w:pStyle w:val="Compact"/>
+            </w:pPr>
+            <w:r>
+              <w:t xml:space="preserve">contrast amplify</w:t>
+            </w:r>
+            <w:r>
+              <w:t xml:space="preserve"> </w:t>
+            </w:r>
+            <m:oMath>
+              <m:r>
+                <m:rPr>
+                  <m:sty m:val="p"/>
+                </m:rPr>
+                <m:t>×</m:t>
+              </m:r>
+              <m:r>
+                <m:t>8</m:t>
+              </m:r>
+            </m:oMath>
+          </w:p>
+        </w:tc>
+        <w:tc>
+          <w:tcPr/>
+          <w:p>
+            <w:pPr>
+              <w:pStyle w:val="Compact"/>
+              <w:jc w:val="right"/>
+            </w:pPr>
+            <w:r>
+              <w:t xml:space="preserve">0.00</w:t>
+            </w:r>
+          </w:p>
+        </w:tc>
+        <w:tc>
+          <w:tcPr/>
+          <w:p>
+            <w:pPr>
+              <w:pStyle w:val="Compact"/>
+              <w:jc w:val="right"/>
+            </w:pPr>
+            <w:r>
+              <w:t xml:space="preserve">0.00</w:t>
+            </w:r>
+          </w:p>
+        </w:tc>
+        <w:tc>
+          <w:tcPr/>
+          <w:p>
+            <w:pPr>
+              <w:pStyle w:val="Compact"/>
+              <w:jc w:val="right"/>
+            </w:pPr>
+            <w:r>
+              <w:t xml:space="preserve">0.00</w:t>
+            </w:r>
+          </w:p>
+        </w:tc>
+        <w:tc>
+          <w:tcPr/>
+          <w:p>
+            <w:pPr>
+              <w:pStyle w:val="Compact"/>
+              <w:jc w:val="right"/>
+            </w:pPr>
+            <w:r>
+              <w:t xml:space="preserve">−5.25</w:t>
+            </w:r>
+          </w:p>
+        </w:tc>
+        <w:tc>
+          <w:tcPr/>
+          <w:p>
+            <w:pPr>
+              <w:pStyle w:val="Compact"/>
+              <w:jc w:val="right"/>
+            </w:pPr>
+            <w:r>
+              <w:t xml:space="preserve">+0.29</w:t>
+            </w:r>
+          </w:p>
+        </w:tc>
+      </w:tr>
+      <w:tr>
+        <w:tc>
+          <w:tcPr/>
+          <w:p>
+            <w:pPr>
+              <w:pStyle w:val="Compact"/>
+            </w:pPr>
+            <w:r>
+              <w:t xml:space="preserve">contrast zero</w:t>
+            </w:r>
+          </w:p>
+        </w:tc>
+        <w:tc>
+          <w:tcPr/>
+          <w:p>
+            <w:pPr>
+              <w:pStyle w:val="Compact"/>
+              <w:jc w:val="right"/>
+            </w:pPr>
+            <w:r>
+              <w:t xml:space="preserve">0.00</w:t>
+            </w:r>
+          </w:p>
+        </w:tc>
+        <w:tc>
+          <w:tcPr/>
+          <w:p>
+            <w:pPr>
+              <w:pStyle w:val="Compact"/>
+              <w:jc w:val="right"/>
+            </w:pPr>
+            <w:r>
+              <w:t xml:space="preserve">0.00</w:t>
+            </w:r>
+          </w:p>
+        </w:tc>
+        <w:tc>
+          <w:tcPr/>
+          <w:p>
+            <w:pPr>
+              <w:pStyle w:val="Compact"/>
+              <w:jc w:val="right"/>
+            </w:pPr>
+            <w:r>
+              <w:t xml:space="preserve">0.00</w:t>
+            </w:r>
+          </w:p>
+        </w:tc>
+        <w:tc>
+          <w:tcPr/>
+          <w:p>
+            <w:pPr>
+              <w:pStyle w:val="Compact"/>
+              <w:jc w:val="right"/>
+            </w:pPr>
+            <w:r>
+              <w:t xml:space="preserve">−5.54</w:t>
+            </w:r>
+          </w:p>
+        </w:tc>
+        <w:tc>
+          <w:tcPr/>
+          <w:p>
+            <w:pPr>
+              <w:pStyle w:val="Compact"/>
+              <w:jc w:val="right"/>
+            </w:pPr>
+            <w:r>
+              <w:t xml:space="preserve">0.00</w:t>
+            </w:r>
+          </w:p>
+        </w:tc>
+      </w:tr>
+      <w:tr>
+        <w:tc>
+          <w:tcPr/>
+          <w:p>
+            <w:pPr>
+              <w:pStyle w:val="Compact"/>
+            </w:pPr>
+            <w:r>
+              <w:t xml:space="preserve">Control amplify</w:t>
+            </w:r>
+            <w:r>
+              <w:t xml:space="preserve"> </w:t>
+            </w:r>
+            <m:oMath>
+              <m:r>
+                <m:rPr>
+                  <m:sty m:val="p"/>
+                </m:rPr>
+                <m:t>×</m:t>
+              </m:r>
+              <m:r>
+                <m:t>5</m:t>
+              </m:r>
+            </m:oMath>
+            <w:r>
+              <w:t xml:space="preserve">/</w:t>
+            </w:r>
+            <m:oMath>
+              <m:r>
+                <m:rPr>
+                  <m:sty m:val="p"/>
+                </m:rPr>
+                <m:t>×</m:t>
+              </m:r>
+              <m:r>
+                <m:t>8</m:t>
+              </m:r>
+            </m:oMath>
+          </w:p>
+        </w:tc>
+        <w:tc>
+          <w:tcPr/>
+          <w:p>
+            <w:pPr>
+              <w:pStyle w:val="Compact"/>
+              <w:jc w:val="right"/>
+            </w:pPr>
+            <w:r>
+              <w:t xml:space="preserve">0.00</w:t>
+            </w:r>
+          </w:p>
+        </w:tc>
+        <w:tc>
+          <w:tcPr/>
+          <w:p>
+            <w:pPr>
+              <w:pStyle w:val="Compact"/>
+              <w:jc w:val="right"/>
+            </w:pPr>
+            <w:r>
+              <w:t xml:space="preserve">0.00</w:t>
+            </w:r>
+          </w:p>
+        </w:tc>
+        <w:tc>
+          <w:tcPr/>
+          <w:p>
+            <w:pPr>
+              <w:pStyle w:val="Compact"/>
+              <w:jc w:val="right"/>
+            </w:pPr>
+            <w:r>
+              <w:t xml:space="preserve">0.00</w:t>
+            </w:r>
+          </w:p>
+        </w:tc>
+        <w:tc>
+          <w:tcPr/>
+          <w:p>
+            <w:pPr>
+              <w:pStyle w:val="Compact"/>
+              <w:jc w:val="right"/>
+            </w:pPr>
+            <w:r>
+              <w:t xml:space="preserve">−5.54 / −5.58</w:t>
+            </w:r>
+          </w:p>
+        </w:tc>
+        <w:tc>
+          <w:tcPr/>
+          <w:p>
+            <w:pPr>
+              <w:pStyle w:val="Compact"/>
+              <w:jc w:val="right"/>
+            </w:pPr>
+            <w:r>
+              <w:t xml:space="preserve">≈0</w:t>
+            </w:r>
+          </w:p>
+        </w:tc>
+      </w:tr>
+    </w:tbl>
+    <w:p>
+      <w:pPr>
+        <w:pStyle w:val="BodyText"/>
+      </w:pPr>
+      <w:r>
+        <w:t xml:space="preserve">Every force-on continuation stayed on the baseline noun (</w:t>
+      </w:r>
+      <w:r>
+        <w:rPr>
+          <w:rStyle w:val="VerbatimChar"/>
+        </w:rPr>
+        <w:t xml:space="preserve">a pilot</w:t>
+      </w:r>
+      <w:r>
+        <w:t xml:space="preserve">,</w:t>
+      </w:r>
+      <w:r>
+        <w:t xml:space="preserve"> </w:t>
+      </w:r>
+      <w:r>
+        <w:rPr>
+          <w:rStyle w:val="VerbatimChar"/>
+        </w:rPr>
+        <w:t xml:space="preserve">a lawyer</w:t>
+      </w:r>
+      <w:r>
+        <w:t xml:space="preserve">,</w:t>
+      </w:r>
+      <w:r>
+        <w:t xml:space="preserve"> </w:t>
+      </w:r>
+      <w:r>
+        <w:rPr>
+          <w:rStyle w:val="VerbatimChar"/>
+        </w:rPr>
+        <w:t xml:space="preserve">a psychologist</w:t>
+      </w:r>
+      <w:r>
+        <w:t xml:space="preserve">). Clamps were not inert—on vs off often</w:t>
+      </w:r>
+      <w:r>
+        <w:t xml:space="preserve"> </w:t>
+      </w:r>
+      <w:r>
+        <w:t xml:space="preserve">differed slightly at the logit level—but never enough to switch nouns or</w:t>
+      </w:r>
+      <w:r>
+        <w:t xml:space="preserve"> </w:t>
+      </w:r>
+      <w:r>
+        <w:t xml:space="preserve">close the ~5-logit same−source gap. Selection found four features per</w:t>
+      </w:r>
+      <w:r>
+        <w:t xml:space="preserve"> </w:t>
+      </w:r>
+      <w:r>
+        <w:t xml:space="preserve">method per family (article bound held without relaxation).</w:t>
+      </w:r>
+    </w:p>
+    <w:p>
+      <w:pPr>
+        <w:pStyle w:val="CaptionedFigure"/>
+      </w:pPr>
+      <w:r>
+        <w:drawing>
+          <wp:inline>
+            <wp:extent cx="5943600" cy="2558407"/>
+            <wp:effectExtent b="0" l="0" r="0" t="0"/>
+            <wp:docPr descr="Figure 10. Per-noun LP-style and contrast features under the Stage XVI fixed-b protocol: within-class outcomes remain exactly zero; same-class nouns stay ~5 logits below source." title="" id="115" name="Picture"/>
+            <a:graphic>
+              <a:graphicData uri="http://schemas.openxmlformats.org/drawingml/2006/picture">
+                <pic:pic>
+                  <pic:nvPicPr>
+                    <pic:cNvPr descr="figures/figure10_per_noun_fixed_b.png" id="116" name="Picture"/>
+                    <pic:cNvPicPr>
+                      <a:picLocks noChangeArrowheads="1" noChangeAspect="1"/>
+                    </pic:cNvPicPr>
+                  </pic:nvPicPr>
+                  <pic:blipFill>
+                    <a:blip r:embed="rId114"/>
+                    <a:stretch>
+                      <a:fillRect/>
+                    </a:stretch>
+                  </pic:blipFill>
+                  <pic:spPr bwMode="auto">
+                    <a:xfrm>
+                      <a:off x="0" y="0"/>
+                      <a:ext cx="5943600" cy="2558407"/>
+                    </a:xfrm>
+                    <a:prstGeom prst="rect">
+                      <a:avLst/>
+                    </a:prstGeom>
+                    <a:noFill/>
+                    <a:ln w="9525">
+                      <a:noFill/>
+                      <a:headEnd/>
+                      <a:tailEnd/>
+                    </a:ln>
+                  </pic:spPr>
+                </pic:pic>
+              </a:graphicData>
+            </a:graphic>
+          </wp:inline>
+        </w:drawing>
+      </w:r>
+    </w:p>
+    <w:p>
+      <w:pPr>
+        <w:pStyle w:val="ImageCaption"/>
+      </w:pPr>
+      <w:r>
+        <w:t xml:space="preserve">Figure 10. Per-noun LP-style and contrast features under the Stage XVI fixed-</w:t>
+      </w:r>
+      <m:oMath>
+        <m:r>
+          <m:t>b</m:t>
+        </m:r>
+      </m:oMath>
+      <w:r>
+        <w:t xml:space="preserve"> </w:t>
+      </w:r>
+      <w:r>
+        <w:t xml:space="preserve">protocol: within-class outcomes remain exactly zero; same-class nouns stay ~5 logits below source.</w:t>
+      </w:r>
+    </w:p>
+    <w:bookmarkEnd w:id="117"/>
+    <w:bookmarkStart w:id="118" w:name="conclusion-of-stage-xvii"/>
+    <w:p>
+      <w:pPr>
+        <w:pStyle w:val="Heading3"/>
+      </w:pPr>
+      <w:r>
+        <w:t xml:space="preserve">Conclusion of Stage XVII</w:t>
+      </w:r>
+    </w:p>
+    <w:p>
+      <w:pPr>
+        <w:pStyle w:val="FirstParagraph"/>
+      </w:pPr>
+      <w:r>
+        <w:t xml:space="preserve">This is a</w:t>
+      </w:r>
+      <w:r>
+        <w:t xml:space="preserve"> </w:t>
+      </w:r>
+      <w:r>
+        <w:rPr>
+          <w:b/>
+          <w:bCs/>
+        </w:rPr>
+        <w:t xml:space="preserve">fairer negative</w:t>
+      </w:r>
+      <w:r>
+        <w:t xml:space="preserve"> </w:t>
+      </w:r>
+      <w:r>
+        <w:t xml:space="preserve">than Stage XVI alone: the null is not an</w:t>
+      </w:r>
+      <w:r>
+        <w:t xml:space="preserve"> </w:t>
+      </w:r>
+      <w:r>
+        <w:t xml:space="preserve">artifact of reusing E1’s recurring S3 set. Per-example Latent-Planning-style</w:t>
+      </w:r>
+      <w:r>
+        <w:t xml:space="preserve"> </w:t>
+      </w:r>
+      <w:r>
+        <w:t xml:space="preserve">target-noun features, and target−source contrast features with low</w:t>
+      </w:r>
+      <w:r>
+        <w:t xml:space="preserve"> </w:t>
+      </w:r>
+      <w:r>
+        <w:t xml:space="preserve">article attribution, still do not open an independent within-class</w:t>
+      </w:r>
+      <w:r>
+        <w:t xml:space="preserve"> </w:t>
+      </w:r>
+      <m:oMath>
+        <m:r>
+          <m:t>C</m:t>
+        </m:r>
+        <m:r>
+          <m:rPr>
+            <m:sty m:val="p"/>
+          </m:rPr>
+          <m:t>→</m:t>
+        </m:r>
+        <m:r>
+          <m:t>c</m:t>
+        </m:r>
+      </m:oMath>
+      <w:r>
+        <w:t xml:space="preserve"> </w:t>
+      </w:r>
+      <w:r>
+        <w:t xml:space="preserve">dial under fixed native</w:t>
+      </w:r>
+      <w:r>
+        <w:t xml:space="preserve"> </w:t>
+      </w:r>
+      <m:oMath>
+        <m:r>
+          <m:t>b</m:t>
+        </m:r>
+      </m:oMath>
+      <w:r>
+        <w:t xml:space="preserve">. The H2 packaging read</w:t>
+      </w:r>
+      <w:r>
+        <w:t xml:space="preserve"> </w:t>
+      </w:r>
+      <w:r>
+        <w:t xml:space="preserve">for</w:t>
+      </w:r>
+      <w:r>
+        <w:t xml:space="preserve"> </w:t>
+      </w:r>
+      <w:r>
+        <w:rPr>
+          <w:i/>
+          <w:iCs/>
+        </w:rPr>
+        <w:t xml:space="preserve">these intervenable sparse features</w:t>
+      </w:r>
+      <w:r>
+        <w:t xml:space="preserve"> </w:t>
+      </w:r>
+      <w:r>
+        <w:t xml:space="preserve">is hardened, not revised.</w:t>
+      </w:r>
+    </w:p>
+    <w:p>
+      <w:pPr>
+        <w:pStyle w:val="BodyText"/>
+      </w:pPr>
+      <w:r>
+        <w:t xml:space="preserve">What remains open (Section 11): residual / dense activation-direction</w:t>
+      </w:r>
+      <w:r>
+        <w:t xml:space="preserve"> </w:t>
+      </w:r>
+      <w:r>
+        <w:t xml:space="preserve">patching; dedicated noun-identity latent probes finer than written tokens</w:t>
+      </w:r>
+      <w:r>
+        <w:t xml:space="preserve"> </w:t>
+      </w:r>
+      <w:r>
+        <w:t xml:space="preserve">+ coarse set means; pure</w:t>
+      </w:r>
+      <w:r>
+        <w:t xml:space="preserve"> </w:t>
+      </w:r>
+      <m:oMath>
+        <m:r>
+          <m:t>A</m:t>
+        </m:r>
+      </m:oMath>
+      <w:r>
+        <w:t xml:space="preserve">; scale / model-family generalization.</w:t>
+      </w:r>
+    </w:p>
+    <w:bookmarkEnd w:id="118"/>
+    <w:bookmarkEnd w:id="119"/>
+    <w:bookmarkStart w:id="120" w:name="current-hypothesis-after-stages-viiixvii"/>
+    <w:p>
+      <w:pPr>
+        <w:pStyle w:val="Heading2"/>
+      </w:pPr>
+      <w:r>
+        <w:t xml:space="preserve">10.14 Current hypothesis (after Stages VIII–XVII)</w:t>
       </w:r>
     </w:p>
     <w:p>
@@ -18694,6 +20483,64 @@
           </w:p>
         </w:tc>
       </w:tr>
+      <w:tr>
+        <w:tc>
+          <w:tcPr/>
+          <w:p>
+            <w:pPr>
+              <w:pStyle w:val="Compact"/>
+            </w:pPr>
+            <w:r>
+              <w:t xml:space="preserve">“Maybe S3 was the wrong grain; need LP-style</w:t>
+            </w:r>
+            <w:r>
+              <w:t xml:space="preserve"> </w:t>
+            </w:r>
+            <m:oMath>
+              <m:sSub>
+                <m:e>
+                  <m:r>
+                    <m:t>C</m:t>
+                  </m:r>
+                </m:e>
+                <m:sub>
+                  <m:r>
+                    <m:t>t</m:t>
+                  </m:r>
+                </m:sub>
+              </m:sSub>
+            </m:oMath>
+            <w:r>
+              <w:t xml:space="preserve">”</w:t>
+            </w:r>
+          </w:p>
+        </w:tc>
+        <w:tc>
+          <w:tcPr/>
+          <w:p>
+            <w:pPr>
+              <w:pStyle w:val="Compact"/>
+            </w:pPr>
+            <w:r>
+              <w:t xml:space="preserve">Per-noun attribution selection under fixed</w:t>
+            </w:r>
+            <w:r>
+              <w:t xml:space="preserve"> </w:t>
+            </w:r>
+            <m:oMath>
+              <m:r>
+                <m:t>b</m:t>
+              </m:r>
+            </m:oMath>
+            <w:r>
+              <w:t xml:space="preserve"> </w:t>
+            </w:r>
+            <w:r>
+              <w:t xml:space="preserve">(Stage XVII)</w:t>
+            </w:r>
+          </w:p>
+        </w:tc>
+      </w:tr>
     </w:tbl>
     <w:p>
       <w:pPr>
@@ -18966,9 +20813,9 @@
         <w:t xml:space="preserve">same-article-class synonyms.</w:t>
       </w:r>
     </w:p>
-    <w:bookmarkEnd w:id="113"/>
-    <w:bookmarkEnd w:id="114"/>
-    <w:bookmarkStart w:id="119" w:name="what-has-and-has-not-been-achieved"/>
+    <w:bookmarkEnd w:id="120"/>
+    <w:bookmarkEnd w:id="121"/>
+    <w:bookmarkStart w:id="126" w:name="what-has-and-has-not-been-achieved"/>
     <w:p>
       <w:pPr>
         <w:pStyle w:val="Heading1"/>
@@ -18977,7 +20824,7 @@
         <w:t xml:space="preserve">11. What has and has not been achieved</w:t>
       </w:r>
     </w:p>
-    <w:bookmarkStart w:id="115" w:name="edge-by-edge-evidence-logical-anchor"/>
+    <w:bookmarkStart w:id="122" w:name="edge-by-edge-evidence-logical-anchor"/>
     <w:p>
       <w:pPr>
         <w:pStyle w:val="Heading2"/>
@@ -19441,7 +21288,7 @@
                 <w:b/>
                 <w:bCs/>
               </w:rPr>
-              <w:t xml:space="preserve">Not demonstrated independently—now under a fair protocol.</w:t>
+              <w:t xml:space="preserve">Not demonstrated independently—now under a fair protocol and a fairer feature grain.</w:t>
             </w:r>
             <w:r>
               <w:t xml:space="preserve"> </w:t>
@@ -19492,7 +21339,7 @@
               </m:r>
             </m:oMath>
             <w:r>
-              <w:t xml:space="preserve">-step clamps were off). Stage XVI keeps content clamps</w:t>
+              <w:t xml:space="preserve">-step clamps were off). Stage XVI: content clamps</w:t>
             </w:r>
             <w:r>
               <w:t xml:space="preserve"> </w:t>
@@ -19533,10 +21380,7 @@
               </m:r>
             </m:oMath>
             <w:r>
-              <w:t xml:space="preserve"> </w:t>
-            </w:r>
-            <w:r>
-              <w:t xml:space="preserve">and asks for within-class noun moves:</w:t>
+              <w:t xml:space="preserve">;</w:t>
             </w:r>
             <w:r>
               <w:t xml:space="preserve"> </w:t>
@@ -19559,7 +21403,30 @@
               <w:t xml:space="preserve"> </w:t>
             </w:r>
             <w:r>
-              <w:t xml:space="preserve">signal = 0 for S3, hint-contrast, and controls.</w:t>
+              <w:t xml:space="preserve">signal = 0 for S3, hint-contrast, and controls. Stage XVII: same schedule with per-noun LP-style / contrast features on three twin families; again signal = 0 (max</w:t>
+            </w:r>
+            <w:r>
+              <w:t xml:space="preserve"> </w:t>
+            </w:r>
+            <m:oMath>
+              <m:r>
+                <m:rPr>
+                  <m:sty m:val="p"/>
+                </m:rPr>
+                <m:t>Δ</m:t>
+              </m:r>
+              <m:r>
+                <m:rPr>
+                  <m:sty m:val="p"/>
+                </m:rPr>
+                <m:t>Δ</m:t>
+              </m:r>
+            </m:oMath>
+            <w:r>
+              <w:t xml:space="preserve"> </w:t>
+            </w:r>
+            <w:r>
+              <w:t xml:space="preserve">same−source ≈ +0.29 logits).</w:t>
             </w:r>
           </w:p>
         </w:tc>
@@ -19590,7 +21457,34 @@
               </m:r>
             </m:oMath>
             <w:r>
-              <w:t xml:space="preserve">. Independent content rewrite fails even when phonology and schedule caveats are closed for these handles.</w:t>
+              <w:t xml:space="preserve">. Independent content rewrite fails for recurring S3</w:t>
+            </w:r>
+            <w:r>
+              <w:t xml:space="preserve"> </w:t>
+            </w:r>
+            <w:r>
+              <w:rPr>
+                <w:b/>
+                <w:bCs/>
+              </w:rPr>
+              <w:t xml:space="preserve">and</w:t>
+            </w:r>
+            <w:r>
+              <w:t xml:space="preserve"> </w:t>
+            </w:r>
+            <w:r>
+              <w:t xml:space="preserve">for Latent-Planning-style per-example noun features under fixed</w:t>
+            </w:r>
+            <w:r>
+              <w:t xml:space="preserve"> </w:t>
+            </w:r>
+            <m:oMath>
+              <m:r>
+                <m:t>b</m:t>
+              </m:r>
+            </m:oMath>
+            <w:r>
+              <w:t xml:space="preserve">.</w:t>
             </w:r>
           </w:p>
         </w:tc>
@@ -19752,8 +21646,8 @@
         </w:tc>
       </w:tr>
     </w:tbl>
-    <w:bookmarkEnd w:id="115"/>
-    <w:bookmarkStart w:id="116" w:name="achievements-engineering-and-experiments"/>
+    <w:bookmarkEnd w:id="122"/>
+    <w:bookmarkStart w:id="123" w:name="achievements-engineering-and-experiments"/>
     <w:p>
       <w:pPr>
         <w:pStyle w:val="Heading2"/>
@@ -19775,7 +21669,7 @@
         <w:pStyle w:val="Compact"/>
         <w:numPr>
           <w:ilvl w:val="0"/>
-          <w:numId w:val="1018"/>
+          <w:numId w:val="1020"/>
         </w:numPr>
       </w:pPr>
       <w:r>
@@ -19793,7 +21687,7 @@
         <w:pStyle w:val="Compact"/>
         <w:numPr>
           <w:ilvl w:val="0"/>
-          <w:numId w:val="1018"/>
+          <w:numId w:val="1020"/>
         </w:numPr>
       </w:pPr>
       <w:r>
@@ -19839,7 +21733,7 @@
         <w:pStyle w:val="Compact"/>
         <w:numPr>
           <w:ilvl w:val="0"/>
-          <w:numId w:val="1018"/>
+          <w:numId w:val="1020"/>
         </w:numPr>
       </w:pPr>
       <w:r>
@@ -19885,17 +21779,17 @@
         <w:pStyle w:val="Compact"/>
         <w:numPr>
           <w:ilvl w:val="0"/>
-          <w:numId w:val="1018"/>
+          <w:numId w:val="1020"/>
         </w:numPr>
       </w:pPr>
       <w:r>
-        <w:t xml:space="preserve">held-out fixed-pair, GoF clincher, E1–E4, Stage XV, and Stage XVI</w:t>
-      </w:r>
-      <w:r>
-        <w:t xml:space="preserve"> </w:t>
-      </w:r>
-      <w:r>
-        <w:t xml:space="preserve">results that map onto the edge table above;</w:t>
+        <w:t xml:space="preserve">held-out fixed-pair, GoF clincher, E1–E4, Stage XV, Stage XVI, and</w:t>
+      </w:r>
+      <w:r>
+        <w:t xml:space="preserve"> </w:t>
+      </w:r>
+      <w:r>
+        <w:t xml:space="preserve">Stage XVII results that map onto the edge table above;</w:t>
       </w:r>
     </w:p>
     <w:p>
@@ -19903,7 +21797,7 @@
         <w:pStyle w:val="Compact"/>
         <w:numPr>
           <w:ilvl w:val="0"/>
-          <w:numId w:val="1018"/>
+          <w:numId w:val="1020"/>
         </w:numPr>
       </w:pPr>
       <w:r>
@@ -19921,7 +21815,7 @@
         <w:pStyle w:val="Compact"/>
         <w:numPr>
           <w:ilvl w:val="0"/>
-          <w:numId w:val="1018"/>
+          <w:numId w:val="1020"/>
         </w:numPr>
       </w:pPr>
       <w:r>
@@ -20016,15 +21910,7 @@
         <w:t xml:space="preserve">aviator</w:t>
       </w:r>
       <w:r>
-        <w:t xml:space="preserve">” caveat for these handles).</w:t>
-      </w:r>
-    </w:p>
-    <w:p>
-      <w:pPr>
-        <w:pStyle w:val="FirstParagraph"/>
-      </w:pPr>
-      <w:r>
-        <w:t xml:space="preserve">We have not achieved:</w:t>
+        <w:t xml:space="preserve">” caveat for these handles);</w:t>
       </w:r>
     </w:p>
     <w:p>
@@ -20032,11 +21918,67 @@
         <w:pStyle w:val="Compact"/>
         <w:numPr>
           <w:ilvl w:val="0"/>
-          <w:numId w:val="1019"/>
+          <w:numId w:val="1020"/>
         </w:numPr>
       </w:pPr>
       <w:r>
-        <w:t xml:space="preserve">a general tool for reducing stalling behavior on country–city prompts;</w:t>
+        <w:t xml:space="preserve">a</w:t>
+      </w:r>
+      <w:r>
+        <w:t xml:space="preserve"> </w:t>
+      </w:r>
+      <w:r>
+        <w:rPr>
+          <w:b/>
+          <w:bCs/>
+        </w:rPr>
+        <w:t xml:space="preserve">per-noun</w:t>
+      </w:r>
+      <w:r>
+        <w:t xml:space="preserve"> </w:t>
+      </w:r>
+      <w:r>
+        <w:t xml:space="preserve">Latent-Planning-style attribution null under that same</w:t>
+      </w:r>
+      <w:r>
+        <w:t xml:space="preserve"> </w:t>
+      </w:r>
+      <w:r>
+        <w:t xml:space="preserve">schedule (Stage XVII)—closes the “wrong sparse grain / wrong</w:t>
+      </w:r>
+      <w:r>
+        <w:t xml:space="preserve"> </w:t>
+      </w:r>
+      <m:oMath>
+        <m:sSub>
+          <m:e>
+            <m:r>
+              <m:t>C</m:t>
+            </m:r>
+          </m:e>
+          <m:sub>
+            <m:r>
+              <m:t>t</m:t>
+            </m:r>
+          </m:sub>
+        </m:sSub>
+      </m:oMath>
+      <w:r>
+        <w:t xml:space="preserve">”</w:t>
+      </w:r>
+      <w:r>
+        <w:t xml:space="preserve"> </w:t>
+      </w:r>
+      <w:r>
+        <w:t xml:space="preserve">escape hatch for the handles we can select from CLT graphs.</w:t>
+      </w:r>
+    </w:p>
+    <w:p>
+      <w:pPr>
+        <w:pStyle w:val="FirstParagraph"/>
+      </w:pPr>
+      <w:r>
+        <w:t xml:space="preserve">We have not achieved:</w:t>
       </w:r>
     </w:p>
     <w:p>
@@ -20044,11 +21986,11 @@
         <w:pStyle w:val="Compact"/>
         <w:numPr>
           <w:ilvl w:val="0"/>
-          <w:numId w:val="1019"/>
+          <w:numId w:val="1021"/>
         </w:numPr>
       </w:pPr>
       <w:r>
-        <w:t xml:space="preserve">a content-preserving grammar correction that transfers across prompts;</w:t>
+        <w:t xml:space="preserve">a general tool for reducing stalling behavior on country–city prompts;</w:t>
       </w:r>
     </w:p>
     <w:p>
@@ -20056,7 +21998,19 @@
         <w:pStyle w:val="Compact"/>
         <w:numPr>
           <w:ilvl w:val="0"/>
-          <w:numId w:val="1019"/>
+          <w:numId w:val="1021"/>
+        </w:numPr>
+      </w:pPr>
+      <w:r>
+        <w:t xml:space="preserve">a content-preserving grammar correction that transfers across prompts;</w:t>
+      </w:r>
+    </w:p>
+    <w:p>
+      <w:pPr>
+        <w:pStyle w:val="Compact"/>
+        <w:numPr>
+          <w:ilvl w:val="0"/>
+          <w:numId w:val="1021"/>
         </w:numPr>
       </w:pPr>
       <w:r>
@@ -20117,7 +22071,7 @@
         <w:pStyle w:val="Compact"/>
         <w:numPr>
           <w:ilvl w:val="0"/>
-          <w:numId w:val="1019"/>
+          <w:numId w:val="1021"/>
         </w:numPr>
       </w:pPr>
       <w:r>
@@ -20137,7 +22091,7 @@
         <w:pStyle w:val="Compact"/>
         <w:numPr>
           <w:ilvl w:val="0"/>
-          <w:numId w:val="1019"/>
+          <w:numId w:val="1021"/>
         </w:numPr>
       </w:pPr>
       <w:r>
@@ -20147,7 +22101,13 @@
         <w:t xml:space="preserve"> </w:t>
       </w:r>
       <w:r>
-        <w:t xml:space="preserve">features and a lightweight hint-contrast selector;</w:t>
+        <w:t xml:space="preserve">features (Stage XVI hint-contrast and Stage XVII per-noun selection</w:t>
+      </w:r>
+      <w:r>
+        <w:t xml:space="preserve"> </w:t>
+      </w:r>
+      <w:r>
+        <w:t xml:space="preserve">remain inside the sparse feature dictionary);</w:t>
       </w:r>
     </w:p>
     <w:p>
@@ -20155,7 +22115,7 @@
         <w:pStyle w:val="Compact"/>
         <w:numPr>
           <w:ilvl w:val="0"/>
-          <w:numId w:val="1019"/>
+          <w:numId w:val="1021"/>
         </w:numPr>
       </w:pPr>
       <w:r>
@@ -20171,7 +22131,7 @@
         <w:t xml:space="preserve"> </w:t>
       </w:r>
       <w:r>
-        <w:t xml:space="preserve">more finely than S2/S3 means + noun logits;</w:t>
+        <w:t xml:space="preserve">more finely than written tokens + coarse set means + noun logits;</w:t>
       </w:r>
     </w:p>
     <w:p>
@@ -20179,7 +22139,7 @@
         <w:pStyle w:val="Compact"/>
         <w:numPr>
           <w:ilvl w:val="0"/>
-          <w:numId w:val="1019"/>
+          <w:numId w:val="1021"/>
         </w:numPr>
       </w:pPr>
       <w:r>
@@ -20203,15 +22163,15 @@
         <w:pStyle w:val="Compact"/>
         <w:numPr>
           <w:ilvl w:val="0"/>
-          <w:numId w:val="1019"/>
+          <w:numId w:val="1021"/>
         </w:numPr>
       </w:pPr>
       <w:r>
         <w:t xml:space="preserve">a complete necessity story from zero-ablation alone on twin baselines.</w:t>
       </w:r>
     </w:p>
-    <w:bookmarkEnd w:id="116"/>
-    <w:bookmarkStart w:id="117" w:name="X46d31a06604842fe089d9adc9cbb8d804c11a4b"/>
+    <w:bookmarkEnd w:id="123"/>
+    <w:bookmarkStart w:id="124" w:name="X46d31a06604842fe089d9adc9cbb8d804c11a4b"/>
     <w:p>
       <w:pPr>
         <w:pStyle w:val="Heading2"/>
@@ -20353,7 +22313,35 @@
         <w:t xml:space="preserve"> </w:t>
       </w:r>
       <w:r>
-        <w:t xml:space="preserve">noun moves. Noun changes under free intervention track</w:t>
+        <w:t xml:space="preserve">noun moves, and including</w:t>
+      </w:r>
+      <w:r>
+        <w:t xml:space="preserve"> </w:t>
+      </w:r>
+      <w:r>
+        <w:rPr>
+          <w:b/>
+          <w:bCs/>
+        </w:rPr>
+        <w:t xml:space="preserve">per-noun Latent-Planning-style</w:t>
+      </w:r>
+      <w:r>
+        <w:t xml:space="preserve"> </w:t>
+      </w:r>
+      <w:r>
+        <w:t xml:space="preserve">feature</w:t>
+      </w:r>
+      <w:r>
+        <w:t xml:space="preserve"> </w:t>
+      </w:r>
+      <w:r>
+        <w:t xml:space="preserve">selection on twin families (Stage XVII). Noun changes under free</w:t>
+      </w:r>
+      <w:r>
+        <w:t xml:space="preserve"> </w:t>
+      </w:r>
+      <w:r>
+        <w:t xml:space="preserve">intervention track</w:t>
       </w:r>
       <w:r>
         <w:t xml:space="preserve"> </w:t>
@@ -20373,13 +22361,7 @@
         </m:r>
       </m:oMath>
       <w:r>
-        <w:t xml:space="preserve">.</w:t>
-      </w:r>
-      <w:r>
-        <w:t xml:space="preserve"> </w:t>
-      </w:r>
-      <w:r>
-        <w:t xml:space="preserve">That is</w:t>
+        <w:t xml:space="preserve">. That is</w:t>
       </w:r>
       <w:r>
         <w:t xml:space="preserve"> </w:t>
@@ -20389,7 +22371,7 @@
           <w:b/>
           <w:bCs/>
         </w:rPr>
-        <w:t xml:space="preserve">strong evidence these mechanisms are not modular latent</w:t>
+        <w:t xml:space="preserve">strong evidence these</w:t>
       </w:r>
       <w:r>
         <w:rPr>
@@ -20403,7 +22385,7 @@
           <w:b/>
           <w:bCs/>
         </w:rPr>
-        <w:t xml:space="preserve">planning (H1)</w:t>
+        <w:t xml:space="preserve">mechanisms are not modular latent planning (H1)</w:t>
       </w:r>
       <w:r>
         <w:t xml:space="preserve">, and that</w:t>
@@ -20457,13 +22439,7 @@
         <w:t xml:space="preserve"> </w:t>
       </w:r>
       <w:r>
-        <w:t xml:space="preserve">for the handles we tested (H2</w:t>
-      </w:r>
-      <w:r>
-        <w:t xml:space="preserve"> </w:t>
-      </w:r>
-      <w:r>
-        <w:t xml:space="preserve">as an account of</w:t>
+        <w:t xml:space="preserve">for the handles we tested (H2 as an account of</w:t>
       </w:r>
       <w:r>
         <w:t xml:space="preserve"> </w:t>
@@ -20587,7 +22563,7 @@
         <w:t xml:space="preserve"> </w:t>
       </w:r>
       <w:r>
-        <w:t xml:space="preserve">contrast), not all of activation space.</w:t>
+        <w:t xml:space="preserve">contrast/per-noun LP-target and contrast), not all of activation space.</w:t>
       </w:r>
       <w:r>
         <w:t xml:space="preserve"> </w:t>
@@ -20597,39 +22573,25 @@
           <w:i/>
           <w:iCs/>
         </w:rPr>
-        <w:t xml:space="preserve">Latent Planning Emerges with</w:t>
-      </w:r>
-      <w:r>
-        <w:rPr>
-          <w:i/>
-          <w:iCs/>
-        </w:rPr>
-        <w:t xml:space="preserve"> </w:t>
-      </w:r>
-      <w:r>
-        <w:rPr>
-          <w:i/>
-          <w:iCs/>
-        </w:rPr>
-        <w:t xml:space="preserve">Scale</w:t>
-      </w:r>
-      <w:r>
-        <w:t xml:space="preserve"> </w:t>
-      </w:r>
-      <w:r>
-        <w:t xml:space="preserve">already places reliable a/an success at much larger models; our</w:t>
-      </w:r>
-      <w:r>
-        <w:t xml:space="preserve"> </w:t>
-      </w:r>
-      <w:r>
-        <w:t xml:space="preserve">contribution is to show why article-moving sparse interventions here are</w:t>
-      </w:r>
-      <w:r>
-        <w:t xml:space="preserve"> </w:t>
-      </w:r>
-      <w:r>
-        <w:t xml:space="preserve">easy to</w:t>
+        <w:t xml:space="preserve">Latent Planning Emerges with Scale</w:t>
+      </w:r>
+      <w:r>
+        <w:t xml:space="preserve"> </w:t>
+      </w:r>
+      <w:r>
+        <w:t xml:space="preserve">already places reliable a/an success</w:t>
+      </w:r>
+      <w:r>
+        <w:t xml:space="preserve"> </w:t>
+      </w:r>
+      <w:r>
+        <w:t xml:space="preserve">at much larger models; our contribution is to show why article-moving</w:t>
+      </w:r>
+      <w:r>
+        <w:t xml:space="preserve"> </w:t>
+      </w:r>
+      <w:r>
+        <w:t xml:space="preserve">sparse interventions here are easy to</w:t>
       </w:r>
       <w:r>
         <w:t xml:space="preserve"> </w:t>
@@ -20668,13 +22630,7 @@
         <w:t xml:space="preserve"> </w:t>
       </w:r>
       <w:r>
-        <w:t xml:space="preserve">and content</w:t>
-      </w:r>
-      <w:r>
-        <w:t xml:space="preserve"> </w:t>
-      </w:r>
-      <w:r>
-        <w:t xml:space="preserve">identity are not tested as separate edges.</w:t>
+        <w:t xml:space="preserve">and content identity are not tested as separate edges.</w:t>
       </w:r>
     </w:p>
     <w:p>
@@ -20704,17 +22660,23 @@
         <w:t xml:space="preserve"> </w:t>
       </w:r>
       <w:r>
-        <w:t xml:space="preserve">stay on and the target noun is within-class; therefore free noun change</w:t>
-      </w:r>
-      <w:r>
-        <w:t xml:space="preserve"> </w:t>
-      </w:r>
-      <w:r>
-        <w:t xml:space="preserve">is not evidence of independent content causation for these features.</w:t>
-      </w:r>
-    </w:p>
-    <w:bookmarkEnd w:id="117"/>
-    <w:bookmarkStart w:id="118" w:name="X69f35625b0afe180d6b9eb586d8718d584be9ab"/>
+        <w:t xml:space="preserve">stay on, the target noun is within-class, and features are selected</w:t>
+      </w:r>
+      <w:r>
+        <w:t xml:space="preserve"> </w:t>
+      </w:r>
+      <w:r>
+        <w:t xml:space="preserve">per-noun for that target; therefore free noun change is not evidence of</w:t>
+      </w:r>
+      <w:r>
+        <w:t xml:space="preserve"> </w:t>
+      </w:r>
+      <w:r>
+        <w:t xml:space="preserve">independent content causation for these features.</w:t>
+      </w:r>
+    </w:p>
+    <w:bookmarkEnd w:id="124"/>
+    <w:bookmarkStart w:id="125" w:name="X69f35625b0afe180d6b9eb586d8718d584be9ab"/>
     <w:p>
       <w:pPr>
         <w:pStyle w:val="Heading2"/>
@@ -20728,13 +22690,13 @@
         <w:pStyle w:val="FirstParagraph"/>
       </w:pPr>
       <w:r>
-        <w:t xml:space="preserve">The scoped claim above is now supported by Stage XV + Stage XVI + E1–E3.</w:t>
-      </w:r>
-      <w:r>
-        <w:t xml:space="preserve"> </w:t>
-      </w:r>
-      <w:r>
-        <w:t xml:space="preserve">The</w:t>
+        <w:t xml:space="preserve">The scoped claim above is now supported by Stage XV + Stage XVI + Stage</w:t>
+      </w:r>
+      <w:r>
+        <w:t xml:space="preserve"> </w:t>
+      </w:r>
+      <w:r>
+        <w:t xml:space="preserve">XVII + E1–E3. The</w:t>
       </w:r>
       <w:r>
         <w:t xml:space="preserve"> </w:t>
@@ -20744,26 +22706,56 @@
           <w:b/>
           <w:bCs/>
         </w:rPr>
-        <w:t xml:space="preserve">within-class / schedule hole is closed</w:t>
-      </w:r>
-      <w:r>
-        <w:t xml:space="preserve"> </w:t>
-      </w:r>
-      <w:r>
-        <w:t xml:space="preserve">for these sparse handles.</w:t>
-      </w:r>
-      <w:r>
-        <w:t xml:space="preserve"> </w:t>
-      </w:r>
-      <w:r>
-        <w:t xml:space="preserve">What still limits a harder claim:</w:t>
+        <w:t xml:space="preserve">within-class / schedule hole</w:t>
+      </w:r>
+      <w:r>
+        <w:t xml:space="preserve"> </w:t>
+      </w:r>
+      <w:r>
+        <w:t xml:space="preserve">and the</w:t>
+      </w:r>
+      <w:r>
+        <w:t xml:space="preserve"> </w:t>
+      </w:r>
+      <w:r>
+        <w:rPr>
+          <w:b/>
+          <w:bCs/>
+        </w:rPr>
+        <w:t xml:space="preserve">per-noun</w:t>
+      </w:r>
+      <w:r>
+        <w:rPr>
+          <w:b/>
+          <w:bCs/>
+        </w:rPr>
+        <w:t xml:space="preserve"> </w:t>
+      </w:r>
+      <w:r>
+        <w:rPr>
+          <w:b/>
+          <w:bCs/>
+        </w:rPr>
+        <w:t xml:space="preserve">sparse-grain hole</w:t>
+      </w:r>
+      <w:r>
+        <w:t xml:space="preserve"> </w:t>
+      </w:r>
+      <w:r>
+        <w:t xml:space="preserve">are closed for these CLT handles. What still limits</w:t>
+      </w:r>
+      <w:r>
+        <w:t xml:space="preserve"> </w:t>
+      </w:r>
+      <w:r>
+        <w:t xml:space="preserve">a harder claim:</w:t>
       </w:r>
     </w:p>
     <w:p>
       <w:pPr>
         <w:numPr>
           <w:ilvl w:val="0"/>
-          <w:numId w:val="1020"/>
+          <w:numId w:val="1022"/>
         </w:numPr>
       </w:pPr>
       <w:r>
@@ -20771,31 +22763,35 @@
           <w:b/>
           <w:bCs/>
         </w:rPr>
-        <w:t xml:space="preserve">Broader content handles.</w:t>
-      </w:r>
-      <w:r>
-        <w:t xml:space="preserve"> </w:t>
-      </w:r>
-      <w:r>
-        <w:t xml:space="preserve">We still lack residual patching and</w:t>
-      </w:r>
-      <w:r>
-        <w:t xml:space="preserve"> </w:t>
-      </w:r>
-      <w:r>
-        <w:t xml:space="preserve">true per-noun attribution-graph feature selection for every twin</w:t>
-      </w:r>
-      <w:r>
-        <w:t xml:space="preserve"> </w:t>
-      </w:r>
-      <w:r>
-        <w:t xml:space="preserve">family (Stage XVI’s contrast selector is a graph-free fallback). A</w:t>
-      </w:r>
-      <w:r>
-        <w:t xml:space="preserve"> </w:t>
-      </w:r>
-      <w:r>
-        <w:t xml:space="preserve">positive</w:t>
+        <w:t xml:space="preserve">Residual / dense content handles.</w:t>
+      </w:r>
+      <w:r>
+        <w:t xml:space="preserve"> </w:t>
+      </w:r>
+      <w:r>
+        <w:t xml:space="preserve">Stage XVII closes per-noun</w:t>
+      </w:r>
+      <w:r>
+        <w:t xml:space="preserve"> </w:t>
+      </w:r>
+      <w:r>
+        <w:rPr>
+          <w:i/>
+          <w:iCs/>
+        </w:rPr>
+        <w:t xml:space="preserve">sparse</w:t>
+      </w:r>
+      <w:r>
+        <w:t xml:space="preserve"> </w:t>
+      </w:r>
+      <w:r>
+        <w:t xml:space="preserve">selection; it does not patch residual-stream or full</w:t>
+      </w:r>
+      <w:r>
+        <w:t xml:space="preserve"> </w:t>
+      </w:r>
+      <w:r>
+        <w:t xml:space="preserve">activation directions. A positive</w:t>
       </w:r>
       <w:r>
         <w:t xml:space="preserve"> </w:t>
@@ -20818,20 +22814,20 @@
         <w:t xml:space="preserve"> </w:t>
       </w:r>
       <w:r>
-        <w:t xml:space="preserve">dial could exist outside E1 S3 / this</w:t>
-      </w:r>
-      <w:r>
-        <w:t xml:space="preserve"> </w:t>
-      </w:r>
-      <w:r>
-        <w:t xml:space="preserve">contrast rule.</w:t>
+        <w:t xml:space="preserve">dial could still</w:t>
+      </w:r>
+      <w:r>
+        <w:t xml:space="preserve"> </w:t>
+      </w:r>
+      <w:r>
+        <w:t xml:space="preserve">exist outside the CLT dictionary.</w:t>
       </w:r>
     </w:p>
     <w:p>
       <w:pPr>
         <w:numPr>
           <w:ilvl w:val="0"/>
-          <w:numId w:val="1020"/>
+          <w:numId w:val="1022"/>
         </w:numPr>
       </w:pPr>
       <w:r>
@@ -20845,7 +22841,7 @@
         <w:t xml:space="preserve"> </w:t>
       </w:r>
       <w:r>
-        <w:t xml:space="preserve">Written tokens and coarse S2/S3</w:t>
+        <w:t xml:space="preserve">Written tokens and coarse set</w:t>
       </w:r>
       <w:r>
         <w:t xml:space="preserve"> </w:t>
@@ -20909,7 +22905,7 @@
       <w:pPr>
         <w:numPr>
           <w:ilvl w:val="0"/>
-          <w:numId w:val="1020"/>
+          <w:numId w:val="1022"/>
         </w:numPr>
       </w:pPr>
       <w:r>
@@ -21051,30 +23047,53 @@
         <w:t xml:space="preserve">behavior</w:t>
       </w:r>
       <w:r>
-        <w:t xml:space="preserve">, with the phonological within-class caveat now closed for</w:t>
-      </w:r>
-      <w:r>
-        <w:t xml:space="preserve"> </w:t>
-      </w:r>
-      <w:r>
-        <w:t xml:space="preserve">these sparse handles. Until finer latent probes and broader handles are</w:t>
-      </w:r>
-      <w:r>
-        <w:t xml:space="preserve"> </w:t>
-      </w:r>
-      <w:r>
-        <w:t xml:space="preserve">run, we should not claim latent absence of all content plans—only</w:t>
-      </w:r>
-      <w:r>
-        <w:t xml:space="preserve"> </w:t>
-      </w:r>
-      <w:r>
-        <w:t xml:space="preserve">absence of demonstrated independent causal control of executed</w:t>
+        <w:t xml:space="preserve">, with the phonological within-class caveat and the per-noun</w:t>
       </w:r>
       <w:r>
         <w:t xml:space="preserve"> </w:t>
       </w:r>
       <m:oMath>
+        <m:sSub>
+          <m:e>
+            <m:r>
+              <m:t>C</m:t>
+            </m:r>
+          </m:e>
+          <m:sub>
+            <m:r>
+              <m:t>t</m:t>
+            </m:r>
+          </m:sub>
+        </m:sSub>
+      </m:oMath>
+      <w:r>
+        <w:t xml:space="preserve"> </w:t>
+      </w:r>
+      <w:r>
+        <w:t xml:space="preserve">grain caveat now closed for sparse CLT handles. Until residual</w:t>
+      </w:r>
+      <w:r>
+        <w:t xml:space="preserve"> </w:t>
+      </w:r>
+      <w:r>
+        <w:t xml:space="preserve">patches and finer latent probes are run, we should not claim latent</w:t>
+      </w:r>
+      <w:r>
+        <w:t xml:space="preserve"> </w:t>
+      </w:r>
+      <w:r>
+        <w:t xml:space="preserve">absence of all content plans—only absence of demonstrated independent</w:t>
+      </w:r>
+      <w:r>
+        <w:t xml:space="preserve"> </w:t>
+      </w:r>
+      <w:r>
+        <w:t xml:space="preserve">causal control of executed</w:t>
+      </w:r>
+      <w:r>
+        <w:t xml:space="preserve"> </w:t>
+      </w:r>
+      <m:oMath>
         <m:r>
           <m:t>c</m:t>
         </m:r>
@@ -21097,12 +23116,18 @@
         <w:t xml:space="preserve"> </w:t>
       </w:r>
       <w:r>
-        <w:t xml:space="preserve">fixed for the handles we tested.</w:t>
-      </w:r>
-    </w:p>
-    <w:bookmarkEnd w:id="118"/>
-    <w:bookmarkEnd w:id="119"/>
-    <w:bookmarkStart w:id="120" w:name="reproducibility-map"/>
+        <w:t xml:space="preserve">fixed for the handles we</w:t>
+      </w:r>
+      <w:r>
+        <w:t xml:space="preserve"> </w:t>
+      </w:r>
+      <w:r>
+        <w:t xml:space="preserve">tested.</w:t>
+      </w:r>
+    </w:p>
+    <w:bookmarkEnd w:id="125"/>
+    <w:bookmarkEnd w:id="126"/>
+    <w:bookmarkStart w:id="127" w:name="reproducibility-map"/>
     <w:p>
       <w:pPr>
         <w:pStyle w:val="Heading1"/>
@@ -21726,6 +23751,47 @@
               <w:pStyle w:val="Compact"/>
             </w:pPr>
             <w:r>
+              <w:t xml:space="preserve">Per-noun LP-style features under fixed</w:t>
+            </w:r>
+            <w:r>
+              <w:t xml:space="preserve"> </w:t>
+            </w:r>
+            <m:oMath>
+              <m:r>
+                <m:t>b</m:t>
+              </m:r>
+            </m:oMath>
+            <w:r>
+              <w:t xml:space="preserve"> </w:t>
+            </w:r>
+            <w:r>
+              <w:t xml:space="preserve">(Stage XVII / Exp 2)</w:t>
+            </w:r>
+          </w:p>
+        </w:tc>
+        <w:tc>
+          <w:tcPr/>
+          <w:p>
+            <w:pPr>
+              <w:pStyle w:val="Compact"/>
+            </w:pPr>
+            <w:r>
+              <w:rPr>
+                <w:rStyle w:val="VerbatimChar"/>
+              </w:rPr>
+              <w:t xml:space="preserve">experiments/per_noun_fixed_b_c_to_c/</w:t>
+            </w:r>
+          </w:p>
+        </w:tc>
+      </w:tr>
+      <w:tr>
+        <w:tc>
+          <w:tcPr/>
+          <w:p>
+            <w:pPr>
+              <w:pStyle w:val="Compact"/>
+            </w:pPr>
+            <w:r>
               <w:t xml:space="preserve">Paper execution contract</w:t>
             </w:r>
           </w:p>
@@ -21841,7 +23907,7 @@
         <w:t xml:space="preserve">(Pandoc path).</w:t>
       </w:r>
     </w:p>
-    <w:bookmarkEnd w:id="120"/>
+    <w:bookmarkEnd w:id="127"/>
     <w:sectPr>
       <w:pgSz w:h="15840" w:orient="portrait" w:w="12240"/>
       <w:pgMar w:bottom="1440" w:footer="720" w:header="720" w:left="1440" w:right="1440" w:top="1440"/>
@@ -22513,12 +24579,45 @@
     </w:lvlOverride>
   </w:num>
   <w:num w:numId="1018">
-    <w:abstractNumId w:val="991"/>
+    <w:abstractNumId w:val="99411"/>
+    <w:lvlOverride w:ilvl="0">
+      <w:startOverride w:val="1"/>
+    </w:lvlOverride>
+    <w:lvlOverride w:ilvl="1">
+      <w:startOverride w:val="1"/>
+    </w:lvlOverride>
+    <w:lvlOverride w:ilvl="2">
+      <w:startOverride w:val="1"/>
+    </w:lvlOverride>
+    <w:lvlOverride w:ilvl="3">
+      <w:startOverride w:val="1"/>
+    </w:lvlOverride>
+    <w:lvlOverride w:ilvl="4">
+      <w:startOverride w:val="1"/>
+    </w:lvlOverride>
+    <w:lvlOverride w:ilvl="5">
+      <w:startOverride w:val="1"/>
+    </w:lvlOverride>
+    <w:lvlOverride w:ilvl="6">
+      <w:startOverride w:val="1"/>
+    </w:lvlOverride>
+    <w:lvlOverride w:ilvl="7">
+      <w:startOverride w:val="1"/>
+    </w:lvlOverride>
+    <w:lvlOverride w:ilvl="8">
+      <w:startOverride w:val="1"/>
+    </w:lvlOverride>
   </w:num>
   <w:num w:numId="1019">
     <w:abstractNumId w:val="991"/>
   </w:num>
   <w:num w:numId="1020">
+    <w:abstractNumId w:val="991"/>
+  </w:num>
+  <w:num w:numId="1021">
+    <w:abstractNumId w:val="991"/>
+  </w:num>
+  <w:num w:numId="1022">
     <w:abstractNumId w:val="99411"/>
     <w:lvlOverride w:ilvl="0">
       <w:startOverride w:val="1"/>

</xml_diff>

<commit_message>
Emphasize packaging-vs-independent-C→c surprise in the collaborator report.
Clarify novelty as the juxtaposition: editable sparse features that
successfully switch {b,c} packages still fail as independent content
dials under fixed b. Sharpen Summary, Stage XVII conclusion, and §11
“What this is” / bottom line; rebuild collaborator-report-v3.docx.

Co-authored-by: Cursor <cursoragent@cursor.com>
</commit_message>
<xml_diff>
--- a/docs/collaborator-report/collaborator-report-v3.docx
+++ b/docs/collaborator-report/collaborator-report-v3.docx
@@ -1200,6 +1200,157 @@
     <w:p>
       <w:pPr>
         <w:pStyle w:val="FirstParagraph"/>
+      </w:pPr>
+      <w:r>
+        <w:t xml:space="preserve">The novelty is the juxtaposition, not a blanket “no content</w:t>
+      </w:r>
+      <w:r>
+        <w:t xml:space="preserve"> </w:t>
+      </w:r>
+      <w:r>
+        <w:t xml:space="preserve">causation” claim. The same editable sparse space that</w:t>
+      </w:r>
+      <w:r>
+        <w:t xml:space="preserve"> </w:t>
+      </w:r>
+      <w:r>
+        <w:rPr>
+          <w:i/>
+          <w:iCs/>
+        </w:rPr>
+        <w:t xml:space="preserve">successfully</w:t>
+      </w:r>
+      <w:r>
+        <w:t xml:space="preserve"> </w:t>
+      </w:r>
+      <w:r>
+        <w:t xml:space="preserve">switches legal packages under free generation (</w:t>
+      </w:r>
+      <w:r>
+        <w:rPr>
+          <w:rStyle w:val="VerbatimChar"/>
+        </w:rPr>
+        <w:t xml:space="preserve">a pilot</w:t>
+      </w:r>
+      <w:r>
+        <w:t xml:space="preserve"> </w:t>
+      </w:r>
+      <w:r>
+        <w:t xml:space="preserve">↔</w:t>
+      </w:r>
+      <w:r>
+        <w:t xml:space="preserve"> </w:t>
+      </w:r>
+      <w:r>
+        <w:rPr>
+          <w:rStyle w:val="VerbatimChar"/>
+        </w:rPr>
+        <w:t xml:space="preserve">an aviator</w:t>
+      </w:r>
+      <w:r>
+        <w:t xml:space="preserve">)</w:t>
+      </w:r>
+      <w:r>
+        <w:t xml:space="preserve"> </w:t>
+      </w:r>
+      <w:r>
+        <w:t xml:space="preserve">still yields a stubborn null for</w:t>
+      </w:r>
+      <w:r>
+        <w:t xml:space="preserve"> </w:t>
+      </w:r>
+      <w:r>
+        <w:rPr>
+          <w:b/>
+          <w:bCs/>
+        </w:rPr>
+        <w:t xml:space="preserve">independent</w:t>
+      </w:r>
+      <w:r>
+        <w:t xml:space="preserve"> </w:t>
+      </w:r>
+      <m:oMath>
+        <m:r>
+          <m:t>C</m:t>
+        </m:r>
+        <m:r>
+          <m:rPr>
+            <m:sty m:val="p"/>
+          </m:rPr>
+          <m:t>→</m:t>
+        </m:r>
+        <m:r>
+          <m:t>c</m:t>
+        </m:r>
+      </m:oMath>
+      <w:r>
+        <w:t xml:space="preserve"> </w:t>
+      </w:r>
+      <w:r>
+        <w:t xml:space="preserve">under fixed</w:t>
+      </w:r>
+      <w:r>
+        <w:t xml:space="preserve"> </w:t>
+      </w:r>
+      <m:oMath>
+        <m:r>
+          <m:t>b</m:t>
+        </m:r>
+      </m:oMath>
+      <w:r>
+        <w:t xml:space="preserve">. Packaging and</w:t>
+      </w:r>
+      <w:r>
+        <w:t xml:space="preserve"> </w:t>
+      </w:r>
+      <m:oMath>
+        <m:r>
+          <m:t>b</m:t>
+        </m:r>
+        <m:r>
+          <m:rPr>
+            <m:sty m:val="p"/>
+          </m:rPr>
+          <m:t>→</m:t>
+        </m:r>
+        <m:r>
+          <m:t>c</m:t>
+        </m:r>
+      </m:oMath>
+      <w:r>
+        <w:t xml:space="preserve"> </w:t>
+      </w:r>
+      <w:r>
+        <w:t xml:space="preserve">are easy to move;</w:t>
+      </w:r>
+      <w:r>
+        <w:t xml:space="preserve"> </w:t>
+      </w:r>
+      <w:r>
+        <w:t xml:space="preserve">modular content control is not—in every representation we could</w:t>
+      </w:r>
+      <w:r>
+        <w:t xml:space="preserve"> </w:t>
+      </w:r>
+      <w:r>
+        <w:t xml:space="preserve">actually manipulate (dual-effect, content-ish, hint-contrast, and</w:t>
+      </w:r>
+      <w:r>
+        <w:t xml:space="preserve"> </w:t>
+      </w:r>
+      <w:r>
+        <w:t xml:space="preserve">per-noun LP-style features). Residual / dense directions remain an open</w:t>
+      </w:r>
+      <w:r>
+        <w:t xml:space="preserve"> </w:t>
+      </w:r>
+      <w:r>
+        <w:t xml:space="preserve">fairness check (Section 11), not a result we claim to have closed.</w:t>
+      </w:r>
+    </w:p>
+    <w:p>
+      <w:pPr>
+        <w:pStyle w:val="BodyText"/>
       </w:pPr>
       <w:r>
         <w:t xml:space="preserve">This is a publishable</w:t>
@@ -20183,6 +20334,149 @@
         <w:pStyle w:val="BodyText"/>
       </w:pPr>
       <w:r>
+        <w:t xml:space="preserve">Surprise for collaborators: packaging success coexists with a stubborn</w:t>
+      </w:r>
+      <w:r>
+        <w:t xml:space="preserve"> </w:t>
+      </w:r>
+      <w:r>
+        <w:t xml:space="preserve">independent-</w:t>
+      </w:r>
+      <m:oMath>
+        <m:r>
+          <m:t>C</m:t>
+        </m:r>
+        <m:r>
+          <m:rPr>
+            <m:sty m:val="p"/>
+          </m:rPr>
+          <m:t>→</m:t>
+        </m:r>
+        <m:r>
+          <m:t>c</m:t>
+        </m:r>
+      </m:oMath>
+      <w:r>
+        <w:t xml:space="preserve"> </w:t>
+      </w:r>
+      <w:r>
+        <w:t xml:space="preserve">null in manipulable space. We are not</w:t>
+      </w:r>
+      <w:r>
+        <w:t xml:space="preserve"> </w:t>
+      </w:r>
+      <w:r>
+        <w:t xml:space="preserve">mainly reporting that content is invisible to intervention; we are</w:t>
+      </w:r>
+      <w:r>
+        <w:t xml:space="preserve"> </w:t>
+      </w:r>
+      <w:r>
+        <w:t xml:space="preserve">reporting that the handles that</w:t>
+      </w:r>
+      <w:r>
+        <w:t xml:space="preserve"> </w:t>
+      </w:r>
+      <w:r>
+        <w:rPr>
+          <w:i/>
+          <w:iCs/>
+        </w:rPr>
+        <w:t xml:space="preserve">do</w:t>
+      </w:r>
+      <w:r>
+        <w:t xml:space="preserve"> </w:t>
+      </w:r>
+      <w:r>
+        <w:t xml:space="preserve">move</w:t>
+      </w:r>
+      <w:r>
+        <w:t xml:space="preserve"> </w:t>
+      </w:r>
+      <m:oMath>
+        <m:r>
+          <m:rPr>
+            <m:sty m:val="p"/>
+          </m:rPr>
+          <m:t>{</m:t>
+        </m:r>
+        <m:r>
+          <m:t>b</m:t>
+        </m:r>
+        <m:r>
+          <m:rPr>
+            <m:sty m:val="p"/>
+          </m:rPr>
+          <m:t>,</m:t>
+        </m:r>
+        <m:r>
+          <m:t>c</m:t>
+        </m:r>
+        <m:r>
+          <m:rPr>
+            <m:sty m:val="p"/>
+          </m:rPr>
+          <m:t>}</m:t>
+        </m:r>
+      </m:oMath>
+      <w:r>
+        <w:t xml:space="preserve"> </w:t>
+      </w:r>
+      <w:r>
+        <w:t xml:space="preserve">packages still fail</w:t>
+      </w:r>
+      <w:r>
+        <w:t xml:space="preserve"> </w:t>
+      </w:r>
+      <w:r>
+        <w:t xml:space="preserve">as content dials once</w:t>
+      </w:r>
+      <w:r>
+        <w:t xml:space="preserve"> </w:t>
+      </w:r>
+      <m:oMath>
+        <m:r>
+          <m:t>b</m:t>
+        </m:r>
+      </m:oMath>
+      <w:r>
+        <w:t xml:space="preserve"> </w:t>
+      </w:r>
+      <w:r>
+        <w:t xml:space="preserve">is held fixed—even after selecting features</w:t>
+      </w:r>
+      <w:r>
+        <w:t xml:space="preserve"> </w:t>
+      </w:r>
+      <w:r>
+        <w:t xml:space="preserve">the way Latent Planning would for a target noun</w:t>
+      </w:r>
+      <w:r>
+        <w:t xml:space="preserve"> </w:t>
+      </w:r>
+      <m:oMath>
+        <m:sSub>
+          <m:e>
+            <m:r>
+              <m:t>C</m:t>
+            </m:r>
+          </m:e>
+          <m:sub>
+            <m:r>
+              <m:t>t</m:t>
+            </m:r>
+          </m:sub>
+        </m:sSub>
+      </m:oMath>
+      <w:r>
+        <w:t xml:space="preserve">.</w:t>
+      </w:r>
+    </w:p>
+    <w:p>
+      <w:pPr>
+        <w:pStyle w:val="BodyText"/>
+      </w:pPr>
+      <w:r>
         <w:t xml:space="preserve">What remains open (Section 11): residual / dense activation-direction</w:t>
       </w:r>
       <w:r>
@@ -22470,66 +22764,207 @@
         <w:t xml:space="preserve"> </w:t>
       </w:r>
       <w:r>
-        <w:t xml:space="preserve">A paper-grade challenge to reading Latent-Planning-style</w:t>
-      </w:r>
-      <w:r>
-        <w:t xml:space="preserve"> </w:t>
-      </w:r>
-      <w:r>
-        <w:t xml:space="preserve">dual-effect (and related) sparse interventions on Gemma 3 270M as the</w:t>
-      </w:r>
-      <w:r>
-        <w:t xml:space="preserve"> </w:t>
-      </w:r>
-      <w:r>
-        <w:t xml:space="preserve">separable modular graph. It is the right emphasis for collaborators and</w:t>
-      </w:r>
-      <w:r>
-        <w:t xml:space="preserve"> </w:t>
-      </w:r>
-      <w:r>
-        <w:t xml:space="preserve">for a methods/results paper on misreading article flips.</w:t>
-      </w:r>
-    </w:p>
-    <w:p>
-      <w:pPr>
-        <w:pStyle w:val="BodyText"/>
-      </w:pPr>
+        <w:t xml:space="preserve">The surprise juxtaposition: on this model, every</w:t>
+      </w:r>
+      <w:r>
+        <w:t xml:space="preserve"> </w:t>
+      </w:r>
+      <w:r>
+        <w:t xml:space="preserve">intervenable sparse representation we could edit that</w:t>
+      </w:r>
+      <w:r>
+        <w:t xml:space="preserve"> </w:t>
+      </w:r>
       <w:r>
         <w:rPr>
           <w:b/>
           <w:bCs/>
         </w:rPr>
-        <w:t xml:space="preserve">What this is not.</w:t>
-      </w:r>
-      <w:r>
-        <w:t xml:space="preserve"> </w:t>
-      </w:r>
-      <w:r>
-        <w:t xml:space="preserve">It is</w:t>
-      </w:r>
-      <w:r>
-        <w:t xml:space="preserve"> </w:t>
+        <w:t xml:space="preserve">successfully</w:t>
       </w:r>
       <w:r>
         <w:rPr>
           <w:b/>
           <w:bCs/>
         </w:rPr>
-        <w:t xml:space="preserve">not</w:t>
-      </w:r>
-      <w:r>
-        <w:t xml:space="preserve"> </w:t>
-      </w:r>
-      <w:r>
-        <w:t xml:space="preserve">a metaphysical refutation of any</w:t>
-      </w:r>
-      <w:r>
+        <w:t xml:space="preserve"> </w:t>
+      </w:r>
+      <w:r>
+        <w:rPr>
+          <w:b/>
+          <w:bCs/>
+        </w:rPr>
+        <w:t xml:space="preserve">moves legal</w:t>
+      </w:r>
+      <w:r>
+        <w:rPr>
+          <w:b/>
+          <w:bCs/>
+        </w:rPr>
         <w:t xml:space="preserve"> </w:t>
       </w:r>
       <m:oMath>
         <m:r>
-          <m:t>C</m:t>
+          <m:rPr>
+            <m:sty m:val="p"/>
+          </m:rPr>
+          <m:t>{</m:t>
+        </m:r>
+        <m:r>
+          <m:t>b</m:t>
+        </m:r>
+        <m:r>
+          <m:rPr>
+            <m:sty m:val="p"/>
+          </m:rPr>
+          <m:t>,</m:t>
+        </m:r>
+        <m:r>
+          <m:t>c</m:t>
+        </m:r>
+        <m:r>
+          <m:rPr>
+            <m:sty m:val="p"/>
+          </m:rPr>
+          <m:t>}</m:t>
+        </m:r>
+      </m:oMath>
+      <w:r>
+        <w:rPr>
+          <w:b/>
+          <w:bCs/>
+        </w:rPr>
+        <w:t xml:space="preserve"> </w:t>
+      </w:r>
+      <w:r>
+        <w:rPr>
+          <w:b/>
+          <w:bCs/>
+        </w:rPr>
+        <w:t xml:space="preserve">packages</w:t>
+      </w:r>
+      <w:r>
+        <w:t xml:space="preserve"> </w:t>
+      </w:r>
+      <w:r>
+        <w:t xml:space="preserve">under free generation still</w:t>
+      </w:r>
+      <w:r>
+        <w:t xml:space="preserve"> </w:t>
+      </w:r>
+      <w:r>
+        <w:rPr>
+          <w:b/>
+          <w:bCs/>
+        </w:rPr>
+        <w:t xml:space="preserve">fails</w:t>
+      </w:r>
+      <w:r>
+        <w:rPr>
+          <w:b/>
+          <w:bCs/>
+        </w:rPr>
+        <w:t xml:space="preserve"> </w:t>
+      </w:r>
+      <w:r>
+        <w:rPr>
+          <w:b/>
+          <w:bCs/>
+        </w:rPr>
+        <w:t xml:space="preserve">to move</w:t>
+      </w:r>
+      <w:r>
+        <w:rPr>
+          <w:b/>
+          <w:bCs/>
+        </w:rPr>
+        <w:t xml:space="preserve"> </w:t>
+      </w:r>
+      <m:oMath>
+        <m:r>
+          <m:t>c</m:t>
+        </m:r>
+      </m:oMath>
+      <w:r>
+        <w:rPr>
+          <w:b/>
+          <w:bCs/>
+        </w:rPr>
+        <w:t xml:space="preserve"> </w:t>
+      </w:r>
+      <w:r>
+        <w:rPr>
+          <w:b/>
+          <w:bCs/>
+        </w:rPr>
+        <w:t xml:space="preserve">independently</w:t>
+      </w:r>
+      <w:r>
+        <w:t xml:space="preserve"> </w:t>
+      </w:r>
+      <w:r>
+        <w:t xml:space="preserve">once</w:t>
+      </w:r>
+      <w:r>
+        <w:t xml:space="preserve"> </w:t>
+      </w:r>
+      <m:oMath>
+        <m:r>
+          <m:t>b</m:t>
+        </m:r>
+      </m:oMath>
+      <w:r>
+        <w:t xml:space="preserve"> </w:t>
+      </w:r>
+      <w:r>
+        <w:t xml:space="preserve">is held fixed (Stages XV–XVII,</w:t>
+      </w:r>
+      <w:r>
+        <w:t xml:space="preserve"> </w:t>
+      </w:r>
+      <w:r>
+        <w:t xml:space="preserve">including per-noun LP-style selection). That is a paper-grade challenge</w:t>
+      </w:r>
+      <w:r>
+        <w:t xml:space="preserve"> </w:t>
+      </w:r>
+      <w:r>
+        <w:t xml:space="preserve">to reading Latent-Planning-style dual-effect (and related) sparse</w:t>
+      </w:r>
+      <w:r>
+        <w:t xml:space="preserve"> </w:t>
+      </w:r>
+      <w:r>
+        <w:t xml:space="preserve">interventions on Gemma 3 270M as the separable modular graph. The</w:t>
+      </w:r>
+      <w:r>
+        <w:t xml:space="preserve"> </w:t>
+      </w:r>
+      <w:r>
+        <w:t xml:space="preserve">practical consequence is that article flips here are easy to</w:t>
+      </w:r>
+      <w:r>
+        <w:t xml:space="preserve"> </w:t>
+      </w:r>
+      <w:r>
+        <w:rPr>
+          <w:b/>
+          <w:bCs/>
+        </w:rPr>
+        <w:t xml:space="preserve">misread</w:t>
+      </w:r>
+      <w:r>
+        <w:t xml:space="preserve"> </w:t>
+      </w:r>
+      <w:r>
+        <w:t xml:space="preserve">as modular planning if</w:t>
+      </w:r>
+      <w:r>
+        <w:t xml:space="preserve"> </w:t>
+      </w:r>
+      <m:oMath>
+        <m:r>
+          <m:t>b</m:t>
         </m:r>
         <m:r>
           <m:rPr>
@@ -22545,76 +22980,54 @@
         <w:t xml:space="preserve"> </w:t>
       </w:r>
       <w:r>
-        <w:t xml:space="preserve">anywhere in the network, nor a claim that the model</w:t>
-      </w:r>
-      <w:r>
-        <w:t xml:space="preserve"> </w:t>
-      </w:r>
-      <w:r>
-        <w:t xml:space="preserve">has no causal structure, nor that latent planning is impossible at larger</w:t>
-      </w:r>
-      <w:r>
-        <w:t xml:space="preserve"> </w:t>
-      </w:r>
-      <w:r>
-        <w:t xml:space="preserve">scales. We tested specific frozen feature sets (S1/S2/S3/controls/hint</w:t>
-      </w:r>
-      <w:r>
-        <w:t xml:space="preserve"> </w:t>
-      </w:r>
-      <w:r>
-        <w:t xml:space="preserve">contrast/per-noun LP-target and contrast), not all of activation space.</w:t>
-      </w:r>
-      <w:r>
-        <w:t xml:space="preserve"> </w:t>
-      </w:r>
-      <w:r>
-        <w:rPr>
-          <w:i/>
-          <w:iCs/>
-        </w:rPr>
-        <w:t xml:space="preserve">Latent Planning Emerges with Scale</w:t>
-      </w:r>
-      <w:r>
-        <w:t xml:space="preserve"> </w:t>
-      </w:r>
-      <w:r>
-        <w:t xml:space="preserve">already places reliable a/an success</w:t>
-      </w:r>
-      <w:r>
-        <w:t xml:space="preserve"> </w:t>
-      </w:r>
-      <w:r>
-        <w:t xml:space="preserve">at much larger models; our contribution is to show why article-moving</w:t>
-      </w:r>
-      <w:r>
-        <w:t xml:space="preserve"> </w:t>
-      </w:r>
-      <w:r>
-        <w:t xml:space="preserve">sparse interventions here are easy to</w:t>
-      </w:r>
-      <w:r>
-        <w:t xml:space="preserve"> </w:t>
-      </w:r>
+        <w:t xml:space="preserve">and content identity are not</w:t>
+      </w:r>
+      <w:r>
+        <w:t xml:space="preserve"> </w:t>
+      </w:r>
+      <w:r>
+        <w:t xml:space="preserve">tested as separate edges.</w:t>
+      </w:r>
+    </w:p>
+    <w:p>
+      <w:pPr>
+        <w:pStyle w:val="BodyText"/>
+      </w:pPr>
       <w:r>
         <w:rPr>
           <w:b/>
           <w:bCs/>
         </w:rPr>
-        <w:t xml:space="preserve">misread</w:t>
-      </w:r>
-      <w:r>
-        <w:t xml:space="preserve"> </w:t>
-      </w:r>
-      <w:r>
-        <w:t xml:space="preserve">as modular planning if</w:t>
+        <w:t xml:space="preserve">What this is not.</w:t>
+      </w:r>
+      <w:r>
+        <w:t xml:space="preserve"> </w:t>
+      </w:r>
+      <w:r>
+        <w:t xml:space="preserve">It is</w:t>
+      </w:r>
+      <w:r>
+        <w:t xml:space="preserve"> </w:t>
+      </w:r>
+      <w:r>
+        <w:rPr>
+          <w:b/>
+          <w:bCs/>
+        </w:rPr>
+        <w:t xml:space="preserve">not</w:t>
+      </w:r>
+      <w:r>
+        <w:t xml:space="preserve"> </w:t>
+      </w:r>
+      <w:r>
+        <w:t xml:space="preserve">a metaphysical refutation of any</w:t>
       </w:r>
       <w:r>
         <w:t xml:space="preserve"> </w:t>
       </w:r>
       <m:oMath>
         <m:r>
-          <m:t>b</m:t>
+          <m:t>C</m:t>
         </m:r>
         <m:r>
           <m:rPr>
@@ -22630,7 +23043,69 @@
         <w:t xml:space="preserve"> </w:t>
       </w:r>
       <w:r>
-        <w:t xml:space="preserve">and content identity are not tested as separate edges.</w:t>
+        <w:t xml:space="preserve">anywhere in the network, nor a claim that the model</w:t>
+      </w:r>
+      <w:r>
+        <w:t xml:space="preserve"> </w:t>
+      </w:r>
+      <w:r>
+        <w:t xml:space="preserve">has no causal structure, nor that latent planning is impossible at larger</w:t>
+      </w:r>
+      <w:r>
+        <w:t xml:space="preserve"> </w:t>
+      </w:r>
+      <w:r>
+        <w:t xml:space="preserve">scales, nor that content causation is absent from every representation.</w:t>
+      </w:r>
+      <w:r>
+        <w:t xml:space="preserve"> </w:t>
+      </w:r>
+      <w:r>
+        <w:t xml:space="preserve">We tested specific frozen feature sets (S1/S2/S3/controls/hint</w:t>
+      </w:r>
+      <w:r>
+        <w:t xml:space="preserve"> </w:t>
+      </w:r>
+      <w:r>
+        <w:t xml:space="preserve">contrast/per-noun LP-target and contrast), not all of activation space.</w:t>
+      </w:r>
+      <w:r>
+        <w:t xml:space="preserve"> </w:t>
+      </w:r>
+      <w:r>
+        <w:rPr>
+          <w:i/>
+          <w:iCs/>
+        </w:rPr>
+        <w:t xml:space="preserve">Latent Planning Emerges with Scale</w:t>
+      </w:r>
+      <w:r>
+        <w:t xml:space="preserve"> </w:t>
+      </w:r>
+      <w:r>
+        <w:t xml:space="preserve">already places reliable a/an success</w:t>
+      </w:r>
+      <w:r>
+        <w:t xml:space="preserve"> </w:t>
+      </w:r>
+      <w:r>
+        <w:t xml:space="preserve">at much larger models; our contribution is the scoped null for</w:t>
+      </w:r>
+      <w:r>
+        <w:t xml:space="preserve"> </w:t>
+      </w:r>
+      <w:r>
+        <w:rPr>
+          <w:i/>
+          <w:iCs/>
+        </w:rPr>
+        <w:t xml:space="preserve">independent</w:t>
+      </w:r>
+      <w:r>
+        <w:t xml:space="preserve"> </w:t>
+      </w:r>
+      <w:r>
+        <w:t xml:space="preserve">content control in the space we could manipulate.</w:t>
       </w:r>
     </w:p>
     <w:p>
@@ -22648,25 +23123,48 @@
         <w:t xml:space="preserve"> </w:t>
       </w:r>
       <w:r>
-        <w:t xml:space="preserve">holding the article fixed</w:t>
-      </w:r>
-      <w:r>
-        <w:t xml:space="preserve"> </w:t>
-      </w:r>
-      <w:r>
-        <w:t xml:space="preserve">abolishes noun change under these interventions—even when content clamps</w:t>
-      </w:r>
-      <w:r>
-        <w:t xml:space="preserve"> </w:t>
-      </w:r>
-      <w:r>
-        <w:t xml:space="preserve">stay on, the target noun is within-class, and features are selected</w:t>
-      </w:r>
-      <w:r>
-        <w:t xml:space="preserve"> </w:t>
-      </w:r>
-      <w:r>
-        <w:t xml:space="preserve">per-noun for that target; therefore free noun change is not evidence of</w:t>
+        <w:t xml:space="preserve">packaging works and independent</w:t>
+      </w:r>
+      <w:r>
+        <w:t xml:space="preserve"> </w:t>
+      </w:r>
+      <m:oMath>
+        <m:r>
+          <m:t>C</m:t>
+        </m:r>
+        <m:r>
+          <m:rPr>
+            <m:sty m:val="p"/>
+          </m:rPr>
+          <m:t>→</m:t>
+        </m:r>
+        <m:r>
+          <m:t>c</m:t>
+        </m:r>
+      </m:oMath>
+      <w:r>
+        <w:t xml:space="preserve"> </w:t>
+      </w:r>
+      <w:r>
+        <w:t xml:space="preserve">does not—in the same editable sparse features—so</w:t>
+      </w:r>
+      <w:r>
+        <w:t xml:space="preserve"> </w:t>
+      </w:r>
+      <w:r>
+        <w:t xml:space="preserve">holding the article fixed abolishes noun change even when content clamps</w:t>
+      </w:r>
+      <w:r>
+        <w:t xml:space="preserve"> </w:t>
+      </w:r>
+      <w:r>
+        <w:t xml:space="preserve">stay on, the target is within-class, and features are selected per-noun</w:t>
+      </w:r>
+      <w:r>
+        <w:t xml:space="preserve"> </w:t>
+      </w:r>
+      <w:r>
+        <w:t xml:space="preserve">for that target; free noun change is therefore not evidence of</w:t>
       </w:r>
       <w:r>
         <w:t xml:space="preserve"> </w:t>

</xml_diff>

<commit_message>
Add residual fixed-b C→c null (Exp 1 / Stage XVIII) and document it.
Implements dense MLP-in activation-direction steering under the Stage XVI
protocol (hint(target)−hint(source) unit directions at layers 8/10/12/14,
α=1–8, matched random controls). Result is a clean null—zero within-class
noun switches; content steering no better than random; same−source gap
stays ~−5.5—closing the main “content lives outside the sparse dictionary /
affine skip” escape hatch for this construction.

Integrates Stage XVIII into the collaborator report with plain-language
glossary and motivation, updates the claim / edge table / remaining holes,
adds Figure 11, and rebuilds collaborator-report-v3.docx.

Co-authored-by: Cursor <cursoragent@cursor.com>
</commit_message>
<xml_diff>
--- a/docs/collaborator-report/collaborator-report-v3.docx
+++ b/docs/collaborator-report/collaborator-report-v3.docx
@@ -590,7 +590,7 @@
         <w:t xml:space="preserve">pasted native article</w:t>
       </w:r>
       <w:r>
-        <w:t xml:space="preserve">, and a</w:t>
+        <w:t xml:space="preserve">, a</w:t>
       </w:r>
       <w:r>
         <w:t xml:space="preserve"> </w:t>
@@ -686,6 +686,60 @@
           <w:b/>
           <w:bCs/>
         </w:rPr>
+        <w:t xml:space="preserve">per-noun Latent-Planning-style feature selection</w:t>
+      </w:r>
+      <w:r>
+        <w:t xml:space="preserve">, and a</w:t>
+      </w:r>
+      <w:r>
+        <w:t xml:space="preserve"> </w:t>
+      </w:r>
+      <w:r>
+        <w:rPr>
+          <w:b/>
+          <w:bCs/>
+        </w:rPr>
+        <w:t xml:space="preserve">dense</w:t>
+      </w:r>
+      <w:r>
+        <w:rPr>
+          <w:b/>
+          <w:bCs/>
+        </w:rPr>
+        <w:t xml:space="preserve"> </w:t>
+      </w:r>
+      <w:r>
+        <w:rPr>
+          <w:b/>
+          <w:bCs/>
+        </w:rPr>
+        <w:t xml:space="preserve">residual / activation-direction steer</w:t>
+      </w:r>
+      <w:r>
+        <w:t xml:space="preserve"> </w:t>
+      </w:r>
+      <w:r>
+        <w:t xml:space="preserve">under that same fixed-</w:t>
+      </w:r>
+      <m:oMath>
+        <m:r>
+          <m:t>b</m:t>
+        </m:r>
+      </m:oMath>
+      <w:r>
+        <w:t xml:space="preserve"> </w:t>
+      </w:r>
+      <w:r>
+        <w:t xml:space="preserve">schedule,</w:t>
+      </w:r>
+      <w:r>
+        <w:t xml:space="preserve"> </w:t>
+      </w:r>
+      <w:r>
+        <w:rPr>
+          <w:b/>
+          <w:bCs/>
+        </w:rPr>
         <w:t xml:space="preserve">no held-out condition produced reliable wrapper-like repair</w:t>
       </w:r>
       <w:r>
@@ -1047,7 +1101,7 @@
           <w:i/>
           <w:iCs/>
         </w:rPr>
-        <w:t xml:space="preserve">protocol, and including Latent-Planning-style per-noun feature</w:t>
+        <w:t xml:space="preserve">protocol, including Latent-Planning-style per-noun feature selection</w:t>
       </w:r>
       <w:r>
         <w:rPr>
@@ -1061,7 +1115,21 @@
           <w:i/>
           <w:iCs/>
         </w:rPr>
-        <w:t xml:space="preserve">selection (Stage XVII); free noun change tracks</w:t>
+        <w:t xml:space="preserve">(Stage XVII), and including a dense residual / activation-direction</w:t>
+      </w:r>
+      <w:r>
+        <w:rPr>
+          <w:i/>
+          <w:iCs/>
+        </w:rPr>
+        <w:t xml:space="preserve"> </w:t>
+      </w:r>
+      <w:r>
+        <w:rPr>
+          <w:i/>
+          <w:iCs/>
+        </w:rPr>
+        <w:t xml:space="preserve">steer (Stage XVIII); free noun change tracks</w:t>
       </w:r>
       <w:r>
         <w:rPr>
@@ -1208,7 +1276,7 @@
         <w:t xml:space="preserve"> </w:t>
       </w:r>
       <w:r>
-        <w:t xml:space="preserve">causation” claim. The same editable sparse space that</w:t>
+        <w:t xml:space="preserve">causation” claim. The same editable space that</w:t>
       </w:r>
       <w:r>
         <w:t xml:space="preserve"> </w:t>
@@ -1327,25 +1395,58 @@
         <w:t xml:space="preserve"> </w:t>
       </w:r>
       <w:r>
-        <w:t xml:space="preserve">modular content control is not—in every representation we could</w:t>
-      </w:r>
-      <w:r>
-        <w:t xml:space="preserve"> </w:t>
-      </w:r>
-      <w:r>
-        <w:t xml:space="preserve">actually manipulate (dual-effect, content-ish, hint-contrast, and</w:t>
-      </w:r>
-      <w:r>
-        <w:t xml:space="preserve"> </w:t>
-      </w:r>
-      <w:r>
-        <w:t xml:space="preserve">per-noun LP-style features). Residual / dense directions remain an open</w:t>
-      </w:r>
-      <w:r>
-        <w:t xml:space="preserve"> </w:t>
-      </w:r>
-      <w:r>
-        <w:t xml:space="preserve">fairness check (Section 11), not a result we claim to have closed.</w:t>
+        <w:t xml:space="preserve">modular content control is not—across sparse dual-effect / content-ish /</w:t>
+      </w:r>
+      <w:r>
+        <w:t xml:space="preserve"> </w:t>
+      </w:r>
+      <w:r>
+        <w:t xml:space="preserve">hint-contrast / per-noun LP-style features</w:t>
+      </w:r>
+      <w:r>
+        <w:t xml:space="preserve"> </w:t>
+      </w:r>
+      <w:r>
+        <w:rPr>
+          <w:b/>
+          <w:bCs/>
+        </w:rPr>
+        <w:t xml:space="preserve">and</w:t>
+      </w:r>
+      <w:r>
+        <w:t xml:space="preserve"> </w:t>
+      </w:r>
+      <w:r>
+        <w:t xml:space="preserve">a dense residual</w:t>
+      </w:r>
+      <w:r>
+        <w:t xml:space="preserve"> </w:t>
+      </w:r>
+      <w:r>
+        <w:t xml:space="preserve">direction constructed to point toward the same-class noun (Stages</w:t>
+      </w:r>
+      <w:r>
+        <w:t xml:space="preserve"> </w:t>
+      </w:r>
+      <w:r>
+        <w:t xml:space="preserve">XVI–XVIII). Remaining limits are finer latent probes, pure</w:t>
+      </w:r>
+      <w:r>
+        <w:t xml:space="preserve"> </w:t>
+      </w:r>
+      <m:oMath>
+        <m:r>
+          <m:t>A</m:t>
+        </m:r>
+      </m:oMath>
+      <w:r>
+        <w:t xml:space="preserve">, and</w:t>
+      </w:r>
+      <w:r>
+        <w:t xml:space="preserve"> </w:t>
+      </w:r>
+      <w:r>
+        <w:t xml:space="preserve">scale (Section 11)—not an untested residual escape hatch.</w:t>
       </w:r>
     </w:p>
     <w:p>
@@ -3160,6 +3261,150 @@
       </w:r>
       <w:r>
         <w:t xml:space="preserve">).</w:t>
+      </w:r>
+    </w:p>
+    <w:p>
+      <w:pPr>
+        <w:numPr>
+          <w:ilvl w:val="0"/>
+          <w:numId w:val="1003"/>
+        </w:numPr>
+      </w:pPr>
+      <w:r>
+        <w:rPr>
+          <w:b/>
+          <w:bCs/>
+        </w:rPr>
+        <w:t xml:space="preserve">Residual stream / MLP-in activation:</w:t>
+      </w:r>
+      <w:r>
+        <w:t xml:space="preserve"> </w:t>
+      </w:r>
+      <w:r>
+        <w:t xml:space="preserve">the high-dimensional continuous</w:t>
+      </w:r>
+      <w:r>
+        <w:t xml:space="preserve"> </w:t>
+      </w:r>
+      <w:r>
+        <w:t xml:space="preserve">state the model carries from layer to layer (here, the vector entering</w:t>
+      </w:r>
+      <w:r>
+        <w:t xml:space="preserve"> </w:t>
+      </w:r>
+      <w:r>
+        <w:t xml:space="preserve">each MLP block). Unlike a sparse “feature,” this is a dense vector of</w:t>
+      </w:r>
+      <w:r>
+        <w:t xml:space="preserve"> </w:t>
+      </w:r>
+      <w:r>
+        <w:t xml:space="preserve">hundreds of numbers. Our affine transcoder reconstructs MLP computation</w:t>
+      </w:r>
+      <w:r>
+        <w:t xml:space="preserve"> </w:t>
+      </w:r>
+      <w:r>
+        <w:t xml:space="preserve">from features</w:t>
+      </w:r>
+      <w:r>
+        <w:t xml:space="preserve"> </w:t>
+      </w:r>
+      <w:r>
+        <w:rPr>
+          <w:b/>
+          <w:bCs/>
+        </w:rPr>
+        <w:t xml:space="preserve">plus</w:t>
+      </w:r>
+      <w:r>
+        <w:t xml:space="preserve"> </w:t>
+      </w:r>
+      <w:r>
+        <w:t xml:space="preserve">a skip path that can bypass those features, so</w:t>
+      </w:r>
+      <w:r>
+        <w:t xml:space="preserve"> </w:t>
+      </w:r>
+      <w:r>
+        <w:t xml:space="preserve">some useful signal might live outside the sparse dictionary.</w:t>
+      </w:r>
+    </w:p>
+    <w:p>
+      <w:pPr>
+        <w:numPr>
+          <w:ilvl w:val="0"/>
+          <w:numId w:val="1003"/>
+        </w:numPr>
+      </w:pPr>
+      <w:r>
+        <w:rPr>
+          <w:b/>
+          <w:bCs/>
+        </w:rPr>
+        <w:t xml:space="preserve">Activation-direction / residual steer:</w:t>
+      </w:r>
+      <w:r>
+        <w:t xml:space="preserve"> </w:t>
+      </w:r>
+      <w:r>
+        <w:t xml:space="preserve">instead of turning a few</w:t>
+      </w:r>
+      <w:r>
+        <w:t xml:space="preserve"> </w:t>
+      </w:r>
+      <w:r>
+        <w:t xml:space="preserve">named features up or down, build a single direction in residual space</w:t>
+      </w:r>
+      <w:r>
+        <w:t xml:space="preserve"> </w:t>
+      </w:r>
+      <w:r>
+        <w:t xml:space="preserve">that points from one concept toward another (for example, from</w:t>
+      </w:r>
+      <w:r>
+        <w:t xml:space="preserve"> </w:t>
+      </w:r>
+      <w:r>
+        <w:t xml:space="preserve">“thinking of</w:t>
+      </w:r>
+      <w:r>
+        <w:t xml:space="preserve"> </w:t>
+      </w:r>
+      <w:r>
+        <w:rPr>
+          <w:i/>
+          <w:iCs/>
+        </w:rPr>
+        <w:t xml:space="preserve">pilot</w:t>
+      </w:r>
+      <w:r>
+        <w:t xml:space="preserve">” toward “thinking of</w:t>
+      </w:r>
+      <w:r>
+        <w:t xml:space="preserve"> </w:t>
+      </w:r>
+      <w:r>
+        <w:rPr>
+          <w:i/>
+          <w:iCs/>
+        </w:rPr>
+        <w:t xml:space="preserve">captain</w:t>
+      </w:r>
+      <w:r>
+        <w:t xml:space="preserve">”), then add a</w:t>
+      </w:r>
+      <w:r>
+        <w:t xml:space="preserve"> </w:t>
+      </w:r>
+      <w:r>
+        <w:t xml:space="preserve">scaled copy of that direction at the planning position. This is the</w:t>
+      </w:r>
+      <w:r>
+        <w:t xml:space="preserve"> </w:t>
+      </w:r>
+      <w:r>
+        <w:t xml:space="preserve">standard dense fallback when sparse features might be the wrong grain.</w:t>
       </w:r>
     </w:p>
     <w:p>
@@ -7527,7 +7772,7 @@
     </w:p>
     <w:bookmarkEnd w:id="68"/>
     <w:bookmarkEnd w:id="69"/>
-    <w:bookmarkStart w:id="121" w:name="Xb22d1a1387c762e8d872cf2f151ca041df80e4c"/>
+    <w:bookmarkStart w:id="129" w:name="Xb22d1a1387c762e8d872cf2f151ca041df80e4c"/>
     <w:p>
       <w:pPr>
         <w:pStyle w:val="Heading1"/>
@@ -7583,7 +7828,7 @@
         <w:t xml:space="preserve"> </w:t>
       </w:r>
       <w:r>
-        <w:t xml:space="preserve">VIII–XVII).</w:t>
+        <w:t xml:space="preserve">VIII–XVIII).</w:t>
       </w:r>
     </w:p>
     <w:bookmarkStart w:id="70" w:name="what-we-planned-after-stage-vii"/>
@@ -8718,13 +8963,19 @@
         <w:t xml:space="preserve"> </w:t>
       </w:r>
       <w:r>
-        <w:t xml:space="preserve">held fixed, including among within-class synonyms and including</w:t>
-      </w:r>
-      <w:r>
-        <w:t xml:space="preserve"> </w:t>
-      </w:r>
-      <w:r>
-        <w:t xml:space="preserve">per-noun Latent-Planning-style features (Stage XVII). (A selective</w:t>
+        <w:t xml:space="preserve">held fixed, including among within-class synonyms, including</w:t>
+      </w:r>
+      <w:r>
+        <w:t xml:space="preserve"> </w:t>
+      </w:r>
+      <w:r>
+        <w:t xml:space="preserve">per-noun Latent-Planning-style features (Stage XVII), and including a</w:t>
+      </w:r>
+      <w:r>
+        <w:t xml:space="preserve"> </w:t>
+      </w:r>
+      <w:r>
+        <w:t xml:space="preserve">dense residual direction toward the same-class noun (Stage XVIII). (A selective</w:t>
       </w:r>
       <w:r>
         <w:t xml:space="preserve"> </w:t>
@@ -9108,6 +9359,29 @@
       </w:r>
       <w:r>
         <w:t xml:space="preserve">repeating that schedule with per-noun LP-style target features.</w:t>
+      </w:r>
+      <w:r>
+        <w:t xml:space="preserve"> </w:t>
+      </w:r>
+      <w:r>
+        <w:t xml:space="preserve">Stage XVIII closes the “maybe it lives outside the sparse dictionary”</w:t>
+      </w:r>
+      <w:r>
+        <w:t xml:space="preserve"> </w:t>
+      </w:r>
+      <w:r>
+        <w:t xml:space="preserve">caveat with a dense residual steer under the same fixed-</w:t>
+      </w:r>
+      <m:oMath>
+        <m:r>
+          <m:t>b</m:t>
+        </m:r>
+      </m:oMath>
+      <w:r>
+        <w:t xml:space="preserve"> </w:t>
+      </w:r>
+      <w:r>
+        <w:t xml:space="preserve">schedule.</w:t>
       </w:r>
     </w:p>
     <w:p>
@@ -9800,6 +10074,38 @@
             </w:r>
             <w:r>
               <w:t xml:space="preserve">assay with per-example target-noun / contrast features (wrong-grain escape hatch)</w:t>
+            </w:r>
+          </w:p>
+        </w:tc>
+      </w:tr>
+      <w:tr>
+        <w:tc>
+          <w:tcPr/>
+          <w:p>
+            <w:pPr>
+              <w:pStyle w:val="Compact"/>
+            </w:pPr>
+            <w:r>
+              <w:t xml:space="preserve">XVIII residual / activation-direction under fixed</w:t>
+            </w:r>
+            <w:r>
+              <w:t xml:space="preserve"> </w:t>
+            </w:r>
+            <m:oMath>
+              <m:r>
+                <m:t>b</m:t>
+              </m:r>
+            </m:oMath>
+          </w:p>
+        </w:tc>
+        <w:tc>
+          <w:tcPr/>
+          <w:p>
+            <w:pPr>
+              <w:pStyle w:val="Compact"/>
+            </w:pPr>
+            <w:r>
+              <w:t xml:space="preserve">Same fair assay with a dense MLP-in direction (dictionary / affine-skip escape hatch)</w:t>
             </w:r>
           </w:p>
         </w:tc>
@@ -20477,19 +20783,19 @@
         <w:pStyle w:val="BodyText"/>
       </w:pPr>
       <w:r>
-        <w:t xml:space="preserve">What remains open (Section 11): residual / dense activation-direction</w:t>
-      </w:r>
-      <w:r>
-        <w:t xml:space="preserve"> </w:t>
-      </w:r>
-      <w:r>
-        <w:t xml:space="preserve">patching; dedicated noun-identity latent probes finer than written tokens</w:t>
-      </w:r>
-      <w:r>
-        <w:t xml:space="preserve"> </w:t>
-      </w:r>
-      <w:r>
-        <w:t xml:space="preserve">+ coarse set means; pure</w:t>
+        <w:t xml:space="preserve">What remains open after Stage XVII alone (Section 11): residual / dense</w:t>
+      </w:r>
+      <w:r>
+        <w:t xml:space="preserve"> </w:t>
+      </w:r>
+      <w:r>
+        <w:t xml:space="preserve">activation-direction patching; dedicated noun-identity latent probes</w:t>
+      </w:r>
+      <w:r>
+        <w:t xml:space="preserve"> </w:t>
+      </w:r>
+      <w:r>
+        <w:t xml:space="preserve">finer than written tokens + coarse set means; pure</w:t>
       </w:r>
       <w:r>
         <w:t xml:space="preserve"> </w:t>
@@ -20500,18 +20806,1633 @@
         </m:r>
       </m:oMath>
       <w:r>
-        <w:t xml:space="preserve">; scale / model-family generalization.</w:t>
+        <w:t xml:space="preserve">; scale /</w:t>
+      </w:r>
+      <w:r>
+        <w:t xml:space="preserve"> </w:t>
+      </w:r>
+      <w:r>
+        <w:t xml:space="preserve">model-family generalization. Stage XVIII closes the residual-direction</w:t>
+      </w:r>
+      <w:r>
+        <w:t xml:space="preserve"> </w:t>
+      </w:r>
+      <w:r>
+        <w:t xml:space="preserve">hole for the construction we tested.</w:t>
       </w:r>
     </w:p>
     <w:bookmarkEnd w:id="118"/>
     <w:bookmarkEnd w:id="119"/>
-    <w:bookmarkStart w:id="120" w:name="current-hypothesis-after-stages-viiixvii"/>
+    <w:bookmarkStart w:id="127" w:name="X7f0ae3430143e86b66d7c0b47c74bd7bf7ba02f"/>
     <w:p>
       <w:pPr>
         <w:pStyle w:val="Heading2"/>
       </w:pPr>
       <w:r>
-        <w:t xml:space="preserve">10.14 Current hypothesis (after Stages VIII–XVII)</w:t>
+        <w:t xml:space="preserve">10.14 Stage XVIII (Experiment 1): Residual / activation-direction under fixed</w:t>
+      </w:r>
+      <w:r>
+        <w:t xml:space="preserve"> </w:t>
+      </w:r>
+      <m:oMath>
+        <m:r>
+          <m:t>b</m:t>
+        </m:r>
+      </m:oMath>
+    </w:p>
+    <w:p>
+      <w:pPr>
+        <w:pStyle w:val="FirstParagraph"/>
+      </w:pPr>
+      <w:r>
+        <w:rPr>
+          <w:b/>
+          <w:bCs/>
+        </w:rPr>
+        <w:t xml:space="preserve">Escape hatch under test:</w:t>
+      </w:r>
+      <w:r>
+        <w:t xml:space="preserve"> </w:t>
+      </w:r>
+      <w:r>
+        <w:t xml:space="preserve">after Stages XVI–XVII, a modular defender</w:t>
+      </w:r>
+      <w:r>
+        <w:t xml:space="preserve"> </w:t>
+      </w:r>
+      <w:r>
+        <w:t xml:space="preserve">could still say: “Sparse features are the wrong</w:t>
+      </w:r>
+      <w:r>
+        <w:t xml:space="preserve"> </w:t>
+      </w:r>
+      <w:r>
+        <w:rPr>
+          <w:i/>
+          <w:iCs/>
+        </w:rPr>
+        <w:t xml:space="preserve">kind</w:t>
+      </w:r>
+      <w:r>
+        <w:t xml:space="preserve"> </w:t>
+      </w:r>
+      <w:r>
+        <w:t xml:space="preserve">of object. The</w:t>
+      </w:r>
+      <w:r>
+        <w:t xml:space="preserve"> </w:t>
+      </w:r>
+      <w:r>
+        <w:t xml:space="preserve">model’s real content code lives in the continuous residual stream—or in</w:t>
+      </w:r>
+      <w:r>
+        <w:t xml:space="preserve"> </w:t>
+      </w:r>
+      <w:r>
+        <w:t xml:space="preserve">the affine skip path that bypasses the transcoder dictionary. Patch</w:t>
+      </w:r>
+      <w:r>
+        <w:t xml:space="preserve"> </w:t>
+      </w:r>
+      <w:r>
+        <w:rPr>
+          <w:i/>
+          <w:iCs/>
+        </w:rPr>
+        <w:t xml:space="preserve">that</w:t>
+      </w:r>
+      <w:r>
+        <w:t xml:space="preserve">, and independent</w:t>
+      </w:r>
+      <w:r>
+        <w:t xml:space="preserve"> </w:t>
+      </w:r>
+      <m:oMath>
+        <m:r>
+          <m:t>C</m:t>
+        </m:r>
+        <m:r>
+          <m:rPr>
+            <m:sty m:val="p"/>
+          </m:rPr>
+          <m:t>→</m:t>
+        </m:r>
+        <m:r>
+          <m:t>c</m:t>
+        </m:r>
+      </m:oMath>
+      <w:r>
+        <w:t xml:space="preserve"> </w:t>
+      </w:r>
+      <w:r>
+        <w:t xml:space="preserve">will appear.”</w:t>
+      </w:r>
+    </w:p>
+    <w:bookmarkStart w:id="120" w:name="plain-language-motivation"/>
+    <w:p>
+      <w:pPr>
+        <w:pStyle w:val="Heading3"/>
+      </w:pPr>
+      <w:r>
+        <w:t xml:space="preserve">Plain-language motivation</w:t>
+      </w:r>
+    </w:p>
+    <w:p>
+      <w:pPr>
+        <w:pStyle w:val="FirstParagraph"/>
+      </w:pPr>
+      <w:r>
+        <w:t xml:space="preserve">Think of sparse features as a small set of named dials Circuit Tracer</w:t>
+      </w:r>
+      <w:r>
+        <w:t xml:space="preserve"> </w:t>
+      </w:r>
+      <w:r>
+        <w:t xml:space="preserve">lets us turn. A residual direction is different: it is a single arrow in</w:t>
+      </w:r>
+      <w:r>
+        <w:t xml:space="preserve"> </w:t>
+      </w:r>
+      <w:r>
+        <w:t xml:space="preserve">the model’s high-dimensional internal space, built by comparing two</w:t>
+      </w:r>
+      <w:r>
+        <w:t xml:space="preserve"> </w:t>
+      </w:r>
+      <w:r>
+        <w:t xml:space="preserve">states of the network—“thinking of</w:t>
+      </w:r>
+      <w:r>
+        <w:t xml:space="preserve"> </w:t>
+      </w:r>
+      <w:r>
+        <w:rPr>
+          <w:i/>
+          <w:iCs/>
+        </w:rPr>
+        <w:t xml:space="preserve">pilot</w:t>
+      </w:r>
+      <w:r>
+        <w:t xml:space="preserve">” versus “thinking of</w:t>
+      </w:r>
+      <w:r>
+        <w:t xml:space="preserve"> </w:t>
+      </w:r>
+      <w:r>
+        <w:rPr>
+          <w:i/>
+          <w:iCs/>
+        </w:rPr>
+        <w:t xml:space="preserve">captain</w:t>
+      </w:r>
+      <w:r>
+        <w:t xml:space="preserve">”—and then pushing the network a bit along that arrow. If</w:t>
+      </w:r>
+      <w:r>
+        <w:t xml:space="preserve"> </w:t>
+      </w:r>
+      <w:r>
+        <w:t xml:space="preserve">independent content control exists anywhere we can edit, this is the</w:t>
+      </w:r>
+      <w:r>
+        <w:t xml:space="preserve"> </w:t>
+      </w:r>
+      <w:r>
+        <w:t xml:space="preserve">standard next place to look after sparse features fail.</w:t>
+      </w:r>
+    </w:p>
+    <w:bookmarkEnd w:id="120"/>
+    <w:bookmarkStart w:id="121" w:name="protocol-2"/>
+    <w:p>
+      <w:pPr>
+        <w:pStyle w:val="Heading3"/>
+      </w:pPr>
+      <w:r>
+        <w:t xml:space="preserve">Protocol</w:t>
+      </w:r>
+    </w:p>
+    <w:p>
+      <w:pPr>
+        <w:pStyle w:val="FirstParagraph"/>
+      </w:pPr>
+      <w:r>
+        <w:t xml:space="preserve">For the same three native-</w:t>
+      </w:r>
+      <w:r>
+        <w:rPr>
+          <w:rStyle w:val="VerbatimChar"/>
+        </w:rPr>
+        <w:t xml:space="preserve">a</w:t>
+      </w:r>
+      <w:r>
+        <w:t xml:space="preserve"> </w:t>
+      </w:r>
+      <w:r>
+        <w:t xml:space="preserve">twin families as Stage XVII (aircraft</w:t>
+      </w:r>
+      <w:r>
+        <w:t xml:space="preserve"> </w:t>
+      </w:r>
+      <w:r>
+        <w:t xml:space="preserve">pilot/captain; legal lawyer/barrister; psychology</w:t>
+      </w:r>
+      <w:r>
+        <w:t xml:space="preserve"> </w:t>
+      </w:r>
+      <w:r>
+        <w:t xml:space="preserve">psychologist/therapist):</w:t>
+      </w:r>
+    </w:p>
+    <w:p>
+      <w:pPr>
+        <w:pStyle w:val="Compact"/>
+        <w:numPr>
+          <w:ilvl w:val="0"/>
+          <w:numId w:val="1020"/>
+        </w:numPr>
+      </w:pPr>
+      <w:r>
+        <w:t xml:space="preserve">Build a</w:t>
+      </w:r>
+      <w:r>
+        <w:t xml:space="preserve"> </w:t>
+      </w:r>
+      <w:r>
+        <w:rPr>
+          <w:b/>
+          <w:bCs/>
+        </w:rPr>
+        <w:t xml:space="preserve">content direction</w:t>
+      </w:r>
+      <w:r>
+        <w:t xml:space="preserve"> </w:t>
+      </w:r>
+      <w:r>
+        <w:t xml:space="preserve">at mid/late layers (8, 10, 12, 14):</w:t>
+      </w:r>
+      <w:r>
+        <w:t xml:space="preserve"> </w:t>
+      </w:r>
+      <w:r>
+        <w:t xml:space="preserve">at the planning (pre-article) position, take</w:t>
+      </w:r>
+      <w:r>
+        <w:t xml:space="preserve"> </w:t>
+      </w:r>
+      <m:oMath>
+        <m:r>
+          <m:rPr>
+            <m:sty m:val="p"/>
+          </m:rPr>
+          <m:t>m</m:t>
+        </m:r>
+        <m:r>
+          <m:rPr>
+            <m:sty m:val="p"/>
+          </m:rPr>
+          <m:t>l</m:t>
+        </m:r>
+        <m:r>
+          <m:rPr>
+            <m:sty m:val="p"/>
+          </m:rPr>
+          <m:t>p</m:t>
+        </m:r>
+        <m:r>
+          <m:rPr>
+            <m:sty m:val="p"/>
+          </m:rPr>
+          <m:t>_</m:t>
+        </m:r>
+        <m:r>
+          <m:rPr>
+            <m:sty m:val="p"/>
+          </m:rPr>
+          <m:t>i</m:t>
+        </m:r>
+        <m:r>
+          <m:rPr>
+            <m:sty m:val="p"/>
+          </m:rPr>
+          <m:t>n</m:t>
+        </m:r>
+        <m:r>
+          <m:rPr>
+            <m:sty m:val="p"/>
+          </m:rPr>
+          <m:t>(</m:t>
+        </m:r>
+        <m:r>
+          <m:rPr>
+            <m:nor/>
+            <m:scr m:val="monospace"/>
+            <m:sty m:val="p"/>
+          </m:rPr>
+          <m:t>Think of a {target}. prompt</m:t>
+        </m:r>
+        <m:r>
+          <m:rPr>
+            <m:sty m:val="p"/>
+          </m:rPr>
+          <m:t>)</m:t>
+        </m:r>
+        <m:r>
+          <m:rPr>
+            <m:sty m:val="p"/>
+          </m:rPr>
+          <m:t>−</m:t>
+        </m:r>
+        <m:r>
+          <m:rPr>
+            <m:sty m:val="p"/>
+          </m:rPr>
+          <m:t>m</m:t>
+        </m:r>
+        <m:r>
+          <m:rPr>
+            <m:sty m:val="p"/>
+          </m:rPr>
+          <m:t>l</m:t>
+        </m:r>
+        <m:r>
+          <m:rPr>
+            <m:sty m:val="p"/>
+          </m:rPr>
+          <m:t>p</m:t>
+        </m:r>
+        <m:r>
+          <m:rPr>
+            <m:sty m:val="p"/>
+          </m:rPr>
+          <m:t>_</m:t>
+        </m:r>
+        <m:r>
+          <m:rPr>
+            <m:sty m:val="p"/>
+          </m:rPr>
+          <m:t>i</m:t>
+        </m:r>
+        <m:r>
+          <m:rPr>
+            <m:sty m:val="p"/>
+          </m:rPr>
+          <m:t>n</m:t>
+        </m:r>
+        <m:r>
+          <m:rPr>
+            <m:sty m:val="p"/>
+          </m:rPr>
+          <m:t>(</m:t>
+        </m:r>
+        <m:r>
+          <m:rPr>
+            <m:nor/>
+            <m:scr m:val="monospace"/>
+            <m:sty m:val="p"/>
+          </m:rPr>
+          <m:t>Think of a {source}. prompt</m:t>
+        </m:r>
+        <m:r>
+          <m:rPr>
+            <m:sty m:val="p"/>
+          </m:rPr>
+          <m:t>)</m:t>
+        </m:r>
+      </m:oMath>
+      <w:r>
+        <w:t xml:space="preserve">,</w:t>
+      </w:r>
+      <w:r>
+        <w:t xml:space="preserve"> </w:t>
+      </w:r>
+      <w:r>
+        <w:t xml:space="preserve">and unit-normalize each layer’s vector. (Here</w:t>
+      </w:r>
+      <w:r>
+        <w:t xml:space="preserve"> </w:t>
+      </w:r>
+      <w:r>
+        <w:rPr>
+          <w:rStyle w:val="VerbatimChar"/>
+        </w:rPr>
+        <w:t xml:space="preserve">mlp_in</w:t>
+      </w:r>
+      <w:r>
+        <w:t xml:space="preserve"> </w:t>
+      </w:r>
+      <w:r>
+        <w:t xml:space="preserve">is the residual</w:t>
+      </w:r>
+      <w:r>
+        <w:t xml:space="preserve"> </w:t>
+      </w:r>
+      <w:r>
+        <w:t xml:space="preserve">vector entering the MLP—the site our affine skip also reads.)</w:t>
+      </w:r>
+    </w:p>
+    <w:p>
+      <w:pPr>
+        <w:pStyle w:val="Compact"/>
+        <w:numPr>
+          <w:ilvl w:val="0"/>
+          <w:numId w:val="1020"/>
+        </w:numPr>
+      </w:pPr>
+      <w:r>
+        <w:t xml:space="preserve">Build a</w:t>
+      </w:r>
+      <w:r>
+        <w:t xml:space="preserve"> </w:t>
+      </w:r>
+      <w:r>
+        <w:rPr>
+          <w:b/>
+          <w:bCs/>
+        </w:rPr>
+        <w:t xml:space="preserve">matched-norm random control</w:t>
+      </w:r>
+      <w:r>
+        <w:t xml:space="preserve"> </w:t>
+      </w:r>
+      <w:r>
+        <w:t xml:space="preserve">direction at the same layers.</w:t>
+      </w:r>
+    </w:p>
+    <w:p>
+      <w:pPr>
+        <w:pStyle w:val="Compact"/>
+        <w:numPr>
+          <w:ilvl w:val="0"/>
+          <w:numId w:val="1020"/>
+        </w:numPr>
+      </w:pPr>
+      <w:r>
+        <w:t xml:space="preserve">Under the Stage XVI schedule: paste the native article, then keep</w:t>
+      </w:r>
+      <w:r>
+        <w:t xml:space="preserve"> </w:t>
+      </w:r>
+      <w:r>
+        <w:t xml:space="preserve">adding</w:t>
+      </w:r>
+      <w:r>
+        <w:t xml:space="preserve"> </w:t>
+      </w:r>
+      <m:oMath>
+        <m:r>
+          <m:t>α</m:t>
+        </m:r>
+        <m:r>
+          <m:rPr>
+            <m:sty m:val="p"/>
+          </m:rPr>
+          <m:t>×</m:t>
+        </m:r>
+      </m:oMath>
+      <w:r>
+        <w:t xml:space="preserve"> </w:t>
+      </w:r>
+      <w:r>
+        <w:t xml:space="preserve">direction at the original planning position</w:t>
+      </w:r>
+      <w:r>
+        <w:t xml:space="preserve"> </w:t>
+      </w:r>
+      <m:oMath>
+        <m:r>
+          <m:t>P</m:t>
+        </m:r>
+      </m:oMath>
+      <w:r>
+        <w:t xml:space="preserve"> </w:t>
+      </w:r>
+      <w:r>
+        <w:t xml:space="preserve">while predicting the noun, for</w:t>
+      </w:r>
+      <w:r>
+        <w:t xml:space="preserve"> </w:t>
+      </w:r>
+      <m:oMath>
+        <m:r>
+          <m:t>α</m:t>
+        </m:r>
+        <m:r>
+          <m:rPr>
+            <m:sty m:val="p"/>
+          </m:rPr>
+          <m:t>∈</m:t>
+        </m:r>
+        <m:r>
+          <m:rPr>
+            <m:sty m:val="p"/>
+          </m:rPr>
+          <m:t>{</m:t>
+        </m:r>
+        <m:r>
+          <m:t>1</m:t>
+        </m:r>
+        <m:r>
+          <m:rPr>
+            <m:sty m:val="p"/>
+          </m:rPr>
+          <m:t>,</m:t>
+        </m:r>
+        <m:r>
+          <m:t>2</m:t>
+        </m:r>
+        <m:r>
+          <m:rPr>
+            <m:sty m:val="p"/>
+          </m:rPr>
+          <m:t>,</m:t>
+        </m:r>
+        <m:r>
+          <m:t>4</m:t>
+        </m:r>
+        <m:r>
+          <m:rPr>
+            <m:sty m:val="p"/>
+          </m:rPr>
+          <m:t>,</m:t>
+        </m:r>
+        <m:r>
+          <m:t>8</m:t>
+        </m:r>
+        <m:r>
+          <m:rPr>
+            <m:sty m:val="p"/>
+          </m:rPr>
+          <m:t>}</m:t>
+        </m:r>
+      </m:oMath>
+      <w:r>
+        <w:t xml:space="preserve">.</w:t>
+      </w:r>
+    </w:p>
+    <w:p>
+      <w:pPr>
+        <w:pStyle w:val="Compact"/>
+        <w:numPr>
+          <w:ilvl w:val="0"/>
+          <w:numId w:val="1020"/>
+        </w:numPr>
+      </w:pPr>
+      <w:r>
+        <w:t xml:space="preserve">Score within-class noun change and same−source noun logits, just as</w:t>
+      </w:r>
+      <w:r>
+        <w:t xml:space="preserve"> </w:t>
+      </w:r>
+      <w:r>
+        <w:t xml:space="preserve">in Stages XVI–XVII.</w:t>
+      </w:r>
+    </w:p>
+    <w:p>
+      <w:pPr>
+        <w:pStyle w:val="FirstParagraph"/>
+      </w:pPr>
+      <w:r>
+        <w:t xml:space="preserve">Primary success (upset): within-class noun switches under fixed</w:t>
+      </w:r>
+      <w:r>
+        <w:t xml:space="preserve"> </w:t>
+      </w:r>
+      <m:oMath>
+        <m:r>
+          <m:t>b</m:t>
+        </m:r>
+      </m:oMath>
+      <w:r>
+        <w:t xml:space="preserve">,</w:t>
+      </w:r>
+      <w:r>
+        <w:t xml:space="preserve"> </w:t>
+      </w:r>
+      <w:r>
+        <w:t xml:space="preserve">or a clear same−source logit takeover that content steering achieves and</w:t>
+      </w:r>
+      <w:r>
+        <w:t xml:space="preserve"> </w:t>
+      </w:r>
+      <w:r>
+        <w:t xml:space="preserve">random controls do not.</w:t>
+      </w:r>
+    </w:p>
+    <w:bookmarkEnd w:id="121"/>
+    <w:bookmarkStart w:id="125" w:name="results-3"/>
+    <w:p>
+      <w:pPr>
+        <w:pStyle w:val="Heading3"/>
+      </w:pPr>
+      <w:r>
+        <w:t xml:space="preserve">Results</w:t>
+      </w:r>
+    </w:p>
+    <w:tbl>
+      <w:tblPr>
+        <w:tblStyle w:val="Table"/>
+        <w:tblW w:type="pct" w:w="5000"/>
+        <w:tblLayout w:type="fixed"/>
+        <w:tblLook w:firstRow="1" w:lastRow="0" w:firstColumn="0" w:lastColumn="0" w:noHBand="0" w:noVBand="0" w:val="0020"/>
+      </w:tblPr>
+      <w:tblGrid>
+        <w:gridCol w:w="1033"/>
+        <w:gridCol w:w="1377"/>
+        <w:gridCol w:w="1377"/>
+        <w:gridCol w:w="1377"/>
+        <w:gridCol w:w="1377"/>
+        <w:gridCol w:w="1377"/>
+      </w:tblGrid>
+      <w:tr>
+        <w:trPr>
+          <w:tblHeader w:val="on"/>
+        </w:trPr>
+        <w:tc>
+          <w:tcPr/>
+          <w:p>
+            <w:pPr>
+              <w:pStyle w:val="Compact"/>
+            </w:pPr>
+            <w:r>
+              <w:t xml:space="preserve">Condition (3 families)</w:t>
+            </w:r>
+          </w:p>
+        </w:tc>
+        <w:tc>
+          <w:tcPr/>
+          <w:p>
+            <w:pPr>
+              <w:pStyle w:val="Compact"/>
+              <w:jc w:val="right"/>
+            </w:pPr>
+            <m:oMath>
+              <m:r>
+                <m:t>c</m:t>
+              </m:r>
+              <m:r>
+                <m:rPr>
+                  <m:sty m:val="p"/>
+                </m:rPr>
+                <m:t>→</m:t>
+              </m:r>
+              <m:r>
+                <m:t>c</m:t>
+              </m:r>
+            </m:oMath>
+            <w:r>
+              <w:t xml:space="preserve"> </w:t>
+            </w:r>
+            <w:r>
+              <w:t xml:space="preserve">signal</w:t>
+            </w:r>
+          </w:p>
+        </w:tc>
+        <w:tc>
+          <w:tcPr/>
+          <w:p>
+            <w:pPr>
+              <w:pStyle w:val="Compact"/>
+              <w:jc w:val="right"/>
+            </w:pPr>
+            <w:r>
+              <w:t xml:space="preserve">Content changed</w:t>
+            </w:r>
+          </w:p>
+        </w:tc>
+        <w:tc>
+          <w:tcPr/>
+          <w:p>
+            <w:pPr>
+              <w:pStyle w:val="Compact"/>
+              <w:jc w:val="right"/>
+            </w:pPr>
+            <w:r>
+              <w:t xml:space="preserve">Matched same-class</w:t>
+            </w:r>
+          </w:p>
+        </w:tc>
+        <w:tc>
+          <w:tcPr/>
+          <w:p>
+            <w:pPr>
+              <w:pStyle w:val="Compact"/>
+              <w:jc w:val="right"/>
+            </w:pPr>
+            <w:r>
+              <w:t xml:space="preserve">Mean</w:t>
+            </w:r>
+            <w:r>
+              <w:t xml:space="preserve"> </w:t>
+            </w:r>
+            <m:oMath>
+              <m:r>
+                <m:rPr>
+                  <m:sty m:val="p"/>
+                </m:rPr>
+                <m:t>Δ</m:t>
+              </m:r>
+            </m:oMath>
+            <w:r>
+              <w:t xml:space="preserve">(same−source)</w:t>
+            </w:r>
+          </w:p>
+        </w:tc>
+        <w:tc>
+          <w:tcPr/>
+          <w:p>
+            <w:pPr>
+              <w:pStyle w:val="Compact"/>
+              <w:jc w:val="right"/>
+            </w:pPr>
+            <w:r>
+              <w:t xml:space="preserve">Mean</w:t>
+            </w:r>
+            <w:r>
+              <w:t xml:space="preserve"> </w:t>
+            </w:r>
+            <m:oMath>
+              <m:r>
+                <m:rPr>
+                  <m:sty m:val="p"/>
+                </m:rPr>
+                <m:t>Δ</m:t>
+              </m:r>
+              <m:r>
+                <m:rPr>
+                  <m:sty m:val="p"/>
+                </m:rPr>
+                <m:t>Δ</m:t>
+              </m:r>
+            </m:oMath>
+            <w:r>
+              <w:t xml:space="preserve">(same−source) vs off</w:t>
+            </w:r>
+          </w:p>
+        </w:tc>
+      </w:tr>
+      <w:tr>
+        <w:tc>
+          <w:tcPr/>
+          <w:p>
+            <w:pPr>
+              <w:pStyle w:val="Compact"/>
+            </w:pPr>
+            <w:r>
+              <w:t xml:space="preserve">Baseline</w:t>
+            </w:r>
+          </w:p>
+        </w:tc>
+        <w:tc>
+          <w:tcPr/>
+          <w:p>
+            <w:pPr>
+              <w:pStyle w:val="Compact"/>
+              <w:jc w:val="right"/>
+            </w:pPr>
+            <w:r>
+              <w:t xml:space="preserve">0.00</w:t>
+            </w:r>
+          </w:p>
+        </w:tc>
+        <w:tc>
+          <w:tcPr/>
+          <w:p>
+            <w:pPr>
+              <w:pStyle w:val="Compact"/>
+              <w:jc w:val="right"/>
+            </w:pPr>
+            <w:r>
+              <w:t xml:space="preserve">0.00</w:t>
+            </w:r>
+          </w:p>
+        </w:tc>
+        <w:tc>
+          <w:tcPr/>
+          <w:p>
+            <w:pPr>
+              <w:pStyle w:val="Compact"/>
+              <w:jc w:val="right"/>
+            </w:pPr>
+            <w:r>
+              <w:t xml:space="preserve">0.00</w:t>
+            </w:r>
+          </w:p>
+        </w:tc>
+        <w:tc>
+          <w:tcPr/>
+          <w:p>
+            <w:pPr>
+              <w:pStyle w:val="Compact"/>
+              <w:jc w:val="right"/>
+            </w:pPr>
+            <w:r>
+              <w:t xml:space="preserve">−5.54</w:t>
+            </w:r>
+          </w:p>
+        </w:tc>
+        <w:tc>
+          <w:tcPr/>
+          <w:p>
+            <w:pPr>
+              <w:pStyle w:val="Compact"/>
+              <w:jc w:val="right"/>
+            </w:pPr>
+            <w:r>
+              <w:t xml:space="preserve">0.00</w:t>
+            </w:r>
+          </w:p>
+        </w:tc>
+      </w:tr>
+      <w:tr>
+        <w:tc>
+          <w:tcPr/>
+          <w:p>
+            <w:pPr>
+              <w:pStyle w:val="Compact"/>
+            </w:pPr>
+            <w:r>
+              <w:t xml:space="preserve">Content steer</w:t>
+            </w:r>
+            <w:r>
+              <w:t xml:space="preserve"> </w:t>
+            </w:r>
+            <m:oMath>
+              <m:r>
+                <m:t>α</m:t>
+              </m:r>
+              <m:r>
+                <m:rPr>
+                  <m:sty m:val="p"/>
+                </m:rPr>
+                <m:t>=</m:t>
+              </m:r>
+              <m:r>
+                <m:t>1</m:t>
+              </m:r>
+            </m:oMath>
+          </w:p>
+        </w:tc>
+        <w:tc>
+          <w:tcPr/>
+          <w:p>
+            <w:pPr>
+              <w:pStyle w:val="Compact"/>
+              <w:jc w:val="right"/>
+            </w:pPr>
+            <w:r>
+              <w:t xml:space="preserve">0.00</w:t>
+            </w:r>
+          </w:p>
+        </w:tc>
+        <w:tc>
+          <w:tcPr/>
+          <w:p>
+            <w:pPr>
+              <w:pStyle w:val="Compact"/>
+              <w:jc w:val="right"/>
+            </w:pPr>
+            <w:r>
+              <w:t xml:space="preserve">0.00</w:t>
+            </w:r>
+          </w:p>
+        </w:tc>
+        <w:tc>
+          <w:tcPr/>
+          <w:p>
+            <w:pPr>
+              <w:pStyle w:val="Compact"/>
+              <w:jc w:val="right"/>
+            </w:pPr>
+            <w:r>
+              <w:t xml:space="preserve">0.00</w:t>
+            </w:r>
+          </w:p>
+        </w:tc>
+        <w:tc>
+          <w:tcPr/>
+          <w:p>
+            <w:pPr>
+              <w:pStyle w:val="Compact"/>
+              <w:jc w:val="right"/>
+            </w:pPr>
+            <w:r>
+              <w:t xml:space="preserve">−5.46</w:t>
+            </w:r>
+          </w:p>
+        </w:tc>
+        <w:tc>
+          <w:tcPr/>
+          <w:p>
+            <w:pPr>
+              <w:pStyle w:val="Compact"/>
+              <w:jc w:val="right"/>
+            </w:pPr>
+            <w:r>
+              <w:t xml:space="preserve">+0.08</w:t>
+            </w:r>
+          </w:p>
+        </w:tc>
+      </w:tr>
+      <w:tr>
+        <w:tc>
+          <w:tcPr/>
+          <w:p>
+            <w:pPr>
+              <w:pStyle w:val="Compact"/>
+            </w:pPr>
+            <w:r>
+              <w:t xml:space="preserve">Content steer</w:t>
+            </w:r>
+            <w:r>
+              <w:t xml:space="preserve"> </w:t>
+            </w:r>
+            <m:oMath>
+              <m:r>
+                <m:t>α</m:t>
+              </m:r>
+              <m:r>
+                <m:rPr>
+                  <m:sty m:val="p"/>
+                </m:rPr>
+                <m:t>=</m:t>
+              </m:r>
+              <m:r>
+                <m:t>2</m:t>
+              </m:r>
+            </m:oMath>
+          </w:p>
+        </w:tc>
+        <w:tc>
+          <w:tcPr/>
+          <w:p>
+            <w:pPr>
+              <w:pStyle w:val="Compact"/>
+              <w:jc w:val="right"/>
+            </w:pPr>
+            <w:r>
+              <w:t xml:space="preserve">0.00</w:t>
+            </w:r>
+          </w:p>
+        </w:tc>
+        <w:tc>
+          <w:tcPr/>
+          <w:p>
+            <w:pPr>
+              <w:pStyle w:val="Compact"/>
+              <w:jc w:val="right"/>
+            </w:pPr>
+            <w:r>
+              <w:t xml:space="preserve">0.00</w:t>
+            </w:r>
+          </w:p>
+        </w:tc>
+        <w:tc>
+          <w:tcPr/>
+          <w:p>
+            <w:pPr>
+              <w:pStyle w:val="Compact"/>
+              <w:jc w:val="right"/>
+            </w:pPr>
+            <w:r>
+              <w:t xml:space="preserve">0.00</w:t>
+            </w:r>
+          </w:p>
+        </w:tc>
+        <w:tc>
+          <w:tcPr/>
+          <w:p>
+            <w:pPr>
+              <w:pStyle w:val="Compact"/>
+              <w:jc w:val="right"/>
+            </w:pPr>
+            <w:r>
+              <w:t xml:space="preserve">−5.50</w:t>
+            </w:r>
+          </w:p>
+        </w:tc>
+        <w:tc>
+          <w:tcPr/>
+          <w:p>
+            <w:pPr>
+              <w:pStyle w:val="Compact"/>
+              <w:jc w:val="right"/>
+            </w:pPr>
+            <w:r>
+              <w:t xml:space="preserve">+0.04</w:t>
+            </w:r>
+          </w:p>
+        </w:tc>
+      </w:tr>
+      <w:tr>
+        <w:tc>
+          <w:tcPr/>
+          <w:p>
+            <w:pPr>
+              <w:pStyle w:val="Compact"/>
+            </w:pPr>
+            <w:r>
+              <w:t xml:space="preserve">Content steer</w:t>
+            </w:r>
+            <w:r>
+              <w:t xml:space="preserve"> </w:t>
+            </w:r>
+            <m:oMath>
+              <m:r>
+                <m:t>α</m:t>
+              </m:r>
+              <m:r>
+                <m:rPr>
+                  <m:sty m:val="p"/>
+                </m:rPr>
+                <m:t>=</m:t>
+              </m:r>
+              <m:r>
+                <m:t>4</m:t>
+              </m:r>
+            </m:oMath>
+          </w:p>
+        </w:tc>
+        <w:tc>
+          <w:tcPr/>
+          <w:p>
+            <w:pPr>
+              <w:pStyle w:val="Compact"/>
+              <w:jc w:val="right"/>
+            </w:pPr>
+            <w:r>
+              <w:t xml:space="preserve">0.00</w:t>
+            </w:r>
+          </w:p>
+        </w:tc>
+        <w:tc>
+          <w:tcPr/>
+          <w:p>
+            <w:pPr>
+              <w:pStyle w:val="Compact"/>
+              <w:jc w:val="right"/>
+            </w:pPr>
+            <w:r>
+              <w:t xml:space="preserve">0.00</w:t>
+            </w:r>
+          </w:p>
+        </w:tc>
+        <w:tc>
+          <w:tcPr/>
+          <w:p>
+            <w:pPr>
+              <w:pStyle w:val="Compact"/>
+              <w:jc w:val="right"/>
+            </w:pPr>
+            <w:r>
+              <w:t xml:space="preserve">0.00</w:t>
+            </w:r>
+          </w:p>
+        </w:tc>
+        <w:tc>
+          <w:tcPr/>
+          <w:p>
+            <w:pPr>
+              <w:pStyle w:val="Compact"/>
+              <w:jc w:val="right"/>
+            </w:pPr>
+            <w:r>
+              <w:t xml:space="preserve">−5.46</w:t>
+            </w:r>
+          </w:p>
+        </w:tc>
+        <w:tc>
+          <w:tcPr/>
+          <w:p>
+            <w:pPr>
+              <w:pStyle w:val="Compact"/>
+              <w:jc w:val="right"/>
+            </w:pPr>
+            <w:r>
+              <w:t xml:space="preserve">+0.08</w:t>
+            </w:r>
+          </w:p>
+        </w:tc>
+      </w:tr>
+      <w:tr>
+        <w:tc>
+          <w:tcPr/>
+          <w:p>
+            <w:pPr>
+              <w:pStyle w:val="Compact"/>
+            </w:pPr>
+            <w:r>
+              <w:t xml:space="preserve">Content steer</w:t>
+            </w:r>
+            <w:r>
+              <w:t xml:space="preserve"> </w:t>
+            </w:r>
+            <m:oMath>
+              <m:r>
+                <m:t>α</m:t>
+              </m:r>
+              <m:r>
+                <m:rPr>
+                  <m:sty m:val="p"/>
+                </m:rPr>
+                <m:t>=</m:t>
+              </m:r>
+              <m:r>
+                <m:t>8</m:t>
+              </m:r>
+            </m:oMath>
+          </w:p>
+        </w:tc>
+        <w:tc>
+          <w:tcPr/>
+          <w:p>
+            <w:pPr>
+              <w:pStyle w:val="Compact"/>
+              <w:jc w:val="right"/>
+            </w:pPr>
+            <w:r>
+              <w:t xml:space="preserve">0.00</w:t>
+            </w:r>
+          </w:p>
+        </w:tc>
+        <w:tc>
+          <w:tcPr/>
+          <w:p>
+            <w:pPr>
+              <w:pStyle w:val="Compact"/>
+              <w:jc w:val="right"/>
+            </w:pPr>
+            <w:r>
+              <w:t xml:space="preserve">0.00</w:t>
+            </w:r>
+          </w:p>
+        </w:tc>
+        <w:tc>
+          <w:tcPr/>
+          <w:p>
+            <w:pPr>
+              <w:pStyle w:val="Compact"/>
+              <w:jc w:val="right"/>
+            </w:pPr>
+            <w:r>
+              <w:t xml:space="preserve">0.00</w:t>
+            </w:r>
+          </w:p>
+        </w:tc>
+        <w:tc>
+          <w:tcPr/>
+          <w:p>
+            <w:pPr>
+              <w:pStyle w:val="Compact"/>
+              <w:jc w:val="right"/>
+            </w:pPr>
+            <w:r>
+              <w:t xml:space="preserve">−5.62</w:t>
+            </w:r>
+          </w:p>
+        </w:tc>
+        <w:tc>
+          <w:tcPr/>
+          <w:p>
+            <w:pPr>
+              <w:pStyle w:val="Compact"/>
+              <w:jc w:val="right"/>
+            </w:pPr>
+            <w:r>
+              <w:t xml:space="preserve">−0.08</w:t>
+            </w:r>
+          </w:p>
+        </w:tc>
+      </w:tr>
+      <w:tr>
+        <w:tc>
+          <w:tcPr/>
+          <w:p>
+            <w:pPr>
+              <w:pStyle w:val="Compact"/>
+            </w:pPr>
+            <w:r>
+              <w:t xml:space="preserve">Random control</w:t>
+            </w:r>
+            <w:r>
+              <w:t xml:space="preserve"> </w:t>
+            </w:r>
+            <m:oMath>
+              <m:r>
+                <m:t>α</m:t>
+              </m:r>
+              <m:r>
+                <m:rPr>
+                  <m:sty m:val="p"/>
+                </m:rPr>
+                <m:t>=</m:t>
+              </m:r>
+              <m:r>
+                <m:t>1</m:t>
+              </m:r>
+            </m:oMath>
+            <w:r>
+              <w:t xml:space="preserve">–</w:t>
+            </w:r>
+            <m:oMath>
+              <m:r>
+                <m:t>8</m:t>
+              </m:r>
+            </m:oMath>
+          </w:p>
+        </w:tc>
+        <w:tc>
+          <w:tcPr/>
+          <w:p>
+            <w:pPr>
+              <w:pStyle w:val="Compact"/>
+              <w:jc w:val="right"/>
+            </w:pPr>
+            <w:r>
+              <w:t xml:space="preserve">0.00</w:t>
+            </w:r>
+          </w:p>
+        </w:tc>
+        <w:tc>
+          <w:tcPr/>
+          <w:p>
+            <w:pPr>
+              <w:pStyle w:val="Compact"/>
+              <w:jc w:val="right"/>
+            </w:pPr>
+            <w:r>
+              <w:t xml:space="preserve">0.00</w:t>
+            </w:r>
+          </w:p>
+        </w:tc>
+        <w:tc>
+          <w:tcPr/>
+          <w:p>
+            <w:pPr>
+              <w:pStyle w:val="Compact"/>
+              <w:jc w:val="right"/>
+            </w:pPr>
+            <w:r>
+              <w:t xml:space="preserve">0.00</w:t>
+            </w:r>
+          </w:p>
+        </w:tc>
+        <w:tc>
+          <w:tcPr/>
+          <w:p>
+            <w:pPr>
+              <w:pStyle w:val="Compact"/>
+              <w:jc w:val="right"/>
+            </w:pPr>
+            <w:r>
+              <w:t xml:space="preserve">~−5.4 to −5.5</w:t>
+            </w:r>
+          </w:p>
+        </w:tc>
+        <w:tc>
+          <w:tcPr/>
+          <w:p>
+            <w:pPr>
+              <w:pStyle w:val="Compact"/>
+              <w:jc w:val="right"/>
+            </w:pPr>
+            <w:r>
+              <w:t xml:space="preserve">≈0</w:t>
+            </w:r>
+          </w:p>
+        </w:tc>
+      </w:tr>
+    </w:tbl>
+    <w:p>
+      <w:pPr>
+        <w:pStyle w:val="BodyText"/>
+      </w:pPr>
+      <w:r>
+        <w:t xml:space="preserve">Every force-on continuation stayed on the baseline noun (</w:t>
+      </w:r>
+      <w:r>
+        <w:rPr>
+          <w:rStyle w:val="VerbatimChar"/>
+        </w:rPr>
+        <w:t xml:space="preserve">a pilot</w:t>
+      </w:r>
+      <w:r>
+        <w:t xml:space="preserve">,</w:t>
+      </w:r>
+      <w:r>
+        <w:t xml:space="preserve"> </w:t>
+      </w:r>
+      <w:r>
+        <w:rPr>
+          <w:rStyle w:val="VerbatimChar"/>
+        </w:rPr>
+        <w:t xml:space="preserve">a lawyer</w:t>
+      </w:r>
+      <w:r>
+        <w:t xml:space="preserve">,</w:t>
+      </w:r>
+      <w:r>
+        <w:t xml:space="preserve"> </w:t>
+      </w:r>
+      <w:r>
+        <w:rPr>
+          <w:rStyle w:val="VerbatimChar"/>
+        </w:rPr>
+        <w:t xml:space="preserve">a psychologist</w:t>
+      </w:r>
+      <w:r>
+        <w:t xml:space="preserve">). Content steering never outperformed</w:t>
+      </w:r>
+      <w:r>
+        <w:t xml:space="preserve"> </w:t>
+      </w:r>
+      <w:r>
+        <w:t xml:space="preserve">random controls on the within-class metrics; the ~5-logit same−source</w:t>
+      </w:r>
+      <w:r>
+        <w:t xml:space="preserve"> </w:t>
+      </w:r>
+      <w:r>
+        <w:t xml:space="preserve">gap did not close.</w:t>
+      </w:r>
+    </w:p>
+    <w:p>
+      <w:pPr>
+        <w:pStyle w:val="CaptionedFigure"/>
+      </w:pPr>
+      <w:r>
+        <w:drawing>
+          <wp:inline>
+            <wp:extent cx="5943600" cy="2522044"/>
+            <wp:effectExtent b="0" l="0" r="0" t="0"/>
+            <wp:docPr descr="Figure 11. Dense residual (MLP-in) content steering under the Stage XVI fixed-b protocol: within-class outcomes remain exactly zero across content and random directions; same-class nouns stay ~5 logits below source." title="" id="123" name="Picture"/>
+            <a:graphic>
+              <a:graphicData uri="http://schemas.openxmlformats.org/drawingml/2006/picture">
+                <pic:pic>
+                  <pic:nvPicPr>
+                    <pic:cNvPr descr="figures/figure11_residual_fixed_b.png" id="124" name="Picture"/>
+                    <pic:cNvPicPr>
+                      <a:picLocks noChangeArrowheads="1" noChangeAspect="1"/>
+                    </pic:cNvPicPr>
+                  </pic:nvPicPr>
+                  <pic:blipFill>
+                    <a:blip r:embed="rId122"/>
+                    <a:stretch>
+                      <a:fillRect/>
+                    </a:stretch>
+                  </pic:blipFill>
+                  <pic:spPr bwMode="auto">
+                    <a:xfrm>
+                      <a:off x="0" y="0"/>
+                      <a:ext cx="5943600" cy="2522044"/>
+                    </a:xfrm>
+                    <a:prstGeom prst="rect">
+                      <a:avLst/>
+                    </a:prstGeom>
+                    <a:noFill/>
+                    <a:ln w="9525">
+                      <a:noFill/>
+                      <a:headEnd/>
+                      <a:tailEnd/>
+                    </a:ln>
+                  </pic:spPr>
+                </pic:pic>
+              </a:graphicData>
+            </a:graphic>
+          </wp:inline>
+        </w:drawing>
+      </w:r>
+    </w:p>
+    <w:p>
+      <w:pPr>
+        <w:pStyle w:val="ImageCaption"/>
+      </w:pPr>
+      <w:r>
+        <w:t xml:space="preserve">Figure 11. Dense residual (MLP-in) content steering under the Stage XVI fixed-</w:t>
+      </w:r>
+      <m:oMath>
+        <m:r>
+          <m:t>b</m:t>
+        </m:r>
+      </m:oMath>
+      <w:r>
+        <w:t xml:space="preserve"> </w:t>
+      </w:r>
+      <w:r>
+        <w:t xml:space="preserve">protocol: within-class outcomes remain exactly zero across content and random directions; same-class nouns stay ~5 logits below source.</w:t>
+      </w:r>
+    </w:p>
+    <w:bookmarkEnd w:id="125"/>
+    <w:bookmarkStart w:id="126" w:name="conclusion-of-stage-xviii"/>
+    <w:p>
+      <w:pPr>
+        <w:pStyle w:val="Heading3"/>
+      </w:pPr>
+      <w:r>
+        <w:t xml:space="preserve">Conclusion of Stage XVIII</w:t>
+      </w:r>
+    </w:p>
+    <w:p>
+      <w:pPr>
+        <w:pStyle w:val="FirstParagraph"/>
+      </w:pPr>
+      <w:r>
+        <w:t xml:space="preserve">In plain terms:</w:t>
+      </w:r>
+      <w:r>
+        <w:t xml:space="preserve"> </w:t>
+      </w:r>
+      <w:r>
+        <w:rPr>
+          <w:b/>
+          <w:bCs/>
+        </w:rPr>
+        <w:t xml:space="preserve">pushing the network along a dense “toward the</w:t>
+      </w:r>
+      <w:r>
+        <w:rPr>
+          <w:b/>
+          <w:bCs/>
+        </w:rPr>
+        <w:t xml:space="preserve"> </w:t>
+      </w:r>
+      <w:r>
+        <w:rPr>
+          <w:b/>
+          <w:bCs/>
+        </w:rPr>
+        <w:t xml:space="preserve">same-class noun” arrow, while holding the article fixed, still does not</w:t>
+      </w:r>
+      <w:r>
+        <w:rPr>
+          <w:b/>
+          <w:bCs/>
+        </w:rPr>
+        <w:t xml:space="preserve"> </w:t>
+      </w:r>
+      <w:r>
+        <w:rPr>
+          <w:b/>
+          <w:bCs/>
+        </w:rPr>
+        <w:t xml:space="preserve">rewrite the noun.</w:t>
+      </w:r>
+      <w:r>
+        <w:t xml:space="preserve"> </w:t>
+      </w:r>
+      <w:r>
+        <w:t xml:space="preserve">The Stage XVI/XVII sparse nulls were therefore not</w:t>
+      </w:r>
+      <w:r>
+        <w:t xml:space="preserve"> </w:t>
+      </w:r>
+      <w:r>
+        <w:t xml:space="preserve">only “we picked the wrong sparse dials.” Independent</w:t>
+      </w:r>
+      <w:r>
+        <w:t xml:space="preserve"> </w:t>
+      </w:r>
+      <m:oMath>
+        <m:r>
+          <m:t>C</m:t>
+        </m:r>
+        <m:r>
+          <m:rPr>
+            <m:sty m:val="p"/>
+          </m:rPr>
+          <m:t>→</m:t>
+        </m:r>
+        <m:r>
+          <m:t>c</m:t>
+        </m:r>
+      </m:oMath>
+      <w:r>
+        <w:t xml:space="preserve"> </w:t>
+      </w:r>
+      <w:r>
+        <w:t xml:space="preserve">also fails for this residual construction at the MLP-in / affine-skip</w:t>
+      </w:r>
+      <w:r>
+        <w:t xml:space="preserve"> </w:t>
+      </w:r>
+      <w:r>
+        <w:t xml:space="preserve">site under the fair fixed-</w:t>
+      </w:r>
+      <m:oMath>
+        <m:r>
+          <m:t>b</m:t>
+        </m:r>
+      </m:oMath>
+      <w:r>
+        <w:t xml:space="preserve"> </w:t>
+      </w:r>
+      <w:r>
+        <w:t xml:space="preserve">schedule.</w:t>
+      </w:r>
+    </w:p>
+    <w:p>
+      <w:pPr>
+        <w:pStyle w:val="BodyText"/>
+      </w:pPr>
+      <w:r>
+        <w:t xml:space="preserve">This hardens—not revises—the H2 packaging read for</w:t>
+      </w:r>
+      <w:r>
+        <w:t xml:space="preserve"> </w:t>
+      </w:r>
+      <w:r>
+        <w:rPr>
+          <w:i/>
+          <w:iCs/>
+        </w:rPr>
+        <w:t xml:space="preserve">editable</w:t>
+      </w:r>
+      <w:r>
+        <w:t xml:space="preserve"> </w:t>
+      </w:r>
+      <w:r>
+        <w:t xml:space="preserve">representations on this model and task. It does</w:t>
+      </w:r>
+      <w:r>
+        <w:t xml:space="preserve"> </w:t>
+      </w:r>
+      <w:r>
+        <w:rPr>
+          <w:b/>
+          <w:bCs/>
+        </w:rPr>
+        <w:t xml:space="preserve">not</w:t>
+      </w:r>
+      <w:r>
+        <w:t xml:space="preserve"> </w:t>
+      </w:r>
+      <w:r>
+        <w:t xml:space="preserve">prove that no denser</w:t>
+      </w:r>
+      <w:r>
+        <w:t xml:space="preserve"> </w:t>
+      </w:r>
+      <w:r>
+        <w:t xml:space="preserve">or differently constructed direction could ever work, nor that content</w:t>
+      </w:r>
+      <w:r>
+        <w:t xml:space="preserve"> </w:t>
+      </w:r>
+      <w:r>
+        <w:t xml:space="preserve">identity is absent from latent space; it closes the specific escape</w:t>
+      </w:r>
+      <w:r>
+        <w:t xml:space="preserve"> </w:t>
+      </w:r>
+      <w:r>
+        <w:t xml:space="preserve">hatch that “sparse dictionary incompleteness alone” explained the null.</w:t>
+      </w:r>
+    </w:p>
+    <w:p>
+      <w:pPr>
+        <w:pStyle w:val="BodyText"/>
+      </w:pPr>
+      <w:r>
+        <w:t xml:space="preserve">What remains open (Section 11): dedicated noun-identity latent probes;</w:t>
+      </w:r>
+      <w:r>
+        <w:t xml:space="preserve"> </w:t>
+      </w:r>
+      <w:r>
+        <w:t xml:space="preserve">pure</w:t>
+      </w:r>
+      <w:r>
+        <w:t xml:space="preserve"> </w:t>
+      </w:r>
+      <m:oMath>
+        <m:r>
+          <m:t>A</m:t>
+        </m:r>
+      </m:oMath>
+      <w:r>
+        <w:t xml:space="preserve">; scale / model-family generalization; alternative dense</w:t>
+      </w:r>
+      <w:r>
+        <w:t xml:space="preserve"> </w:t>
+      </w:r>
+      <w:r>
+        <w:t xml:space="preserve">constructions (e.g. other sites or multi-token patching) if collaborators</w:t>
+      </w:r>
+      <w:r>
+        <w:t xml:space="preserve"> </w:t>
+      </w:r>
+      <w:r>
+        <w:t xml:space="preserve">want even harder completeness.</w:t>
+      </w:r>
+    </w:p>
+    <w:bookmarkEnd w:id="126"/>
+    <w:bookmarkEnd w:id="127"/>
+    <w:bookmarkStart w:id="128" w:name="X4aa47f6369ab9bf182e63c98eda1afd23e468a6"/>
+    <w:p>
+      <w:pPr>
+        <w:pStyle w:val="Heading2"/>
+      </w:pPr>
+      <w:r>
+        <w:t xml:space="preserve">10.15 Current hypothesis (after Stages VIII–XVIII)</w:t>
       </w:r>
     </w:p>
     <w:p>
@@ -20835,6 +22756,44 @@
           </w:p>
         </w:tc>
       </w:tr>
+      <w:tr>
+        <w:tc>
+          <w:tcPr/>
+          <w:p>
+            <w:pPr>
+              <w:pStyle w:val="Compact"/>
+            </w:pPr>
+            <w:r>
+              <w:t xml:space="preserve">“Maybe content lives outside the sparse dictionary”</w:t>
+            </w:r>
+          </w:p>
+        </w:tc>
+        <w:tc>
+          <w:tcPr/>
+          <w:p>
+            <w:pPr>
+              <w:pStyle w:val="Compact"/>
+            </w:pPr>
+            <w:r>
+              <w:t xml:space="preserve">Residual / MLP-in activation-direction under fixed</w:t>
+            </w:r>
+            <w:r>
+              <w:t xml:space="preserve"> </w:t>
+            </w:r>
+            <m:oMath>
+              <m:r>
+                <m:t>b</m:t>
+              </m:r>
+            </m:oMath>
+            <w:r>
+              <w:t xml:space="preserve"> </w:t>
+            </w:r>
+            <w:r>
+              <w:t xml:space="preserve">(Stage XVIII)</w:t>
+            </w:r>
+          </w:p>
+        </w:tc>
+      </w:tr>
     </w:tbl>
     <w:p>
       <w:pPr>
@@ -21107,9 +23066,9 @@
         <w:t xml:space="preserve">same-article-class synonyms.</w:t>
       </w:r>
     </w:p>
-    <w:bookmarkEnd w:id="120"/>
-    <w:bookmarkEnd w:id="121"/>
-    <w:bookmarkStart w:id="126" w:name="what-has-and-has-not-been-achieved"/>
+    <w:bookmarkEnd w:id="128"/>
+    <w:bookmarkEnd w:id="129"/>
+    <w:bookmarkStart w:id="134" w:name="what-has-and-has-not-been-achieved"/>
     <w:p>
       <w:pPr>
         <w:pStyle w:val="Heading1"/>
@@ -21118,7 +23077,7 @@
         <w:t xml:space="preserve">11. What has and has not been achieved</w:t>
       </w:r>
     </w:p>
-    <w:bookmarkStart w:id="122" w:name="edge-by-edge-evidence-logical-anchor"/>
+    <w:bookmarkStart w:id="130" w:name="edge-by-edge-evidence-logical-anchor"/>
     <w:p>
       <w:pPr>
         <w:pStyle w:val="Heading2"/>
@@ -21582,7 +23541,7 @@
                 <w:b/>
                 <w:bCs/>
               </w:rPr>
-              <w:t xml:space="preserve">Not demonstrated independently—now under a fair protocol and a fairer feature grain.</w:t>
+              <w:t xml:space="preserve">Not demonstrated independently—now under a fair protocol, fairer sparse grain, and a dense residual steer.</w:t>
             </w:r>
             <w:r>
               <w:t xml:space="preserve"> </w:t>
@@ -21674,35 +23633,43 @@
               </m:r>
             </m:oMath>
             <w:r>
-              <w:t xml:space="preserve">;</w:t>
-            </w:r>
-            <w:r>
-              <w:t xml:space="preserve"> </w:t>
+              <w:t xml:space="preserve">; signal = 0 for S3, hint-contrast, controls. Stage XVII: per-noun LP-style / contrast features; signal = 0. Stage XVIII: residual MLP-in content directions (</w:t>
             </w:r>
             <m:oMath>
               <m:r>
-                <m:t>c</m:t>
+                <m:t>α</m:t>
               </m:r>
               <m:r>
                 <m:rPr>
                   <m:sty m:val="p"/>
                 </m:rPr>
-                <m:t>→</m:t>
+                <m:t>=</m:t>
               </m:r>
               <m:r>
-                <m:t>c</m:t>
+                <m:t>1</m:t>
               </m:r>
             </m:oMath>
             <w:r>
+              <w:t xml:space="preserve">–</w:t>
+            </w:r>
+            <m:oMath>
+              <m:r>
+                <m:t>8</m:t>
+              </m:r>
+            </m:oMath>
+            <w:r>
+              <w:t xml:space="preserve">); signal = 0 and no better than random controls (max</w:t>
+            </w:r>
+            <w:r>
               <w:t xml:space="preserve"> </w:t>
             </w:r>
-            <w:r>
-              <w:t xml:space="preserve">signal = 0 for S3, hint-contrast, and controls. Stage XVII: same schedule with per-noun LP-style / contrast features on three twin families; again signal = 0 (max</w:t>
-            </w:r>
-            <w:r>
-              <w:t xml:space="preserve"> </w:t>
-            </w:r>
             <m:oMath>
+              <m:r>
+                <m:rPr>
+                  <m:sty m:val="p"/>
+                </m:rPr>
+                <m:t>|</m:t>
+              </m:r>
               <m:r>
                 <m:rPr>
                   <m:sty m:val="p"/>
@@ -21715,12 +23682,18 @@
                 </m:rPr>
                 <m:t>Δ</m:t>
               </m:r>
+              <m:r>
+                <m:rPr>
+                  <m:sty m:val="p"/>
+                </m:rPr>
+                <m:t>|</m:t>
+              </m:r>
             </m:oMath>
             <w:r>
               <w:t xml:space="preserve"> </w:t>
             </w:r>
             <w:r>
-              <w:t xml:space="preserve">same−source ≈ +0.29 logits).</w:t>
+              <w:t xml:space="preserve">same−source ≲ 0.15).</w:t>
             </w:r>
           </w:p>
         </w:tc>
@@ -21751,7 +23724,7 @@
               </m:r>
             </m:oMath>
             <w:r>
-              <w:t xml:space="preserve">. Independent content rewrite fails for recurring S3</w:t>
+              <w:t xml:space="preserve">. Independent content rewrite fails for recurring S3, Latent-Planning-style per-example features,</w:t>
             </w:r>
             <w:r>
               <w:t xml:space="preserve"> </w:t>
@@ -21767,7 +23740,7 @@
               <w:t xml:space="preserve"> </w:t>
             </w:r>
             <w:r>
-              <w:t xml:space="preserve">for Latent-Planning-style per-example noun features under fixed</w:t>
+              <w:t xml:space="preserve">this dense residual construction under fixed</w:t>
             </w:r>
             <w:r>
               <w:t xml:space="preserve"> </w:t>
@@ -21940,8 +23913,8 @@
         </w:tc>
       </w:tr>
     </w:tbl>
-    <w:bookmarkEnd w:id="122"/>
-    <w:bookmarkStart w:id="123" w:name="achievements-engineering-and-experiments"/>
+    <w:bookmarkEnd w:id="130"/>
+    <w:bookmarkStart w:id="131" w:name="achievements-engineering-and-experiments"/>
     <w:p>
       <w:pPr>
         <w:pStyle w:val="Heading2"/>
@@ -21963,7 +23936,7 @@
         <w:pStyle w:val="Compact"/>
         <w:numPr>
           <w:ilvl w:val="0"/>
-          <w:numId w:val="1020"/>
+          <w:numId w:val="1021"/>
         </w:numPr>
       </w:pPr>
       <w:r>
@@ -21981,7 +23954,7 @@
         <w:pStyle w:val="Compact"/>
         <w:numPr>
           <w:ilvl w:val="0"/>
-          <w:numId w:val="1020"/>
+          <w:numId w:val="1021"/>
         </w:numPr>
       </w:pPr>
       <w:r>
@@ -22027,7 +24000,7 @@
         <w:pStyle w:val="Compact"/>
         <w:numPr>
           <w:ilvl w:val="0"/>
-          <w:numId w:val="1020"/>
+          <w:numId w:val="1021"/>
         </w:numPr>
       </w:pPr>
       <w:r>
@@ -22073,17 +24046,17 @@
         <w:pStyle w:val="Compact"/>
         <w:numPr>
           <w:ilvl w:val="0"/>
-          <w:numId w:val="1020"/>
+          <w:numId w:val="1021"/>
         </w:numPr>
       </w:pPr>
       <w:r>
-        <w:t xml:space="preserve">held-out fixed-pair, GoF clincher, E1–E4, Stage XV, Stage XVI, and</w:t>
-      </w:r>
-      <w:r>
-        <w:t xml:space="preserve"> </w:t>
-      </w:r>
-      <w:r>
-        <w:t xml:space="preserve">Stage XVII results that map onto the edge table above;</w:t>
+        <w:t xml:space="preserve">held-out fixed-pair, GoF clincher, E1–E4, Stage XV, Stage XVI, Stage</w:t>
+      </w:r>
+      <w:r>
+        <w:t xml:space="preserve"> </w:t>
+      </w:r>
+      <w:r>
+        <w:t xml:space="preserve">XVII, and Stage XVIII results that map onto the edge table above;</w:t>
       </w:r>
     </w:p>
     <w:p>
@@ -22091,7 +24064,7 @@
         <w:pStyle w:val="Compact"/>
         <w:numPr>
           <w:ilvl w:val="0"/>
-          <w:numId w:val="1020"/>
+          <w:numId w:val="1021"/>
         </w:numPr>
       </w:pPr>
       <w:r>
@@ -22109,7 +24082,7 @@
         <w:pStyle w:val="Compact"/>
         <w:numPr>
           <w:ilvl w:val="0"/>
-          <w:numId w:val="1020"/>
+          <w:numId w:val="1021"/>
         </w:numPr>
       </w:pPr>
       <w:r>
@@ -22212,7 +24185,7 @@
         <w:pStyle w:val="Compact"/>
         <w:numPr>
           <w:ilvl w:val="0"/>
-          <w:numId w:val="1020"/>
+          <w:numId w:val="1021"/>
         </w:numPr>
       </w:pPr>
       <w:r>
@@ -22264,15 +24237,7 @@
         <w:t xml:space="preserve"> </w:t>
       </w:r>
       <w:r>
-        <w:t xml:space="preserve">escape hatch for the handles we can select from CLT graphs.</w:t>
-      </w:r>
-    </w:p>
-    <w:p>
-      <w:pPr>
-        <w:pStyle w:val="FirstParagraph"/>
-      </w:pPr>
-      <w:r>
-        <w:t xml:space="preserve">We have not achieved:</w:t>
+        <w:t xml:space="preserve">escape hatch for the handles we can select from CLT graphs;</w:t>
       </w:r>
     </w:p>
     <w:p>
@@ -22284,7 +24249,49 @@
         </w:numPr>
       </w:pPr>
       <w:r>
-        <w:t xml:space="preserve">a general tool for reducing stalling behavior on country–city prompts;</w:t>
+        <w:t xml:space="preserve">a</w:t>
+      </w:r>
+      <w:r>
+        <w:t xml:space="preserve"> </w:t>
+      </w:r>
+      <w:r>
+        <w:rPr>
+          <w:b/>
+          <w:bCs/>
+        </w:rPr>
+        <w:t xml:space="preserve">dense residual / MLP-in activation-direction</w:t>
+      </w:r>
+      <w:r>
+        <w:t xml:space="preserve"> </w:t>
+      </w:r>
+      <w:r>
+        <w:t xml:space="preserve">null under that same</w:t>
+      </w:r>
+      <w:r>
+        <w:t xml:space="preserve"> </w:t>
+      </w:r>
+      <w:r>
+        <w:t xml:space="preserve">schedule (Stage XVIII)—closes the main “maybe it lives outside the</w:t>
+      </w:r>
+      <w:r>
+        <w:t xml:space="preserve"> </w:t>
+      </w:r>
+      <w:r>
+        <w:t xml:space="preserve">sparse dictionary / affine skip” escape hatch for the construction we</w:t>
+      </w:r>
+      <w:r>
+        <w:t xml:space="preserve"> </w:t>
+      </w:r>
+      <w:r>
+        <w:t xml:space="preserve">tested.</w:t>
+      </w:r>
+    </w:p>
+    <w:p>
+      <w:pPr>
+        <w:pStyle w:val="FirstParagraph"/>
+      </w:pPr>
+      <w:r>
+        <w:t xml:space="preserve">We have not achieved:</w:t>
       </w:r>
     </w:p>
     <w:p>
@@ -22292,11 +24299,11 @@
         <w:pStyle w:val="Compact"/>
         <w:numPr>
           <w:ilvl w:val="0"/>
-          <w:numId w:val="1021"/>
+          <w:numId w:val="1022"/>
         </w:numPr>
       </w:pPr>
       <w:r>
-        <w:t xml:space="preserve">a content-preserving grammar correction that transfers across prompts;</w:t>
+        <w:t xml:space="preserve">a general tool for reducing stalling behavior on country–city prompts;</w:t>
       </w:r>
     </w:p>
     <w:p>
@@ -22304,7 +24311,19 @@
         <w:pStyle w:val="Compact"/>
         <w:numPr>
           <w:ilvl w:val="0"/>
-          <w:numId w:val="1021"/>
+          <w:numId w:val="1022"/>
+        </w:numPr>
+      </w:pPr>
+      <w:r>
+        <w:t xml:space="preserve">a content-preserving grammar correction that transfers across prompts;</w:t>
+      </w:r>
+    </w:p>
+    <w:p>
+      <w:pPr>
+        <w:pStyle w:val="Compact"/>
+        <w:numPr>
+          <w:ilvl w:val="0"/>
+          <w:numId w:val="1022"/>
         </w:numPr>
       </w:pPr>
       <w:r>
@@ -22357,7 +24376,7 @@
         <w:t xml:space="preserve"> </w:t>
       </w:r>
       <w:r>
-        <w:t xml:space="preserve">for any frozen feature set we tried;</w:t>
+        <w:t xml:space="preserve">for any frozen feature set or residual direction we tried;</w:t>
       </w:r>
     </w:p>
     <w:p>
@@ -22365,7 +24384,7 @@
         <w:pStyle w:val="Compact"/>
         <w:numPr>
           <w:ilvl w:val="0"/>
-          <w:numId w:val="1021"/>
+          <w:numId w:val="1022"/>
         </w:numPr>
       </w:pPr>
       <w:r>
@@ -22385,23 +24404,33 @@
         <w:pStyle w:val="Compact"/>
         <w:numPr>
           <w:ilvl w:val="0"/>
-          <w:numId w:val="1021"/>
+          <w:numId w:val="1022"/>
         </w:numPr>
       </w:pPr>
       <w:r>
-        <w:t xml:space="preserve">residual / full activation-direction content steering beyond sparse CLT</w:t>
-      </w:r>
-      <w:r>
-        <w:t xml:space="preserve"> </w:t>
-      </w:r>
-      <w:r>
-        <w:t xml:space="preserve">features (Stage XVI hint-contrast and Stage XVII per-noun selection</w:t>
-      </w:r>
-      <w:r>
-        <w:t xml:space="preserve"> </w:t>
-      </w:r>
-      <w:r>
-        <w:t xml:space="preserve">remain inside the sparse feature dictionary);</w:t>
+        <w:t xml:space="preserve">proof that</w:t>
+      </w:r>
+      <w:r>
+        <w:t xml:space="preserve"> </w:t>
+      </w:r>
+      <w:r>
+        <w:rPr>
+          <w:i/>
+          <w:iCs/>
+        </w:rPr>
+        <w:t xml:space="preserve">every</w:t>
+      </w:r>
+      <w:r>
+        <w:t xml:space="preserve"> </w:t>
+      </w:r>
+      <w:r>
+        <w:t xml:space="preserve">possible dense construction fails (Stage XVIII tests</w:t>
+      </w:r>
+      <w:r>
+        <w:t xml:space="preserve"> </w:t>
+      </w:r>
+      <w:r>
+        <w:t xml:space="preserve">one standard hint-contrast residual direction at MLP-in layers);</w:t>
       </w:r>
     </w:p>
     <w:p>
@@ -22409,7 +24438,7 @@
         <w:pStyle w:val="Compact"/>
         <w:numPr>
           <w:ilvl w:val="0"/>
-          <w:numId w:val="1021"/>
+          <w:numId w:val="1022"/>
         </w:numPr>
       </w:pPr>
       <w:r>
@@ -22433,7 +24462,7 @@
         <w:pStyle w:val="Compact"/>
         <w:numPr>
           <w:ilvl w:val="0"/>
-          <w:numId w:val="1021"/>
+          <w:numId w:val="1022"/>
         </w:numPr>
       </w:pPr>
       <w:r>
@@ -22457,15 +24486,15 @@
         <w:pStyle w:val="Compact"/>
         <w:numPr>
           <w:ilvl w:val="0"/>
-          <w:numId w:val="1021"/>
+          <w:numId w:val="1022"/>
         </w:numPr>
       </w:pPr>
       <w:r>
         <w:t xml:space="preserve">a complete necessity story from zero-ablation alone on twin baselines.</w:t>
       </w:r>
     </w:p>
-    <w:bookmarkEnd w:id="123"/>
-    <w:bookmarkStart w:id="124" w:name="X46d31a06604842fe089d9adc9cbb8d804c11a4b"/>
+    <w:bookmarkEnd w:id="131"/>
+    <w:bookmarkStart w:id="132" w:name="X46d31a06604842fe089d9adc9cbb8d804c11a4b"/>
     <w:p>
       <w:pPr>
         <w:pStyle w:val="Heading2"/>
@@ -22495,7 +24524,7 @@
         <w:t xml:space="preserve"> </w:t>
       </w:r>
       <w:r>
-        <w:t xml:space="preserve">features, we</w:t>
+        <w:t xml:space="preserve">features</w:t>
       </w:r>
       <w:r>
         <w:t xml:space="preserve"> </w:t>
@@ -22505,7 +24534,37 @@
           <w:b/>
           <w:bCs/>
         </w:rPr>
-        <w:t xml:space="preserve">cannot demonstrate independent</w:t>
+        <w:t xml:space="preserve">and</w:t>
+      </w:r>
+      <w:r>
+        <w:t xml:space="preserve"> </w:t>
+      </w:r>
+      <w:r>
+        <w:t xml:space="preserve">a dense residual content direction, we</w:t>
+      </w:r>
+      <w:r>
+        <w:t xml:space="preserve"> </w:t>
+      </w:r>
+      <w:r>
+        <w:rPr>
+          <w:b/>
+          <w:bCs/>
+        </w:rPr>
+        <w:t xml:space="preserve">cannot</w:t>
+      </w:r>
+      <w:r>
+        <w:rPr>
+          <w:b/>
+          <w:bCs/>
+        </w:rPr>
+        <w:t xml:space="preserve"> </w:t>
+      </w:r>
+      <w:r>
+        <w:rPr>
+          <w:b/>
+          <w:bCs/>
+        </w:rPr>
+        <w:t xml:space="preserve">demonstrate independent</w:t>
       </w:r>
       <w:r>
         <w:rPr>
@@ -22566,34 +24625,13 @@
           <w:b/>
           <w:bCs/>
         </w:rPr>
-        <w:t xml:space="preserve">is held fixed</w:t>
-      </w:r>
-      <w:r>
-        <w:t xml:space="preserve">—including under a corrected protocol that keeps</w:t>
-      </w:r>
-      <w:r>
-        <w:t xml:space="preserve"> </w:t>
-      </w:r>
-      <w:r>
-        <w:t xml:space="preserve">content clamps</w:t>
-      </w:r>
-      <w:r>
-        <w:t xml:space="preserve"> </w:t>
+        <w:t xml:space="preserve">is held</w:t>
       </w:r>
       <w:r>
         <w:rPr>
           <w:b/>
           <w:bCs/>
         </w:rPr>
-        <w:t xml:space="preserve">on</w:t>
-      </w:r>
-      <w:r>
-        <w:t xml:space="preserve"> </w:t>
-      </w:r>
-      <w:r>
-        <w:t xml:space="preserve">at the noun step and asks for</w:t>
-      </w:r>
-      <w:r>
         <w:t xml:space="preserve"> </w:t>
       </w:r>
       <w:r>
@@ -22601,13 +24639,10 @@
           <w:b/>
           <w:bCs/>
         </w:rPr>
-        <w:t xml:space="preserve">within-class</w:t>
-      </w:r>
-      <w:r>
-        <w:t xml:space="preserve"> </w:t>
-      </w:r>
-      <w:r>
-        <w:t xml:space="preserve">noun moves, and including</w:t>
+        <w:t xml:space="preserve">fixed</w:t>
+      </w:r>
+      <w:r>
+        <w:t xml:space="preserve">—including under a corrected protocol that keeps content edits</w:t>
       </w:r>
       <w:r>
         <w:t xml:space="preserve"> </w:t>
@@ -22617,25 +24652,35 @@
           <w:b/>
           <w:bCs/>
         </w:rPr>
-        <w:t xml:space="preserve">per-noun Latent-Planning-style</w:t>
-      </w:r>
-      <w:r>
-        <w:t xml:space="preserve"> </w:t>
-      </w:r>
-      <w:r>
-        <w:t xml:space="preserve">feature</w:t>
-      </w:r>
-      <w:r>
-        <w:t xml:space="preserve"> </w:t>
-      </w:r>
-      <w:r>
-        <w:t xml:space="preserve">selection on twin families (Stage XVII). Noun changes under free</w:t>
-      </w:r>
-      <w:r>
-        <w:t xml:space="preserve"> </w:t>
-      </w:r>
-      <w:r>
-        <w:t xml:space="preserve">intervention track</w:t>
+        <w:t xml:space="preserve">on</w:t>
+      </w:r>
+      <w:r>
+        <w:t xml:space="preserve"> </w:t>
+      </w:r>
+      <w:r>
+        <w:t xml:space="preserve">at the noun step and asks for</w:t>
+      </w:r>
+      <w:r>
+        <w:t xml:space="preserve"> </w:t>
+      </w:r>
+      <w:r>
+        <w:rPr>
+          <w:b/>
+          <w:bCs/>
+        </w:rPr>
+        <w:t xml:space="preserve">within-class</w:t>
+      </w:r>
+      <w:r>
+        <w:t xml:space="preserve"> </w:t>
+      </w:r>
+      <w:r>
+        <w:t xml:space="preserve">noun moves</w:t>
+      </w:r>
+      <w:r>
+        <w:t xml:space="preserve"> </w:t>
+      </w:r>
+      <w:r>
+        <w:t xml:space="preserve">(Stages XVI–XVIII). Noun changes under free intervention track</w:t>
       </w:r>
       <w:r>
         <w:t xml:space="preserve"> </w:t>
@@ -22665,7 +24710,7 @@
           <w:b/>
           <w:bCs/>
         </w:rPr>
-        <w:t xml:space="preserve">strong evidence these</w:t>
+        <w:t xml:space="preserve">strong evidence these mechanisms are not</w:t>
       </w:r>
       <w:r>
         <w:rPr>
@@ -22679,7 +24724,7 @@
           <w:b/>
           <w:bCs/>
         </w:rPr>
-        <w:t xml:space="preserve">mechanisms are not modular latent planning (H1)</w:t>
+        <w:t xml:space="preserve">modular latent planning (H1)</w:t>
       </w:r>
       <w:r>
         <w:t xml:space="preserve">, and that</w:t>
@@ -22692,7 +24737,21 @@
           <w:b/>
           <w:bCs/>
         </w:rPr>
-        <w:t xml:space="preserve">article-conditioned packaging and/or strong</w:t>
+        <w:t xml:space="preserve">article-conditioned packaging</w:t>
+      </w:r>
+      <w:r>
+        <w:rPr>
+          <w:b/>
+          <w:bCs/>
+        </w:rPr>
+        <w:t xml:space="preserve"> </w:t>
+      </w:r>
+      <w:r>
+        <w:rPr>
+          <w:b/>
+          <w:bCs/>
+        </w:rPr>
+        <w:t xml:space="preserve">and/or strong</w:t>
       </w:r>
       <w:r>
         <w:rPr>
@@ -22733,7 +24792,13 @@
         <w:t xml:space="preserve"> </w:t>
       </w:r>
       <w:r>
-        <w:t xml:space="preserve">for the handles we tested (H2 as an account of</w:t>
+        <w:t xml:space="preserve">for the handles</w:t>
+      </w:r>
+      <w:r>
+        <w:t xml:space="preserve"> </w:t>
+      </w:r>
+      <w:r>
+        <w:t xml:space="preserve">we tested (H2 as an account of</w:t>
       </w:r>
       <w:r>
         <w:t xml:space="preserve"> </w:t>
@@ -22770,7 +24835,7 @@
         <w:t xml:space="preserve"> </w:t>
       </w:r>
       <w:r>
-        <w:t xml:space="preserve">intervenable sparse representation we could edit that</w:t>
+        <w:t xml:space="preserve">intervenable representation we could edit that</w:t>
       </w:r>
       <w:r>
         <w:t xml:space="preserve"> </w:t>
@@ -22917,31 +24982,59 @@
         <w:t xml:space="preserve"> </w:t>
       </w:r>
       <w:r>
-        <w:t xml:space="preserve">is held fixed (Stages XV–XVII,</w:t>
-      </w:r>
-      <w:r>
-        <w:t xml:space="preserve"> </w:t>
-      </w:r>
-      <w:r>
-        <w:t xml:space="preserve">including per-noun LP-style selection). That is a paper-grade challenge</w:t>
-      </w:r>
-      <w:r>
-        <w:t xml:space="preserve"> </w:t>
-      </w:r>
-      <w:r>
-        <w:t xml:space="preserve">to reading Latent-Planning-style dual-effect (and related) sparse</w:t>
-      </w:r>
-      <w:r>
-        <w:t xml:space="preserve"> </w:t>
-      </w:r>
-      <w:r>
-        <w:t xml:space="preserve">interventions on Gemma 3 270M as the separable modular graph. The</w:t>
-      </w:r>
-      <w:r>
-        <w:t xml:space="preserve"> </w:t>
-      </w:r>
-      <w:r>
-        <w:t xml:space="preserve">practical consequence is that article flips here are easy to</w:t>
+        <w:t xml:space="preserve">is held fixed—sparse dual-effect</w:t>
+      </w:r>
+      <w:r>
+        <w:t xml:space="preserve"> </w:t>
+      </w:r>
+      <w:r>
+        <w:t xml:space="preserve">/ content-ish / hint-contrast / per-noun LP-style features</w:t>
+      </w:r>
+      <w:r>
+        <w:t xml:space="preserve"> </w:t>
+      </w:r>
+      <w:r>
+        <w:rPr>
+          <w:b/>
+          <w:bCs/>
+        </w:rPr>
+        <w:t xml:space="preserve">and</w:t>
+      </w:r>
+      <w:r>
+        <w:t xml:space="preserve"> </w:t>
+      </w:r>
+      <w:r>
+        <w:t xml:space="preserve">a</w:t>
+      </w:r>
+      <w:r>
+        <w:t xml:space="preserve"> </w:t>
+      </w:r>
+      <w:r>
+        <w:t xml:space="preserve">dense residual (MLP-in) direction toward the same-class noun (Stages</w:t>
+      </w:r>
+      <w:r>
+        <w:t xml:space="preserve"> </w:t>
+      </w:r>
+      <w:r>
+        <w:t xml:space="preserve">XV–XVIII). That is a paper-grade challenge to reading</w:t>
+      </w:r>
+      <w:r>
+        <w:t xml:space="preserve"> </w:t>
+      </w:r>
+      <w:r>
+        <w:t xml:space="preserve">Latent-Planning-style article-moving interventions on Gemma 3 270M as</w:t>
+      </w:r>
+      <w:r>
+        <w:t xml:space="preserve"> </w:t>
+      </w:r>
+      <w:r>
+        <w:t xml:space="preserve">the separable modular graph. The practical consequence is that article</w:t>
+      </w:r>
+      <w:r>
+        <w:t xml:space="preserve"> </w:t>
+      </w:r>
+      <w:r>
+        <w:t xml:space="preserve">flips here are easy to</w:t>
       </w:r>
       <w:r>
         <w:t xml:space="preserve"> </w:t>
@@ -22980,13 +25073,13 @@
         <w:t xml:space="preserve"> </w:t>
       </w:r>
       <w:r>
-        <w:t xml:space="preserve">and content identity are not</w:t>
-      </w:r>
-      <w:r>
-        <w:t xml:space="preserve"> </w:t>
-      </w:r>
-      <w:r>
-        <w:t xml:space="preserve">tested as separate edges.</w:t>
+        <w:t xml:space="preserve">and content identity are not tested as separate</w:t>
+      </w:r>
+      <w:r>
+        <w:t xml:space="preserve"> </w:t>
+      </w:r>
+      <w:r>
+        <w:t xml:space="preserve">edges.</w:t>
       </w:r>
     </w:p>
     <w:p>
@@ -23055,19 +25148,19 @@
         <w:t xml:space="preserve"> </w:t>
       </w:r>
       <w:r>
-        <w:t xml:space="preserve">scales, nor that content causation is absent from every representation.</w:t>
-      </w:r>
-      <w:r>
-        <w:t xml:space="preserve"> </w:t>
-      </w:r>
-      <w:r>
-        <w:t xml:space="preserve">We tested specific frozen feature sets (S1/S2/S3/controls/hint</w:t>
-      </w:r>
-      <w:r>
-        <w:t xml:space="preserve"> </w:t>
-      </w:r>
-      <w:r>
-        <w:t xml:space="preserve">contrast/per-noun LP-target and contrast), not all of activation space.</w:t>
+        <w:t xml:space="preserve">scales, nor that every conceivable dense patch has been tried. We tested</w:t>
+      </w:r>
+      <w:r>
+        <w:t xml:space="preserve"> </w:t>
+      </w:r>
+      <w:r>
+        <w:t xml:space="preserve">specific frozen feature sets and one standard residual construction, not</w:t>
+      </w:r>
+      <w:r>
+        <w:t xml:space="preserve"> </w:t>
+      </w:r>
+      <w:r>
+        <w:t xml:space="preserve">all of activation space.</w:t>
       </w:r>
       <w:r>
         <w:t xml:space="preserve"> </w:t>
@@ -23083,13 +25176,19 @@
         <w:t xml:space="preserve"> </w:t>
       </w:r>
       <w:r>
-        <w:t xml:space="preserve">already places reliable a/an success</w:t>
-      </w:r>
-      <w:r>
-        <w:t xml:space="preserve"> </w:t>
-      </w:r>
-      <w:r>
-        <w:t xml:space="preserve">at much larger models; our contribution is the scoped null for</w:t>
+        <w:t xml:space="preserve">already</w:t>
+      </w:r>
+      <w:r>
+        <w:t xml:space="preserve"> </w:t>
+      </w:r>
+      <w:r>
+        <w:t xml:space="preserve">places reliable a/an success at much larger models; our contribution is</w:t>
+      </w:r>
+      <w:r>
+        <w:t xml:space="preserve"> </w:t>
+      </w:r>
+      <w:r>
+        <w:t xml:space="preserve">the scoped null for</w:t>
       </w:r>
       <w:r>
         <w:t xml:space="preserve"> </w:t>
@@ -23105,7 +25204,13 @@
         <w:t xml:space="preserve"> </w:t>
       </w:r>
       <w:r>
-        <w:t xml:space="preserve">content control in the space we could manipulate.</w:t>
+        <w:t xml:space="preserve">content control in the space we could</w:t>
+      </w:r>
+      <w:r>
+        <w:t xml:space="preserve"> </w:t>
+      </w:r>
+      <w:r>
+        <w:t xml:space="preserve">manipulate.</w:t>
       </w:r>
     </w:p>
     <w:p>
@@ -23146,55 +25251,7 @@
         <w:t xml:space="preserve"> </w:t>
       </w:r>
       <w:r>
-        <w:t xml:space="preserve">does not—in the same editable sparse features—so</w:t>
-      </w:r>
-      <w:r>
-        <w:t xml:space="preserve"> </w:t>
-      </w:r>
-      <w:r>
-        <w:t xml:space="preserve">holding the article fixed abolishes noun change even when content clamps</w:t>
-      </w:r>
-      <w:r>
-        <w:t xml:space="preserve"> </w:t>
-      </w:r>
-      <w:r>
-        <w:t xml:space="preserve">stay on, the target is within-class, and features are selected per-noun</w:t>
-      </w:r>
-      <w:r>
-        <w:t xml:space="preserve"> </w:t>
-      </w:r>
-      <w:r>
-        <w:t xml:space="preserve">for that target; free noun change is therefore not evidence of</w:t>
-      </w:r>
-      <w:r>
-        <w:t xml:space="preserve"> </w:t>
-      </w:r>
-      <w:r>
-        <w:t xml:space="preserve">independent content causation for these features.</w:t>
-      </w:r>
-    </w:p>
-    <w:bookmarkEnd w:id="124"/>
-    <w:bookmarkStart w:id="125" w:name="X69f35625b0afe180d6b9eb586d8718d584be9ab"/>
-    <w:p>
-      <w:pPr>
-        <w:pStyle w:val="Heading2"/>
-      </w:pPr>
-      <w:r>
-        <w:t xml:space="preserve">What is still missing (before we can state the claim more forcefully)</w:t>
-      </w:r>
-    </w:p>
-    <w:p>
-      <w:pPr>
-        <w:pStyle w:val="FirstParagraph"/>
-      </w:pPr>
-      <w:r>
-        <w:t xml:space="preserve">The scoped claim above is now supported by Stage XV + Stage XVI + Stage</w:t>
-      </w:r>
-      <w:r>
-        <w:t xml:space="preserve"> </w:t>
-      </w:r>
-      <w:r>
-        <w:t xml:space="preserve">XVII + E1–E3. The</w:t>
+        <w:t xml:space="preserve">does not—in editable sparse features</w:t>
       </w:r>
       <w:r>
         <w:t xml:space="preserve"> </w:t>
@@ -23204,13 +25261,61 @@
           <w:b/>
           <w:bCs/>
         </w:rPr>
-        <w:t xml:space="preserve">within-class / schedule hole</w:t>
-      </w:r>
-      <w:r>
-        <w:t xml:space="preserve"> </w:t>
-      </w:r>
-      <w:r>
-        <w:t xml:space="preserve">and the</w:t>
+        <w:t xml:space="preserve">and</w:t>
+      </w:r>
+      <w:r>
+        <w:t xml:space="preserve"> </w:t>
+      </w:r>
+      <w:r>
+        <w:t xml:space="preserve">in a</w:t>
+      </w:r>
+      <w:r>
+        <w:t xml:space="preserve"> </w:t>
+      </w:r>
+      <w:r>
+        <w:t xml:space="preserve">dense residual steer toward the same-class noun—so holding the article</w:t>
+      </w:r>
+      <w:r>
+        <w:t xml:space="preserve"> </w:t>
+      </w:r>
+      <w:r>
+        <w:t xml:space="preserve">fixed abolishes noun change even when content edits stay on and the</w:t>
+      </w:r>
+      <w:r>
+        <w:t xml:space="preserve"> </w:t>
+      </w:r>
+      <w:r>
+        <w:t xml:space="preserve">target is within-class; free noun change is therefore not evidence of</w:t>
+      </w:r>
+      <w:r>
+        <w:t xml:space="preserve"> </w:t>
+      </w:r>
+      <w:r>
+        <w:t xml:space="preserve">independent content causation for these handles.</w:t>
+      </w:r>
+    </w:p>
+    <w:bookmarkEnd w:id="132"/>
+    <w:bookmarkStart w:id="133" w:name="X69f35625b0afe180d6b9eb586d8718d584be9ab"/>
+    <w:p>
+      <w:pPr>
+        <w:pStyle w:val="Heading2"/>
+      </w:pPr>
+      <w:r>
+        <w:t xml:space="preserve">What is still missing (before we can state the claim more forcefully)</w:t>
+      </w:r>
+    </w:p>
+    <w:p>
+      <w:pPr>
+        <w:pStyle w:val="FirstParagraph"/>
+      </w:pPr>
+      <w:r>
+        <w:t xml:space="preserve">The scoped claim above is now supported by Stage XV + Stage XVI + Stage</w:t>
+      </w:r>
+      <w:r>
+        <w:t xml:space="preserve"> </w:t>
+      </w:r>
+      <w:r>
+        <w:t xml:space="preserve">XVII + Stage XVIII + E1–E3. The</w:t>
       </w:r>
       <w:r>
         <w:t xml:space="preserve"> </w:t>
@@ -23220,40 +25325,66 @@
           <w:b/>
           <w:bCs/>
         </w:rPr>
-        <w:t xml:space="preserve">per-noun</w:t>
+        <w:t xml:space="preserve">within-class / schedule</w:t>
+      </w:r>
+      <w:r>
+        <w:t xml:space="preserve">,</w:t>
+      </w:r>
+      <w:r>
+        <w:t xml:space="preserve"> </w:t>
       </w:r>
       <w:r>
         <w:rPr>
           <w:b/>
           <w:bCs/>
         </w:rPr>
-        <w:t xml:space="preserve"> </w:t>
+        <w:t xml:space="preserve">per-noun</w:t>
       </w:r>
       <w:r>
         <w:rPr>
           <w:b/>
           <w:bCs/>
         </w:rPr>
-        <w:t xml:space="preserve">sparse-grain hole</w:t>
-      </w:r>
-      <w:r>
-        <w:t xml:space="preserve"> </w:t>
-      </w:r>
-      <w:r>
-        <w:t xml:space="preserve">are closed for these CLT handles. What still limits</w:t>
-      </w:r>
-      <w:r>
-        <w:t xml:space="preserve"> </w:t>
-      </w:r>
-      <w:r>
-        <w:t xml:space="preserve">a harder claim:</w:t>
+        <w:t xml:space="preserve"> </w:t>
+      </w:r>
+      <w:r>
+        <w:rPr>
+          <w:b/>
+          <w:bCs/>
+        </w:rPr>
+        <w:t xml:space="preserve">sparse-grain</w:t>
+      </w:r>
+      <w:r>
+        <w:t xml:space="preserve">, and</w:t>
+      </w:r>
+      <w:r>
+        <w:t xml:space="preserve"> </w:t>
+      </w:r>
+      <w:r>
+        <w:rPr>
+          <w:b/>
+          <w:bCs/>
+        </w:rPr>
+        <w:t xml:space="preserve">residual-direction</w:t>
+      </w:r>
+      <w:r>
+        <w:t xml:space="preserve"> </w:t>
+      </w:r>
+      <w:r>
+        <w:t xml:space="preserve">holes are closed for the</w:t>
+      </w:r>
+      <w:r>
+        <w:t xml:space="preserve"> </w:t>
+      </w:r>
+      <w:r>
+        <w:t xml:space="preserve">constructions we tested. What still limits a harder claim:</w:t>
       </w:r>
     </w:p>
     <w:p>
       <w:pPr>
         <w:numPr>
           <w:ilvl w:val="0"/>
-          <w:numId w:val="1022"/>
+          <w:numId w:val="1023"/>
         </w:numPr>
       </w:pPr>
       <w:r>
@@ -23261,13 +25392,102 @@
           <w:b/>
           <w:bCs/>
         </w:rPr>
-        <w:t xml:space="preserve">Residual / dense content handles.</w:t>
-      </w:r>
-      <w:r>
-        <w:t xml:space="preserve"> </w:t>
-      </w:r>
-      <w:r>
-        <w:t xml:space="preserve">Stage XVII closes per-noun</w:t>
+        <w:t xml:space="preserve">Alternative dense constructions.</w:t>
+      </w:r>
+      <w:r>
+        <w:t xml:space="preserve"> </w:t>
+      </w:r>
+      <w:r>
+        <w:t xml:space="preserve">Stage XVIII closes one standard</w:t>
+      </w:r>
+      <w:r>
+        <w:t xml:space="preserve"> </w:t>
+      </w:r>
+      <w:r>
+        <w:t xml:space="preserve">hint-contrast residual direction at MLP-in layers with matched random</w:t>
+      </w:r>
+      <w:r>
+        <w:t xml:space="preserve"> </w:t>
+      </w:r>
+      <w:r>
+        <w:t xml:space="preserve">controls. Other sites, multi-position patches, or differently built</w:t>
+      </w:r>
+      <w:r>
+        <w:t xml:space="preserve"> </w:t>
+      </w:r>
+      <w:r>
+        <w:t xml:space="preserve">directions could still be tried if collaborators want completeness</w:t>
+      </w:r>
+      <w:r>
+        <w:t xml:space="preserve"> </w:t>
+      </w:r>
+      <w:r>
+        <w:t xml:space="preserve">beyond this construction—without undoing the scoped claim about the</w:t>
+      </w:r>
+      <w:r>
+        <w:t xml:space="preserve"> </w:t>
+      </w:r>
+      <w:r>
+        <w:t xml:space="preserve">handles we already edited.</w:t>
+      </w:r>
+    </w:p>
+    <w:p>
+      <w:pPr>
+        <w:numPr>
+          <w:ilvl w:val="0"/>
+          <w:numId w:val="1023"/>
+        </w:numPr>
+      </w:pPr>
+      <w:r>
+        <w:rPr>
+          <w:b/>
+          <w:bCs/>
+        </w:rPr>
+        <w:t xml:space="preserve">Finer latent content identity.</w:t>
+      </w:r>
+      <w:r>
+        <w:t xml:space="preserve"> </w:t>
+      </w:r>
+      <w:r>
+        <w:t xml:space="preserve">Written tokens and coarse set</w:t>
+      </w:r>
+      <w:r>
+        <w:t xml:space="preserve"> </w:t>
+      </w:r>
+      <w:r>
+        <w:t xml:space="preserve">means only show execution plus set-level amplitude. Dedicated</w:t>
+      </w:r>
+      <w:r>
+        <w:t xml:space="preserve"> </w:t>
+      </w:r>
+      <w:r>
+        <w:t xml:space="preserve">noun-identity probes (pilot vs captain / aviator) at (i) the article</w:t>
+      </w:r>
+      <w:r>
+        <w:t xml:space="preserve"> </w:t>
+      </w:r>
+      <w:r>
+        <w:t xml:space="preserve">step under intervention and (ii) the noun step after paste-native</w:t>
+      </w:r>
+      <w:r>
+        <w:t xml:space="preserve"> </w:t>
+      </w:r>
+      <m:oMath>
+        <m:r>
+          <m:t>b</m:t>
+        </m:r>
+      </m:oMath>
+      <w:r>
+        <w:t xml:space="preserve"> </w:t>
+      </w:r>
+      <w:r>
+        <w:t xml:space="preserve">would distinguish packaging-with-reset from plan-then-abandon</w:t>
+      </w:r>
+      <w:r>
+        <w:t xml:space="preserve"> </w:t>
+      </w:r>
+      <w:r>
+        <w:t xml:space="preserve">more sharply. That does not weaken the scoped claim about</w:t>
       </w:r>
       <w:r>
         <w:t xml:space="preserve"> </w:t>
@@ -23277,26 +25497,68 @@
           <w:i/>
           <w:iCs/>
         </w:rPr>
-        <w:t xml:space="preserve">sparse</w:t>
-      </w:r>
-      <w:r>
-        <w:t xml:space="preserve"> </w:t>
-      </w:r>
-      <w:r>
-        <w:t xml:space="preserve">selection; it does not patch residual-stream or full</w:t>
-      </w:r>
-      <w:r>
-        <w:t xml:space="preserve"> </w:t>
-      </w:r>
-      <w:r>
-        <w:t xml:space="preserve">activation directions. A positive</w:t>
-      </w:r>
-      <w:r>
+        <w:t xml:space="preserve">execution</w:t>
+      </w:r>
+      <w:r>
+        <w:t xml:space="preserve">, but it is required before claiming there was never a</w:t>
+      </w:r>
+      <w:r>
+        <w:t xml:space="preserve"> </w:t>
+      </w:r>
+      <w:r>
+        <w:t xml:space="preserve">latent content code.</w:t>
+      </w:r>
+    </w:p>
+    <w:p>
+      <w:pPr>
+        <w:numPr>
+          <w:ilvl w:val="0"/>
+          <w:numId w:val="1023"/>
+        </w:numPr>
+      </w:pPr>
+      <w:r>
+        <w:rPr>
+          <w:b/>
+          <w:bCs/>
+        </w:rPr>
+        <w:t xml:space="preserve">Pure</w:t>
+      </w:r>
+      <w:r>
+        <w:rPr>
+          <w:b/>
+          <w:bCs/>
+        </w:rPr>
         <w:t xml:space="preserve"> </w:t>
       </w:r>
       <m:oMath>
         <m:r>
-          <m:t>C</m:t>
+          <m:t>A</m:t>
+        </m:r>
+      </m:oMath>
+      <w:r>
+        <w:rPr>
+          <w:b/>
+          <w:bCs/>
+        </w:rPr>
+        <w:t xml:space="preserve"> </w:t>
+      </w:r>
+      <w:r>
+        <w:rPr>
+          <w:b/>
+          <w:bCs/>
+        </w:rPr>
+        <w:t xml:space="preserve">and</w:t>
+      </w:r>
+      <w:r>
+        <w:rPr>
+          <w:b/>
+          <w:bCs/>
+        </w:rPr>
+        <w:t xml:space="preserve"> </w:t>
+      </w:r>
+      <m:oMath>
+        <m:r>
+          <m:t>A</m:t>
         </m:r>
         <m:r>
           <m:rPr>
@@ -23305,113 +25567,45 @@
           <m:t>→</m:t>
         </m:r>
         <m:r>
-          <m:t>c</m:t>
+          <m:t>C</m:t>
         </m:r>
       </m:oMath>
-      <w:r>
-        <w:t xml:space="preserve"> </w:t>
-      </w:r>
-      <w:r>
-        <w:t xml:space="preserve">dial could still</w:t>
-      </w:r>
-      <w:r>
-        <w:t xml:space="preserve"> </w:t>
-      </w:r>
-      <w:r>
-        <w:t xml:space="preserve">exist outside the CLT dictionary.</w:t>
-      </w:r>
-    </w:p>
-    <w:p>
-      <w:pPr>
-        <w:numPr>
-          <w:ilvl w:val="0"/>
-          <w:numId w:val="1022"/>
-        </w:numPr>
-      </w:pPr>
       <w:r>
         <w:rPr>
           <w:b/>
           <w:bCs/>
         </w:rPr>
-        <w:t xml:space="preserve">Finer latent content identity.</w:t>
-      </w:r>
-      <w:r>
-        <w:t xml:space="preserve"> </w:t>
-      </w:r>
-      <w:r>
-        <w:t xml:space="preserve">Written tokens and coarse set</w:t>
-      </w:r>
-      <w:r>
-        <w:t xml:space="preserve"> </w:t>
-      </w:r>
-      <w:r>
-        <w:t xml:space="preserve">means only show execution plus set-level amplitude. Dedicated</w:t>
-      </w:r>
-      <w:r>
-        <w:t xml:space="preserve"> </w:t>
-      </w:r>
-      <w:r>
-        <w:t xml:space="preserve">noun-identity probes (pilot vs captain / aviator) at (i) the article</w:t>
-      </w:r>
-      <w:r>
-        <w:t xml:space="preserve"> </w:t>
-      </w:r>
-      <w:r>
-        <w:t xml:space="preserve">step under intervention and (ii) the noun step after paste-native</w:t>
-      </w:r>
-      <w:r>
-        <w:t xml:space="preserve"> </w:t>
-      </w:r>
-      <m:oMath>
-        <m:r>
-          <m:t>b</m:t>
-        </m:r>
-      </m:oMath>
-      <w:r>
-        <w:t xml:space="preserve"> </w:t>
-      </w:r>
-      <w:r>
-        <w:t xml:space="preserve">would distinguish packaging-with-reset from plan-then-abandon</w:t>
-      </w:r>
-      <w:r>
-        <w:t xml:space="preserve"> </w:t>
-      </w:r>
-      <w:r>
-        <w:t xml:space="preserve">more sharply. That does not weaken the scoped claim about</w:t>
-      </w:r>
-      <w:r>
-        <w:t xml:space="preserve"> </w:t>
-      </w:r>
-      <w:r>
-        <w:rPr>
-          <w:i/>
-          <w:iCs/>
-        </w:rPr>
-        <w:t xml:space="preserve">execution</w:t>
-      </w:r>
-      <w:r>
-        <w:t xml:space="preserve">, but it is required before claiming there was never a</w:t>
-      </w:r>
-      <w:r>
-        <w:t xml:space="preserve"> </w:t>
-      </w:r>
-      <w:r>
-        <w:t xml:space="preserve">latent content code.</w:t>
-      </w:r>
-    </w:p>
-    <w:p>
-      <w:pPr>
-        <w:numPr>
-          <w:ilvl w:val="0"/>
-          <w:numId w:val="1022"/>
-        </w:numPr>
-      </w:pPr>
+        <w:t xml:space="preserve">.</w:t>
+      </w:r>
+      <w:r>
+        <w:t xml:space="preserve"> </w:t>
+      </w:r>
+      <w:r>
+        <w:t xml:space="preserve">Still untested as causal</w:t>
+      </w:r>
+      <w:r>
+        <w:t xml:space="preserve"> </w:t>
+      </w:r>
+      <w:r>
+        <w:t xml:space="preserve">interventions.</w:t>
+      </w:r>
+    </w:p>
+    <w:p>
+      <w:pPr>
+        <w:pStyle w:val="FirstParagraph"/>
+      </w:pPr>
+      <w:r>
+        <w:t xml:space="preserve">Collaborators should read the interim claim as:</w:t>
+      </w:r>
+      <w:r>
+        <w:t xml:space="preserve"> </w:t>
+      </w:r>
       <w:r>
         <w:rPr>
           <w:b/>
           <w:bCs/>
         </w:rPr>
-        <w:t xml:space="preserve">Pure</w:t>
+        <w:t xml:space="preserve">strong against modular</w:t>
       </w:r>
       <w:r>
         <w:rPr>
@@ -23420,74 +25614,37 @@
         </w:rPr>
         <w:t xml:space="preserve"> </w:t>
       </w:r>
-      <m:oMath>
-        <m:r>
-          <m:t>A</m:t>
-        </m:r>
-      </m:oMath>
       <w:r>
         <w:rPr>
           <w:b/>
           <w:bCs/>
         </w:rPr>
-        <w:t xml:space="preserve"> </w:t>
-      </w:r>
+        <w:t xml:space="preserve">H1 for these interventions’ free-generation and fixed-</w:t>
+      </w:r>
+      <m:oMath>
+        <m:r>
+          <m:t>b</m:t>
+        </m:r>
+      </m:oMath>
       <w:r>
         <w:rPr>
           <w:b/>
           <w:bCs/>
         </w:rPr>
-        <w:t xml:space="preserve">and</w:t>
+        <w:t xml:space="preserve"> </w:t>
       </w:r>
       <w:r>
         <w:rPr>
           <w:b/>
           <w:bCs/>
         </w:rPr>
-        <w:t xml:space="preserve"> </w:t>
-      </w:r>
-      <m:oMath>
-        <m:r>
-          <m:t>A</m:t>
-        </m:r>
-        <m:r>
-          <m:rPr>
-            <m:sty m:val="p"/>
-          </m:rPr>
-          <m:t>→</m:t>
-        </m:r>
-        <m:r>
-          <m:t>C</m:t>
-        </m:r>
-      </m:oMath>
+        <w:t xml:space="preserve">execution</w:t>
+      </w:r>
       <w:r>
         <w:rPr>
           <w:b/>
           <w:bCs/>
         </w:rPr>
-        <w:t xml:space="preserve">.</w:t>
-      </w:r>
-      <w:r>
-        <w:t xml:space="preserve"> </w:t>
-      </w:r>
-      <w:r>
-        <w:t xml:space="preserve">Still untested as causal</w:t>
-      </w:r>
-      <w:r>
-        <w:t xml:space="preserve"> </w:t>
-      </w:r>
-      <w:r>
-        <w:t xml:space="preserve">interventions.</w:t>
-      </w:r>
-    </w:p>
-    <w:p>
-      <w:pPr>
-        <w:pStyle w:val="FirstParagraph"/>
-      </w:pPr>
-      <w:r>
-        <w:t xml:space="preserve">Collaborators should read the interim claim as:</w:t>
-      </w:r>
-      <w:r>
         <w:t xml:space="preserve"> </w:t>
       </w:r>
       <w:r>
@@ -23495,57 +25652,10 @@
           <w:b/>
           <w:bCs/>
         </w:rPr>
-        <w:t xml:space="preserve">strong against modular</w:t>
-      </w:r>
-      <w:r>
-        <w:rPr>
-          <w:b/>
-          <w:bCs/>
-        </w:rPr>
-        <w:t xml:space="preserve"> </w:t>
-      </w:r>
-      <w:r>
-        <w:rPr>
-          <w:b/>
-          <w:bCs/>
-        </w:rPr>
-        <w:t xml:space="preserve">H1 for these interventions’ free-generation and fixed-</w:t>
-      </w:r>
-      <m:oMath>
-        <m:r>
-          <m:t>b</m:t>
-        </m:r>
-      </m:oMath>
-      <w:r>
-        <w:rPr>
-          <w:b/>
-          <w:bCs/>
-        </w:rPr>
-        <w:t xml:space="preserve"> </w:t>
-      </w:r>
-      <w:r>
-        <w:rPr>
-          <w:b/>
-          <w:bCs/>
-        </w:rPr>
-        <w:t xml:space="preserve">execution</w:t>
-      </w:r>
-      <w:r>
-        <w:rPr>
-          <w:b/>
-          <w:bCs/>
-        </w:rPr>
-        <w:t xml:space="preserve"> </w:t>
-      </w:r>
-      <w:r>
-        <w:rPr>
-          <w:b/>
-          <w:bCs/>
-        </w:rPr>
         <w:t xml:space="preserve">behavior</w:t>
       </w:r>
       <w:r>
-        <w:t xml:space="preserve">, with the phonological within-class caveat and the per-noun</w:t>
+        <w:t xml:space="preserve">, with the phonological within-class caveat, the per-noun</w:t>
       </w:r>
       <w:r>
         <w:t xml:space="preserve"> </w:t>
@@ -23568,25 +25678,31 @@
         <w:t xml:space="preserve"> </w:t>
       </w:r>
       <w:r>
-        <w:t xml:space="preserve">grain caveat now closed for sparse CLT handles. Until residual</w:t>
-      </w:r>
-      <w:r>
-        <w:t xml:space="preserve"> </w:t>
-      </w:r>
-      <w:r>
-        <w:t xml:space="preserve">patches and finer latent probes are run, we should not claim latent</w:t>
-      </w:r>
-      <w:r>
-        <w:t xml:space="preserve"> </w:t>
-      </w:r>
-      <w:r>
-        <w:t xml:space="preserve">absence of all content plans—only absence of demonstrated independent</w:t>
-      </w:r>
-      <w:r>
-        <w:t xml:space="preserve"> </w:t>
-      </w:r>
-      <w:r>
-        <w:t xml:space="preserve">causal control of executed</w:t>
+        <w:t xml:space="preserve">grain caveat, and the residual-direction caveat now closed for</w:t>
+      </w:r>
+      <w:r>
+        <w:t xml:space="preserve"> </w:t>
+      </w:r>
+      <w:r>
+        <w:t xml:space="preserve">the constructions we tested. Until finer latent probes (and optionally</w:t>
+      </w:r>
+      <w:r>
+        <w:t xml:space="preserve"> </w:t>
+      </w:r>
+      <w:r>
+        <w:t xml:space="preserve">further dense variants) are run, we should not claim latent absence of</w:t>
+      </w:r>
+      <w:r>
+        <w:t xml:space="preserve"> </w:t>
+      </w:r>
+      <w:r>
+        <w:t xml:space="preserve">all content plans—only absence of demonstrated independent causal control</w:t>
+      </w:r>
+      <w:r>
+        <w:t xml:space="preserve"> </w:t>
+      </w:r>
+      <w:r>
+        <w:t xml:space="preserve">of executed</w:t>
       </w:r>
       <w:r>
         <w:t xml:space="preserve"> </w:t>
@@ -23614,18 +25730,12 @@
         <w:t xml:space="preserve"> </w:t>
       </w:r>
       <w:r>
-        <w:t xml:space="preserve">fixed for the handles we</w:t>
-      </w:r>
-      <w:r>
-        <w:t xml:space="preserve"> </w:t>
-      </w:r>
-      <w:r>
-        <w:t xml:space="preserve">tested.</w:t>
-      </w:r>
-    </w:p>
-    <w:bookmarkEnd w:id="125"/>
-    <w:bookmarkEnd w:id="126"/>
-    <w:bookmarkStart w:id="127" w:name="reproducibility-map"/>
+        <w:t xml:space="preserve">fixed for the handles we tested.</w:t>
+      </w:r>
+    </w:p>
+    <w:bookmarkEnd w:id="133"/>
+    <w:bookmarkEnd w:id="134"/>
+    <w:bookmarkStart w:id="135" w:name="reproducibility-map"/>
     <w:p>
       <w:pPr>
         <w:pStyle w:val="Heading1"/>
@@ -24290,6 +26400,47 @@
               <w:pStyle w:val="Compact"/>
             </w:pPr>
             <w:r>
+              <w:t xml:space="preserve">Residual / MLP-in direction under fixed</w:t>
+            </w:r>
+            <w:r>
+              <w:t xml:space="preserve"> </w:t>
+            </w:r>
+            <m:oMath>
+              <m:r>
+                <m:t>b</m:t>
+              </m:r>
+            </m:oMath>
+            <w:r>
+              <w:t xml:space="preserve"> </w:t>
+            </w:r>
+            <w:r>
+              <w:t xml:space="preserve">(Stage XVIII / Exp 1)</w:t>
+            </w:r>
+          </w:p>
+        </w:tc>
+        <w:tc>
+          <w:tcPr/>
+          <w:p>
+            <w:pPr>
+              <w:pStyle w:val="Compact"/>
+            </w:pPr>
+            <w:r>
+              <w:rPr>
+                <w:rStyle w:val="VerbatimChar"/>
+              </w:rPr>
+              <w:t xml:space="preserve">experiments/residual_direction_fixed_b_c_to_c/</w:t>
+            </w:r>
+          </w:p>
+        </w:tc>
+      </w:tr>
+      <w:tr>
+        <w:tc>
+          <w:tcPr/>
+          <w:p>
+            <w:pPr>
+              <w:pStyle w:val="Compact"/>
+            </w:pPr>
+            <w:r>
               <w:t xml:space="preserve">Paper execution contract</w:t>
             </w:r>
           </w:p>
@@ -24405,7 +26556,7 @@
         <w:t xml:space="preserve">(Pandoc path).</w:t>
       </w:r>
     </w:p>
-    <w:bookmarkEnd w:id="127"/>
+    <w:bookmarkEnd w:id="135"/>
     <w:sectPr>
       <w:pgSz w:h="15840" w:orient="portrait" w:w="12240"/>
       <w:pgMar w:bottom="1440" w:footer="720" w:header="720" w:left="1440" w:right="1440" w:top="1440"/>
@@ -25110,12 +27261,42 @@
     <w:abstractNumId w:val="991"/>
   </w:num>
   <w:num w:numId="1020">
-    <w:abstractNumId w:val="991"/>
+    <w:abstractNumId w:val="99411"/>
+    <w:lvlOverride w:ilvl="0">
+      <w:startOverride w:val="1"/>
+    </w:lvlOverride>
+    <w:lvlOverride w:ilvl="1">
+      <w:startOverride w:val="1"/>
+    </w:lvlOverride>
+    <w:lvlOverride w:ilvl="2">
+      <w:startOverride w:val="1"/>
+    </w:lvlOverride>
+    <w:lvlOverride w:ilvl="3">
+      <w:startOverride w:val="1"/>
+    </w:lvlOverride>
+    <w:lvlOverride w:ilvl="4">
+      <w:startOverride w:val="1"/>
+    </w:lvlOverride>
+    <w:lvlOverride w:ilvl="5">
+      <w:startOverride w:val="1"/>
+    </w:lvlOverride>
+    <w:lvlOverride w:ilvl="6">
+      <w:startOverride w:val="1"/>
+    </w:lvlOverride>
+    <w:lvlOverride w:ilvl="7">
+      <w:startOverride w:val="1"/>
+    </w:lvlOverride>
+    <w:lvlOverride w:ilvl="8">
+      <w:startOverride w:val="1"/>
+    </w:lvlOverride>
   </w:num>
   <w:num w:numId="1021">
     <w:abstractNumId w:val="991"/>
   </w:num>
   <w:num w:numId="1022">
+    <w:abstractNumId w:val="991"/>
+  </w:num>
+  <w:num w:numId="1023">
     <w:abstractNumId w:val="99411"/>
     <w:lvlOverride w:ilvl="0">
       <w:startOverride w:val="1"/>

</xml_diff>